<commit_message>
RIB: move series notes into notes/ and build scripts into scripts/; Book 1 Kindle and Book 2 draft updates; review-fix scripts
</commit_message>
<xml_diff>
--- a/The Relativistic Investigation Bureau - SERIES/Book 2 - The Warning That Was Sent Too Late/The_Warning_That_Was_Sent_Too_Late_BOOK_2_DRAFT.docx
+++ b/The Relativistic Investigation Bureau - SERIES/Book 2 - The Warning That Was Sent Too Late/The_Warning_That_Was_Sent_Too_Late_BOOK_2_DRAFT.docx
@@ -10015,7 +10015,7 @@
           <w:b w:val="0"/>
           <w:sz w:val="22"/>
         </w:rPr>
-        <w:t>At twenty past three the public address system cleared its throat, in the way of public address systems everywhere, and a woman's voice, recorded so long ago that she might by now have retired to the coast, apologised for the late running of the 14:52 from Cardiff Central. The 14:52 from Cardiff Central was already in. It had been in for six minutes. Its passengers were streaming past them towards the Underground, with the faces of people who have already done their suffering and do not wish to hear about it again.</w:t>
+        <w:t>At twenty past three the public address system cleared its throat, in the way of public address systems everywhere, and a woman's voice, recorded so long ago that she might by now have retired to the coast, apologised for the late running of the 12:52 from Cardiff Central. The 12:52 from Cardiff Central was already in. It had been in for six minutes. Its passengers were streaming past them towards the Underground, with the faces of people who have already done their suffering and do not wish to hear about it again.</w:t>
       </w:r>
     </w:p>
     <w:p>
@@ -10249,7 +10249,7 @@
           <w:b w:val="0"/>
           <w:sz w:val="22"/>
         </w:rPr>
-        <w:t>The recorded voice came back on, unbidden, to apologise again for the late running of the 14:52 from Cardiff Central, which had by now been in for nine minutes and was being cleaned.</w:t>
+        <w:t>The recorded voice came back on, unbidden, to apologise again for the late running of the 12:52 from Cardiff Central, which had by now been in for nine minutes and was being cleaned.</w:t>
       </w:r>
     </w:p>
     <w:p>
@@ -14449,7 +14449,7 @@
           <w:b w:val="0"/>
           <w:sz w:val="22"/>
         </w:rPr>
-        <w:t>Derek understood, then, what the stairwell had been. Not the lease. Not only the lease. A woman sitting on a step for five hours with a clipboard on her knee, facing a frame, because she thought she might have let something in.</w:t>
+        <w:t>Derek understood, then, what the stairwell had been. Not the lease. Not only the lease. A woman sitting on a step for the best part of four hours with a clipboard on her knee, facing a frame, because she thought she might have let something in.</w:t>
       </w:r>
     </w:p>
     <w:p>
@@ -14540,7 +14540,7 @@
           <w:b w:val="0"/>
           <w:sz w:val="22"/>
         </w:rPr>
-        <w:t>"Then you weren't warned. You were recorded. There's a difference. We learned it at the station this afternoon from a woman apologising for a train from Cardiff." She came round the desk and stood beside Derek, not too close to Mrs Marsh, in the manner of somebody approaching a cat on a wall. "A warning that comes after an act can't tell you not to do it. All it can do is say somebody wished it hadn't been done. That's not the same as saying you did wrong."</w:t>
+        <w:t>"Then you weren't warned. You were recorded. There's a difference. We learned it at the station this afternoon from a woman apologising for a train from Cardiff." Penny came round the desk and stood beside Derek, not too close to Mrs Marsh, in the manner of somebody approaching a cat on a wall. "A warning that comes after an act can't tell you not to do it. All it can do is say somebody wished it hadn't been done. That's not the same as saying you did wrong."</w:t>
       </w:r>
     </w:p>
     <w:p>
@@ -16495,7 +16495,7 @@
           <w:b w:val="0"/>
           <w:sz w:val="22"/>
         </w:rPr>
-        <w:t>The itinerary said London Heathrow to Athens, Thursday week, departing 07:40, arriving 13:05 local. Three hours twenty-five, once you took off the two hours Greece was ahead. Weinstein had looked at it upside down under the departure board at Paddington, with his train due in nine minutes, and had said, without any appearance of effort, "Ten billionths of a second. Older. You will come back older than Derek by about ten nanoseconds, and I shall want to hear about it from the air, because if you tell me on the ground it will merely be arithmetic."</w:t>
+        <w:t>The itinerary said London Heathrow to Athens, Thursday week, departing 07:40, arriving 13:05 local. Three hours twenty-five, once you took off the two hours Greece was ahead. Weinstein had looked at it upside down under the departure board at Paddington, with his ticket barely in his pocket, and had said, without any appearance of effort, "Ten billionths of a second. Older. You will come back older than Derek by about ten nanoseconds, and I shall want to hear about it from the air, because if you tell me on the ground it will merely be arithmetic."</w:t>
       </w:r>
     </w:p>
     <w:p>
@@ -16521,7 +16521,7 @@
           <w:b w:val="0"/>
           <w:sz w:val="22"/>
         </w:rPr>
-        <w:t>He had said, "About ten. Do it yourself. You will not believe me otherwise," and he had been right about that, and then he had gone through the barrier and turned round once.</w:t>
+        <w:t>He had said, "About ten. Do it yourself. You will not believe me otherwise," and he had been right about that, and then, a couple of hours later, he had gone through the barrier and turned round once.</w:t>
       </w:r>
     </w:p>
     <w:p>
@@ -16612,7 +16612,7 @@
           <w:b w:val="0"/>
           <w:sz w:val="22"/>
         </w:rPr>
-        <w:t>It annoyed her more than she could reasonably account for. It was not that she wanted him to be wrong. It was that he had done it upside down, in his head, in the nine minutes before a train, while being visibly delighted about something else, and she had done it at a table with a biro over twenty minutes, and they had got the same number, and that was what being very smart and very lazy looked like from the outside. Herbert's phrase. She had heard Weinstein quote it about himself with something not far from pride.</w:t>
+        <w:t>It annoyed her more than she could reasonably account for. It was not that she wanted him to be wrong. It was that he had done it upside down, in his head, in the time it took to put a ticket away, while being visibly delighted about something else, and she had done it at a table with a biro over twenty minutes, and they had got the same number, and that was what being very smart and very lazy looked like from the outside. Herbert's phrase. She had heard Weinstein quote it about himself with something not far from pride.</w:t>
       </w:r>
     </w:p>
     <w:p>
@@ -18580,7 +18580,7 @@
           <w:b w:val="0"/>
           <w:sz w:val="22"/>
         </w:rPr>
-        <w:t>"I was the first to see it. I was standing at Derek's desk, being polite, which I had come to London to be, and I looked down, and it was there. It had not been there a moment before. I am quite sure of that. I am a patent attorney; I notice paper. And then it was in my hand, and then, because I am polite, in my pocket, and then the door opened. I did not read it until afterwards. None of us did."</w:t>
+        <w:t>"I was the first to see it. I was standing at Derek's desk, being polite, which I had come to London to be, and I looked down, and it was there. It had not been there a moment before. I am quite sure of that. I am a patent attorney; I notice paper. And then it was in my hand, and then, because I am polite, in Derek's hand, and then the door opened. I did not read it until afterwards. None of us did."</w:t>
       </w:r>
     </w:p>
     <w:p>
@@ -20422,7 +20422,7 @@
           <w:b w:val="0"/>
           <w:sz w:val="22"/>
         </w:rPr>
-        <w:t>"Monday. The train. He told me on the telephone he very nearly stayed. He said he got on the airport train at four, and turned round once at the barrier, and did not come back through it. Staying would have been a tenancy. He hurried. He was right to. It was the one act in the whole day with a perfectly clear place in the shape: after the refusal to board the other one, before anything else could happen to him. A man who leaves on time is a man who knows where he is in the order." He paused. "Do not tell him I said he was right. Tell him the hurry was. He will know the difference and it will annoy him."</w:t>
+        <w:t>"Monday. The train. He told me on the telephone he very nearly stayed. He said he got on the airport train at four, and turned round once at the barrier, and did not come back through it. Staying would have been a tenancy. He hurried. He was right to. It was the one act in the whole day with a perfectly clear place in the shape: after the door, before the refusal was written down, before anything else could happen to him. A man who leaves on time is a man who knows where he is in the order." He paused. "Do not tell him I said he was right. Tell him the hurry was. He will know the difference and it will annoy him."</w:t>
       </w:r>
     </w:p>
     <w:p>
@@ -22091,7 +22091,7 @@
           <w:b w:val="0"/>
           <w:sz w:val="22"/>
         </w:rPr>
-        <w:t>"The corridor clock's the ordinary clock. It doesn't have a second hand." Trevor was already out in the corridor, leaning, with his phone held up beside the clock face. He came back. "And it's slow. It says twenty-three minutes past five. The phone says twenty-three minutes and thirty-one seconds. Call it half a minute slow. I checked it against the platform clock on Monday, but I never checked it against the phone, because I was only asking whether they ran at the same rate. They do. That's not the same as being right." He looked faintly ashamed of the corridor clock, as if it were a relative. "So when I said ten oh five on Monday, it was really ten oh five and a half, roughly, by the phone. Give or take a bit, because I don't know how far through the minute the hand was when I read it."</w:t>
+        <w:t>"The corridor clock's the ordinary clock. It doesn't have a second hand." Trevor was already out in the corridor, leaning, with his phone held up beside the clock face. He came back. "And it's slow. It says twenty-three minutes past five, and the hand's only just on the twenty-three. The phone says twenty-three minutes and thirty-one seconds. Call it half a minute slow. I checked it against the platform clock on Monday, but I never checked it against the phone, because I was only asking whether they ran at the same rate. They do. That's not the same as being right." He looked faintly ashamed of the corridor clock, as if it were a relative. "So when I said ten oh five on Monday, it was really ten oh five and a half, roughly, by the phone. Give or take a bit, because I don't know how far through the minute the hand was when I read it."</w:t>
       </w:r>
     </w:p>
     <w:p>
@@ -22650,7 +22650,7 @@
           <w:b w:val="0"/>
           <w:sz w:val="22"/>
         </w:rPr>
-        <w:t>"I've been a landlord for thirty years." "I've had subsidence. I've had a fire in a restaurant on the ground floor of a building in Hammersmith. I once had a tenant who kept bees in a stationery cupboard. Every single time, the first thing anybody asked was when. When did the crack start. When did the fat catch. When did the bees arrive. And every single time somebody gave them a time. I always thought it was because somebody knew." He turned the ring, slowly, once. "It wasn't, was it."</w:t>
+        <w:t>"I've been a landlord for thirty years. I've had subsidence. I've had a fire in a restaurant on the ground floor of a building in Hammersmith. I once had a tenant who kept bees in a stationery cupboard. Every single time, the first thing anybody asked was when. When did the crack start. When did the fat catch. When did the bees arrive. And every single time somebody gave them a time. I always thought it was because somebody knew." He turned the ring, slowly, once. "It wasn't, was it."</w:t>
       </w:r>
     </w:p>
     <w:p>
@@ -23153,7 +23153,7 @@
           <w:b w:val="0"/>
           <w:sz w:val="22"/>
         </w:rPr>
-        <w:t>He came in her coat collar, as he did when he came at all, and she set him down on the corridor carpet, and he looked at the sill for a long time. He looked at the yellow tape, which Trevor had rolled up that morning on the grounds that the platform had now proved it could keep still without supervision. He looked at the grey slabs and the bench nobody would choose and the train lit at all its windows. Then he went and lay down in the hall, a little way along the corridor, as if a railway were a piece of furniture he had declined to discuss.</w:t>
+        <w:t>He came in her coat collar, as he did when he came at all, and she set him down on the corridor carpet, and he looked at the sill for a long time. He looked at the sill where the yellow tape had lain until Trevor rolled it up on Monday evening, on the grounds that the platform had proved it could keep still without supervision. He looked at the grey slabs and the bench nobody would choose and the train lit at all its windows. Then he went and lay down in the hall, a little way along the corridor, as if a railway were a piece of furniture he had declined to discuss.</w:t>
       </w:r>
     </w:p>
     <w:p>

</xml_diff>

<commit_message>
RIB series audit: Book 1 and Book 2 docx fixes; notes/audit_2026-10-02.md
Book 1 (64,072 -> 64,113 words): series line Book One; Coming Next five words, names Book 2; epilogue drops a chapter-number line, a new-term contradiction and a repeated drawer; Also by Lothar J. Musiol (Physics, Actually Vols 1-3, The Quantum World); author metadata set.
Book 2 (49,007 -> 49,378 words): all headings now Word Heading 1 with page breaks; copyright line, fiction notice, linked Table of Contents; About the Author and Also by added; Ch 9 time and place fixes (15:20, out of school); Ch 18/19 Barbarian email timing; filler similes trimmed; author metadata was python-docx.
kdp_description.docx author metadata set to Lothar J. Musiol. SERIES_SEAM notes that the docx is now the master and the text files are behind it. Open story questions are in notes/audit_2026-10-02.md.
</commit_message>
<xml_diff>
--- a/The Relativistic Investigation Bureau - SERIES/Book 2 - The Warning That Was Sent Too Late/The_Warning_That_Was_Sent_Too_Late_BOOK_2_DRAFT.docx
+++ b/The Relativistic Investigation Bureau - SERIES/Book 2 - The Warning That Was Sent Too Late/The_Warning_That_Was_Sent_Too_Late_BOOK_2_DRAFT.docx
@@ -50,6 +50,7 @@
     <w:p>
       <w:pPr>
         <w:spacing w:after="160" w:line="240" w:lineRule="auto"/>
+        <w:jc w:val="center"/>
       </w:pPr>
       <w:r>
         <w:rPr>
@@ -63,6 +64,7 @@
     <w:p>
       <w:pPr>
         <w:spacing w:after="160" w:line="240" w:lineRule="auto"/>
+        <w:jc w:val="center"/>
       </w:pPr>
       <w:r>
         <w:rPr>
@@ -75,9 +77,41 @@
     </w:p>
     <w:p>
       <w:pPr>
+        <w:spacing w:after="160" w:line="240" w:lineRule="auto"/>
+        <w:jc w:val="center"/>
+      </w:pPr>
+      <w:r>
+        <w:rPr>
+          <w:rFonts w:ascii="Georgia" w:hAnsi="Georgia" w:eastAsia="Georgia"/>
+          <w:b w:val="0"/>
+          <w:sz w:val="22"/>
+        </w:rPr>
+        <w:t>Copyright © 2026 Lothar J. Musiol. All rights reserved.</w:t>
+      </w:r>
+    </w:p>
+    <w:p>
+      <w:pPr>
+        <w:spacing w:after="160" w:line="240" w:lineRule="auto"/>
+        <w:jc w:val="center"/>
+      </w:pPr>
+      <w:r>
+        <w:rPr>
+          <w:rFonts w:ascii="Georgia" w:hAnsi="Georgia" w:eastAsia="Georgia"/>
+          <w:b w:val="0"/>
+          <w:sz w:val="22"/>
+        </w:rPr>
+        <w:t>This is a work of fiction. Names, characters, places and events are the products of the author's imagination or are used fictitiously.</w:t>
+      </w:r>
+    </w:p>
+    <w:p>
+      <w:pPr>
+        <w:pStyle w:val="Heading1"/>
+        <w:keepNext/>
+        <w:pageBreakBefore/>
         <w:spacing w:before="320" w:after="200"/>
         <w:jc w:val="center"/>
       </w:pPr>
+      <w:bookmarkStart w:id="903" w:name="toc"/>
       <w:r>
         <w:rPr>
           <w:rFonts w:ascii="Amazon Ember" w:hAnsi="Amazon Ember" w:eastAsia="Amazon Ember"/>
@@ -85,14 +119,419 @@
           <w:color w:val="0C447C"/>
           <w:sz w:val="36"/>
         </w:rPr>
-        <w:t>PROLOGUE</w:t>
-      </w:r>
-    </w:p>
-    <w:p>
-      <w:pPr>
+        <w:t>Table of Contents</w:t>
+      </w:r>
+      <w:bookmarkEnd w:id="903"/>
+    </w:p>
+    <w:p>
+      <w:pPr>
+        <w:spacing w:after="40" w:line="240" w:lineRule="auto"/>
+      </w:pPr>
+      <w:hyperlink w:anchor="prologue">
+        <w:r>
+          <w:rPr>
+            <w:rFonts w:ascii="Georgia" w:hAnsi="Georgia"/>
+            <w:sz w:val="22"/>
+            <w:color w:val="0563C1"/>
+            <w:u w:val="single"/>
+          </w:rPr>
+          <w:t xml:space="preserve">PROLOGUE - In Which a File Arrives Before Its Author</w:t>
+        </w:r>
+      </w:hyperlink>
+    </w:p>
+    <w:p>
+      <w:pPr>
+        <w:spacing w:after="40" w:line="240" w:lineRule="auto"/>
+      </w:pPr>
+      <w:hyperlink w:anchor="chapter_1">
+        <w:r>
+          <w:rPr>
+            <w:rFonts w:ascii="Georgia" w:hAnsi="Georgia"/>
+            <w:sz w:val="22"/>
+            <w:color w:val="0563C1"/>
+            <w:u w:val="single"/>
+          </w:rPr>
+          <w:t xml:space="preserve">Chapter 1 - The Door Is Already Open</w:t>
+        </w:r>
+      </w:hyperlink>
+    </w:p>
+    <w:p>
+      <w:pPr>
+        <w:spacing w:after="40" w:line="240" w:lineRule="auto"/>
+      </w:pPr>
+      <w:hyperlink w:anchor="chapter_2">
+        <w:r>
+          <w:rPr>
+            <w:rFonts w:ascii="Georgia" w:hAnsi="Georgia"/>
+            <w:sz w:val="22"/>
+            <w:color w:val="0563C1"/>
+            <w:u w:val="single"/>
+          </w:rPr>
+          <w:t xml:space="preserve">Chapter 2 - A Clock Set Wrong</w:t>
+        </w:r>
+      </w:hyperlink>
+    </w:p>
+    <w:p>
+      <w:pPr>
+        <w:spacing w:after="40" w:line="240" w:lineRule="auto"/>
+      </w:pPr>
+      <w:hyperlink w:anchor="chapter_3">
+        <w:r>
+          <w:rPr>
+            <w:rFonts w:ascii="Georgia" w:hAnsi="Georgia"/>
+            <w:sz w:val="22"/>
+            <w:color w:val="0563C1"/>
+            <w:u w:val="single"/>
+          </w:rPr>
+          <w:t xml:space="preserve">Chapter 3 - A Sender Requires a Birthday</w:t>
+        </w:r>
+      </w:hyperlink>
+    </w:p>
+    <w:p>
+      <w:pPr>
+        <w:spacing w:after="40" w:line="240" w:lineRule="auto"/>
+      </w:pPr>
+      <w:hyperlink w:anchor="chapter_4">
+        <w:r>
+          <w:rPr>
+            <w:rFonts w:ascii="Georgia" w:hAnsi="Georgia"/>
+            <w:sz w:val="22"/>
+            <w:color w:val="0563C1"/>
+            <w:u w:val="single"/>
+          </w:rPr>
+          <w:t xml:space="preserve">Chapter 4 - The Other One</w:t>
+        </w:r>
+      </w:hyperlink>
+    </w:p>
+    <w:p>
+      <w:pPr>
+        <w:spacing w:after="40" w:line="240" w:lineRule="auto"/>
+      </w:pPr>
+      <w:hyperlink w:anchor="chapter_5">
+        <w:r>
+          <w:rPr>
+            <w:rFonts w:ascii="Georgia" w:hAnsi="Georgia"/>
+            <w:sz w:val="22"/>
+            <w:color w:val="0563C1"/>
+            <w:u w:val="single"/>
+          </w:rPr>
+          <w:t xml:space="preserve">Chapter 5 - The Late Sheet</w:t>
+        </w:r>
+      </w:hyperlink>
+    </w:p>
+    <w:p>
+      <w:pPr>
+        <w:spacing w:after="40" w:line="240" w:lineRule="auto"/>
+      </w:pPr>
+      <w:hyperlink w:anchor="chapter_6">
+        <w:r>
+          <w:rPr>
+            <w:rFonts w:ascii="Georgia" w:hAnsi="Georgia"/>
+            <w:sz w:val="22"/>
+            <w:color w:val="0563C1"/>
+            <w:u w:val="single"/>
+          </w:rPr>
+          <w:t xml:space="preserve">Chapter 6 - Two Times, No Third Person</w:t>
+        </w:r>
+      </w:hyperlink>
+    </w:p>
+    <w:p>
+      <w:pPr>
+        <w:spacing w:after="40" w:line="240" w:lineRule="auto"/>
+      </w:pPr>
+      <w:hyperlink w:anchor="chapter_7">
+        <w:r>
+          <w:rPr>
+            <w:rFonts w:ascii="Georgia" w:hAnsi="Georgia"/>
+            <w:sz w:val="22"/>
+            <w:color w:val="0563C1"/>
+            <w:u w:val="single"/>
+          </w:rPr>
+          <w:t xml:space="preserve">Chapter 7 - A Letter From Afterwards</w:t>
+        </w:r>
+      </w:hyperlink>
+    </w:p>
+    <w:p>
+      <w:pPr>
+        <w:spacing w:after="40" w:line="240" w:lineRule="auto"/>
+      </w:pPr>
+      <w:hyperlink w:anchor="chapter_8">
+        <w:r>
+          <w:rPr>
+            <w:rFonts w:ascii="Georgia" w:hAnsi="Georgia"/>
+            <w:sz w:val="22"/>
+            <w:color w:val="0563C1"/>
+            <w:u w:val="single"/>
+          </w:rPr>
+          <w:t xml:space="preserve">Chapter 8 - Double Maths</w:t>
+        </w:r>
+      </w:hyperlink>
+    </w:p>
+    <w:p>
+      <w:pPr>
+        <w:spacing w:after="40" w:line="240" w:lineRule="auto"/>
+      </w:pPr>
+      <w:hyperlink w:anchor="chapter_9">
+        <w:r>
+          <w:rPr>
+            <w:rFonts w:ascii="Georgia" w:hAnsi="Georgia"/>
+            <w:sz w:val="22"/>
+            <w:color w:val="0563C1"/>
+            <w:u w:val="single"/>
+          </w:rPr>
+          <w:t xml:space="preserve">Chapter 9 - What She Didn't Write</w:t>
+        </w:r>
+      </w:hyperlink>
+    </w:p>
+    <w:p>
+      <w:pPr>
+        <w:spacing w:after="40" w:line="240" w:lineRule="auto"/>
+      </w:pPr>
+      <w:hyperlink w:anchor="chapter_10">
+        <w:r>
+          <w:rPr>
+            <w:rFonts w:ascii="Georgia" w:hAnsi="Georgia"/>
+            <w:sz w:val="22"/>
+            <w:color w:val="0563C1"/>
+            <w:u w:val="single"/>
+          </w:rPr>
+          <w:t xml:space="preserve">Chapter 10 - The Sign on the Gap</w:t>
+        </w:r>
+      </w:hyperlink>
+    </w:p>
+    <w:p>
+      <w:pPr>
+        <w:spacing w:after="40" w:line="240" w:lineRule="auto"/>
+      </w:pPr>
+      <w:hyperlink w:anchor="chapter_11">
+        <w:r>
+          <w:rPr>
+            <w:rFonts w:ascii="Georgia" w:hAnsi="Georgia"/>
+            <w:sz w:val="22"/>
+            <w:color w:val="0563C1"/>
+            <w:u w:val="single"/>
+          </w:rPr>
+          <w:t xml:space="preserve">Chapter 11 - A Train That Leaves After You Board It</w:t>
+        </w:r>
+      </w:hyperlink>
+    </w:p>
+    <w:p>
+      <w:pPr>
+        <w:spacing w:after="40" w:line="240" w:lineRule="auto"/>
+      </w:pPr>
+      <w:hyperlink w:anchor="chapter_12">
+        <w:r>
+          <w:rPr>
+            <w:rFonts w:ascii="Georgia" w:hAnsi="Georgia"/>
+            <w:sz w:val="22"/>
+            <w:color w:val="0563C1"/>
+            <w:u w:val="single"/>
+          </w:rPr>
+          <w:t xml:space="preserve">Chapter 12 - The Author Is the Refusal</w:t>
+        </w:r>
+      </w:hyperlink>
+    </w:p>
+    <w:p>
+      <w:pPr>
+        <w:spacing w:after="40" w:line="240" w:lineRule="auto"/>
+      </w:pPr>
+      <w:hyperlink w:anchor="chapter_13">
+        <w:r>
+          <w:rPr>
+            <w:rFonts w:ascii="Georgia" w:hAnsi="Georgia"/>
+            <w:sz w:val="22"/>
+            <w:color w:val="0563C1"/>
+            <w:u w:val="single"/>
+          </w:rPr>
+          <w:t xml:space="preserve">Chapter 13 - Sunday at Six</w:t>
+        </w:r>
+      </w:hyperlink>
+    </w:p>
+    <w:p>
+      <w:pPr>
+        <w:spacing w:after="40" w:line="240" w:lineRule="auto"/>
+      </w:pPr>
+      <w:hyperlink w:anchor="chapter_14">
+        <w:r>
+          <w:rPr>
+            <w:rFonts w:ascii="Georgia" w:hAnsi="Georgia"/>
+            <w:sz w:val="22"/>
+            <w:color w:val="0563C1"/>
+            <w:u w:val="single"/>
+          </w:rPr>
+          <w:t xml:space="preserve">Chapter 14 - What Time It Counts From</w:t>
+        </w:r>
+      </w:hyperlink>
+    </w:p>
+    <w:p>
+      <w:pPr>
+        <w:spacing w:after="40" w:line="240" w:lineRule="auto"/>
+      </w:pPr>
+      <w:hyperlink w:anchor="chapter_15">
+        <w:r>
+          <w:rPr>
+            <w:rFonts w:ascii="Georgia" w:hAnsi="Georgia"/>
+            <w:sz w:val="22"/>
+            <w:color w:val="0563C1"/>
+            <w:u w:val="single"/>
+          </w:rPr>
+          <w:t xml:space="preserve">Chapter 15 - Penny's Number</w:t>
+        </w:r>
+      </w:hyperlink>
+    </w:p>
+    <w:p>
+      <w:pPr>
+        <w:spacing w:after="40" w:line="240" w:lineRule="auto"/>
+      </w:pPr>
+      <w:hyperlink w:anchor="chapter_16">
+        <w:r>
+          <w:rPr>
+            <w:rFonts w:ascii="Georgia" w:hAnsi="Georgia"/>
+            <w:sz w:val="22"/>
+            <w:color w:val="0563C1"/>
+            <w:u w:val="single"/>
+          </w:rPr>
+          <w:t xml:space="preserve">Chapter 16 - The Night Shift</w:t>
+        </w:r>
+      </w:hyperlink>
+    </w:p>
+    <w:p>
+      <w:pPr>
+        <w:spacing w:after="40" w:line="240" w:lineRule="auto"/>
+      </w:pPr>
+      <w:hyperlink w:anchor="chapter_17">
+        <w:r>
+          <w:rPr>
+            <w:rFonts w:ascii="Georgia" w:hAnsi="Georgia"/>
+            <w:sz w:val="22"/>
+            <w:color w:val="0563C1"/>
+            <w:u w:val="single"/>
+          </w:rPr>
+          <w:t xml:space="preserve">Chapter 17 - Herbert Steps</w:t>
+        </w:r>
+      </w:hyperlink>
+    </w:p>
+    <w:p>
+      <w:pPr>
+        <w:spacing w:after="40" w:line="240" w:lineRule="auto"/>
+      </w:pPr>
+      <w:hyperlink w:anchor="chapter_18">
+        <w:r>
+          <w:rPr>
+            <w:rFonts w:ascii="Georgia" w:hAnsi="Georgia"/>
+            <w:sz w:val="22"/>
+            <w:color w:val="0563C1"/>
+            <w:u w:val="single"/>
+          </w:rPr>
+          <w:t xml:space="preserve">Chapter 18 - Twenty Clocks</w:t>
+        </w:r>
+      </w:hyperlink>
+    </w:p>
+    <w:p>
+      <w:pPr>
+        <w:spacing w:after="40" w:line="240" w:lineRule="auto"/>
+      </w:pPr>
+      <w:hyperlink w:anchor="chapter_19">
+        <w:r>
+          <w:rPr>
+            <w:rFonts w:ascii="Georgia" w:hAnsi="Georgia"/>
+            <w:sz w:val="22"/>
+            <w:color w:val="0563C1"/>
+            <w:u w:val="single"/>
+          </w:rPr>
+          <w:t xml:space="preserve">Chapter 19 - The Landlord Prefers a Metaphor</w:t>
+        </w:r>
+      </w:hyperlink>
+    </w:p>
+    <w:p>
+      <w:pPr>
+        <w:spacing w:after="40" w:line="240" w:lineRule="auto"/>
+      </w:pPr>
+      <w:hyperlink w:anchor="chapter_20">
+        <w:r>
+          <w:rPr>
+            <w:rFonts w:ascii="Georgia" w:hAnsi="Georgia"/>
+            <w:sz w:val="22"/>
+            <w:color w:val="0563C1"/>
+            <w:u w:val="single"/>
+          </w:rPr>
+          <w:t xml:space="preserve">Chapter 20 - Ten O'Clock Cover</w:t>
+        </w:r>
+      </w:hyperlink>
+    </w:p>
+    <w:p>
+      <w:pPr>
+        <w:spacing w:after="40" w:line="240" w:lineRule="auto"/>
+      </w:pPr>
+      <w:hyperlink w:anchor="epilogue">
+        <w:r>
+          <w:rPr>
+            <w:rFonts w:ascii="Georgia" w:hAnsi="Georgia"/>
+            <w:sz w:val="22"/>
+            <w:color w:val="0563C1"/>
+            <w:u w:val="single"/>
+          </w:rPr>
+          <w:t xml:space="preserve">EPILOGUE - Wednesday, Like a Person</w:t>
+        </w:r>
+      </w:hyperlink>
+    </w:p>
+    <w:p>
+      <w:pPr>
+        <w:spacing w:after="40" w:line="240" w:lineRule="auto"/>
+      </w:pPr>
+      <w:hyperlink w:anchor="course">
+        <w:r>
+          <w:rPr>
+            <w:rFonts w:ascii="Georgia" w:hAnsi="Georgia"/>
+            <w:sz w:val="22"/>
+            <w:color w:val="0563C1"/>
+            <w:u w:val="single"/>
+          </w:rPr>
+          <w:t xml:space="preserve">COURSE (lessons, glossary, further reading, bibliography)</w:t>
+        </w:r>
+      </w:hyperlink>
+    </w:p>
+    <w:p>
+      <w:pPr>
+        <w:spacing w:after="40" w:line="240" w:lineRule="auto"/>
+      </w:pPr>
+      <w:hyperlink w:anchor="about">
+        <w:r>
+          <w:rPr>
+            <w:rFonts w:ascii="Georgia" w:hAnsi="Georgia"/>
+            <w:sz w:val="22"/>
+            <w:color w:val="0563C1"/>
+            <w:u w:val="single"/>
+          </w:rPr>
+          <w:t xml:space="preserve">About the Author</w:t>
+        </w:r>
+      </w:hyperlink>
+    </w:p>
+    <w:p>
+      <w:pPr>
+        <w:spacing w:after="40" w:line="240" w:lineRule="auto"/>
+      </w:pPr>
+      <w:hyperlink w:anchor="also_by">
+        <w:r>
+          <w:rPr>
+            <w:rFonts w:ascii="Georgia" w:hAnsi="Georgia"/>
+            <w:sz w:val="22"/>
+            <w:color w:val="0563C1"/>
+            <w:u w:val="single"/>
+          </w:rPr>
+          <w:t xml:space="preserve">Also by Lothar J. Musiol</w:t>
+        </w:r>
+      </w:hyperlink>
+    </w:p>
+    <w:p>
+      <w:pPr>
+        <w:pStyle w:val="Heading1"/>
+        <w:keepNext/>
+        <w:pageBreakBefore/>
         <w:spacing w:before="320" w:after="200"/>
         <w:jc w:val="center"/>
       </w:pPr>
+      <w:bookmarkStart w:id="901" w:name="prologue"/>
       <w:r>
         <w:rPr>
           <w:rFonts w:ascii="Amazon Ember" w:hAnsi="Amazon Ember" w:eastAsia="Amazon Ember"/>
@@ -100,6 +539,22 @@
           <w:color w:val="0C447C"/>
           <w:sz w:val="36"/>
         </w:rPr>
+        <w:t>PROLOGUE</w:t>
+      </w:r>
+      <w:bookmarkEnd w:id="901"/>
+    </w:p>
+    <w:p>
+      <w:pPr>
+        <w:spacing w:before="320" w:after="200"/>
+        <w:jc w:val="center"/>
+      </w:pPr>
+      <w:r>
+        <w:rPr>
+          <w:rFonts w:ascii="Amazon Ember" w:hAnsi="Amazon Ember" w:eastAsia="Amazon Ember"/>
+          <w:b/>
+          <w:color w:val="0C447C"/>
+          <w:sz w:val="36"/>
+        </w:rPr>
         <w:t>In Which a File Arrives Before Its Author</w:t>
       </w:r>
     </w:p>
@@ -132,6 +587,9 @@
     <w:p>
       <w:bookmarkStart w:id="1" w:name="chapter_1"/>
       <w:pPr>
+        <w:pStyle w:val="Heading1"/>
+        <w:keepNext/>
+        <w:pageBreakBefore/>
         <w:spacing w:before="320" w:after="200"/>
         <w:jc w:val="center"/>
       </w:pPr>
@@ -1935,6 +2393,9 @@
     <w:p>
       <w:bookmarkStart w:id="2" w:name="chapter_2"/>
       <w:pPr>
+        <w:pStyle w:val="Heading1"/>
+        <w:keepNext/>
+        <w:pageBreakBefore/>
         <w:spacing w:before="320" w:after="200"/>
         <w:jc w:val="center"/>
       </w:pPr>
@@ -2455,7 +2916,7 @@
           <w:b w:val="0"/>
           <w:sz w:val="22"/>
         </w:rPr>
-        <w:t>At ten to eleven the knocks did not come. Derek noticed himself waiting for them, the way you wait for the second shoe, and noticed Penny noticing, and made himself sit down.</w:t>
+        <w:t>At ten to eleven the knocks did not come. Derek noticed himself waiting for them, and noticed Penny noticing, and made himself sit down.</w:t>
       </w:r>
     </w:p>
     <w:p>
@@ -3049,6 +3510,9 @@
     <w:p>
       <w:bookmarkStart w:id="3" w:name="chapter_3"/>
       <w:pPr>
+        <w:pStyle w:val="Heading1"/>
+        <w:keepNext/>
+        <w:pageBreakBefore/>
         <w:spacing w:before="320" w:after="200"/>
         <w:jc w:val="center"/>
       </w:pPr>
@@ -4488,6 +4952,9 @@
     <w:p>
       <w:bookmarkStart w:id="4" w:name="chapter_4"/>
       <w:pPr>
+        <w:pStyle w:val="Heading1"/>
+        <w:keepNext/>
+        <w:pageBreakBefore/>
         <w:spacing w:before="320" w:after="200"/>
         <w:jc w:val="center"/>
       </w:pPr>
@@ -5355,6 +5822,9 @@
     <w:p>
       <w:bookmarkStart w:id="5" w:name="chapter_5"/>
       <w:pPr>
+        <w:pStyle w:val="Heading1"/>
+        <w:keepNext/>
+        <w:pageBreakBefore/>
         <w:spacing w:before="320" w:after="200"/>
         <w:jc w:val="center"/>
       </w:pPr>
@@ -6443,6 +6913,9 @@
     <w:p>
       <w:bookmarkStart w:id="6" w:name="chapter_6"/>
       <w:pPr>
+        <w:pStyle w:val="Heading1"/>
+        <w:keepNext/>
+        <w:pageBreakBefore/>
         <w:spacing w:before="320" w:after="200"/>
         <w:jc w:val="center"/>
       </w:pPr>
@@ -7206,6 +7679,9 @@
     <w:p>
       <w:bookmarkStart w:id="7" w:name="chapter_7"/>
       <w:pPr>
+        <w:pStyle w:val="Heading1"/>
+        <w:keepNext/>
+        <w:pageBreakBefore/>
         <w:spacing w:before="320" w:after="200"/>
         <w:jc w:val="center"/>
       </w:pPr>
@@ -7323,7 +7799,7 @@
           <w:b w:val="0"/>
           <w:sz w:val="22"/>
         </w:rPr>
-        <w:t>Trevor went. He carried the tea in both hands, the way he carried most things that might spill, and he came out through the doors onto Praed Street, where the rain had decided on the fine, persistent kind that does not fall so much as attend.</w:t>
+        <w:t>Trevor went. He carried the tea in both hands and came out through the doors onto Praed Street, where the rain had decided on the fine, persistent kind that does not fall so much as attend.</w:t>
       </w:r>
     </w:p>
     <w:p>
@@ -8268,6 +8744,9 @@
     <w:p>
       <w:bookmarkStart w:id="8" w:name="chapter_8"/>
       <w:pPr>
+        <w:pStyle w:val="Heading1"/>
+        <w:keepNext/>
+        <w:pageBreakBefore/>
         <w:spacing w:before="320" w:after="200"/>
         <w:jc w:val="center"/>
       </w:pPr>
@@ -8966,6 +9445,9 @@
     <w:p>
       <w:bookmarkStart w:id="9" w:name="chapter_9"/>
       <w:pPr>
+        <w:pStyle w:val="Heading1"/>
+        <w:keepNext/>
+        <w:pageBreakBefore/>
         <w:spacing w:before="320" w:after="200"/>
         <w:jc w:val="center"/>
       </w:pPr>
@@ -9772,7 +10254,7 @@
           <w:b w:val="0"/>
           <w:sz w:val="22"/>
         </w:rPr>
-        <w:t>"At home. Not writing it down."</w:t>
+        <w:t>"Out of school. Not writing it down."</w:t>
       </w:r>
     </w:p>
     <w:p>
@@ -9928,7 +10410,7 @@
           <w:b w:val="0"/>
           <w:sz w:val="22"/>
         </w:rPr>
-        <w:t>"I know. I was here. I'd have seen you go." Her hair was pulled back the way Sophie's was, with the same impatience, and he had noticed that before, at lunch, and had decided not to mention it, and decided again now. "Nearly four. He's got a ticket. Go and watch him use it."</w:t>
+        <w:t>"I know. I was here. I'd have seen you go." Her hair was pulled back the way Sophie's was, with the same impatience, and he had noticed that before, at lunch, and had decided not to mention it, and decided again now. "Four o'clock is coming. He's got a ticket. Go and watch him use it."</w:t>
       </w:r>
     </w:p>
     <w:p>
@@ -9963,6 +10445,9 @@
     <w:p>
       <w:bookmarkStart w:id="10" w:name="chapter_10"/>
       <w:pPr>
+        <w:pStyle w:val="Heading1"/>
+        <w:keepNext/>
+        <w:pageBreakBefore/>
         <w:spacing w:before="320" w:after="200"/>
         <w:jc w:val="center"/>
       </w:pPr>
@@ -11337,6 +11822,9 @@
     <w:p>
       <w:bookmarkStart w:id="11" w:name="chapter_11"/>
       <w:pPr>
+        <w:pStyle w:val="Heading1"/>
+        <w:keepNext/>
+        <w:pageBreakBefore/>
         <w:spacing w:before="320" w:after="200"/>
         <w:jc w:val="center"/>
       </w:pPr>
@@ -12854,6 +13342,9 @@
     <w:p>
       <w:bookmarkStart w:id="12" w:name="chapter_12"/>
       <w:pPr>
+        <w:pStyle w:val="Heading1"/>
+        <w:keepNext/>
+        <w:pageBreakBefore/>
         <w:spacing w:before="320" w:after="200"/>
         <w:jc w:val="center"/>
       </w:pPr>
@@ -14072,6 +14563,9 @@
     <w:p>
       <w:bookmarkStart w:id="13" w:name="chapter_13"/>
       <w:pPr>
+        <w:pStyle w:val="Heading1"/>
+        <w:keepNext/>
+        <w:pageBreakBefore/>
         <w:spacing w:before="320" w:after="200"/>
         <w:jc w:val="center"/>
       </w:pPr>
@@ -14774,7 +15268,7 @@
           <w:b w:val="0"/>
           <w:sz w:val="22"/>
         </w:rPr>
-        <w:t>Mrs Marsh stood very still in the doorway with the marbled book open on her clipboard. Derek watched her take the sentence and turn it over and check the back of it for anything written there, the way Tuppence had at lunch, the way Mrs Marsh checked every form that had ever crossed her desk.</w:t>
+        <w:t>Mrs Marsh stood very still in the doorway with the marbled book open on her clipboard. Derek watched her take the sentence and turn it over and check the back of it for anything written there, the way Tuppence had at lunch, and the way she checked every form that had ever crossed her desk.</w:t>
       </w:r>
     </w:p>
     <w:p>
@@ -15186,6 +15680,9 @@
     <w:p>
       <w:bookmarkStart w:id="14" w:name="chapter_14"/>
       <w:pPr>
+        <w:pStyle w:val="Heading1"/>
+        <w:keepNext/>
+        <w:pageBreakBefore/>
         <w:spacing w:before="320" w:after="200"/>
         <w:jc w:val="center"/>
       </w:pPr>
@@ -16356,7 +16853,7 @@
           <w:b w:val="0"/>
           <w:sz w:val="22"/>
         </w:rPr>
-        <w:t>"It's finished," he said, mildly surprised, the way he always was.</w:t>
+        <w:t>"It's finished," he said, mildly surprised.</w:t>
       </w:r>
     </w:p>
     <w:p>
@@ -16417,6 +16914,9 @@
     <w:p>
       <w:bookmarkStart w:id="15" w:name="chapter_15"/>
       <w:pPr>
+        <w:pStyle w:val="Heading1"/>
+        <w:keepNext/>
+        <w:pageBreakBefore/>
         <w:spacing w:before="320" w:after="200"/>
         <w:jc w:val="center"/>
       </w:pPr>
@@ -17739,6 +18239,9 @@
     <w:p>
       <w:bookmarkStart w:id="16" w:name="chapter_16"/>
       <w:pPr>
+        <w:pStyle w:val="Heading1"/>
+        <w:keepNext/>
+        <w:pageBreakBefore/>
         <w:spacing w:before="320" w:after="200"/>
         <w:jc w:val="center"/>
       </w:pPr>
@@ -18346,6 +18849,9 @@
     <w:p>
       <w:bookmarkStart w:id="17" w:name="chapter_17"/>
       <w:pPr>
+        <w:pStyle w:val="Heading1"/>
+        <w:keepNext/>
+        <w:pageBreakBefore/>
         <w:spacing w:before="320" w:after="200"/>
         <w:jc w:val="center"/>
       </w:pPr>
@@ -19018,6 +19524,9 @@
     <w:p>
       <w:bookmarkStart w:id="18" w:name="chapter_18"/>
       <w:pPr>
+        <w:pStyle w:val="Heading1"/>
+        <w:keepNext/>
+        <w:pageBreakBefore/>
         <w:spacing w:before="320" w:after="200"/>
         <w:jc w:val="center"/>
       </w:pPr>
@@ -20500,7 +21009,7 @@
           <w:b w:val="0"/>
           <w:sz w:val="22"/>
         </w:rPr>
-        <w:t>He sent it. It was four o'clock in London. He did not check.</w:t>
+        <w:t>He sent it. It was a little after four in London. He did not check.</w:t>
       </w:r>
     </w:p>
     <w:p>
@@ -20535,6 +21044,9 @@
     <w:p>
       <w:bookmarkStart w:id="19" w:name="chapter_19"/>
       <w:pPr>
+        <w:pStyle w:val="Heading1"/>
+        <w:keepNext/>
+        <w:pageBreakBefore/>
         <w:spacing w:before="320" w:after="200"/>
         <w:jc w:val="center"/>
       </w:pPr>
@@ -21016,7 +21528,7 @@
           <w:b w:val="0"/>
           <w:sz w:val="22"/>
         </w:rPr>
-        <w:t>"It times it. It sends light out and waits for it to come back. That's all a distance is, to it. A time. Eight hundred and ninety-six millimetres there and back is about six nanoseconds. It's not measuring where the frame is. It's measuring when the light gets home." He was going a little pink, the way he did. "So you did measure it. You measured the light that came back off the sill. If you pointed it one inch further, it'd come back off the platform, and it'd come back late by exactly the right amount, because the platform's there. It doesn't care about the lease."</w:t>
+        <w:t>"It times it. It sends light out and waits for it to come back. That's all a distance is, to it. A time. Eight hundred and ninety-six millimetres there and back is about six nanoseconds. It's not measuring where the frame is. It's measuring when the light gets home." He was going a little pink. "So you did measure it. You measured the light that came back off the sill. If you pointed it one inch further, it'd come back off the platform, and it'd come back late by exactly the right amount, because the platform's there. It doesn't care about the lease."</w:t>
       </w:r>
     </w:p>
     <w:p>
@@ -21276,7 +21788,7 @@
           <w:b w:val="0"/>
           <w:sz w:val="22"/>
         </w:rPr>
-        <w:t>At four an email arrived from Munich. It had no subject line, because, Derek assumed, subject lines implied that one thing was about another.</w:t>
+        <w:t>A little after four an email arrived from Munich. It had no subject line, because, Derek assumed, subject lines implied that one thing was about another.</w:t>
       </w:r>
     </w:p>
     <w:p>
@@ -21480,6 +21992,9 @@
     <w:p>
       <w:bookmarkStart w:id="20" w:name="chapter_20"/>
       <w:pPr>
+        <w:pStyle w:val="Heading1"/>
+        <w:keepNext/>
+        <w:pageBreakBefore/>
         <w:spacing w:before="320" w:after="200"/>
         <w:jc w:val="center"/>
       </w:pPr>
@@ -23101,6 +23616,9 @@
     <w:p>
       <w:bookmarkStart w:id="21" w:name="epilogue"/>
       <w:pPr>
+        <w:pStyle w:val="Heading1"/>
+        <w:keepNext/>
+        <w:pageBreakBefore/>
         <w:spacing w:before="320" w:after="200"/>
         <w:jc w:val="center"/>
       </w:pPr>
@@ -24097,9 +24615,13 @@
     </w:p>
     <w:p>
       <w:pPr>
+        <w:pStyle w:val="Heading1"/>
+        <w:keepNext/>
+        <w:pageBreakBefore/>
         <w:spacing w:before="320" w:after="200"/>
         <w:jc w:val="center"/>
       </w:pPr>
+      <w:bookmarkStart w:id="902" w:name="course"/>
       <w:r>
         <w:rPr>
           <w:rFonts w:ascii="Amazon Ember" w:hAnsi="Amazon Ember" w:eastAsia="Amazon Ember"/>
@@ -24109,6 +24631,7 @@
         </w:rPr>
         <w:t>COURSE</w:t>
       </w:r>
+      <w:bookmarkEnd w:id="902"/>
     </w:p>
     <w:p>
       <w:pPr>
@@ -24193,6 +24716,9 @@
     <w:p>
       <w:bookmarkStart w:id="22" w:name="lesson_1"/>
       <w:pPr>
+        <w:pStyle w:val="Heading1"/>
+        <w:keepNext/>
+        <w:pageBreakBefore/>
         <w:spacing w:before="320" w:after="200"/>
         <w:jc w:val="center"/>
       </w:pPr>
@@ -24303,6 +24829,9 @@
     <w:p>
       <w:bookmarkStart w:id="23" w:name="lesson_2"/>
       <w:pPr>
+        <w:pStyle w:val="Heading1"/>
+        <w:keepNext/>
+        <w:pageBreakBefore/>
         <w:spacing w:before="320" w:after="200"/>
         <w:jc w:val="center"/>
       </w:pPr>
@@ -24400,6 +24929,9 @@
     <w:p>
       <w:bookmarkStart w:id="24" w:name="lesson_3"/>
       <w:pPr>
+        <w:pStyle w:val="Heading1"/>
+        <w:keepNext/>
+        <w:pageBreakBefore/>
         <w:spacing w:before="320" w:after="200"/>
         <w:jc w:val="center"/>
       </w:pPr>
@@ -24497,6 +25029,9 @@
     <w:p>
       <w:bookmarkStart w:id="25" w:name="lesson_4"/>
       <w:pPr>
+        <w:pStyle w:val="Heading1"/>
+        <w:keepNext/>
+        <w:pageBreakBefore/>
         <w:spacing w:before="320" w:after="200"/>
         <w:jc w:val="center"/>
       </w:pPr>
@@ -24594,6 +25129,9 @@
     <w:p>
       <w:bookmarkStart w:id="26" w:name="lesson_5"/>
       <w:pPr>
+        <w:pStyle w:val="Heading1"/>
+        <w:keepNext/>
+        <w:pageBreakBefore/>
         <w:spacing w:before="320" w:after="200"/>
         <w:jc w:val="center"/>
       </w:pPr>
@@ -24691,6 +25229,9 @@
     <w:p>
       <w:bookmarkStart w:id="27" w:name="lesson_6"/>
       <w:pPr>
+        <w:pStyle w:val="Heading1"/>
+        <w:keepNext/>
+        <w:pageBreakBefore/>
         <w:spacing w:before="320" w:after="200"/>
         <w:jc w:val="center"/>
       </w:pPr>
@@ -24878,6 +25419,9 @@
     </w:p>
     <w:p>
       <w:pPr>
+        <w:pStyle w:val="Heading1"/>
+        <w:keepNext/>
+        <w:pageBreakBefore/>
         <w:spacing w:before="320" w:after="200"/>
         <w:jc w:val="center"/>
       </w:pPr>
@@ -25073,6 +25617,9 @@
     </w:p>
     <w:p>
       <w:pPr>
+        <w:pStyle w:val="Heading1"/>
+        <w:keepNext/>
+        <w:pageBreakBefore/>
         <w:spacing w:before="320" w:after="200"/>
         <w:jc w:val="center"/>
       </w:pPr>
@@ -25162,6 +25709,9 @@
     </w:p>
     <w:p>
       <w:pPr>
+        <w:pStyle w:val="Heading1"/>
+        <w:keepNext/>
+        <w:pageBreakBefore/>
         <w:spacing w:before="320" w:after="200"/>
         <w:jc w:val="center"/>
       </w:pPr>
@@ -25281,6 +25831,9 @@
     </w:p>
     <w:p>
       <w:pPr>
+        <w:pStyle w:val="Heading1"/>
+        <w:keepNext/>
+        <w:pageBreakBefore/>
         <w:spacing w:before="320" w:after="200"/>
         <w:jc w:val="center"/>
       </w:pPr>
@@ -25305,6 +25858,202 @@
           <w:sz w:val="22"/>
         </w:rPr>
         <w:t>The voice was late. The sheet was earlier than the door. The refusal was on time. Anyone who wrote to say the seventeen minutes must be a portal is thanked, and referred to Lesson 3.</w:t>
+      </w:r>
+    </w:p>
+    <w:p>
+      <w:pPr>
+        <w:pStyle w:val="Heading1"/>
+        <w:keepNext/>
+        <w:pageBreakBefore/>
+        <w:spacing w:before="320" w:after="200"/>
+        <w:jc w:val="center"/>
+      </w:pPr>
+      <w:bookmarkStart w:id="904" w:name="about"/>
+      <w:r>
+        <w:rPr>
+          <w:rFonts w:ascii="Amazon Ember" w:hAnsi="Amazon Ember" w:eastAsia="Amazon Ember"/>
+          <w:b/>
+          <w:color w:val="0C447C"/>
+          <w:sz w:val="36"/>
+        </w:rPr>
+        <w:t>About the Author</w:t>
+      </w:r>
+      <w:bookmarkEnd w:id="904"/>
+    </w:p>
+    <w:p>
+      <w:pPr>
+        <w:spacing w:after="160" w:line="240" w:lineRule="auto"/>
+      </w:pPr>
+      <w:r>
+        <w:rPr>
+          <w:rFonts w:ascii="Georgia" w:hAnsi="Georgia" w:eastAsia="Georgia"/>
+          <w:b w:val="0"/>
+          <w:sz w:val="22"/>
+        </w:rPr>
+        <w:t>The alleged author Spezala Genara Relavi (S.G.R.) has never been formally accused of understanding General Relativity, though several of her fictitious colleagues maintain that she does. She divides her time between London, Munich, and a rather small pink filing cabinet labelled</w:t>
+      </w:r>
+    </w:p>
+    <w:p>
+      <w:pPr>
+        <w:spacing w:after="160" w:line="240" w:lineRule="auto"/>
+      </w:pPr>
+      <w:r>
+        <w:rPr>
+          <w:rFonts w:ascii="Georgia" w:hAnsi="Georgia" w:eastAsia="Georgia"/>
+          <w:b w:val="0"/>
+          <w:sz w:val="22"/>
+        </w:rPr>
+        <w:t>[ PRE-TRANSFORMATION / DO NOT OBSERVE ]</w:t>
+      </w:r>
+    </w:p>
+    <w:p>
+      <w:pPr>
+        <w:spacing w:after="160" w:line="240" w:lineRule="auto"/>
+      </w:pPr>
+      <w:r>
+        <w:rPr>
+          <w:rFonts w:ascii="Georgia" w:hAnsi="Georgia" w:eastAsia="Georgia"/>
+          <w:b w:val="0"/>
+          <w:sz w:val="22"/>
+        </w:rPr>
+        <w:t>Spezala Genara Relavi is the author of The Relativistic Investigation Bureau series, allegedly. This is Exhibit Two.</w:t>
+      </w:r>
+    </w:p>
+    <w:p>
+      <w:pPr>
+        <w:spacing w:after="160" w:line="240" w:lineRule="auto"/>
+      </w:pPr>
+      <w:r>
+        <w:rPr>
+          <w:rFonts w:ascii="Georgia" w:hAnsi="Georgia" w:eastAsia="Georgia"/>
+          <w:b w:val="0"/>
+          <w:sz w:val="22"/>
+        </w:rPr>
+        <w:t>Ms Relavi has not yet been murdered, although she understands this might be subject to change without further notice.</w:t>
+      </w:r>
+    </w:p>
+    <w:p>
+      <w:pPr>
+        <w:spacing w:after="160" w:line="240" w:lineRule="auto"/>
+      </w:pPr>
+      <w:r>
+        <w:rPr>
+          <w:rFonts w:ascii="Georgia" w:hAnsi="Georgia" w:eastAsia="Georgia"/>
+          <w:b w:val="0"/>
+          <w:sz w:val="22"/>
+        </w:rPr>
+        <w:t>The real author, Lothar J. Musiol, exists in a more conventional sense and is responsible for the nonfiction behind the weird work of fiction. He is German by birth, American by choice, and writes in British because he regards it as the most awkward American dialect.</w:t>
+      </w:r>
+    </w:p>
+    <w:p>
+      <w:pPr>
+        <w:pStyle w:val="Heading1"/>
+        <w:keepNext/>
+        <w:pageBreakBefore/>
+        <w:spacing w:before="320" w:after="200"/>
+        <w:jc w:val="center"/>
+      </w:pPr>
+      <w:bookmarkStart w:id="905" w:name="also_by"/>
+      <w:r>
+        <w:rPr>
+          <w:rFonts w:ascii="Amazon Ember" w:hAnsi="Amazon Ember" w:eastAsia="Amazon Ember"/>
+          <w:b/>
+          <w:color w:val="0C447C"/>
+          <w:sz w:val="36"/>
+        </w:rPr>
+        <w:t>Also by Lothar J. Musiol</w:t>
+      </w:r>
+      <w:bookmarkEnd w:id="905"/>
+    </w:p>
+    <w:p>
+      <w:pPr>
+        <w:spacing w:after="160" w:line="240" w:lineRule="auto"/>
+      </w:pPr>
+      <w:r>
+        <w:rPr>
+          <w:rFonts w:ascii="Georgia" w:hAnsi="Georgia" w:eastAsia="Georgia"/>
+          <w:b/>
+          <w:sz w:val="22"/>
+        </w:rPr>
+        <w:t>The Relativistic Investigation Bureau</w:t>
+      </w:r>
+    </w:p>
+    <w:p>
+      <w:pPr>
+        <w:spacing w:after="160" w:line="240" w:lineRule="auto"/>
+      </w:pPr>
+      <w:r>
+        <w:rPr>
+          <w:rFonts w:ascii="Georgia" w:hAnsi="Georgia" w:eastAsia="Georgia"/>
+          <w:b w:val="0"/>
+          <w:sz w:val="22"/>
+        </w:rPr>
+        <w:t>Book One: The Murder That Hadn't Happened Yet</w:t>
+      </w:r>
+    </w:p>
+    <w:p>
+      <w:pPr>
+        <w:spacing w:after="160" w:line="240" w:lineRule="auto"/>
+      </w:pPr>
+      <w:r>
+        <w:rPr>
+          <w:rFonts w:ascii="Georgia" w:hAnsi="Georgia" w:eastAsia="Georgia"/>
+          <w:b/>
+          <w:sz w:val="22"/>
+        </w:rPr>
+        <w:t>Physics, Actually (nonfiction)</w:t>
+      </w:r>
+    </w:p>
+    <w:p>
+      <w:pPr>
+        <w:spacing w:after="160" w:line="240" w:lineRule="auto"/>
+      </w:pPr>
+      <w:r>
+        <w:rPr>
+          <w:rFonts w:ascii="Georgia" w:hAnsi="Georgia" w:eastAsia="Georgia"/>
+          <w:b w:val="0"/>
+          <w:sz w:val="22"/>
+        </w:rPr>
+        <w:t>Volume 1 — Motion, Forces, Time, and Relativity</w:t>
+      </w:r>
+    </w:p>
+    <w:p>
+      <w:pPr>
+        <w:spacing w:after="160" w:line="240" w:lineRule="auto"/>
+      </w:pPr>
+      <w:r>
+        <w:rPr>
+          <w:rFonts w:ascii="Georgia" w:hAnsi="Georgia" w:eastAsia="Georgia"/>
+          <w:b w:val="0"/>
+          <w:sz w:val="22"/>
+        </w:rPr>
+        <w:t>Volume 2 — Gravity, Cosmology, and the Limits of Spacetime</w:t>
+      </w:r>
+    </w:p>
+    <w:p>
+      <w:pPr>
+        <w:spacing w:after="160" w:line="240" w:lineRule="auto"/>
+      </w:pPr>
+      <w:r>
+        <w:rPr>
+          <w:rFonts w:ascii="Georgia" w:hAnsi="Georgia" w:eastAsia="Georgia"/>
+          <w:b w:val="0"/>
+          <w:sz w:val="22"/>
+        </w:rPr>
+        <w:t>Volume 3 — The Standard Model, Chaos, and the Edge of Knowledge</w:t>
+      </w:r>
+    </w:p>
+    <w:p>
+      <w:pPr>
+        <w:spacing w:after="160" w:line="240" w:lineRule="auto"/>
+      </w:pPr>
+      <w:r>
+        <w:rPr>
+          <w:rFonts w:ascii="Georgia" w:hAnsi="Georgia" w:eastAsia="Georgia"/>
+          <w:b w:val="0"/>
+          <w:sz w:val="22"/>
+        </w:rPr>
+        <w:t>Companion book — The Quantum World</w:t>
       </w:r>
     </w:p>
     <w:sectPr>

</xml_diff>

<commit_message>
RIB2: line-edit pass - Derek's decisive refusal moved to ch12 (16:41), recaps cut in ch10/12/17/18, PL/9 comic set piece in ch19, RIB1 continuity, cut science moved to course; manuscript_text synced
</commit_message>
<xml_diff>
--- a/The Relativistic Investigation Bureau - SERIES/Book 2 - The Warning That Was Sent Too Late/The_Warning_That_Was_Sent_Too_Late_BOOK_2_DRAFT.docx
+++ b/The Relativistic Investigation Bureau - SERIES/Book 2 - The Warning That Was Sent Too Late/The_Warning_That_Was_Sent_Too_Late_BOOK_2_DRAFT.docx
@@ -713,6 +713,19 @@
           <w:b w:val="0"/>
           <w:sz w:val="22"/>
         </w:rPr>
+        <w:t xml:space="preserve">Sophie's brass railway clock had gone into drawer three with the file at a quarter to ten. Trevor had wanted it on the filing cabinet, where it kept better time than anything else the Bureau owned. Mrs Marsh had said that it was evidence until a file said otherwise, and that she did not take a file's word for anything until it was filed.</w:t>
+      </w:r>
+    </w:p>
+    <w:p>
+      <w:pPr>
+        <w:spacing w:after="160" w:line="240" w:lineRule="auto"/>
+      </w:pPr>
+      <w:r>
+        <w:rPr>
+          <w:rFonts w:ascii="Georgia" w:hAnsi="Georgia" w:eastAsia="Georgia"/>
+          <w:b w:val="0"/>
+          <w:sz w:val="22"/>
+        </w:rPr>
         <w:t>At the outer door, Mrs Marsh, the building's superintendent, received drawer three's key back from Penny as if it were a hostage being returned in good condition. She did not come in. She never came in. She stood on the corridor side of the sill with her clipboard and said, "It will be filed by eleven," and went downstairs, and the stairs reported her going.</w:t>
       </w:r>
     </w:p>
@@ -943,7 +956,7 @@
           <w:b w:val="0"/>
           <w:sz w:val="22"/>
         </w:rPr>
-        <w:t>The corridor clock read 10:05. Trevor read it out by leaning through the outer room until most of him was in the corridor and his glasses were in serious danger. Nobody had looked at anything with numbers on it while the door was opening. They had been looking at Weinstein, and Weinstein had been looking at the sheet, and the sheet had been looking, in its flat official way, at Derek.</w:t>
+        <w:t xml:space="preserve">The corridor clock read 10:05. Trevor read it out by leaning through the outer room until most of him was in the corridor and his glasses were in serious danger. Nobody had looked at anything with numbers on it while the door was opening. They had been looking at Weinstein, and Weinstein had been looking at the sheet, and the sheet had been looking, in its flat official way, at Derek. The one good clock in the building, Sophie's, was in drawer three under a closed file, and the drawer was locked, and the key was downstairs.</w:t>
       </w:r>
     </w:p>
     <w:p>
@@ -1164,7 +1177,7 @@
           <w:b w:val="0"/>
           <w:sz w:val="22"/>
         </w:rPr>
-        <w:t>He was visiting. Same jacket, as on every day of the year, on the grounds that changing it introduced a variable. He had no door on this corridor, and he had taken no wound from the lack of one. He was perched on the corner of Derek's desk with the expression of a man who has come to London for a polite few days and been handed, at no extra charge, the most interesting morning of his decade.</w:t>
+        <w:t xml:space="preserve">He was visiting. Same jacket, as on every day of the year, on the grounds that changing it introduced a variable. He had no door on this corridor and did not seem to miss one. He was perched on the corner of Derek's desk with the expression of a man who has come to London for a polite few days and been handed, at no extra charge, the most interesting morning of his decade.</w:t>
       </w:r>
     </w:p>
     <w:p>
@@ -1216,7 +1229,7 @@
           <w:b w:val="0"/>
           <w:sz w:val="22"/>
         </w:rPr>
-        <w:t>"Tuesday," Penny countered.</w:t>
+        <w:t xml:space="preserve">"Tuesday," said Penny.</w:t>
       </w:r>
     </w:p>
     <w:p>
@@ -1320,7 +1333,7 @@
           <w:b w:val="0"/>
           <w:sz w:val="22"/>
         </w:rPr>
-        <w:t>"Roughly," Derek conceded.</w:t>
+        <w:t xml:space="preserve">"Roughly," said Derek.</w:t>
       </w:r>
     </w:p>
     <w:p>
@@ -1372,7 +1385,7 @@
           <w:b w:val="0"/>
           <w:sz w:val="22"/>
         </w:rPr>
-        <w:t>"The instruction names you," Penny pointed out. "It does not name me."</w:t>
+        <w:t xml:space="preserve">"The instruction names you," said Penny. "It does not name me."</w:t>
       </w:r>
     </w:p>
     <w:p>
@@ -1775,7 +1788,7 @@
           <w:b w:val="0"/>
           <w:sz w:val="22"/>
         </w:rPr>
-        <w:t>"LOCALHOST sent the photograph. This did not. Different paper, different hand, different lie. I do not want anybody in this room solving last week again because it was comfortable."</w:t>
+        <w:t xml:space="preserve">"Last week's photograph came off our own camera, through our own machine, from a phone nobody has named. Device three is still open, and it can stay open. This did not come from there. Different paper, different route, different lie. I do not want anybody in this room solving last week again because it was comfortable."</w:t>
       </w:r>
     </w:p>
     <w:p>
@@ -1905,7 +1918,7 @@
           <w:b w:val="0"/>
           <w:sz w:val="22"/>
         </w:rPr>
-        <w:t>"Don't," Penny warned.</w:t>
+        <w:t xml:space="preserve">"Don't," said Penny.</w:t>
       </w:r>
     </w:p>
     <w:p>
@@ -2283,6 +2296,19 @@
           <w:sz w:val="22"/>
         </w:rPr>
         <w:t>Trevor, who had been kneeling, managed to sit down without letting go of the tape, which was a feat of engineering in itself.</w:t>
+      </w:r>
+    </w:p>
+    <w:p>
+      <w:pPr>
+        <w:spacing w:after="160" w:line="240" w:lineRule="auto"/>
+      </w:pPr>
+      <w:r>
+        <w:rPr>
+          <w:rFonts w:ascii="Georgia" w:hAnsi="Georgia" w:eastAsia="Georgia"/>
+          <w:b w:val="0"/>
+          <w:sz w:val="22"/>
+        </w:rPr>
+        <w:t xml:space="preserve">For the last week of Case 1047, on the evenings Tabitha had come by with the dog and the leftovers, Derek had taken to shutting his office door. Nobody had asked why. Trevor had noticed, because Trevor had a sister, and had said nothing, for the same reason.</w:t>
       </w:r>
     </w:p>
     <w:p>
@@ -2970,20 +2996,7 @@
           <w:b w:val="0"/>
           <w:sz w:val="22"/>
         </w:rPr>
-        <w:t>"Last week the clocks disagreed." Weinstein held up one finger. "That is not the same as lying. A clock that disagrees with you is reporting a fact about its path. A clock that is merely set wrong is reporting a fact about whoever set it."</w:t>
-      </w:r>
-    </w:p>
-    <w:p>
-      <w:pPr>
-        <w:spacing w:after="160" w:line="240" w:lineRule="auto"/>
-      </w:pPr>
-      <w:r>
-        <w:rPr>
-          <w:rFonts w:ascii="Georgia" w:hAnsi="Georgia" w:eastAsia="Georgia"/>
-          <w:b w:val="0"/>
-          <w:sz w:val="22"/>
-        </w:rPr>
-        <w:t>"There are two ways for that clock to be different from ours. It can run at a different rate, which would tell us something about the platform, how fast it moves, how deep it sits in gravity. Or it can run at the same rate and simply say something different, which would tell us only that somebody turned the little knob at the back." Weinstein bent, very slightly, towards the doorway, and then thought better of it and straightened. "The first is physics. The second is housekeeping. I should like to know which one we have."</w:t>
+        <w:t xml:space="preserve">"Last week the clocks disagreed." Weinstein held up one finger. "That is not the same as lying. A clock that disagrees with you is reporting a fact about its path. A clock that is merely set wrong is reporting a fact about whoever set it. There are two ways for that clock to be different from ours. It can run at a different rate, which would tell us something about the platform, how fast it moves, how deep it sits in gravity. Or it can run at the same rate and simply say something different, which would tell us only that somebody turned the little knob at the back." He bent, very slightly, towards the doorway, and then thought better of it and straightened. "The first is physics. The second is housekeeping. I should like to know which one we have."</w:t>
       </w:r>
     </w:p>
     <w:p>
@@ -3165,7 +3178,7 @@
           <w:b w:val="0"/>
           <w:sz w:val="22"/>
         </w:rPr>
-        <w:t>Twenty minutes is not long, as a rule. It is the length of a bus journey, or a bath, or a conversation with a bank. It is very long when you are four adults in an office with a railway in the door, and you have agreed not to talk to the railway and not to look at it and not to step towards it, and the only entertainment available is a phone propped against a glass ornament that cannot hold tea.</w:t>
+        <w:t xml:space="preserve">Twenty minutes is the length of a bus journey, or a bath, or a conversation with a bank. It is very long when you are four adults in an office with a railway in the door, and the only entertainment available is a phone propped against a glass ornament that cannot hold tea.</w:t>
       </w:r>
     </w:p>
     <w:p>
@@ -3581,7 +3594,7 @@
           <w:b w:val="0"/>
           <w:sz w:val="22"/>
         </w:rPr>
-        <w:t>"A clock set wrong is not a clock running slow," Weinstein agreed. "You cannot fix a wrong label by doing relativity at it. You can only fix it by finding out who wrote the label."</w:t>
+        <w:t xml:space="preserve">"A clock set wrong is not a clock running slow," Weinstein said. "You cannot fix a wrong label by doing relativity at it. You can only fix it by finding out who wrote the label."</w:t>
       </w:r>
     </w:p>
     <w:p>
@@ -4204,7 +4217,7 @@
           <w:b w:val="0"/>
           <w:sz w:val="22"/>
         </w:rPr>
-        <w:t>"Again," Derek instructed.</w:t>
+        <w:t xml:space="preserve">"Again," said Derek.</w:t>
       </w:r>
     </w:p>
     <w:p>
@@ -4282,7 +4295,7 @@
           <w:b w:val="0"/>
           <w:sz w:val="22"/>
         </w:rPr>
-        <w:t>"Because he boarded," Penny supplied, "and it was bad."</w:t>
+        <w:t xml:space="preserve">"Because he boarded," Penny said, "and it was bad."</w:t>
       </w:r>
     </w:p>
     <w:p>
@@ -4308,7 +4321,7 @@
           <w:b w:val="0"/>
           <w:sz w:val="22"/>
         </w:rPr>
-        <w:t>"Because he got the warning," Trevor ventured, slowly. "From himself. And then he sent it back. To himself."</w:t>
+        <w:t xml:space="preserve">"Because he got the warning," Trevor said slowly. "From himself. And then he sent it back. To himself."</w:t>
       </w:r>
     </w:p>
     <w:p>
@@ -4503,7 +4516,7 @@
           <w:b w:val="0"/>
           <w:sz w:val="22"/>
         </w:rPr>
-        <w:t>"Last case," Derek admitted.</w:t>
+        <w:t xml:space="preserve">"Last case," said Derek.</w:t>
       </w:r>
     </w:p>
     <w:p>
@@ -4945,6 +4958,19 @@
           <w:b w:val="0"/>
           <w:sz w:val="22"/>
         </w:rPr>
+        <w:t xml:space="preserve">He thought about Kenneth Greaves, who sat in cars, and about the last time he had paid a man to sit in one outside her school. It had been the wrong decision made for the right reason. He did not ring him.</w:t>
+      </w:r>
+    </w:p>
+    <w:p>
+      <w:pPr>
+        <w:spacing w:after="160" w:line="240" w:lineRule="auto"/>
+      </w:pPr>
+      <w:r>
+        <w:rPr>
+          <w:rFonts w:ascii="Georgia" w:hAnsi="Georgia" w:eastAsia="Georgia"/>
+          <w:b w:val="0"/>
+          <w:sz w:val="22"/>
+        </w:rPr>
         <w:t>His phone buzzed in his hand. Sophie. He read the message twice, which was once more than Sophie would have approved of.</w:t>
       </w:r>
     </w:p>
@@ -5153,7 +5179,7 @@
           <w:b w:val="0"/>
           <w:sz w:val="22"/>
         </w:rPr>
-        <w:t>"That's the first useful sentence since ten," Penny judged.</w:t>
+        <w:t xml:space="preserve">"That's the first useful sentence since ten," said Penny.</w:t>
       </w:r>
     </w:p>
     <w:p>
@@ -5672,7 +5698,7 @@
           <w:b w:val="0"/>
           <w:sz w:val="22"/>
         </w:rPr>
-        <w:t>"Of course it is." She did not ask why. She turned instead and looked, for the first time, at Tabitha, who was standing by the kettle with her coat still on and her hands round a mug, exactly as unhurried as she had been at the moment the door opened downstairs.</w:t>
+        <w:t xml:space="preserve">"Of course it is." She did not ask why. She turned instead and looked, for the first time, at Tabitha, who was standing by the kettle with her coat still on and her hands round a mug, as unhurried as she had been at the moment the door opened downstairs.</w:t>
       </w:r>
     </w:p>
     <w:p>
@@ -5958,7 +5984,7 @@
           <w:b w:val="0"/>
           <w:sz w:val="22"/>
         </w:rPr>
-        <w:t>He sat down. He found that his hands wanted something to straighten, and that there was nothing within reach that was not already straight, and that he did not, for once, need it to be.</w:t>
+        <w:t xml:space="preserve">He sat down. He found that his hands wanted something to straighten, and that there was nothing within reach that needed it, and that he did not, for once, need it to be.</w:t>
       </w:r>
     </w:p>
     <w:p>
@@ -6010,33 +6036,33 @@
           <w:b w:val="0"/>
           <w:sz w:val="22"/>
         </w:rPr>
-        <w:t>"So I gather. It is a rare skill. Most people's warnings are records. Hers are instructions." He reached for his jacket, which was on the chair he had refused, and did not put it on. "You told her the order. Sheet, door, board, refusal. That is the first time today anybody has said the case out loud in the right sequence to someone who was not already in the room."</w:t>
-      </w:r>
-    </w:p>
-    <w:p>
-      <w:pPr>
-        <w:spacing w:after="40" w:line="240" w:lineRule="auto"/>
-      </w:pPr>
-      <w:r>
-        <w:rPr>
-          <w:rFonts w:ascii="Georgia" w:hAnsi="Georgia" w:eastAsia="Georgia"/>
-          <w:b w:val="0"/>
-          <w:sz w:val="22"/>
-        </w:rPr>
-        <w:t>"She didn't want the order. She wanted to know if Sophie was safe."</w:t>
-      </w:r>
-    </w:p>
-    <w:p>
-      <w:pPr>
-        <w:spacing w:after="160" w:line="240" w:lineRule="auto"/>
-      </w:pPr>
-      <w:r>
-        <w:rPr>
-          <w:rFonts w:ascii="Georgia" w:hAnsi="Georgia" w:eastAsia="Georgia"/>
-          <w:b w:val="0"/>
-          <w:sz w:val="22"/>
-        </w:rPr>
-        <w:t>"The order is how you answered. She heard it." Weinstein looked at the doorway, at the board, at the word. "People think a warning is a sentence. It is not. It is a sentence and a time. The same sentence early is advice. Late, it is an apology. Sophie's mother has always known this. It is why she rings the school before you do."</w:t>
+        <w:t xml:space="preserve">"So I gather. It is a rare skill. Most people's warnings are records. Hers are instructions." He reached for his jacket, which was on the chair he had refused, and did not put it on. "And you told her before it was over. I did not know you could."</w:t>
+      </w:r>
+    </w:p>
+    <w:p>
+      <w:pPr>
+        <w:spacing w:after="40" w:line="240" w:lineRule="auto"/>
+      </w:pPr>
+      <w:r>
+        <w:rPr>
+          <w:rFonts w:ascii="Georgia" w:hAnsi="Georgia" w:eastAsia="Georgia"/>
+          <w:b w:val="0"/>
+          <w:sz w:val="22"/>
+        </w:rPr>
+        <w:t xml:space="preserve">"She didn't want the case. She wanted to know if Sophie was safe."</w:t>
+      </w:r>
+    </w:p>
+    <w:p>
+      <w:pPr>
+        <w:spacing w:after="160" w:line="240" w:lineRule="auto"/>
+      </w:pPr>
+      <w:r>
+        <w:rPr>
+          <w:rFonts w:ascii="Georgia" w:hAnsi="Georgia" w:eastAsia="Georgia"/>
+          <w:b w:val="0"/>
+          <w:sz w:val="22"/>
+        </w:rPr>
+        <w:t xml:space="preserve">"The case is how you answered. She heard it." Weinstein looked at the doorway, at the board, at the word. "People think a warning is a sentence. It is not. It is a sentence and a time. The same sentence early is advice. Late, it is an apology. Sophie's mother has always known this. It is why she rings the school before you do."</w:t>
       </w:r>
     </w:p>
     <w:p>
@@ -6152,7 +6178,7 @@
           <w:b w:val="0"/>
           <w:sz w:val="22"/>
         </w:rPr>
-        <w:t>"Paddington," Weinstein proposed. "I have to buy a ticket in any case."</w:t>
+        <w:t xml:space="preserve">"Paddington," said Weinstein. "I have to buy a ticket in any case."</w:t>
       </w:r>
     </w:p>
     <w:p>
@@ -6438,7 +6464,7 @@
           <w:b w:val="0"/>
           <w:sz w:val="22"/>
         </w:rPr>
-        <w:t>"Lost property," Derek suggested.</w:t>
+        <w:t xml:space="preserve">"Lost property," said Derek.</w:t>
       </w:r>
     </w:p>
     <w:p>
@@ -6802,46 +6828,7 @@
           <w:b w:val="0"/>
           <w:sz w:val="22"/>
         </w:rPr>
-        <w:t>"The sign on Sunday is late," Weinstein said. "That is clean. Today the voice is late for the opening, and we do not know by how much, because nobody wrote the opening down. We were all looking at the paper. The sheet was already in the pocket before the door. Finishing the reading at 10:22 does not move it. A cause after an act cannot be the cause of the act. Munich cannot vote the order backwards."</w:t>
-      </w:r>
-    </w:p>
-    <w:p>
-      <w:pPr>
-        <w:spacing w:after="40" w:line="240" w:lineRule="auto"/>
-      </w:pPr>
-      <w:r>
-        <w:rPr>
-          <w:rFonts w:ascii="Georgia" w:hAnsi="Georgia" w:eastAsia="Georgia"/>
-          <w:b w:val="0"/>
-          <w:sz w:val="22"/>
-        </w:rPr>
-        <w:t>"Nobody's asked Munich to vote."</w:t>
-      </w:r>
-    </w:p>
-    <w:p>
-      <w:pPr>
-        <w:spacing w:after="40" w:line="240" w:lineRule="auto"/>
-      </w:pPr>
-      <w:r>
-        <w:rPr>
-          <w:rFonts w:ascii="Georgia" w:hAnsi="Georgia" w:eastAsia="Georgia"/>
-          <w:b w:val="0"/>
-          <w:sz w:val="22"/>
-        </w:rPr>
-        <w:t>"Trevor has asked Munich to vote. With his eyebrows."</w:t>
-      </w:r>
-    </w:p>
-    <w:p>
-      <w:pPr>
-        <w:spacing w:after="160" w:line="240" w:lineRule="auto"/>
-      </w:pPr>
-      <w:r>
-        <w:rPr>
-          <w:rFonts w:ascii="Georgia" w:hAnsi="Georgia" w:eastAsia="Georgia"/>
-          <w:b w:val="0"/>
-          <w:sz w:val="22"/>
-        </w:rPr>
-        <w:t>"And we are not making a signature out of being slow," Penny said. "Herbert can sort Sunday. He cannot give us a clock for a voice we only know came after."</w:t>
+        <w:t xml:space="preserve">"The sign on Sunday is late," Weinstein said. "That is clean. Today's voice is late too, by an amount nobody wrote down. That is less clean, and it will have to do."</w:t>
       </w:r>
     </w:p>
     <w:p>
@@ -6867,20 +6854,20 @@
           <w:b w:val="0"/>
           <w:sz w:val="22"/>
         </w:rPr>
-        <w:t>"If you only had the numerals, you'd think they were the same thing. If you had the events, you'd never confuse them. One is a gap between an act and its warning. One is a gap between us noticing and us finishing. The second one isn't about the sender at all. It's about us. It's how long it takes four people to read a sheet of paper."</w:t>
-      </w:r>
-    </w:p>
-    <w:p>
-      <w:pPr>
-        <w:spacing w:after="40" w:line="240" w:lineRule="auto"/>
-      </w:pPr>
-      <w:r>
-        <w:rPr>
-          <w:rFonts w:ascii="Georgia" w:hAnsi="Georgia" w:eastAsia="Georgia"/>
-          <w:b w:val="0"/>
-          <w:sz w:val="22"/>
-        </w:rPr>
-        <w:t>"Four people and a frightened one," Penny amended.</w:t>
+        <w:t xml:space="preserve">"So the second one isn't about the sender at all," he said. "It's about us. It's how long it takes four people to read a sheet of paper."</w:t>
+      </w:r>
+    </w:p>
+    <w:p>
+      <w:pPr>
+        <w:spacing w:after="40" w:line="240" w:lineRule="auto"/>
+      </w:pPr>
+      <w:r>
+        <w:rPr>
+          <w:rFonts w:ascii="Georgia" w:hAnsi="Georgia" w:eastAsia="Georgia"/>
+          <w:b w:val="0"/>
+          <w:sz w:val="22"/>
+        </w:rPr>
+        <w:t xml:space="preserve">"Four people and a frightened one," said Penny.</w:t>
       </w:r>
     </w:p>
     <w:p>
@@ -6945,7 +6932,7 @@
           <w:b w:val="0"/>
           <w:sz w:val="22"/>
         </w:rPr>
-        <w:t>"It's a train station," Penny murmured, at his elbow. "It's only allowed to be a train station."</w:t>
+        <w:t xml:space="preserve">"It's a train station," Penny said, at his elbow. "It's only allowed to be a train station."</w:t>
       </w:r>
     </w:p>
     <w:p>
@@ -7282,20 +7269,7 @@
           <w:b w:val="0"/>
           <w:sz w:val="22"/>
         </w:rPr>
-        <w:t>Derek told him. He had rehearsed it on the walk, without meaning to, the way a man rehearses a phone call to a bank, and it came out in the order the morning had taught him.</w:t>
-      </w:r>
-    </w:p>
-    <w:p>
-      <w:pPr>
-        <w:spacing w:after="160" w:line="240" w:lineRule="auto"/>
-      </w:pPr>
-      <w:r>
-        <w:rPr>
-          <w:rFonts w:ascii="Georgia" w:hAnsi="Georgia" w:eastAsia="Georgia"/>
-          <w:b w:val="0"/>
-          <w:sz w:val="22"/>
-        </w:rPr>
-        <w:t>"Sunday. An opening at eighteen hundred. A notice at eighteen seventeen. That notice is late. Today the sheet was already in the pocket, then the door opened, then the voice said don't. We noticed the open door at ten oh five. We finished reading at ten twenty-two. That interval is us. The voice is late for the opening. I cannot tell you the size. The sheet is not."</w:t>
+        <w:t xml:space="preserve">Derek told him. He had rehearsed it on the walk without meaning to, the way a man rehearses a phone call to a bank, and it came out in the order the morning had taught him: Sunday's slip, the sheet, the door, the voice, and two seventeens that were not the same.</w:t>
       </w:r>
     </w:p>
     <w:p>
@@ -7321,7 +7295,7 @@
           <w:b w:val="0"/>
           <w:sz w:val="22"/>
         </w:rPr>
-        <w:t>"That is a coordinate. The voice is after the door. The sheet is not the late one. You have stopped enjoying the wrong order."</w:t>
+        <w:t xml:space="preserve">"That is a coordinate. You have stopped enjoying the wrong order."</w:t>
       </w:r>
     </w:p>
     <w:p>
@@ -7750,7 +7724,7 @@
           <w:b w:val="0"/>
           <w:sz w:val="22"/>
         </w:rPr>
-        <w:t>Trevor looked at it for a long moment.</w:t>
+        <w:t xml:space="preserve">Trevor looked at it.</w:t>
       </w:r>
     </w:p>
     <w:p>
@@ -7815,7 +7789,7 @@
           <w:b w:val="0"/>
           <w:sz w:val="22"/>
         </w:rPr>
-        <w:t>Nobody argued. There had been a week, not long ago, when the dolphin had seen the shape of the whole thing before the rest of them had seen its corners, and the memory of that week sat over the bench like weather. It was tempting, very tempting, to wait for him. Derek found that he did not want to. A witness who declines is a witness who has decided this one belongs to the people in the room.</w:t>
+        <w:t xml:space="preserve">Nobody argued. There had been a week, not long ago, when the dolphin had seen the shape of the whole thing before the rest of them had seen its corners. It was tempting to wait for him. Derek found that he did not want to. A witness who declines is a witness who has decided this one belongs to the people in the room.</w:t>
       </w:r>
     </w:p>
     <w:p>
@@ -8893,7 +8867,7 @@
           <w:b w:val="0"/>
           <w:sz w:val="22"/>
         </w:rPr>
-        <w:t>He put his glasses on. They were wet. He went back inside through the doors with the empty cup still in his hand, and found Derek exactly where he had left him, standing a little apart from the others, watching the board as if it might put a child on it.</w:t>
+        <w:t xml:space="preserve">He put his glasses on. They were wet. He went back inside through the doors with the empty cup still in his hand, and found Derek exactly where he had left him, standing a little apart from the others, watching the board.</w:t>
       </w:r>
     </w:p>
     <w:p>
@@ -8932,20 +8906,20 @@
           <w:b w:val="0"/>
           <w:sz w:val="22"/>
         </w:rPr>
-        <w:t>"Not date of birth. The form's been asking the wrong question. A letter doesn't need its sender to be alive when it's read. It needs them to have done the writing before it arrived. Somebody did something before five past ten. That's the field."</w:t>
-      </w:r>
-    </w:p>
-    <w:p>
-      <w:pPr>
-        <w:spacing w:after="160" w:line="240" w:lineRule="auto"/>
-      </w:pPr>
-      <w:r>
-        <w:rPr>
-          <w:rFonts w:ascii="Georgia" w:hAnsi="Georgia" w:eastAsia="Georgia"/>
-          <w:b w:val="0"/>
-          <w:sz w:val="22"/>
-        </w:rPr>
-        <w:t>Derek looked at him for a long moment. Weinstein, at the pillar, lowered his newspaper.</w:t>
+        <w:t xml:space="preserve">"Time of act. Not date of birth. A letter doesn't need its sender alive when it's read. It needs the writing done before it arrives. Somebody did something before five past ten. That's the field."</w:t>
+      </w:r>
+    </w:p>
+    <w:p>
+      <w:pPr>
+        <w:spacing w:after="160" w:line="240" w:lineRule="auto"/>
+      </w:pPr>
+      <w:r>
+        <w:rPr>
+          <w:rFonts w:ascii="Georgia" w:hAnsi="Georgia" w:eastAsia="Georgia"/>
+          <w:b w:val="0"/>
+          <w:sz w:val="22"/>
+        </w:rPr>
+        <w:t xml:space="preserve">Derek looked at him. Weinstein, at the pillar, lowered his newspaper.</w:t>
       </w:r>
     </w:p>
     <w:p>
@@ -8971,7 +8945,7 @@
           <w:b w:val="0"/>
           <w:sz w:val="22"/>
         </w:rPr>
-        <w:t>"Herbert said it," Trevor agreed. "My grandmother proved it." He sat down on the metal chairs with the empty cup in his lap and the slip on his knee, and would not explain any further, and nobody asked him to.</w:t>
+        <w:t xml:space="preserve">"Herbert said it," said Trevor. "My grandmother proved it." He sat down on the metal chairs with the empty cup in his lap and the slip on his knee, and would not explain any further, and nobody asked him to.</w:t>
       </w:r>
     </w:p>
     <w:p>
@@ -9269,7 +9243,7 @@
           <w:b w:val="0"/>
           <w:sz w:val="22"/>
         </w:rPr>
-        <w:t>Mr Okafor was doing negative numbers with the Year Sevens, which was beneath Sophie, and she let him know it by sitting very upright and answering everything a quarter of a second before anyone else could put their hand up. He had drawn a number line on the board, long and white, with a zero in the middle and the numbers going off in both directions.</w:t>
+        <w:t xml:space="preserve">Mr Okafor was doing negative numbers, which Sophie had done in Year Six, and she let him know it by sitting very upright and answering everything a quarter of a second before anyone else could put their hand up. He had drawn a number line on the board, long and white, with a zero in the middle and the numbers going off in both directions.</w:t>
       </w:r>
     </w:p>
     <w:p>
@@ -9399,7 +9373,7 @@
           <w:b w:val="0"/>
           <w:sz w:val="22"/>
         </w:rPr>
-        <w:t>It was Mrs Adeyemi from the office. She did not come in. She looked through the glass, found Sophie at the second desk from the window, looked at her for exactly as long as it took to confirm that she was a girl sitting at a desk, and went away.</w:t>
+        <w:t xml:space="preserve">It was Mrs Halloran from the office. She did not come in. She looked through the glass, found Sophie at the second desk from the window, looked at her for exactly as long as it took to confirm that she was a girl sitting at a desk, and went away.</w:t>
       </w:r>
     </w:p>
     <w:p>
@@ -9425,20 +9399,20 @@
           <w:b w:val="0"/>
           <w:sz w:val="22"/>
         </w:rPr>
-        <w:t>Mr Okafor was asking whether you could subtract a bigger number from a smaller one. Most of the room thought you could not. Sophie, for once, did not answer first. She was thinking about Mrs Adeyemi.</w:t>
-      </w:r>
-    </w:p>
-    <w:p>
-      <w:pPr>
-        <w:spacing w:after="160" w:line="240" w:lineRule="auto"/>
-      </w:pPr>
-      <w:r>
-        <w:rPr>
-          <w:rFonts w:ascii="Georgia" w:hAnsi="Georgia" w:eastAsia="Georgia"/>
-          <w:b w:val="0"/>
-          <w:sz w:val="22"/>
-        </w:rPr>
-        <w:t>Somebody had rung the school. Her mother, almost certainly; the school always rang her mother first, and her mother had probably rung back to check, because that was what her mother did. And then somebody else had rung, and the school had sent Mrs Adeyemi to look, and Mrs Adeyemi had looked, and gone away without fetching her.</w:t>
+        <w:t xml:space="preserve">Mr Okafor was asking whether you could subtract a bigger number from a smaller one. Most of the room thought you could not. Sophie, for once, did not answer first. She was thinking about Mrs Halloran.</w:t>
+      </w:r>
+    </w:p>
+    <w:p>
+      <w:pPr>
+        <w:spacing w:after="160" w:line="240" w:lineRule="auto"/>
+      </w:pPr>
+      <w:r>
+        <w:rPr>
+          <w:rFonts w:ascii="Georgia" w:hAnsi="Georgia" w:eastAsia="Georgia"/>
+          <w:b w:val="0"/>
+          <w:sz w:val="22"/>
+        </w:rPr>
+        <w:t xml:space="preserve">Somebody had rung the school. Her mother, almost certainly; the school always rang her mother first, and her mother had probably rung back to check, because that was what her mother did. And then somebody else had rung, and the school had sent Mrs Halloran to look, and Mrs Halloran had looked, and gone away without fetching her.</w:t>
       </w:r>
     </w:p>
     <w:p>
@@ -9464,7 +9438,7 @@
           <w:b w:val="0"/>
           <w:sz w:val="22"/>
         </w:rPr>
-        <w:t>That meant that someone knew what the heading said, and had decided that she should stay exactly where she was, in double maths, being bored, and not be told.</w:t>
+        <w:t xml:space="preserve">That meant that someone knew what the heading said, and had decided that she should stay where she was, in double maths, being bored, and not be told.</w:t>
       </w:r>
     </w:p>
     <w:p>
@@ -9516,7 +9490,7 @@
           <w:b w:val="0"/>
           <w:sz w:val="22"/>
         </w:rPr>
-        <w:t>At twenty to three Mrs Adeyemi came back.</w:t>
+        <w:t xml:space="preserve">At twenty to three Mrs Halloran came back.</w:t>
       </w:r>
     </w:p>
     <w:p>
@@ -9569,32 +9543,6 @@
           <w:sz w:val="22"/>
         </w:rPr>
         <w:t>She thought: if he's frightened, he wants me not to know. If I go and find out, he'll have been frightened for nothing.</w:t>
-      </w:r>
-    </w:p>
-    <w:p>
-      <w:pPr>
-        <w:spacing w:after="160" w:line="240" w:lineRule="auto"/>
-      </w:pPr>
-      <w:r>
-        <w:rPr>
-          <w:rFonts w:ascii="Georgia" w:hAnsi="Georgia" w:eastAsia="Georgia"/>
-          <w:b w:val="0"/>
-          <w:sz w:val="22"/>
-        </w:rPr>
-        <w:t>She thought: if I open the heading, it's in my notebook because it has my name near it. And then it's evidence it was about me, because it's in my notebook.</w:t>
-      </w:r>
-    </w:p>
-    <w:p>
-      <w:pPr>
-        <w:spacing w:after="160" w:line="240" w:lineRule="auto"/>
-      </w:pPr>
-      <w:r>
-        <w:rPr>
-          <w:rFonts w:ascii="Georgia" w:hAnsi="Georgia" w:eastAsia="Georgia"/>
-          <w:b w:val="0"/>
-          <w:sz w:val="22"/>
-        </w:rPr>
-        <w:t>She thought: that's circular. Mr Okafor says that's how you can tell somebody's selling you something.</w:t>
       </w:r>
     </w:p>
     <w:p>
@@ -10035,33 +9983,20 @@
           <w:b w:val="0"/>
           <w:sz w:val="22"/>
         </w:rPr>
-        <w:t>At a quarter past three, the school let go of its children in the ordinary way, all at once and with no regard for anyone's afternoon. At seventeen minutes past, Derek's phone rang. He noticed the minute and declined to have an opinion about it.</w:t>
-      </w:r>
-    </w:p>
-    <w:p>
-      <w:pPr>
-        <w:spacing w:after="160" w:line="240" w:lineRule="auto"/>
-      </w:pPr>
-      <w:r>
-        <w:rPr>
-          <w:rFonts w:ascii="Georgia" w:hAnsi="Georgia" w:eastAsia="Georgia"/>
-          <w:b w:val="0"/>
-          <w:sz w:val="22"/>
-        </w:rPr>
-        <w:t>It was Sophie. She had not texted first. Waiting to be managed was not a hobby she kept.</w:t>
-      </w:r>
-    </w:p>
-    <w:p>
-      <w:pPr>
-        <w:spacing w:after="160" w:line="240" w:lineRule="auto"/>
-      </w:pPr>
-      <w:r>
-        <w:rPr>
-          <w:rFonts w:ascii="Georgia" w:hAnsi="Georgia" w:eastAsia="Georgia"/>
-          <w:b w:val="0"/>
-          <w:sz w:val="22"/>
-        </w:rPr>
-        <w:t>"I still haven't written it down," she said, without hello, in the voice she used for reading out results. "The heading. I didn't read it, so it isn't data. If you want it in the notebook, say so. If you don't, say that. Don't be weird, and don't send Mum a second time. She already did the gates."</w:t>
+        <w:t xml:space="preserve">At seventeen minutes past three Derek's phone rang. He noticed the minute and declined to have an opinion about it.</w:t>
+      </w:r>
+    </w:p>
+    <w:p>
+      <w:pPr>
+        <w:spacing w:after="160" w:line="240" w:lineRule="auto"/>
+      </w:pPr>
+      <w:r>
+        <w:rPr>
+          <w:rFonts w:ascii="Georgia" w:hAnsi="Georgia" w:eastAsia="Georgia"/>
+          <w:b w:val="0"/>
+          <w:sz w:val="22"/>
+        </w:rPr>
+        <w:t xml:space="preserve">"I still haven't written it down," she said, without hello, in the voice she kept for reading out results. "The heading. I didn't read it, so it isn't data. If you want it in the notebook, say so. If you don't, say that. Don't be weird, and don't send Mum a second time. She already did the gates."</w:t>
       </w:r>
     </w:p>
     <w:p>
@@ -10347,7 +10282,7 @@
           <w:b w:val="0"/>
           <w:sz w:val="22"/>
         </w:rPr>
-        <w:t>"Solve the habit, then. Not the case." Penny ticked it off on her fingers, which she did only when she was angry and wished to appear organised. "An empty person-field. It wants filling. It fills with the nearest name it can find. Last week that was you. This week it's a twelve-year-old who wasn't on the platform, wasn't in the room, didn't touch the sheet and didn't read the heading. She is the nearest name it has for a child-shaped blank, and it is not getting one."</w:t>
+        <w:t xml:space="preserve">"Solve the habit, then. Not the case." Penny ticked it off on her fingers, which she did only when she was angry and wished to appear organised. "An empty person-field wants filling. It takes the nearest name it can find. Last week that was you. This week it's a twelve-year-old who wasn't on the platform, wasn't in the room and didn't read the heading. It is not getting her."</w:t>
       </w:r>
     </w:p>
     <w:p>
@@ -10365,67 +10300,15 @@
     </w:p>
     <w:p>
       <w:pPr>
-        <w:spacing w:after="40" w:line="240" w:lineRule="auto"/>
-      </w:pPr>
-      <w:r>
-        <w:rPr>
-          <w:rFonts w:ascii="Georgia" w:hAnsi="Georgia" w:eastAsia="Georgia"/>
-          <w:b w:val="0"/>
-          <w:sz w:val="22"/>
-        </w:rPr>
-        <w:t>"No."</w:t>
-      </w:r>
-    </w:p>
-    <w:p>
-      <w:pPr>
-        <w:spacing w:after="40" w:line="240" w:lineRule="auto"/>
-      </w:pPr>
-      <w:r>
-        <w:rPr>
-          <w:rFonts w:ascii="Georgia" w:hAnsi="Georgia" w:eastAsia="Georgia"/>
-          <w:b w:val="0"/>
-          <w:sz w:val="22"/>
-        </w:rPr>
-        <w:t>"Why not?"</w:t>
-      </w:r>
-    </w:p>
-    <w:p>
-      <w:pPr>
-        <w:spacing w:after="160" w:line="240" w:lineRule="auto"/>
-      </w:pPr>
-      <w:r>
-        <w:rPr>
-          <w:rFonts w:ascii="Georgia" w:hAnsi="Georgia" w:eastAsia="Georgia"/>
-          <w:b w:val="0"/>
-          <w:sz w:val="22"/>
-        </w:rPr>
-        <w:t>"Because striking her before we know the open act is how you delete a girl to tidy a form." Penny's voice had gone quick and flat, the voice she used when agreement and sarcasm were briefly the same thing. "The open act is still boarding. Sixteen hundred hasn't happened. She has refused the only act anyone could pretend was hers. Those are two different sentences. Keep them in two different lines. If we strike her now, we're striking her because we're frightened, and the next time a board puts a name up we'll strike that one because we're frightened too, and one day it'll be a name that did have an act and we'll have struck it out of habit."</w:t>
-      </w:r>
-    </w:p>
-    <w:p>
-      <w:pPr>
-        <w:spacing w:after="40" w:line="240" w:lineRule="auto"/>
-      </w:pPr>
-      <w:r>
-        <w:rPr>
-          <w:rFonts w:ascii="Georgia" w:hAnsi="Georgia" w:eastAsia="Georgia"/>
-          <w:b w:val="0"/>
-          <w:sz w:val="22"/>
-        </w:rPr>
-        <w:t>"So we wait."</w:t>
-      </w:r>
-    </w:p>
-    <w:p>
-      <w:pPr>
-        <w:spacing w:after="40" w:line="240" w:lineRule="auto"/>
-      </w:pPr>
-      <w:r>
-        <w:rPr>
-          <w:rFonts w:ascii="Georgia" w:hAnsi="Georgia" w:eastAsia="Georgia"/>
-          <w:b w:val="0"/>
-          <w:sz w:val="22"/>
-        </w:rPr>
-        <w:t>"We wait until four. Then we strike her because it's true, not because it's soothing."</w:t>
+        <w:spacing w:after="160" w:line="240" w:lineRule="auto"/>
+      </w:pPr>
+      <w:r>
+        <w:rPr>
+          <w:rFonts w:ascii="Georgia" w:hAnsi="Georgia" w:eastAsia="Georgia"/>
+          <w:b w:val="0"/>
+          <w:sz w:val="22"/>
+        </w:rPr>
+        <w:t xml:space="preserve">"Not till four," Penny said. "The open act is still boarding. If we strike her now, the fear did it, and the next time a board puts a name up we'll strike that one too, and one day it'll be a name that did have an act. At four we strike her because it's true, not because it's soothing."</w:t>
       </w:r>
     </w:p>
     <w:p>
@@ -10464,7 +10347,7 @@
           <w:b w:val="0"/>
           <w:sz w:val="22"/>
         </w:rPr>
-        <w:t>"That a name in a notebook becomes evidence because it is in the notebook. That is how people get themselves into closed curves, Mr Gent, and not only in physics. The file says it is about her; she writes it down; the writing makes it about her; the file was right. Very tidy. Nobody has done anything at all, and yet a girl is guilty of a sentence." He considered this. "She refused to be the pen. That is the best thing anybody has done today, and she did it at a school with a wall to lean on."</w:t>
+        <w:t xml:space="preserve">"That a name in a notebook becomes evidence because it is in the notebook. The file says it is about her; she writes it down; the writing makes it about her; the file was right. That is how people get themselves into closed curves, Mr Gent, and not only in physics. Nobody has done anything at all, and yet a girl is guilty of a sentence." He considered this. "She refused to be the pen. That is the best thing anybody has done today, and she did it with a wall to lean on."</w:t>
       </w:r>
     </w:p>
     <w:p>
@@ -10534,119 +10417,15 @@
     </w:p>
     <w:p>
       <w:pPr>
-        <w:spacing w:after="40" w:line="240" w:lineRule="auto"/>
-      </w:pPr>
-      <w:r>
-        <w:rPr>
-          <w:rFonts w:ascii="Georgia" w:hAnsi="Georgia" w:eastAsia="Georgia"/>
-          <w:b w:val="0"/>
-          <w:sz w:val="22"/>
-        </w:rPr>
-        <w:t>"She said something," Derek told her.</w:t>
-      </w:r>
-    </w:p>
-    <w:p>
-      <w:pPr>
-        <w:spacing w:after="40" w:line="240" w:lineRule="auto"/>
-      </w:pPr>
-      <w:r>
-        <w:rPr>
-          <w:rFonts w:ascii="Georgia" w:hAnsi="Georgia" w:eastAsia="Georgia"/>
-          <w:b w:val="0"/>
-          <w:sz w:val="22"/>
-        </w:rPr>
-        <w:t>"She usually does."</w:t>
-      </w:r>
-    </w:p>
-    <w:p>
-      <w:pPr>
-        <w:spacing w:after="160" w:line="240" w:lineRule="auto"/>
-      </w:pPr>
-      <w:r>
-        <w:rPr>
-          <w:rFonts w:ascii="Georgia" w:hAnsi="Georgia" w:eastAsia="Georgia"/>
-          <w:b w:val="0"/>
-          <w:sz w:val="22"/>
-        </w:rPr>
-        <w:t>"She said if she wrote the heading down because it had her name near it, it would be evidence it was about her because it was in her notebook. She said that was circular."</w:t>
-      </w:r>
-    </w:p>
-    <w:p>
-      <w:pPr>
-        <w:spacing w:after="160" w:line="240" w:lineRule="auto"/>
-      </w:pPr>
-      <w:r>
-        <w:rPr>
-          <w:rFonts w:ascii="Georgia" w:hAnsi="Georgia" w:eastAsia="Georgia"/>
-          <w:b w:val="0"/>
-          <w:sz w:val="22"/>
-        </w:rPr>
-        <w:t>Tabitha considered the traffic on Praed Street, a taxi, a cyclist with a dog in a basket who was not Gucci and would never be forgiven by Gucci for the impersonation.</w:t>
-      </w:r>
-    </w:p>
-    <w:p>
-      <w:pPr>
-        <w:spacing w:after="160" w:line="240" w:lineRule="auto"/>
-      </w:pPr>
-      <w:r>
-        <w:rPr>
-          <w:rFonts w:ascii="Georgia" w:hAnsi="Georgia" w:eastAsia="Georgia"/>
-          <w:b w:val="0"/>
-          <w:sz w:val="22"/>
-        </w:rPr>
-        <w:t>"So the board wanted her to do its homework for it," she said, in exactly the tone she would have used to order a flat white. "Put her name on its own answer, so it could mark itself right."</w:t>
-      </w:r>
-    </w:p>
-    <w:p>
-      <w:pPr>
-        <w:spacing w:after="40" w:line="240" w:lineRule="auto"/>
-      </w:pPr>
-      <w:r>
-        <w:rPr>
-          <w:rFonts w:ascii="Georgia" w:hAnsi="Georgia" w:eastAsia="Georgia"/>
-          <w:b w:val="0"/>
-          <w:sz w:val="22"/>
-        </w:rPr>
-        <w:t>"Weinstein said closed curve."</w:t>
-      </w:r>
-    </w:p>
-    <w:p>
-      <w:pPr>
-        <w:spacing w:after="160" w:line="240" w:lineRule="auto"/>
-      </w:pPr>
-      <w:r>
-        <w:rPr>
-          <w:rFonts w:ascii="Georgia" w:hAnsi="Georgia" w:eastAsia="Georgia"/>
-          <w:b w:val="0"/>
-          <w:sz w:val="22"/>
-        </w:rPr>
-        <w:t>"Weinstein would. It's the same thing with a longer word." She pulled her coat a little tighter, against nothing in particular. "She didn't do it."</w:t>
-      </w:r>
-    </w:p>
-    <w:p>
-      <w:pPr>
-        <w:spacing w:after="40" w:line="240" w:lineRule="auto"/>
-      </w:pPr>
-      <w:r>
-        <w:rPr>
-          <w:rFonts w:ascii="Georgia" w:hAnsi="Georgia" w:eastAsia="Georgia"/>
-          <w:b w:val="0"/>
-          <w:sz w:val="22"/>
-        </w:rPr>
-        <w:t>"No."</w:t>
-      </w:r>
-    </w:p>
-    <w:p>
-      <w:pPr>
-        <w:spacing w:after="160" w:line="240" w:lineRule="auto"/>
-      </w:pPr>
-      <w:r>
-        <w:rPr>
-          <w:rFonts w:ascii="Georgia" w:hAnsi="Georgia" w:eastAsia="Georgia"/>
-          <w:b w:val="0"/>
-          <w:sz w:val="22"/>
-        </w:rPr>
-        <w:t>"Then she's cleverer than the board. That's not news, but it's nice when the board finds out." She looked at him, and for a moment the flat delivery went somewhere less flat. "And you didn't go to the gates."</w:t>
+        <w:spacing w:after="160" w:line="240" w:lineRule="auto"/>
+      </w:pPr>
+      <w:r>
+        <w:rPr>
+          <w:rFonts w:ascii="Georgia" w:hAnsi="Georgia" w:eastAsia="Georgia"/>
+          <w:b w:val="0"/>
+          <w:sz w:val="22"/>
+        </w:rPr>
+        <w:t xml:space="preserve">"Then she's cleverer than the board," Tabitha said. "That's not news, but it's nice when the board finds out." She looked at him, and for a moment the flat delivery went somewhere less flat. "And you didn't go to the gates."</w:t>
       </w:r>
     </w:p>
     <w:p>
@@ -10672,7 +10451,7 @@
           <w:b w:val="0"/>
           <w:sz w:val="22"/>
         </w:rPr>
-        <w:t>"I know. I was here. I'd have seen you go." Her hair was pulled back the way Sophie's was, with the same impatience, and he had noticed that before, at lunch, and had decided not to mention it, and decided again now. "Four o'clock is coming. He's got a ticket. Go and watch him use it."</w:t>
+        <w:t xml:space="preserve">"I know. I was here. I'd have seen you go." She pulled her coat a little tighter, against nothing in particular. "Four o'clock is coming. He's got a ticket. Go and watch him use it."</w:t>
       </w:r>
     </w:p>
     <w:p>
@@ -10996,33 +10775,20 @@
           <w:b w:val="0"/>
           <w:sz w:val="22"/>
         </w:rPr>
-        <w:t>Trevor wrote. He had the best handwriting of the three of them, which was not saying a great deal, and he was the only one who could be trusted not to add an adjective. He knelt at the end of the row of metal chairs and used the seat as a desk. Penny stood over him. Derek stood over Penny. Weinstein stood over everybody, technically, by virtue of being on the far side of the chairs and reading upside down, which was unnecessary and typical.</w:t>
-      </w:r>
-    </w:p>
-    <w:p>
-      <w:pPr>
-        <w:spacing w:after="40" w:line="240" w:lineRule="auto"/>
-      </w:pPr>
-      <w:r>
-        <w:rPr>
-          <w:rFonts w:ascii="Georgia" w:hAnsi="Georgia" w:eastAsia="Georgia"/>
-          <w:b w:val="0"/>
-          <w:sz w:val="22"/>
-        </w:rPr>
-        <w:t>They went through it act by act, because Penny would not let them do it any other way, and Trevor wrote each line in capitals and read it back. The door noticed open at 10:05; opened earlier; time unknown. In the room, before any clock: the sheet, then the door, then the voice. The voice was late for the door, and nothing it said could have kept the door shut. The sheet was earlier than the door, sender unknown. Ten twenty-two was how long they had taken to read, and Trevor gave it its own line, so that it could do no harm there. Sunday's seventeen stayed Sunday's: a notice after an act.</w:t>
-      </w:r>
-    </w:p>
-    <w:p>
-      <w:pPr>
-        <w:spacing w:after="160" w:line="240" w:lineRule="auto"/>
-      </w:pPr>
-      <w:r>
-        <w:rPr>
-          <w:rFonts w:ascii="Georgia" w:hAnsi="Georgia" w:eastAsia="Georgia"/>
-          <w:b w:val="0"/>
-          <w:sz w:val="22"/>
-        </w:rPr>
-        <w:t>Trevor looked at what they had. Five lines, and four of them the same answer in different clothes: whatever this was, it had come too late for anything already done. He felt, Derek could see, the way a man feels when he has checked every door in the house and found them all locked, and only then remembers there is a window.</w:t>
+        <w:t xml:space="preserve">Trevor wrote. He had the best handwriting of the three of them, which was not saying a great deal, and he was the only one who could be trusted not to add an adjective. He knelt at the end of the row of metal chairs and used the seat as a desk, while Weinstein read upside down from the far side, which was unnecessary and typical.</w:t>
+      </w:r>
+    </w:p>
+    <w:p>
+      <w:pPr>
+        <w:spacing w:after="40" w:line="240" w:lineRule="auto"/>
+      </w:pPr>
+      <w:r>
+        <w:rPr>
+          <w:rFonts w:ascii="Georgia" w:hAnsi="Georgia" w:eastAsia="Georgia"/>
+          <w:b w:val="0"/>
+          <w:sz w:val="22"/>
+        </w:rPr>
+        <w:t xml:space="preserve">They went through it act by act, because Penny would not let them do it any other way. It took four lines, and three of them said the same thing in different clothes: whatever had arrived that morning had arrived too late for anything already done.</w:t>
       </w:r>
     </w:p>
     <w:p>
@@ -11048,20 +10814,20 @@
           <w:b w:val="0"/>
           <w:sz w:val="22"/>
         </w:rPr>
-        <w:t>"Boarding," Penny agreed.</w:t>
-      </w:r>
-    </w:p>
-    <w:p>
-      <w:pPr>
-        <w:spacing w:after="160" w:line="240" w:lineRule="auto"/>
-      </w:pPr>
-      <w:r>
-        <w:rPr>
-          <w:rFonts w:ascii="Georgia" w:hAnsi="Georgia" w:eastAsia="Georgia"/>
-          <w:b w:val="0"/>
-          <w:sz w:val="22"/>
-        </w:rPr>
-        <w:t>"The airport train is at sixteen hundred. It's twenty-five past three. That's ahead. The sheet says don't let Derek board the mysterious train. The mysterious train is still in the doorway. Nobody's on it." He paused with the pencil. "So that's the only one we can still do anything about."</w:t>
+        <w:t xml:space="preserve">"Boarding," said Penny.</w:t>
+      </w:r>
+    </w:p>
+    <w:p>
+      <w:pPr>
+        <w:spacing w:after="160" w:line="240" w:lineRule="auto"/>
+      </w:pPr>
+      <w:r>
+        <w:rPr>
+          <w:rFonts w:ascii="Georgia" w:hAnsi="Georgia" w:eastAsia="Georgia"/>
+          <w:b w:val="0"/>
+          <w:sz w:val="22"/>
+        </w:rPr>
+        <w:t xml:space="preserve">"The airport train is at sixteen hundred. It's twenty-five past three. That's ahead. And the other train is still in the doorway, and nobody's on it." He paused with the pencil. "That's the only one we can still do anything about."</w:t>
       </w:r>
     </w:p>
     <w:p>
@@ -11100,7 +10866,7 @@
           <w:b w:val="0"/>
           <w:sz w:val="22"/>
         </w:rPr>
-        <w:t>"Early. The sheet is early for boarding. The boarding is in its future. It can still change it." He looked up at Weinstein. "That's the light cone. You drew it for us last week. A message can only reach the things in front of it. The door wasn't in front of the voice. The train's in front of the sheet."</w:t>
+        <w:t xml:space="preserve">"Early. The sheet is early for boarding. The boarding is in its future." He looked up at Weinstein. "A message can only reach the things in front of it. The door wasn't in front of the voice. The train's in front of the sheet."</w:t>
       </w:r>
     </w:p>
     <w:p>
@@ -11204,85 +10970,7 @@
           <w:b w:val="0"/>
           <w:sz w:val="22"/>
         </w:rPr>
-        <w:t>"And we don't need later me," Derek said.</w:t>
-      </w:r>
-    </w:p>
-    <w:p>
-      <w:pPr>
-        <w:spacing w:after="160" w:line="240" w:lineRule="auto"/>
-      </w:pPr>
-      <w:r>
-        <w:rPr>
-          <w:rFonts w:ascii="Georgia" w:hAnsi="Georgia" w:eastAsia="Georgia"/>
-          <w:b w:val="0"/>
-          <w:sz w:val="22"/>
-        </w:rPr>
-        <w:t>It came out more quietly than he had meant. It had been sitting under everything since lunch, under the form and the board and the name: the thought that somewhere further up Monday there was a man with his voice who had learned something terrible enough to knock on a carriage door about it.</w:t>
-      </w:r>
-    </w:p>
-    <w:p>
-      <w:pPr>
-        <w:spacing w:after="160" w:line="240" w:lineRule="auto"/>
-      </w:pPr>
-      <w:r>
-        <w:rPr>
-          <w:rFonts w:ascii="Georgia" w:hAnsi="Georgia" w:eastAsia="Georgia"/>
-          <w:b w:val="0"/>
-          <w:sz w:val="22"/>
-        </w:rPr>
-        <w:t>"No," Weinstein said. "A birthday is the wrong field for the record we have not written yet. The refusal can author that record, once the train has left and we are not on the other one. It cannot have posted the sheet that was already in your pocket this morning. That sheet came first. Whatever we do at four o'clock, we do it after."</w:t>
-      </w:r>
-    </w:p>
-    <w:p>
-      <w:pPr>
-        <w:spacing w:after="40" w:line="240" w:lineRule="auto"/>
-      </w:pPr>
-      <w:r>
-        <w:rPr>
-          <w:rFonts w:ascii="Georgia" w:hAnsi="Georgia" w:eastAsia="Georgia"/>
-          <w:b w:val="0"/>
-          <w:sz w:val="22"/>
-        </w:rPr>
-        <w:t>"So the refusal doesn't explain the sheet."</w:t>
-      </w:r>
-    </w:p>
-    <w:p>
-      <w:pPr>
-        <w:spacing w:after="160" w:line="240" w:lineRule="auto"/>
-      </w:pPr>
-      <w:r>
-        <w:rPr>
-          <w:rFonts w:ascii="Georgia" w:hAnsi="Georgia" w:eastAsia="Georgia"/>
-          <w:b w:val="0"/>
-          <w:sz w:val="22"/>
-        </w:rPr>
-        <w:t>"The refusal explains the refusal. That is all anything has to do. People keep wanting the end of a story to have written its beginning. It is a very romantic idea and I have never once seen it in a laboratory."</w:t>
-      </w:r>
-    </w:p>
-    <w:p>
-      <w:pPr>
-        <w:spacing w:after="160" w:line="240" w:lineRule="auto"/>
-      </w:pPr>
-      <w:r>
-        <w:rPr>
-          <w:rFonts w:ascii="Georgia" w:hAnsi="Georgia" w:eastAsia="Georgia"/>
-          <w:b w:val="0"/>
-          <w:sz w:val="22"/>
-        </w:rPr>
-        <w:t>Trevor looked at the mystery's absence. The other train was not at Paddington. It was still, as far as they knew, standing in a doorway in the office, waiting.</w:t>
-      </w:r>
-    </w:p>
-    <w:p>
-      <w:pPr>
-        <w:spacing w:after="40" w:line="240" w:lineRule="auto"/>
-      </w:pPr>
-      <w:r>
-        <w:rPr>
-          <w:rFonts w:ascii="Georgia" w:hAnsi="Georgia" w:eastAsia="Georgia"/>
-          <w:b w:val="0"/>
-          <w:sz w:val="22"/>
-        </w:rPr>
-        <w:t>"And if the platform boards someone while we're here?"</w:t>
+        <w:t xml:space="preserve">"And if the platform boards someone while we're here?" Trevor said.</w:t>
       </w:r>
     </w:p>
     <w:p>
@@ -12126,7 +11814,7 @@
           <w:b w:val="0"/>
           <w:sz w:val="22"/>
         </w:rPr>
-        <w:t>Penny had the itinerary half out of her bag, under the photograph, and put it back without looking at it. It was the first time all day Derek had seen her do something with her hands that was not decisive. She stood a little closer to the barrier than she needed to, and a little further from Weinstein than she could have, and Derek, who had been her cousin all his life and had learned at a young age when not to describe her, looked at the timetable instead.</w:t>
+        <w:t xml:space="preserve">Penny had the itinerary half out of her bag, under the photograph, and put it back without looking at it. It was the first time all day Derek had seen her do something with her hands that was not decisive. She stood a little closer to the barrier than she needed to, and a little further from Weinstein than she could have, and Derek looked at the timetable instead.</w:t>
       </w:r>
     </w:p>
     <w:p>
@@ -12425,7 +12113,7 @@
           <w:b w:val="0"/>
           <w:sz w:val="22"/>
         </w:rPr>
-        <w:t>"That's still a control," Penny said, but she put her arm through his, briefly, which she had not done since they were children at a wedding neither of them had wanted to attend.</w:t>
+        <w:t xml:space="preserve">"That's still a control," Penny said, but she put her arm through his, briefly, which she had not done since they were children.</w:t>
       </w:r>
     </w:p>
     <w:p>
@@ -12477,7 +12165,7 @@
           <w:b w:val="0"/>
           <w:sz w:val="22"/>
         </w:rPr>
-        <w:t>"Under no circumstances." A pause, in which a tunnel briefly had its opinion. "The sheet was already in the pocket before the door. The voice was not. I am not going to tell you how to file it."</w:t>
+        <w:t xml:space="preserve">"Under no circumstances." A pause, in which a tunnel briefly had its opinion. "I am not going to tell you how to file it."</w:t>
       </w:r>
     </w:p>
     <w:p>
@@ -12594,7 +12282,7 @@
           <w:b w:val="0"/>
           <w:sz w:val="22"/>
         </w:rPr>
-        <w:t>Derek stood beside her and did not say anything. He had been her cousin all his life and had learned, at a wedding when they were nine, that the correct response to Penny looking at something was to look at it as well and keep his mouth shut.</w:t>
+        <w:t xml:space="preserve">Derek stood beside her and kept his mouth shut, which he had learned at a wedding when they were nine was the correct response to Penny looking at something.</w:t>
       </w:r>
     </w:p>
     <w:p>
@@ -12750,20 +12438,20 @@
           <w:b w:val="0"/>
           <w:sz w:val="22"/>
         </w:rPr>
-        <w:t>Trevor stood up when they reached him and held out the slip, as if returning something he had borrowed under protest. "He got on before it left."</w:t>
-      </w:r>
-    </w:p>
-    <w:p>
-      <w:pPr>
-        <w:spacing w:after="40" w:line="240" w:lineRule="auto"/>
-      </w:pPr>
-      <w:r>
-        <w:rPr>
-          <w:rFonts w:ascii="Georgia" w:hAnsi="Georgia" w:eastAsia="Georgia"/>
-          <w:b w:val="0"/>
-          <w:sz w:val="22"/>
-        </w:rPr>
-        <w:t>"I watched the board," Trevor said. "It said departed at sixteen hundred. Not sixteen hundred and seventeen. I checked." He looked faintly embarrassed. "I wasn't worshipping it. I was checking."</w:t>
+        <w:t xml:space="preserve">Trevor stood up when they reached him and held out the slip, as if returning something he had borrowed under protest. "He got on before it left. I watched the board. It said departed at sixteen hundred. Not sixteen hundred and seventeen. I checked."</w:t>
+      </w:r>
+    </w:p>
+    <w:p>
+      <w:pPr>
+        <w:spacing w:after="40" w:line="240" w:lineRule="auto"/>
+      </w:pPr>
+      <w:r>
+        <w:rPr>
+          <w:rFonts w:ascii="Georgia" w:hAnsi="Georgia" w:eastAsia="Georgia"/>
+          <w:b w:val="0"/>
+          <w:sz w:val="22"/>
+        </w:rPr>
+        <w:t xml:space="preserve">He looked faintly embarrassed. "I wasn't worshipping it. I was checking."</w:t>
       </w:r>
     </w:p>
     <w:p>
@@ -13014,45 +12702,6 @@
     </w:p>
     <w:p>
       <w:pPr>
-        <w:spacing w:after="40" w:line="240" w:lineRule="auto"/>
-      </w:pPr>
-      <w:r>
-        <w:rPr>
-          <w:rFonts w:ascii="Georgia" w:hAnsi="Georgia" w:eastAsia="Georgia"/>
-          <w:b w:val="0"/>
-          <w:sz w:val="22"/>
-        </w:rPr>
-        <w:t>"Mrs Marsh is still on the stairs. Penny rang."</w:t>
-      </w:r>
-    </w:p>
-    <w:p>
-      <w:pPr>
-        <w:spacing w:after="160" w:line="240" w:lineRule="auto"/>
-      </w:pPr>
-      <w:r>
-        <w:rPr>
-          <w:rFonts w:ascii="Georgia" w:hAnsi="Georgia" w:eastAsia="Georgia"/>
-          <w:b w:val="0"/>
-          <w:sz w:val="22"/>
-        </w:rPr>
-        <w:t>"Of course she is. She'll have decided the stairs are hers by now. You'll never get them back."</w:t>
-      </w:r>
-    </w:p>
-    <w:p>
-      <w:pPr>
-        <w:spacing w:after="40" w:line="240" w:lineRule="auto"/>
-      </w:pPr>
-      <w:r>
-        <w:rPr>
-          <w:rFonts w:ascii="Georgia" w:hAnsi="Georgia" w:eastAsia="Georgia"/>
-          <w:b w:val="0"/>
-          <w:sz w:val="22"/>
-        </w:rPr>
-        <w:t>"I've never had them."</w:t>
-      </w:r>
-    </w:p>
-    <w:p>
-      <w:pPr>
         <w:spacing w:after="160" w:line="240" w:lineRule="auto"/>
       </w:pPr>
       <w:r>
@@ -13126,85 +12775,20 @@
           <w:b w:val="0"/>
           <w:sz w:val="22"/>
         </w:rPr>
-        <w:t>"I know it won't shut. I was there this morning on the telephone while it didn't." She walked on a few steps. "I'm asking because lately the only thing anyone could see of us was a closed door with a dog outside it. Trevor saw the door. Penny saw the door. Mrs Marsh, I expect, has the door in a drawer. And now there isn't a door. There's a railway. So if there's going to be anything, it's going to be in front of the railway. In front of everybody."</w:t>
-      </w:r>
-    </w:p>
-    <w:p>
-      <w:pPr>
-        <w:spacing w:after="40" w:line="240" w:lineRule="auto"/>
-      </w:pPr>
-      <w:r>
-        <w:rPr>
-          <w:rFonts w:ascii="Georgia" w:hAnsi="Georgia" w:eastAsia="Georgia"/>
-          <w:b w:val="0"/>
-          <w:sz w:val="22"/>
-        </w:rPr>
-        <w:t>"Yes."</w:t>
-      </w:r>
-    </w:p>
-    <w:p>
-      <w:pPr>
-        <w:spacing w:after="40" w:line="240" w:lineRule="auto"/>
-      </w:pPr>
-      <w:r>
-        <w:rPr>
-          <w:rFonts w:ascii="Georgia" w:hAnsi="Georgia" w:eastAsia="Georgia"/>
-          <w:b w:val="0"/>
-          <w:sz w:val="22"/>
-        </w:rPr>
-        <w:t>"I'm not complaining. I'm checking you know."</w:t>
-      </w:r>
-    </w:p>
-    <w:p>
-      <w:pPr>
-        <w:spacing w:after="40" w:line="240" w:lineRule="auto"/>
-      </w:pPr>
-      <w:r>
-        <w:rPr>
-          <w:rFonts w:ascii="Georgia" w:hAnsi="Georgia" w:eastAsia="Georgia"/>
-          <w:b w:val="0"/>
-          <w:sz w:val="22"/>
-        </w:rPr>
-        <w:t>"I know."</w:t>
-      </w:r>
-    </w:p>
-    <w:p>
-      <w:pPr>
-        <w:spacing w:after="160" w:line="240" w:lineRule="auto"/>
-      </w:pPr>
-      <w:r>
-        <w:rPr>
-          <w:rFonts w:ascii="Georgia" w:hAnsi="Georgia" w:eastAsia="Georgia"/>
-          <w:b w:val="0"/>
-          <w:sz w:val="22"/>
-        </w:rPr>
-        <w:t>"Good." She was quiet for a little. "I liked the door. I'm not going to pretend I didn't. But a door was also a way of not having the sentence. You said that yourself, on the pavement. If the hinge has taken it away, I'm not going to ask for it back so that we can go on not saying things in private."</w:t>
-      </w:r>
-    </w:p>
-    <w:p>
-      <w:pPr>
-        <w:spacing w:after="40" w:line="240" w:lineRule="auto"/>
-      </w:pPr>
-      <w:r>
-        <w:rPr>
-          <w:rFonts w:ascii="Georgia" w:hAnsi="Georgia" w:eastAsia="Georgia"/>
-          <w:b w:val="0"/>
-          <w:sz w:val="22"/>
-        </w:rPr>
-        <w:t>"The hinge didn't take it away. I'd have opened it."</w:t>
-      </w:r>
-    </w:p>
-    <w:p>
-      <w:pPr>
-        <w:spacing w:after="160" w:line="240" w:lineRule="auto"/>
-      </w:pPr>
-      <w:r>
-        <w:rPr>
-          <w:rFonts w:ascii="Georgia" w:hAnsi="Georgia" w:eastAsia="Georgia"/>
-          <w:b w:val="0"/>
-          <w:sz w:val="22"/>
-        </w:rPr>
-        <w:t>"I know you would. You said. I'm not a platform." She stopped at the kerb, waiting for the lights, and looked at him sideways with the flat, unhurried look that was, he had learned, the most dangerous thing about her. "Do the form first, Derek. Strike her name. Then come out on to the London side where I'm standing. I'll be there. I'm not going to make you do it in a stairwell."</w:t>
+        <w:t xml:space="preserve">"I know it won't shut." She walked on a few steps. "Lately the only thing anyone could see of us was a closed door with a dog outside it. Trevor saw the door. Penny saw the door. Mrs Marsh, I expect, has the door in a drawer. Now there isn't a door. There's a railway. So if there's going to be anything, it's going to be in front of everybody."</w:t>
+      </w:r>
+    </w:p>
+    <w:p>
+      <w:pPr>
+        <w:spacing w:after="160" w:line="240" w:lineRule="auto"/>
+      </w:pPr>
+      <w:r>
+        <w:rPr>
+          <w:rFonts w:ascii="Georgia" w:hAnsi="Georgia" w:eastAsia="Georgia"/>
+          <w:b w:val="0"/>
+          <w:sz w:val="22"/>
+        </w:rPr>
+        <w:t xml:space="preserve">She stopped at the kerb, waiting for the lights, and looked at him sideways with the flat, unhurried look that was, he had learned, the most dangerous thing about her. "Do the form first, Derek. Then come out on to the London side where I'm standing. I'm not going to make you do it in a stairwell."</w:t>
       </w:r>
     </w:p>
     <w:p>
@@ -13243,33 +12827,33 @@
           <w:b w:val="0"/>
           <w:sz w:val="22"/>
         </w:rPr>
-        <w:t>Derek had known it would be. He had known it all the way back, on foot, with Tabitha's hand in his and Trevor's Mini overtaking them twice at junctions with the air of a car that wished to be seen to have tried. He had known it on the stairs, and on the landing, where Mrs Marsh rose from her step at their approach with the clipboard already raised. He knew it, and then he came into his office and saw it, and found that knowing a thing and seeing it were still, after all this, two separate events.</w:t>
-      </w:r>
-    </w:p>
-    <w:p>
-      <w:pPr>
-        <w:spacing w:after="160" w:line="240" w:lineRule="auto"/>
-      </w:pPr>
-      <w:r>
-        <w:rPr>
-          <w:rFonts w:ascii="Georgia" w:hAnsi="Georgia" w:eastAsia="Georgia"/>
-          <w:b w:val="0"/>
-          <w:sz w:val="22"/>
-        </w:rPr>
-        <w:t>The amber board read YESTERDAY. The train stood lit and empty. The yellow tape still lay across the sill with its case pinned under the fire extinguisher on the London side, but it was longer than Trevor had left it. The yellow line had come over the sill. It lay on the carpet, a finger's width of paint on wool, thirty-one millimetres inside the office, and the bench was that much nearer the desk. No one was on the platform. No one had been.</w:t>
-      </w:r>
-    </w:p>
-    <w:p>
-      <w:pPr>
-        <w:spacing w:after="160" w:line="240" w:lineRule="auto"/>
-      </w:pPr>
-      <w:r>
-        <w:rPr>
-          <w:rFonts w:ascii="Georgia" w:hAnsi="Georgia" w:eastAsia="Georgia"/>
-          <w:b w:val="0"/>
-          <w:sz w:val="22"/>
-        </w:rPr>
-        <w:t>"No one has boarded," Mrs Marsh said behind them, before anyone could ask. "I have had the stairwell since one. I have had Mr Pendleton twice. I have had the landlord in writing, three times, the last in capitals, and I have not replied to any of it, which he will understand as a reply. I should like my afternoon back. I am not going to get it."</w:t>
+        <w:t xml:space="preserve">Derek had known it would be. He had known it all the way back, on foot, with Tabitha's hand in his. He had known it on the stairs, and on the landing, where Mrs Marsh rose from her step at their approach with the clipboard already raised and Penny and Trevor stood behind her, not going in. He knew it, and then he came into his office and saw it, and found that knowing a thing and seeing it were still, after all this, two separate events.</w:t>
+      </w:r>
+    </w:p>
+    <w:p>
+      <w:pPr>
+        <w:spacing w:after="160" w:line="240" w:lineRule="auto"/>
+      </w:pPr>
+      <w:r>
+        <w:rPr>
+          <w:rFonts w:ascii="Georgia" w:hAnsi="Georgia" w:eastAsia="Georgia"/>
+          <w:b w:val="0"/>
+          <w:sz w:val="22"/>
+        </w:rPr>
+        <w:t xml:space="preserve">The amber board read YESTERDAY. The yellow tape still lay across the sill with its case pinned under the fire extinguisher, but the yellow line had come over the sill. It lay on the carpet, a finger's width of paint on wool, and it was no longer thirty-one millimetres inside the office. Trevor knelt and read the tape and said forty-four. The bench was that much nearer the desk. And the nearest door of the carriage was open. It stood back on its runners, lit, with nothing beeping, as if the train had worked out that beeping only hurried people and had decided to try patience instead.</w:t>
+      </w:r>
+    </w:p>
+    <w:p>
+      <w:pPr>
+        <w:spacing w:after="160" w:line="240" w:lineRule="auto"/>
+      </w:pPr>
+      <w:r>
+        <w:rPr>
+          <w:rFonts w:ascii="Georgia" w:hAnsi="Georgia" w:eastAsia="Georgia"/>
+          <w:b w:val="0"/>
+          <w:sz w:val="22"/>
+        </w:rPr>
+        <w:t xml:space="preserve">"No one has boarded," Mrs Marsh said behind them, before anyone could ask. "The doors opened again at twenty-five past four, and they have stayed open. I have had the stairwell since one. I have had Mr Pendleton twice. I have had the landlord in writing, three times, the last in capitals, and I have not replied to any of it, which he will understand as a reply. I should like my afternoon back. I am not going to get it."</w:t>
       </w:r>
     </w:p>
     <w:p>
@@ -13295,202 +12879,293 @@
           <w:b w:val="0"/>
           <w:sz w:val="22"/>
         </w:rPr>
-        <w:t>"Do not thank me. It was the lease." She handed Trevor the extinguisher, as if the tape measure had been hers all along and was now being returned to its rightful owner on probation. "Mr Pendleton left a note."</w:t>
-      </w:r>
-    </w:p>
-    <w:p>
-      <w:pPr>
-        <w:spacing w:after="160" w:line="240" w:lineRule="auto"/>
-      </w:pPr>
-      <w:r>
-        <w:rPr>
-          <w:rFonts w:ascii="Georgia" w:hAnsi="Georgia" w:eastAsia="Georgia"/>
-          <w:b w:val="0"/>
-          <w:sz w:val="22"/>
-        </w:rPr>
-        <w:t>The note was on Derek's desk, square to the edge, in Pendleton's careful apologetic hand.</w:t>
-      </w:r>
-    </w:p>
-    <w:p>
-      <w:pPr>
-        <w:spacing w:after="160" w:line="240" w:lineRule="auto"/>
-      </w:pPr>
-      <w:r>
-        <w:rPr>
-          <w:rFonts w:ascii="Georgia" w:hAnsi="Georgia" w:eastAsia="Georgia"/>
-          <w:b w:val="0"/>
-          <w:sz w:val="22"/>
-        </w:rPr>
-        <w:t>Whichever form this is, it is not mine.</w:t>
-      </w:r>
-    </w:p>
-    <w:p>
-      <w:pPr>
-        <w:spacing w:after="40" w:line="240" w:lineRule="auto"/>
-      </w:pPr>
-      <w:r>
-        <w:rPr>
-          <w:rFonts w:ascii="Georgia" w:hAnsi="Georgia" w:eastAsia="Georgia"/>
-          <w:b w:val="0"/>
-          <w:sz w:val="22"/>
-        </w:rPr>
-        <w:t>"He's very consistent."</w:t>
-      </w:r>
-    </w:p>
-    <w:p>
-      <w:pPr>
-        <w:spacing w:after="160" w:line="240" w:lineRule="auto"/>
-      </w:pPr>
-      <w:r>
-        <w:rPr>
-          <w:rFonts w:ascii="Georgia" w:hAnsi="Georgia" w:eastAsia="Georgia"/>
-          <w:b w:val="0"/>
-          <w:sz w:val="22"/>
-        </w:rPr>
-        <w:t>"It's the only thing about him I trust," said Mrs Marsh, and went back to her stairwell. She did not go downstairs. Derek noticed that. She sat on the top step with the clipboard on her knee, facing the corridor, facing the frame.</w:t>
-      </w:r>
-    </w:p>
-    <w:p>
-      <w:pPr>
-        <w:spacing w:after="160" w:line="240" w:lineRule="auto"/>
-      </w:pPr>
-      <w:r>
-        <w:rPr>
-          <w:rFonts w:ascii="Georgia" w:hAnsi="Georgia" w:eastAsia="Georgia"/>
-          <w:b w:val="0"/>
-          <w:sz w:val="22"/>
-        </w:rPr>
-        <w:t>Trevor read the office clock. "16:41."</w:t>
-      </w:r>
-    </w:p>
-    <w:p>
-      <w:pPr>
-        <w:spacing w:after="160" w:line="240" w:lineRule="auto"/>
-      </w:pPr>
-      <w:r>
-        <w:rPr>
-          <w:rFonts w:ascii="Georgia" w:hAnsi="Georgia" w:eastAsia="Georgia"/>
-          <w:b w:val="0"/>
-          <w:sz w:val="22"/>
-        </w:rPr>
-        <w:t>The airport train had gone. Weinstein was, by now, at the airport, queuing with his passport in the jacket pocket he trusted, exactly as far into the future of the door as the clocks said. The mystery train had not acquired a passenger. And the form was still open on the screen, where they had left it at lunch, with its four lines of grey certainty and the gap underneath.</w:t>
-      </w:r>
-    </w:p>
-    <w:p>
-      <w:pPr>
-        <w:spacing w:after="160" w:line="240" w:lineRule="auto"/>
-      </w:pPr>
-      <w:r>
-        <w:rPr>
-          <w:rFonts w:ascii="Georgia" w:hAnsi="Georgia" w:eastAsia="Georgia"/>
-          <w:b w:val="0"/>
-          <w:sz w:val="22"/>
-        </w:rPr>
-        <w:t>Trevor sat down at the keyboard. He did it slowly. He put his glasses on, then took them off, then put them on again, and then looked at Derek.</w:t>
-      </w:r>
-    </w:p>
-    <w:p>
-      <w:pPr>
-        <w:spacing w:after="40" w:line="240" w:lineRule="auto"/>
-      </w:pPr>
-      <w:r>
-        <w:rPr>
-          <w:rFonts w:ascii="Georgia" w:hAnsi="Georgia" w:eastAsia="Georgia"/>
-          <w:b w:val="0"/>
-          <w:sz w:val="22"/>
-        </w:rPr>
-        <w:t>"Who's typing?"</w:t>
-      </w:r>
-    </w:p>
-    <w:p>
-      <w:pPr>
-        <w:spacing w:after="40" w:line="240" w:lineRule="auto"/>
-      </w:pPr>
-      <w:r>
-        <w:rPr>
-          <w:rFonts w:ascii="Georgia" w:hAnsi="Georgia" w:eastAsia="Georgia"/>
-          <w:b w:val="0"/>
-          <w:sz w:val="22"/>
-        </w:rPr>
-        <w:t>"You are."</w:t>
-      </w:r>
-    </w:p>
-    <w:p>
-      <w:pPr>
-        <w:spacing w:after="40" w:line="240" w:lineRule="auto"/>
-      </w:pPr>
-      <w:r>
-        <w:rPr>
-          <w:rFonts w:ascii="Georgia" w:hAnsi="Georgia" w:eastAsia="Georgia"/>
-          <w:b w:val="0"/>
-          <w:sz w:val="22"/>
-        </w:rPr>
-        <w:t>"I thought it ought to be you. It's your name on the sheet."</w:t>
-      </w:r>
-    </w:p>
-    <w:p>
-      <w:pPr>
-        <w:spacing w:after="160" w:line="240" w:lineRule="auto"/>
-      </w:pPr>
-      <w:r>
-        <w:rPr>
-          <w:rFonts w:ascii="Georgia" w:hAnsi="Georgia" w:eastAsia="Georgia"/>
-          <w:b w:val="0"/>
-          <w:sz w:val="22"/>
-        </w:rPr>
-        <w:t>"That's why it oughtn't. The sheet's about me. I'm not filing my own prohibition. The form told us that much."</w:t>
-      </w:r>
-    </w:p>
-    <w:p>
-      <w:pPr>
-        <w:spacing w:after="40" w:line="240" w:lineRule="auto"/>
-      </w:pPr>
-      <w:r>
-        <w:rPr>
-          <w:rFonts w:ascii="Georgia" w:hAnsi="Georgia" w:eastAsia="Georgia"/>
-          <w:b w:val="0"/>
-          <w:sz w:val="22"/>
-        </w:rPr>
-        <w:t>"Then Penny."</w:t>
-      </w:r>
-    </w:p>
-    <w:p>
-      <w:pPr>
-        <w:spacing w:after="160" w:line="240" w:lineRule="auto"/>
-      </w:pPr>
-      <w:r>
-        <w:rPr>
-          <w:rFonts w:ascii="Georgia" w:hAnsi="Georgia" w:eastAsia="Georgia"/>
-          <w:b w:val="0"/>
-          <w:sz w:val="22"/>
-        </w:rPr>
-        <w:t>"Penny's going to do the bit at the end. You do the times. You're the one who measured the door."</w:t>
-      </w:r>
-    </w:p>
-    <w:p>
-      <w:pPr>
-        <w:spacing w:after="160" w:line="240" w:lineRule="auto"/>
-      </w:pPr>
-      <w:r>
-        <w:rPr>
-          <w:rFonts w:ascii="Georgia" w:hAnsi="Georgia" w:eastAsia="Georgia"/>
-          <w:b w:val="0"/>
-          <w:sz w:val="22"/>
-        </w:rPr>
-        <w:t>Trevor considered this, and seemed to find in it some small dignity he had not known was on offer. He flexed his fingers over the keys in the manner of a pianist who has only ever played scales. Then he typed, and this time the form took the record they were making. It did not argue. It did not grey anything out. It did not offer to become the morning sheet.</w:t>
-      </w:r>
-    </w:p>
-    <w:p>
-      <w:pPr>
-        <w:spacing w:after="160" w:line="240" w:lineRule="auto"/>
-      </w:pPr>
-      <w:r>
-        <w:rPr>
-          <w:rFonts w:ascii="Georgia" w:hAnsi="Georgia" w:eastAsia="Georgia"/>
-          <w:b w:val="0"/>
-          <w:sz w:val="22"/>
-        </w:rPr>
-        <w:t>AUTHOR OF THIS RECORD: THE REFUSAL.</w:t>
+        <w:t xml:space="preserve">Then she went back to her stairwell. She did not go downstairs. Derek noticed that. She sat on the top step with the clipboard on her knee, facing the corridor, facing the frame.</w:t>
+      </w:r>
+    </w:p>
+    <w:p>
+      <w:pPr>
+        <w:spacing w:after="160" w:line="240" w:lineRule="auto"/>
+      </w:pPr>
+      <w:r>
+        <w:rPr>
+          <w:rFonts w:ascii="Georgia" w:hAnsi="Georgia" w:eastAsia="Georgia"/>
+          <w:b w:val="0"/>
+          <w:sz w:val="22"/>
+        </w:rPr>
+        <w:t xml:space="preserve">Trevor was still on his knees by the tape. "It's moving," he said. "Look. Forty-five."</w:t>
+      </w:r>
+    </w:p>
+    <w:p>
+      <w:pPr>
+        <w:spacing w:after="160" w:line="240" w:lineRule="auto"/>
+      </w:pPr>
+      <w:r>
+        <w:rPr>
+          <w:rFonts w:ascii="Georgia" w:hAnsi="Georgia" w:eastAsia="Georgia"/>
+          <w:b w:val="0"/>
+          <w:sz w:val="22"/>
+        </w:rPr>
+        <w:t xml:space="preserve">Nobody looked anywhere else. The paint crept the way a minute hand creeps: you could not see it go, and you could see that it had gone.</w:t>
+      </w:r>
+    </w:p>
+    <w:p>
+      <w:pPr>
+        <w:spacing w:after="160" w:line="240" w:lineRule="auto"/>
+      </w:pPr>
+      <w:r>
+        <w:rPr>
+          <w:rFonts w:ascii="Georgia" w:hAnsi="Georgia" w:eastAsia="Georgia"/>
+          <w:b w:val="0"/>
+          <w:sz w:val="22"/>
+        </w:rPr>
+        <w:t xml:space="preserve">"It doesn't need him to step on." Trevor's voice had gone very level, which in Trevor meant the opposite. "If it comes far enough, it comes to the desk. Then he's standing on a platform without having moved, and the doors are open, and—" He stopped, because he had worked out the end of the sentence and did not want it in the room.</w:t>
+      </w:r>
+    </w:p>
+    <w:p>
+      <w:pPr>
+        <w:spacing w:after="160" w:line="240" w:lineRule="auto"/>
+      </w:pPr>
+      <w:r>
+        <w:rPr>
+          <w:rFonts w:ascii="Georgia" w:hAnsi="Georgia" w:eastAsia="Georgia"/>
+          <w:b w:val="0"/>
+          <w:sz w:val="22"/>
+        </w:rPr>
+        <w:t xml:space="preserve">"Then we type the refusal now," Penny said. She had the form up before anyone answered, and Trevor was in the chair with his fingers over the keys. "Boarding refused. The time. Her name off. Before it gets any further."</w:t>
+      </w:r>
+    </w:p>
+    <w:p>
+      <w:pPr>
+        <w:spacing w:after="160" w:line="240" w:lineRule="auto"/>
+      </w:pPr>
+      <w:r>
+        <w:rPr>
+          <w:rFonts w:ascii="Georgia" w:hAnsi="Georgia" w:eastAsia="Georgia"/>
+          <w:b w:val="0"/>
+          <w:sz w:val="22"/>
+        </w:rPr>
+        <w:t xml:space="preserve">"No," said Derek.</w:t>
+      </w:r>
+    </w:p>
+    <w:p>
+      <w:pPr>
+        <w:spacing w:after="160" w:line="240" w:lineRule="auto"/>
+      </w:pPr>
+      <w:r>
+        <w:rPr>
+          <w:rFonts w:ascii="Georgia" w:hAnsi="Georgia" w:eastAsia="Georgia"/>
+          <w:b w:val="0"/>
+          <w:sz w:val="22"/>
+        </w:rPr>
+        <w:t xml:space="preserve">They both looked at him. It was not a word he used in the office. He used it on the telephone, to clients who wanted him to promise they would not be murdered, and on Sophie, rarely, and badly.</w:t>
+      </w:r>
+    </w:p>
+    <w:p>
+      <w:pPr>
+        <w:spacing w:after="160" w:line="240" w:lineRule="auto"/>
+      </w:pPr>
+      <w:r>
+        <w:rPr>
+          <w:rFonts w:ascii="Georgia" w:hAnsi="Georgia" w:eastAsia="Georgia"/>
+          <w:b w:val="0"/>
+          <w:sz w:val="22"/>
+        </w:rPr>
+        <w:t xml:space="preserve">"We haven't refused anything. We've not boarded. That isn't the same. Not boarding is a thing that keeps not happening. You can't put a time on it." He found he knew this the way he knew the floor. "If Trevor types BOARDING REFUSED with that door standing open, it's a forecast. It's a sentence about what I'm going to do. The platform's got no reason to believe a forecast. Neither have I."</w:t>
+      </w:r>
+    </w:p>
+    <w:p>
+      <w:pPr>
+        <w:spacing w:after="160" w:line="240" w:lineRule="auto"/>
+      </w:pPr>
+      <w:r>
+        <w:rPr>
+          <w:rFonts w:ascii="Georgia" w:hAnsi="Georgia" w:eastAsia="Georgia"/>
+          <w:b w:val="0"/>
+          <w:sz w:val="22"/>
+        </w:rPr>
+        <w:t xml:space="preserve">"Derek."</w:t>
+      </w:r>
+    </w:p>
+    <w:p>
+      <w:pPr>
+        <w:spacing w:after="160" w:line="240" w:lineRule="auto"/>
+      </w:pPr>
+      <w:r>
+        <w:rPr>
+          <w:rFonts w:ascii="Georgia" w:hAnsi="Georgia" w:eastAsia="Georgia"/>
+          <w:b w:val="0"/>
+          <w:sz w:val="22"/>
+        </w:rPr>
+        <w:t xml:space="preserve">"Read the sheet. It doesn't tell me anything. It tells you. Do not allow Derek Gent to board. It's an instruction to whoever's in the room. Nobody in the room can do the other half for me. I've got to do it myself while it can still be done, or there's nothing for the form to record."</w:t>
+      </w:r>
+    </w:p>
+    <w:p>
+      <w:pPr>
+        <w:spacing w:after="160" w:line="240" w:lineRule="auto"/>
+      </w:pPr>
+      <w:r>
+        <w:rPr>
+          <w:rFonts w:ascii="Georgia" w:hAnsi="Georgia" w:eastAsia="Georgia"/>
+          <w:b w:val="0"/>
+          <w:sz w:val="22"/>
+        </w:rPr>
+        <w:t xml:space="preserve">He took the sheet out of his pocket. He walked to the yellow line where it lay on his own carpet, and stood on it.</w:t>
+      </w:r>
+    </w:p>
+    <w:p>
+      <w:pPr>
+        <w:spacing w:after="160" w:line="240" w:lineRule="auto"/>
+      </w:pPr>
+      <w:r>
+        <w:rPr>
+          <w:rFonts w:ascii="Georgia" w:hAnsi="Georgia" w:eastAsia="Georgia"/>
+          <w:b w:val="0"/>
+          <w:sz w:val="22"/>
+        </w:rPr>
+        <w:t xml:space="preserve">Penny made a small sound, the one she made when a spreadsheet did something without being asked. Trevor's hand went out for his sleeve and stopped, because Trevor had measured the door and knew to the millimetre where the platform began, and Derek was standing on it. He was on a railway in his own office. The open door of the carriage was one long step away, and inside it was the nearest seat, and on the seat was nothing, in a blue moquette that every railway in Britain had bought in bulk at some point and regretted.</w:t>
+      </w:r>
+    </w:p>
+    <w:p>
+      <w:pPr>
+        <w:spacing w:after="160" w:line="240" w:lineRule="auto"/>
+      </w:pPr>
+      <w:r>
+        <w:rPr>
+          <w:rFonts w:ascii="Georgia" w:hAnsi="Georgia" w:eastAsia="Georgia"/>
+          <w:b w:val="0"/>
+          <w:sz w:val="22"/>
+        </w:rPr>
+        <w:t xml:space="preserve">He did not look at the seat. He held the sheet up, so that whatever was in the carriage could read it if it read, and said the thing nobody had said to the train all day, because everybody had been too busy not saying anything to it.</w:t>
+      </w:r>
+    </w:p>
+    <w:p>
+      <w:pPr>
+        <w:spacing w:after="160" w:line="240" w:lineRule="auto"/>
+      </w:pPr>
+      <w:r>
+        <w:rPr>
+          <w:rFonts w:ascii="Georgia" w:hAnsi="Georgia" w:eastAsia="Georgia"/>
+          <w:b w:val="0"/>
+          <w:sz w:val="22"/>
+        </w:rPr>
+        <w:t xml:space="preserve">"No."</w:t>
+      </w:r>
+    </w:p>
+    <w:p>
+      <w:pPr>
+        <w:spacing w:after="160" w:line="240" w:lineRule="auto"/>
+      </w:pPr>
+      <w:r>
+        <w:rPr>
+          <w:rFonts w:ascii="Georgia" w:hAnsi="Georgia" w:eastAsia="Georgia"/>
+          <w:b w:val="0"/>
+          <w:sz w:val="22"/>
+        </w:rPr>
+        <w:t xml:space="preserve">He said it in the voice he used for tea. Then he turned his back on the open door, which was the hardest thing he had done with his body since he had learned to walk, and stepped off the yellow line onto the carpet, and put the sheet back in his pocket, and went to the desk, and put his hand on the back of Trevor's chair.</w:t>
+      </w:r>
+    </w:p>
+    <w:p>
+      <w:pPr>
+        <w:spacing w:after="160" w:line="240" w:lineRule="auto"/>
+      </w:pPr>
+      <w:r>
+        <w:rPr>
+          <w:rFonts w:ascii="Georgia" w:hAnsi="Georgia" w:eastAsia="Georgia"/>
+          <w:b w:val="0"/>
+          <w:sz w:val="22"/>
+        </w:rPr>
+        <w:t xml:space="preserve">"Time."</w:t>
+      </w:r>
+    </w:p>
+    <w:p>
+      <w:pPr>
+        <w:spacing w:after="160" w:line="240" w:lineRule="auto"/>
+      </w:pPr>
+      <w:r>
+        <w:rPr>
+          <w:rFonts w:ascii="Georgia" w:hAnsi="Georgia" w:eastAsia="Georgia"/>
+          <w:b w:val="0"/>
+          <w:sz w:val="22"/>
+        </w:rPr>
+        <w:t xml:space="preserve">Trevor looked at the office clock. "Sixteen forty-one."</w:t>
+      </w:r>
+    </w:p>
+    <w:p>
+      <w:pPr>
+        <w:spacing w:after="160" w:line="240" w:lineRule="auto"/>
+      </w:pPr>
+      <w:r>
+        <w:rPr>
+          <w:rFonts w:ascii="Georgia" w:hAnsi="Georgia" w:eastAsia="Georgia"/>
+          <w:b w:val="0"/>
+          <w:sz w:val="22"/>
+        </w:rPr>
+        <w:t xml:space="preserve">Behind Derek, without a beep, the carriage door slid shut. Nobody heard it. Trevor saw it in the window glass, and said afterwards that it had closed the way a door closes when somebody has finally answered the question it was asking. The paint on the carpet stopped. The tape said forty-six millimetres, and went on saying it.</w:t>
+      </w:r>
+    </w:p>
+    <w:p>
+      <w:pPr>
+        <w:spacing w:after="160" w:line="240" w:lineRule="auto"/>
+      </w:pPr>
+      <w:r>
+        <w:rPr>
+          <w:rFonts w:ascii="Georgia" w:hAnsi="Georgia" w:eastAsia="Georgia"/>
+          <w:b w:val="0"/>
+          <w:sz w:val="22"/>
+        </w:rPr>
+        <w:t xml:space="preserve">"Up," said Derek. "It's my act. I'll write it."</w:t>
+      </w:r>
+    </w:p>
+    <w:p>
+      <w:pPr>
+        <w:spacing w:after="160" w:line="240" w:lineRule="auto"/>
+      </w:pPr>
+      <w:r>
+        <w:rPr>
+          <w:rFonts w:ascii="Georgia" w:hAnsi="Georgia" w:eastAsia="Georgia"/>
+          <w:b w:val="0"/>
+          <w:sz w:val="22"/>
+        </w:rPr>
+        <w:t xml:space="preserve">"The form wouldn't take you this morning," Trevor said, getting up anyway. "A file may not be received from its own prohibition."</w:t>
+      </w:r>
+    </w:p>
+    <w:p>
+      <w:pPr>
+        <w:spacing w:after="160" w:line="240" w:lineRule="auto"/>
+      </w:pPr>
+      <w:r>
+        <w:rPr>
+          <w:rFonts w:ascii="Georgia" w:hAnsi="Georgia" w:eastAsia="Georgia"/>
+          <w:b w:val="0"/>
+          <w:sz w:val="22"/>
+        </w:rPr>
+        <w:t xml:space="preserve">"I'm not sending it a warning. I'm telling it what I did."</w:t>
+      </w:r>
+    </w:p>
+    <w:p>
+      <w:pPr>
+        <w:spacing w:after="160" w:line="240" w:lineRule="auto"/>
+      </w:pPr>
+      <w:r>
+        <w:rPr>
+          <w:rFonts w:ascii="Georgia" w:hAnsi="Georgia" w:eastAsia="Georgia"/>
+          <w:b w:val="0"/>
+          <w:sz w:val="22"/>
+        </w:rPr>
+        <w:t xml:space="preserve">He sat down and typed with two fingers, which was how he typed everything, and this time the form took the record he was making. It did not argue. It did not grey anything out. It did not offer to become the morning sheet.</w:t>
+      </w:r>
+    </w:p>
+    <w:p>
+      <w:pPr>
+        <w:spacing w:after="160" w:line="240" w:lineRule="auto"/>
+      </w:pPr>
+      <w:r>
+        <w:rPr>
+          <w:rFonts w:ascii="Georgia" w:hAnsi="Georgia" w:eastAsia="Georgia"/>
+          <w:b w:val="0"/>
+          <w:sz w:val="22"/>
+        </w:rPr>
+        <w:t xml:space="preserve">AUTHOR OF THIS RECORD: D. GENT, REFUSING.</w:t>
       </w:r>
     </w:p>
     <w:p>
@@ -13529,7 +13204,7 @@
           <w:b w:val="0"/>
           <w:sz w:val="22"/>
         </w:rPr>
-        <w:t>MORNING SHEET: SENDER UNKNOWN. NOT A BIRTHDAY. NOT LOCALHOST.</w:t>
+        <w:t xml:space="preserve">MORNING SHEET: SENDER UNKNOWN. NOT A BIRTHDAY. NOT CASEBOOK. NOT DEVICE 3.</w:t>
       </w:r>
     </w:p>
     <w:p>
@@ -13555,72 +13230,33 @@
           <w:b w:val="0"/>
           <w:sz w:val="22"/>
         </w:rPr>
-        <w:t>Trevor stared at it. "That wasn't there at lunch."</w:t>
-      </w:r>
-    </w:p>
-    <w:p>
-      <w:pPr>
-        <w:spacing w:after="40" w:line="240" w:lineRule="auto"/>
-      </w:pPr>
-      <w:r>
-        <w:rPr>
-          <w:rFonts w:ascii="Georgia" w:hAnsi="Georgia" w:eastAsia="Georgia"/>
-          <w:b w:val="0"/>
-          <w:sz w:val="22"/>
-        </w:rPr>
-        <w:t>"It was the field we needed at lunch," Derek said. "We didn't have an act yet."</w:t>
-      </w:r>
-    </w:p>
-    <w:p>
-      <w:pPr>
-        <w:spacing w:after="160" w:line="240" w:lineRule="auto"/>
-      </w:pPr>
-      <w:r>
-        <w:rPr>
-          <w:rFonts w:ascii="Georgia" w:hAnsi="Georgia" w:eastAsia="Georgia"/>
-          <w:b w:val="0"/>
-          <w:sz w:val="22"/>
-        </w:rPr>
-        <w:t>Trevor filled the new field for the refusal: the time, and the room, and nothing else. He left the birthday empty. It was, Derek thought, the most precise thing he had ever seen anyone not type. The form accepted the act they had just performed. It left the morning sheet's author blank, and did not complain about it, and the absence sat there on the screen like an empty chair at a table, waiting for someone who was not going to come today, and might not come at all.</w:t>
-      </w:r>
-    </w:p>
-    <w:p>
-      <w:pPr>
-        <w:spacing w:after="160" w:line="240" w:lineRule="auto"/>
-      </w:pPr>
-      <w:r>
-        <w:rPr>
-          <w:rFonts w:ascii="Georgia" w:hAnsi="Georgia" w:eastAsia="Georgia"/>
-          <w:b w:val="0"/>
-          <w:sz w:val="22"/>
-        </w:rPr>
-        <w:t>CASE STATUS: BOARDING REFUSED. SHEET BEFORE THE DOOR. VOICE AFTER THE DOOR. THE READING IS NOT THE ARRIVAL.</w:t>
-      </w:r>
-    </w:p>
-    <w:p>
-      <w:pPr>
-        <w:spacing w:after="160" w:line="240" w:lineRule="auto"/>
-      </w:pPr>
-      <w:r>
-        <w:rPr>
-          <w:rFonts w:ascii="Georgia" w:hAnsi="Georgia" w:eastAsia="Georgia"/>
-          <w:b w:val="0"/>
-          <w:sz w:val="22"/>
-        </w:rPr>
-        <w:t>SENDER OF THIS RECORD: THE REFUSAL, THIS ROOM, 16:41.</w:t>
-      </w:r>
-    </w:p>
-    <w:p>
-      <w:pPr>
-        <w:spacing w:after="160" w:line="240" w:lineRule="auto"/>
-      </w:pPr>
-      <w:r>
-        <w:rPr>
-          <w:rFonts w:ascii="Georgia" w:hAnsi="Georgia" w:eastAsia="Georgia"/>
-          <w:b w:val="0"/>
-          <w:sz w:val="22"/>
-        </w:rPr>
-        <w:t>SENDER OF THE MORNING SHEET: UNKNOWN.</w:t>
+        <w:t xml:space="preserve">Trevor stared at it over Derek's shoulder. "That wasn't there at lunch."</w:t>
+      </w:r>
+    </w:p>
+    <w:p>
+      <w:pPr>
+        <w:spacing w:after="40" w:line="240" w:lineRule="auto"/>
+      </w:pPr>
+      <w:r>
+        <w:rPr>
+          <w:rFonts w:ascii="Georgia" w:hAnsi="Georgia" w:eastAsia="Georgia"/>
+          <w:b w:val="0"/>
+          <w:sz w:val="22"/>
+        </w:rPr>
+        <w:t xml:space="preserve">"It was the field we needed at lunch," Derek said. "We didn't have an act at lunch."</w:t>
+      </w:r>
+    </w:p>
+    <w:p>
+      <w:pPr>
+        <w:spacing w:after="160" w:line="240" w:lineRule="auto"/>
+      </w:pPr>
+      <w:r>
+        <w:rPr>
+          <w:rFonts w:ascii="Georgia" w:hAnsi="Georgia" w:eastAsia="Georgia"/>
+          <w:b w:val="0"/>
+          <w:sz w:val="22"/>
+        </w:rPr>
+        <w:t xml:space="preserve">He filled the new field: the time, and the yellow line, and nothing else. He left the birthday empty. The form accepted the act he had just performed. It left the morning sheet's author blank, and did not complain about it, and the absence sat there on the screen like an empty chair at a table, waiting for someone who was not going to come today, and might not come at all.</w:t>
       </w:r>
     </w:p>
     <w:p>
@@ -13685,7 +13321,7 @@
           <w:b w:val="0"/>
           <w:sz w:val="22"/>
         </w:rPr>
-        <w:t>Penny put her handbag down on the desk. She took out the face-down photograph, looked at the back of it for a moment, and put it face-down on the desk beside the keyboard, where it would be in the room for this and would not have to watch. Then she leaned over Trevor's shoulder, put one finger on the delete key, and did not press it.</w:t>
+        <w:t xml:space="preserve">Penny put her handbag down on the desk. She took out the face-down photograph, looked at the back of it for a moment, and put it face-down on the desk beside the keyboard, where it would be in the room for this and would not have to watch. Then she leaned over Derek's shoulder, put one finger on the delete key, and did not press it.</w:t>
       </w:r>
     </w:p>
     <w:p>
@@ -13737,7 +13373,7 @@
           <w:b w:val="0"/>
           <w:sz w:val="22"/>
         </w:rPr>
-        <w:t>"Nearest name," Penny said. "No act. She wasn't in the room. She didn't touch the sheet. She was asked not to file a heading she didn't read, and she refused the filing, and she told us why, and she was right. She is not the author. She is not the passenger. She was never going to be the passenger."</w:t>
+        <w:t xml:space="preserve">"Nearest name," Penny said. "No act. She wasn't in the room. She didn't touch the sheet. She was asked not to file a heading she didn't read, and she refused, and she was right. She is not the author. She is not the passenger. He's just made sure of the second."</w:t>
       </w:r>
     </w:p>
     <w:p>
@@ -13789,20 +13425,20 @@
           <w:b w:val="0"/>
           <w:sz w:val="22"/>
         </w:rPr>
-        <w:t>Trevor was looking past her at the floor. The yellow line was back behind the sill, where it had been at ten in the morning. Nobody had seen it go. The tape, when he bent to read it, said eight hundred and ninety-six millimetres and nothing more.</w:t>
-      </w:r>
-    </w:p>
-    <w:p>
-      <w:pPr>
-        <w:spacing w:after="160" w:line="240" w:lineRule="auto"/>
-      </w:pPr>
-      <w:r>
-        <w:rPr>
-          <w:rFonts w:ascii="Georgia" w:hAnsi="Georgia" w:eastAsia="Georgia"/>
-          <w:b w:val="0"/>
-          <w:sz w:val="22"/>
-        </w:rPr>
-        <w:t>Derek did not breathe wrong this time. The wrong breathing had been lunch. He found that he was breathing in an entirely ordinary way, in and out, the way he had breathed every day of his life before a Tuesday not long ago, and that his hands, for once, had nothing to straighten.</w:t>
+        <w:t xml:space="preserve">Trevor was looking past them at the floor. The yellow line was back behind the sill, where it had been at ten in the morning. Nobody had seen it go. The tape, when he bent to read it, said what it had said at ten.</w:t>
+      </w:r>
+    </w:p>
+    <w:p>
+      <w:pPr>
+        <w:spacing w:after="160" w:line="240" w:lineRule="auto"/>
+      </w:pPr>
+      <w:r>
+        <w:rPr>
+          <w:rFonts w:ascii="Georgia" w:hAnsi="Georgia" w:eastAsia="Georgia"/>
+          <w:b w:val="0"/>
+          <w:sz w:val="22"/>
+        </w:rPr>
+        <w:t xml:space="preserve">Derek found that he was breathing in an entirely ordinary way, in and out, the way he had breathed every day of his life before a Tuesday not long ago, and that his hands, for once, had nothing to straighten.</w:t>
       </w:r>
     </w:p>
     <w:p>
@@ -13828,7 +13464,7 @@
           <w:b w:val="0"/>
           <w:sz w:val="22"/>
         </w:rPr>
-        <w:t>"That's the acts," Penny corrected.</w:t>
+        <w:t xml:space="preserve">"That's the acts," said Penny.</w:t>
       </w:r>
     </w:p>
     <w:p>
@@ -13997,7 +13633,7 @@
           <w:b w:val="0"/>
           <w:sz w:val="22"/>
         </w:rPr>
-        <w:t>"Boarding refused. Her name is off the record. The sheet that was in my pocket this morning is still nobody's."</w:t>
+        <w:t xml:space="preserve">"Boarding refused. By me, at the line, at sixteen forty-one. Her name is off the record. The sheet in my pocket is still nobody's."</w:t>
       </w:r>
     </w:p>
     <w:p>
@@ -14023,20 +13659,20 @@
           <w:b w:val="0"/>
           <w:sz w:val="22"/>
         </w:rPr>
-        <w:t>She kissed him. It was brief. It was on the London side of a door that could not be shut, in full view of a railway, a stairwell, and a man at a keyboard who had immediately become fascinated by the font settings. The door stayed open because it could not do otherwise, and because he would not have shut her out if it could. He knew that now. He had known it on the Paddington pavement. He found that knowing it here, with the platform in the hinge and the board saying a word that was not a day, made it more true and not less.</w:t>
-      </w:r>
-    </w:p>
-    <w:p>
-      <w:pPr>
-        <w:spacing w:after="160" w:line="240" w:lineRule="auto"/>
-      </w:pPr>
-      <w:r>
-        <w:rPr>
-          <w:rFonts w:ascii="Georgia" w:hAnsi="Georgia" w:eastAsia="Georgia"/>
-          <w:b w:val="0"/>
-          <w:sz w:val="22"/>
-        </w:rPr>
-        <w:t>Trevor stood up, said nothing useful, and went to the kitchen. They heard the kettle go on. It was, by any reasonable reading, the correct kettle.</w:t>
+        <w:t xml:space="preserve">She kissed him. It was brief. It was on the London side of a door that could not be shut, in full view of a railway, a stairwell, and a man at a keyboard who had immediately become fascinated by the font settings. The door stayed open because it could not do otherwise, and because he would not have shut her out if it could.</w:t>
+      </w:r>
+    </w:p>
+    <w:p>
+      <w:pPr>
+        <w:spacing w:after="160" w:line="240" w:lineRule="auto"/>
+      </w:pPr>
+      <w:r>
+        <w:rPr>
+          <w:rFonts w:ascii="Georgia" w:hAnsi="Georgia" w:eastAsia="Georgia"/>
+          <w:b w:val="0"/>
+          <w:sz w:val="22"/>
+        </w:rPr>
+        <w:t xml:space="preserve">Trevor, who had taken the chair back, stood up again, said nothing useful, and went to the kitchen. They heard the kettle go on. It was, by any reasonable reading, the correct kettle.</w:t>
       </w:r>
     </w:p>
     <w:p>
@@ -14088,7 +13724,7 @@
           <w:b w:val="0"/>
           <w:sz w:val="22"/>
         </w:rPr>
-        <w:t>Rule: A record of a refusal is written after the refusal. It claims nothing earlier than itself.</w:t>
+        <w:t xml:space="preserve">Rule: Refuse first, then write it down. A record claims nothing earlier than itself.</w:t>
       </w:r>
     </w:p>
     <w:p>
@@ -14633,7 +14269,7 @@
           <w:b w:val="0"/>
           <w:sz w:val="22"/>
         </w:rPr>
-        <w:t>"It's the only one in your book. It's not the only one in London." Penny's voice had gone quick and flat. "And even if it was this one: you opened it onto an office. With a desk and a kettle and a bottle that can't hold tea. You locked it nine minutes later. The platform wasn't there. This morning the sheet was in this room before the door opened. Then the door. Then the voice. That's the order. You're not in it."</w:t>
+        <w:t xml:space="preserve">"It's the only one in your book. It's not the only one in London." Penny's voice had gone quick and flat. "And even if it was this one: you opened it onto an office. With a desk and a kettle and a bottle that can't hold tea. You locked it nine minutes later. The platform wasn't there."</w:t>
       </w:r>
     </w:p>
     <w:p>
@@ -14659,7 +14295,7 @@
           <w:b w:val="0"/>
           <w:sz w:val="22"/>
         </w:rPr>
-        <w:t>She was right. Derek knew she was right. It was the thing Weinstein had said that morning, the thing Trevor had done the sum for on the back of an envelope: same building, a day apart, everybody in the universe agreed which came first. Sunday at six was in the past of Monday morning. If anything on Sunday could have reached the door on Monday, Mrs Marsh's hand on the key could have.</w:t>
+        <w:t xml:space="preserve">She was right, and Derek knew it. Same building, a day apart: everybody in the universe agreed which came first. If anything on Sunday could have reached the door on Monday, Mrs Marsh's hand on the key could have.</w:t>
       </w:r>
     </w:p>
     <w:p>
@@ -14880,7 +14516,7 @@
           <w:b w:val="0"/>
           <w:sz w:val="22"/>
         </w:rPr>
-        <w:t>Penny took a sheet of the Bureau's paper from the tray and wrote on it, in her own fast, unambiguous hand. She did not ask permission. She wrote it the way she had written Sophie's line on the back of the Sunday slip, and when she had finished she turned it round so that Mrs Marsh could read it.</w:t>
+        <w:t xml:space="preserve">Penny took a sheet of the Bureau's paper from the tray and wrote on it, in her own fast hand. She did not ask permission. She wrote it the way she had written Sophie's line on the back of the Sunday slip, and when she had finished she turned it round so that Mrs Marsh could read it.</w:t>
       </w:r>
     </w:p>
     <w:p>
@@ -15101,7 +14737,7 @@
           <w:b w:val="0"/>
           <w:sz w:val="22"/>
         </w:rPr>
-        <w:t>"It's the same mistake the board made about Sophie. Only Sophie didn't have an act, and Mrs Marsh did, and it still wasn't enough." Penny picked up her handbag. "Nearest hand. Nearest name. Everybody wants a person in the empty field. Even the person."</w:t>
+        <w:t xml:space="preserve">"It's the same mistake the board made about Sophie," Penny said. "Only Sophie didn't have an act, and Mrs Marsh did, and it still wasn't enough. Nearest hand. Nearest name. Everybody wants a person in the empty field. Even the person."</w:t>
       </w:r>
     </w:p>
     <w:p>
@@ -15295,7 +14931,7 @@
           <w:b w:val="0"/>
           <w:sz w:val="22"/>
         </w:rPr>
-        <w:t>Julian was in the kitchen, standing at the hob with a wooden spoon and a clothes hanger, because he was always holding a clothes hanger. This one was beech, unfinished, with a shoulder he did not like yet. He put the spoon down when she came in and the hanger down a moment after, which was the correct order of priorities, and which she had noticed, the first year, as the thing about him that was entirely unlike Derek: when Julian put things down, he put them down in the order he had picked them up.</w:t>
+        <w:t xml:space="preserve">Julian was in the kitchen, standing at the hob with a wooden spoon in one hand and a clothes hanger in the other. It was his first Monday in the house. He had moved in on Sunday, the night the clocks went back, and had spent the extra hour, by his own account, deciding which drawer the hangers lived in; the boxes in the hall still said BOOKS on two sides. This hanger was beech, unfinished, with a shoulder he did not like yet. He put the spoon down when she came in and the hanger down a moment after, which was the correct order of priorities, and which she had noticed, the first year, as the thing about him that was entirely unlike Derek: when Julian put things down, he put them down in the order he had picked them up.</w:t>
       </w:r>
     </w:p>
     <w:p>
@@ -15854,7 +15490,7 @@
           <w:b w:val="0"/>
           <w:sz w:val="22"/>
         </w:rPr>
-        <w:t>Sophie was at the desk, doing homework that she had already done, in the way of somebody who wants to be in the room with her mother without having to say so. The notebook lay beside the homework, open at an earlier page, and Tuppence, who did not read other people's notebooks, could not help seeing the heading at the top of it, because it was in capitals and underlined twice: DAD'S STUDY CLOCK.</w:t>
+        <w:t xml:space="preserve">Sophie was at the desk, doing homework that she had already done, in the way of somebody who wants to be in the room with her mother without having to say so. The notebook lay beside the homework, open at an earlier page, and Tuppence, who did not read other people's notebooks, could not help seeing the heading at the top of it, because it was in capitals and underlined twice: DAD'S KITCHEN CLOCK.</w:t>
       </w:r>
     </w:p>
     <w:p>
@@ -15880,7 +15516,7 @@
           <w:b w:val="0"/>
           <w:sz w:val="22"/>
         </w:rPr>
-        <w:t>"Is that the brass one? On his windowsill?"</w:t>
+        <w:t xml:space="preserve">"Is that the one over his cooker? With the crack in the glass?"</w:t>
       </w:r>
     </w:p>
     <w:p>
@@ -16075,7 +15711,7 @@
           <w:b w:val="0"/>
           <w:sz w:val="22"/>
         </w:rPr>
-        <w:t>"He's frightened," Tuppence said, because her daughter had asked a direct question in her results voice and deserved the same thing back. "And he's tidying."</w:t>
+        <w:t xml:space="preserve">"He's frightened," Tuppence said, because her daughter had asked a direct question and deserved the same thing back. "And he's tidying."</w:t>
       </w:r>
     </w:p>
     <w:p>
@@ -16932,20 +16568,20 @@
           <w:b w:val="0"/>
           <w:sz w:val="22"/>
         </w:rPr>
-        <w:t>"It doesn't cancel. That's the thing. That's what everybody gets wrong." He was going faster now; she could hear it, the particular acceleration of Trevor when a problem had stopped being a problem and become a pleasure. "The clocks that run slow are the ones that move. But move compared with what? Not compared with the ground, because the ground's moving. You have to compare everyone against something that isn't going round. The centre of the Earth, if you like. Not actually the centre. Just a frame that isn't spinning. And in that frame, the ground's already moving east at three hundred, so its clocks are already slow. And you, flying east, are moving at three hundred plus your two hundred and fifty, give or take, so you're slower still. You're not two hundred and fifty faster than nothing. You're five hundred and something faster than nothing, and the ground's three hundred faster than nothing, and the difference in the slowing goes like the difference in the squares."</w:t>
-      </w:r>
-    </w:p>
-    <w:p>
-      <w:pPr>
-        <w:spacing w:after="40" w:line="240" w:lineRule="auto"/>
-      </w:pPr>
-      <w:r>
-        <w:rPr>
-          <w:rFonts w:ascii="Georgia" w:hAnsi="Georgia" w:eastAsia="Georgia"/>
-          <w:b w:val="0"/>
-          <w:sz w:val="22"/>
-        </w:rPr>
-        <w:t>"Say that in English."</w:t>
+        <w:t xml:space="preserve">"It doesn't cancel. That's what everybody gets wrong." He was going faster now; she could hear it, the particular acceleration of Trevor when a problem had stopped being a problem and become a pleasure. "Moving clocks run slow, but moving compared with what? Not the ground. The ground's moving. You have to measure everyone against something that isn't spinning. In that frame the ground's already doing three hundred east, so its clocks are already slow, and you, flying east, are doing three hundred plus your two-fifty. And the slowing goes with the square of the speed."</w:t>
+      </w:r>
+    </w:p>
+    <w:p>
+      <w:pPr>
+        <w:spacing w:after="40" w:line="240" w:lineRule="auto"/>
+      </w:pPr>
+      <w:r>
+        <w:rPr>
+          <w:rFonts w:ascii="Georgia" w:hAnsi="Georgia" w:eastAsia="Georgia"/>
+          <w:b w:val="0"/>
+          <w:sz w:val="22"/>
+        </w:rPr>
+        <w:t xml:space="preserve">"Shorter."</w:t>
       </w:r>
     </w:p>
     <w:p>
@@ -17153,32 +16789,6 @@
           <w:b w:val="0"/>
           <w:sz w:val="22"/>
         </w:rPr>
-        <w:t>"And the ground in Athens? Is that a different rate from the ground here? It's going faster, you said."</w:t>
-      </w:r>
-    </w:p>
-    <w:p>
-      <w:pPr>
-        <w:spacing w:after="160" w:line="240" w:lineRule="auto"/>
-      </w:pPr>
-      <w:r>
-        <w:rPr>
-          <w:rFonts w:ascii="Georgia" w:hAnsi="Georgia" w:eastAsia="Georgia"/>
-          <w:b w:val="0"/>
-          <w:sz w:val="22"/>
-        </w:rPr>
-        <w:t>"No. That's the other lovely thing. Every clock at sea level ticks at the same rate. London, Athens, the North Pole. The ones near the equator are going faster round, so they ought to be slower, but the Earth bulges at the equator, because it's spinning, so they're also further from the middle, so they're higher up, so they're faster. And it exactly cancels. It has to. The sea settles itself into the shape where it cancels; that's what the shape of the sea is. So you don't have to worry about Greece. Greece is the same as here. It's only the bit in the air that's different."</w:t>
-      </w:r>
-    </w:p>
-    <w:p>
-      <w:pPr>
-        <w:spacing w:after="160" w:line="240" w:lineRule="auto"/>
-      </w:pPr>
-      <w:r>
-        <w:rPr>
-          <w:rFonts w:ascii="Georgia" w:hAnsi="Georgia" w:eastAsia="Georgia"/>
-          <w:b w:val="0"/>
-          <w:sz w:val="22"/>
-        </w:rPr>
         <w:t>Penny found that she was smiling at the itinerary, which was ridiculous, and stopped.</w:t>
       </w:r>
     </w:p>
@@ -17348,7 +16958,7 @@
           <w:b w:val="0"/>
           <w:sz w:val="22"/>
         </w:rPr>
-        <w:t>Penny sat very still. She thought about a sheet of paper with a line on it, and a voice that had come late through three soft knocks, and a slip from a station telling a woman not to open a door she had already locked again. She thought about what Weinstein had said at lunchtime, after Tuppence had gone: the same sentence early is advice, and late it is an apology. He had meant it about warnings. He had not, at the time, been thinking about her.</w:t>
+        <w:t xml:space="preserve">Penny did not move. She thought about a sheet of paper and a voice that had come late through three soft knocks, and about what Weinstein had said after Tuppence had gone: the same sentence early is advice, and late it is an apology. He had meant it about warnings. He had not, at the time, been thinking about her.</w:t>
       </w:r>
     </w:p>
     <w:p>
@@ -17673,7 +17283,7 @@
           <w:b w:val="0"/>
           <w:sz w:val="22"/>
         </w:rPr>
-        <w:t>He rang off. She sat for a while with the phone in her hand and the itinerary in front of her, and the kettle she had boiled at seven and forgotten, and the rain on the window, and a train somewhere across London lit at all its windows in a doorway on the second floor of an old building, with Derek sitting in front of it with the face.</w:t>
+        <w:t xml:space="preserve">He rang off. She sat for a while with the phone in her hand and the itinerary in front of her, and the kettle she had boiled at seven and forgotten, and the rain on the window, and a train somewhere across London in a doorway on the second floor of an old building, with Derek sitting in front of it with the face.</w:t>
       </w:r>
     </w:p>
     <w:p>
@@ -17699,7 +17309,7 @@
           <w:b w:val="0"/>
           <w:sz w:val="22"/>
         </w:rPr>
-        <w:t>Instead she picked up the biro, turned the itinerary over to the front, and wrote along the top margin, above the flight number, in her own fast and unambiguous hand, the things Trevor had told her to write down, in the order he had said them, with a space after each one for the number she did not yet have.</w:t>
+        <w:t xml:space="preserve">Instead she picked up the biro, turned the itinerary over to the front, and wrote along the top margin, above the flight number, in her own fast hand, the things Trevor had told her to write down, in the order he had said them, with a space after each one for the number she did not yet have.</w:t>
       </w:r>
     </w:p>
     <w:p>
@@ -17893,7 +17503,7 @@
           <w:b w:val="0"/>
           <w:sz w:val="22"/>
         </w:rPr>
-        <w:t>It was, he thought, almost the whole lecture. The light came from there to here. It came across the sill without being asked, the way light does, and it reached him, and he could see the train because of it. Nothing of his had to go back the other way for that to happen. Light could come from there to here all night without anything of his going from here to there. Seeing was not boarding. Being lit by a thing was not being on it. Weinstein would have drawn it as a cone, and Herbert would have drawn it more neatly, and Trevor would have done the sum on an envelope, and they would all have meant the same thing: what reaches you is in your past. What you reach is in your future. The two are not the same set, and a man sitting very still in a chair can be reached by a thing all night without once reaching back, for as long as he likes.</w:t>
+        <w:t xml:space="preserve">It was, he thought, almost the whole lecture. The light came across the sill without being asked, and reached him, and nothing of his had to go back the other way for that to happen. Seeing was not boarding. Being lit by a thing was not being on it. What reaches you is in your past; what you reach is in your future; and a man sitting very still in a chair can be reached by a thing all night without once reaching back, for as long as he likes.</w:t>
       </w:r>
     </w:p>
     <w:p>
@@ -18270,7 +17880,7 @@
           <w:b w:val="0"/>
           <w:sz w:val="22"/>
         </w:rPr>
-        <w:t>He looked at it for a long time. He wanted to know the date on that newspaper more than he had wanted anything all day, except the one thing, the three seconds, which had been worse.</w:t>
+        <w:t xml:space="preserve">He wanted to know the date on that newspaper more than he had wanted anything all day, except the one thing, the three seconds, which had been worse.</w:t>
       </w:r>
     </w:p>
     <w:p>
@@ -18296,7 +17906,7 @@
           <w:b w:val="0"/>
           <w:sz w:val="22"/>
         </w:rPr>
-        <w:t>He said it to the platform, in his own voice, the one for tea. It was the word Sherlock had sent at lunch, he realised, the single word on Trevor's screen, refusing a case before it was offered. He had thought at the time it meant the dolphin did not want it. He thought now it might simply have been the correct reply to a railway, given early enough to be useful.</w:t>
+        <w:t xml:space="preserve">He said it to the platform in his own voice, the one for tea, as he had said it at sixteen forty-one with his feet on the yellow line. It was the word Sherlock had sent at lunch, he realised, the single word on Trevor's screen, refusing a case before it was offered. He had thought at the time it meant the dolphin did not want it. He thought now that it might simply have been the correct reply to a railway, and that it needed saying more than once.</w:t>
       </w:r>
     </w:p>
     <w:p>
@@ -18542,7 +18152,7 @@
           <w:b w:val="0"/>
           <w:sz w:val="22"/>
         </w:rPr>
-        <w:t>Weinstein looked at it. It was, of course, immaculate. The office's history ran up the page in one clean line. Near the bottom, a small mark, labelled in Herbert's handwriting: SHEET. Above it: DOOR. Above that: VOICE. Then a gap, and a mark labelled READ, 10:22, and higher, far up, a mark labelled REFUSAL, 16:41. Off to one side, a little below the whole thing, on a separate short line of its own, a mark labelled: SUNDAY. RADIATOR.</w:t>
+        <w:t xml:space="preserve">Weinstein looked at it. It was, of course, immaculate: one clean vertical line for the office's history, and on it, from the bottom, SHEET, DOOR, VOICE, READ 10:22, REFUSAL 16:41. Off to one side, on a short line of its own, SUNDAY. RADIATOR.</w:t>
       </w:r>
     </w:p>
     <w:p>
@@ -18633,7 +18243,7 @@
           <w:b w:val="0"/>
           <w:sz w:val="22"/>
         </w:rPr>
-        <w:t>"I was the first to see it. I was standing at Derek's desk, being polite, which I had come to London to be, and I looked down, and it was there. It had not been there a moment before. I am quite sure of that. I am a patent attorney; I notice paper. And then it was in my hand, and then, because I am polite, in Derek's hand, and then the door opened. I did not read it until afterwards. None of us did."</w:t>
+        <w:t xml:space="preserve">"I was the first to see it. I was standing at Derek's desk, being polite, and I looked down, and it was there. I am a patent attorney; I notice paper. It had not been there a moment before. Then it was in my hand, and then, because I am polite, in Derek's, and then the door opened."</w:t>
       </w:r>
     </w:p>
     <w:p>
@@ -18815,7 +18425,7 @@
           <w:b w:val="0"/>
           <w:sz w:val="22"/>
         </w:rPr>
-        <w:t>"I am saying you are not necessary. You were the nearest hand. That is all. A sheet of paper appeared, and you were the man standing nearest to the desk, and so you have spent a night and a morning trying to make yourself its author, because a blank is unbearable and a name, even your own name, is less unbearable than a blank." Herbert put the pencil away. "Mr Gent's daughter did not do it. That woman on the stairs did not do it, though she tried very hard to. You are now trying to do it. It is the same mistake three times in two days. I find it very restful that it is the same mistake. It means the case was consistent."</w:t>
+        <w:t xml:space="preserve">"I am saying you are not necessary. You were the nearest hand. A blank is unbearable, and a name, even your own, is less unbearable than a blank." Herbert put the pencil away. "Mr Gent's daughter did not do it. That woman on the stairs did not do it, though she tried very hard to. You are now trying to do it. It is the same mistake three times in two days. I find that very restful. It means the case is consistent."</w:t>
       </w:r>
     </w:p>
     <w:p>
@@ -18919,7 +18529,7 @@
           <w:b w:val="0"/>
           <w:sz w:val="22"/>
         </w:rPr>
-        <w:t>"Because the order was the easy part. You were right about the order. Sheet, door, voice. It didn't tell anyone who to be frightened for. They had to work that out themselves. In a station. With a slip from lost property and a pencil."</w:t>
+        <w:t xml:space="preserve">"Because the order was the easy part. It didn't tell anyone who to be frightened for. They had to work that out for themselves, in a station, with a slip from lost property and a pencil. And then Derek had to stand on a railway and say no to it. The order did not do that either."</w:t>
       </w:r>
     </w:p>
     <w:p>
@@ -18958,46 +18568,20 @@
           <w:b w:val="0"/>
           <w:sz w:val="22"/>
         </w:rPr>
-        <w:t>Then he got out his phone, and opened the flight times Penny had shown him on Monday, standing under the departure board at Paddington with the itinerary half out of her bag. London to Athens. Three and a half hours, or near enough. Cruising at eleven kilometres. He did the sum on the back of the dishwasher's patent application, in ink: the gravitational part, which made her clock run a little faster up there, and the speed part, which made it run a little slower, and the gravitational part won, as it always did at airliner heights.</w:t>
-      </w:r>
-    </w:p>
-    <w:p>
-      <w:pPr>
-        <w:spacing w:after="160" w:line="240" w:lineRule="auto"/>
-      </w:pPr>
-      <w:r>
-        <w:rPr>
-          <w:rFonts w:ascii="Georgia" w:hAnsi="Georgia" w:eastAsia="Georgia"/>
-          <w:b w:val="0"/>
-          <w:sz w:val="22"/>
-        </w:rPr>
-        <w:t>About ten billionths of a second, one way. He had told her that at the station. He checked it anyway, twice.</w:t>
-      </w:r>
-    </w:p>
-    <w:p>
-      <w:pPr>
-        <w:spacing w:after="160" w:line="240" w:lineRule="auto"/>
-      </w:pPr>
-      <w:r>
-        <w:rPr>
-          <w:rFonts w:ascii="Georgia" w:hAnsi="Georgia" w:eastAsia="Georgia"/>
-          <w:b w:val="0"/>
-          <w:sz w:val="22"/>
-        </w:rPr>
-        <w:t>It was, he thought, the first number in the whole affair whose origin he knew exactly.</w:t>
-      </w:r>
-    </w:p>
-    <w:p>
-      <w:pPr>
-        <w:spacing w:after="160" w:line="240" w:lineRule="auto"/>
-      </w:pPr>
-      <w:r>
-        <w:rPr>
-          <w:rFonts w:ascii="Georgia" w:hAnsi="Georgia" w:eastAsia="Georgia"/>
-          <w:b w:val="0"/>
-          <w:sz w:val="22"/>
-        </w:rPr>
-        <w:t>He decided he would not send it to her. It was not his number. It was hers, and she would send it to him from the air, a week on Thursday, at whatever altitude she happened to be at when she remembered. He would be annoyed. He was already looking forward to it.</w:t>
+        <w:t xml:space="preserve">Then he got out his phone and did Penny's sum again, on the back of the dishwasher's patent application, in ink, the textbook way: height makes a clock run fast, speed makes it run slow, and at airliner heights the height wins. About ten billionths of a second. He checked it twice. It was, he thought, the first number in the whole affair whose origin he knew exactly.</w:t>
+      </w:r>
+    </w:p>
+    <w:p>
+      <w:pPr>
+        <w:spacing w:after="160" w:line="240" w:lineRule="auto"/>
+      </w:pPr>
+      <w:r>
+        <w:rPr>
+          <w:rFonts w:ascii="Georgia" w:hAnsi="Georgia" w:eastAsia="Georgia"/>
+          <w:b w:val="0"/>
+          <w:sz w:val="22"/>
+        </w:rPr>
+        <w:t xml:space="preserve">He would not send it to her. It was her number. She would send it to him from the air, a week on Thursday, and he would be annoyed, and he was already looking forward to it.</w:t>
       </w:r>
     </w:p>
     <w:p>
@@ -19269,7 +18853,7 @@
           <w:b w:val="0"/>
           <w:sz w:val="22"/>
         </w:rPr>
-        <w:t>They were not a collection in the ordinary sense. Nobody would have collected them for their beauty. There was a kitchen timer shaped like a tomato. There was a station clock, small, of the kind that hangs over platforms, with its cable cut. There was a ship's chronometer in a box, a child's alarm clock with bells, two wristwatches lying on their backs, an hourglass, a candle marked in rings, a metronome, a digital thing from a car dashboard wired to a battery, a pendulum clock lying on its side, which was therefore not going, and others Herbert did not stop to catalogue. Every one that told the time at all told a different one. Not slightly different. Different. The station clock said twenty past nine. The chronometer said a quarter to five. The tomato said nothing, because it was a timer and did not believe in the hour at all, only in how long until the next thing.</w:t>
+        <w:t xml:space="preserve">They were not a collection in the ordinary sense. Nobody would have collected them for their beauty. There was a kitchen timer shaped like a tomato. There was a station clock, small, of the kind that hangs over platforms, with its cable cut. There was a ship's chronometer in a box, a child's alarm clock with bells, two wristwatches lying on their backs, an hourglass, a candle marked in rings, a metronome, a pendulum clock lying on its side, which was therefore not going, and others Herbert did not stop to catalogue. Every one that told the time at all told a different one. Not slightly different. Different. The station clock said twenty past nine. The chronometer said a quarter to five. The tomato said nothing, because it was a timer and did not believe in the hour at all, only in how long until the next thing.</w:t>
       </w:r>
     </w:p>
     <w:p>
@@ -19425,7 +19009,7 @@
           <w:b w:val="0"/>
           <w:sz w:val="22"/>
         </w:rPr>
-        <w:t>Herbert turned it round. It was the same sheet he had shown Alfred that morning, squared paper, a vertical line drawn with a ruler up the middle of the page, and on it, in order from the bottom, small marks with labels in his hand: SHEET. DOOR. VOICE. READ, 10:22. REFUSAL, 16:41. Off to one side, lower, on a short line of its own: SUNDAY. RADIATOR. Beside SHEET, in pencil, the small question mark he had added at ten o'clock in Schwabing.</w:t>
+        <w:t xml:space="preserve">Herbert turned it round: the same squared sheet he had shown Alfred that morning, the ruled line, the labelled marks, and beside SHEET the small pencilled question mark.</w:t>
       </w:r>
     </w:p>
     <w:p>
@@ -19555,7 +19139,7 @@
           <w:b w:val="0"/>
           <w:sz w:val="22"/>
         </w:rPr>
-        <w:t>"Good. That is the case. Sheet, door, voice, reading, refusal. Five events and which is next to which. Mr Gent did not need anything else. He did not need the line. He did not need a single minute. He needed to know that the sheet was before the door, and the door before the voice, and the voice was too late to stop the door, and the train was still in front of all of it. That is order. That is a relation." Barbarian leaned back. "Now. Which number in this whole affair misled everybody?"</w:t>
+        <w:t xml:space="preserve">"Good. That is the case. Five events and which is next to which. Mr Gent did not need the line. He did not need a single minute. He needed the order, and the train still in front of all of it." Barbarian leaned back. "Now. Which number in this whole affair misled everybody?"</w:t>
       </w:r>
     </w:p>
     <w:p>
@@ -19594,7 +19178,7 @@
           <w:b w:val="0"/>
           <w:sz w:val="22"/>
         </w:rPr>
-        <w:t>"Seventeen minutes. Ten oh five to ten twenty-two. A duration. A length of your wire. The office spent half a day trying to make it mean something, because it had a number and the number looked like the other number, on Sunday, and people love a number that looks like another number. And it meant nothing. It was how long four people took to read a sheet of paper. The case was solved by order. It was nearly ruined by duration."</w:t>
+        <w:t xml:space="preserve">"Seventeen minutes. A duration. A length of your wire. The office spent half a day trying to make it mean something because it looked like Sunday's seventeen, and it was how long four people took to read a sheet of paper. The case was solved by order. It was nearly ruined by duration."</w:t>
       </w:r>
     </w:p>
     <w:p>
@@ -19672,7 +19256,7 @@
           <w:b w:val="0"/>
           <w:sz w:val="22"/>
         </w:rPr>
-        <w:t>"In steps. One." He laid the pencil beside the drawing, parallel to the ruled line, exactly. "Between the door and the reading there is a quantity which every clock at rest in that office would agree on, if it had been wound, whatever it said at the start. The difference between its readings. That quantity does not depend on Braunschweig. It does not depend on what time anybody set. It is the length of the office's history between those two events, and in relativity it is the one thing about the interval that every observer, moving or not, will agree upon. It is not a convention. It is geometry. Two."</w:t>
+        <w:t xml:space="preserve">"In steps. One." He laid the pencil beside the drawing, parallel to the ruled line, exactly. "Between the door and the reading there is a quantity every good clock at rest in that office would agree on, whatever it said at the start: the difference between its readings. It does not depend on Braunschweig. In relativity it is the one thing about that interval every observer agrees upon. It is not a convention. It is geometry. Two."</w:t>
       </w:r>
     </w:p>
     <w:p>
@@ -19737,7 +19321,7 @@
           <w:b w:val="0"/>
           <w:sz w:val="22"/>
         </w:rPr>
-        <w:t>"By counting. Each one counts its own motion. A pendulum counts swings. A quartz counts vibrations. Braunschweig counts the vibrations of caesium atoms, nine billion one hundred and ninety-two million six hundred and thirty-one thousand seven hundred and seventy of them to the second, because in 1967 a committee in Paris agreed that it would. Before that the second was a fraction of the year, because the astronomers had decided the Earth going round the Sun was the thing to count. Before that it was a fraction of the day. Every second there has ever been is one motion counted against another motion. None of them is time. There is no time in any of it. There is only counting, and comparing the counts." He spread his hands over the twenty clocks. "These do not measure time. They measure each other. That is all a clock has ever done."</w:t>
+        <w:t xml:space="preserve">"By counting. Each one counts its own motion. A pendulum counts swings. Braunschweig counts caesium atoms, because a committee in Paris told it to. Every second there has ever been is one motion counted against another. There is no time in any of it. There is only counting, and comparing the counts." He spread his hands over the twenty clocks. "These do not measure time. They measure each other."</w:t>
       </w:r>
     </w:p>
     <w:p>
@@ -19815,7 +19399,7 @@
           <w:b w:val="0"/>
           <w:sz w:val="22"/>
         </w:rPr>
-        <w:t>"Two. Grant you the counting. Grant you that a second is a convention about which motion to count. When two clocks that were together at the door are compared together at the reading, they will agree on the count between, if they are good clocks and at rest. They will agree regardless of the convention. The agreement is not a convention. It is a fact about the world. You may call it a relation between two counts if you like, but it is a relation that the world enforces, and it has a number, and the number is the same for everyone who goes that way between those two events. Three—"</w:t>
+        <w:t xml:space="preserve">"Two. Grant you the counting. Two good clocks at rest, together at the door and together at the reading, agree on the count between, whatever convention you choose. That agreement is not a convention. The world enforces it. Three—"</w:t>
       </w:r>
     </w:p>
     <w:p>
@@ -19854,7 +19438,7 @@
           <w:b w:val="0"/>
           <w:sz w:val="22"/>
         </w:rPr>
-        <w:t>"You were going to say that therefore duration is real. It is not therefore. It is a relation between two motions that the world keeps consistent. I give you that. I have always given you that. I give you that the world is extraordinarily well behaved about which counts agree. What I do not give you is the wire." Barbarian tapped the ruled line on the drawing, once, very lightly, with the end of a finger, the only time he touched the paper. "You have the events. You have the order. You have the counts, if anybody counted, which this office mostly did not. Where in any of that is the line?"</w:t>
+        <w:t xml:space="preserve">"You were going to say that therefore duration is real. It is not therefore. I give you that the world is extraordinarily well behaved about which counts agree. What I do not give you is the wire." Barbarian tapped the ruled line once with the end of a finger, the only time he touched the paper. "You have the events. You have the order. You have the counts, if anybody counted, which this office mostly did not. Where in any of that is the line?"</w:t>
       </w:r>
     </w:p>
     <w:p>
@@ -19971,7 +19555,7 @@
           <w:b w:val="0"/>
           <w:sz w:val="22"/>
         </w:rPr>
-        <w:t>"It is wrong in the form he asks it. Who sent it. Sent is a verb with a before inside it. He wants a person standing at the before, holding the sheet out. But he has no before. He has the sheet and the door. That is all the relations he possesses that touch it. You cannot get a sender out of an order. You can only get one out of a mechanism. He has no mechanism. So he has no sender." Barbarian considered. "Alfred thinks it was himself, I suppose."</w:t>
+        <w:t xml:space="preserve">"It is wrong in the form he asks it. Who sent it. Sent is a verb with a before inside it. He wants a person standing at the before, holding the sheet out. But you cannot get a sender out of an order. You can only get one out of a mechanism, and he has no mechanism." Barbarian considered. "Alfred thinks it was himself, I suppose."</w:t>
       </w:r>
     </w:p>
     <w:p>
@@ -19997,7 +19581,7 @@
           <w:b w:val="0"/>
           <w:sz w:val="22"/>
         </w:rPr>
-        <w:t>"Of course he does. He was holding it. He wants to be the before. People always want to be the before; it is the only position in a story that cannot be blamed for arriving late." Barbarian shook his head, slowly, with every appearance of affection. "Tell him to want the relation instead. Tell him he is in the order, and that is honour enough for anyone. Sheet before door. He was there for the sheet. That is all."</w:t>
+        <w:t xml:space="preserve">"Of course he does. He was holding it. People always want to be the before; it is the only position in a story that cannot be blamed for arriving late." Barbarian shook his head, slowly, with every appearance of affection. "Tell him he is in the order, and that is honour enough for anyone. He was there for the sheet. That is all."</w:t>
       </w:r>
     </w:p>
     <w:p>
@@ -20101,7 +19685,7 @@
           <w:b w:val="0"/>
           <w:sz w:val="22"/>
         </w:rPr>
-        <w:t>"Three. You say the case was solved by order, and nearly ruined by duration. I agree. I have agreed all along. But you have left something out. Order on one line is cheap. Of course everything in one office is in one order; the office does not go anywhere. What made the case hard was not the order in the office. It was that a sheet and a voice purported to come from somewhere else, and you cannot order events in different places unless you know whether a signal could have passed between them. That is the cone. That is not a relation between counts. That is the structure of the world. It tells you which pairs can be ordered at all and which cannot. You may take away my ruler. You may not take away the cone. Without the cone your relations are a heap. With it they are a—"</w:t>
+        <w:t xml:space="preserve">"Three. Order on one line is cheap. Of course everything in one office is in one order; the office does not go anywhere. What made the case hard is that a sheet and a voice purported to come from somewhere else, and you cannot order events in different places unless you know whether a signal could pass between them. That is the cone. You may take away my ruler. You may not take away the cone. Without it your relations are a heap. With it they are a—"</w:t>
       </w:r>
     </w:p>
     <w:p>
@@ -20127,7 +19711,7 @@
           <w:b w:val="0"/>
           <w:sz w:val="22"/>
         </w:rPr>
-        <w:t>"I am going on. With it they are a partial order. Some pairs before and after. Some pairs neither. The door and the voice, both in the office: ordered. The sheet and its sender, wherever he is: unknown, because we do not know where he is, and so we do not know whether the pair can be ordered at all, and that is the only honest reason the sender stays blank. Not that the question is wrong. That the pair is not yet in the shape."</w:t>
+        <w:t xml:space="preserve">"I am going on. With it they are a partial order. Some pairs before and after. Some pairs neither. The door and the voice: ordered. The sheet and its sender, wherever he is: unknown, because we do not know where he stands, and so we do not know whether the pair can be ordered at all."</w:t>
       </w:r>
     </w:p>
     <w:p>
@@ -20179,7 +19763,7 @@
           <w:b w:val="0"/>
           <w:sz w:val="22"/>
         </w:rPr>
-        <w:t>"The sender stays blank because we do not know where the sender stands in the shape. That is all. It is not a mystery. It is a missing coordinate. When Mr Gent leaves that field empty, he is not refusing to ask. He is writing down accurately that one of his events has no place yet. That is not the wrong question. That is the right answer to a question that has not been finished. Now you may speak."</w:t>
+        <w:t xml:space="preserve">"The sender stays blank because we do not know where the sender stands in the shape. It is not a mystery. It is a missing coordinate. When Mr Gent leaves that field empty, he is writing down accurately that one of his events has no place yet. Now you may speak."</w:t>
       </w:r>
     </w:p>
     <w:p>
@@ -20348,7 +19932,7 @@
           <w:b w:val="0"/>
           <w:sz w:val="22"/>
         </w:rPr>
-        <w:t>Barbarian looked at it for a long time.</w:t>
+        <w:t xml:space="preserve">Barbarian looked at it.</w:t>
       </w:r>
     </w:p>
     <w:p>
@@ -20478,7 +20062,7 @@
           <w:b w:val="0"/>
           <w:sz w:val="22"/>
         </w:rPr>
-        <w:t>"Monday. The train. He told me on the telephone he very nearly stayed. He said he got on the airport train at four, and turned round once at the barrier, and did not come back through it. Staying would have been a tenancy. He hurried. He was right to. It was the one act in the whole day with a perfectly clear place in the shape: after the door, before the refusal was written down, before anything else could happen to him. A man who leaves on time is a man who knows where he is in the order." He paused. "Do not tell him I said he was right. Tell him the hurry was. He will know the difference and it will annoy him."</w:t>
+        <w:t xml:space="preserve">"Monday. He told me on the telephone that he very nearly stayed. He went through the barrier at four and turned round once and did not come back. Staying would have been a tenancy. It was the cleanest act of the day, until Mr Gent's. Do not tell him I said he was right. Tell him the hurry was. He will know the difference, and it will annoy him."</w:t>
       </w:r>
     </w:p>
     <w:p>
@@ -20517,20 +20101,7 @@
           <w:b w:val="0"/>
           <w:sz w:val="22"/>
         </w:rPr>
-        <w:t>He wrote four hundred words, and read them, and found that they explained the joke, and deleted them. He wrote two hundred, and found that they agreed with Herbert, and deleted those too, because a letter that agreed with Herbert would be read in London as a letter from Herbert. He wrote a single line about the board and deleted it because it was envious. Then he looked at the clocks for a while, all twenty of them, the station clock and the tomato and the chronometer and the two wristwatches on their backs, each one perfectly honest and none of them in agreement, and he found that he was content, and wrote what he meant.</w:t>
-      </w:r>
-    </w:p>
-    <w:p>
-      <w:pPr>
-        <w:spacing w:after="160" w:line="240" w:lineRule="auto"/>
-      </w:pPr>
-      <w:r>
-        <w:rPr>
-          <w:rFonts w:ascii="Georgia" w:hAnsi="Georgia" w:eastAsia="Georgia"/>
-          <w:b w:val="0"/>
-          <w:sz w:val="22"/>
-        </w:rPr>
-        <w:t>You had two events and a relation. Congratulations. I have twenty clocks and not one of them agrees with you. They do not agree with each other either. I find it restful. Tell Alfred the hurry was correct this once. Barbarian.</w:t>
+        <w:t xml:space="preserve">He wrote four hundred words, and found that they explained the joke, and deleted them. He wrote two hundred, and found that they agreed with Herbert, and deleted those too, because a letter that agreed with Herbert would be read in London as a letter from Herbert. Then he looked at the clocks for a while, the station clock and the tomato and the chronometer and the two wristwatches on their backs, each one perfectly honest and none of them in agreement, and found that he was content, and wrote four lines that said what he meant.</w:t>
       </w:r>
     </w:p>
     <w:p>
@@ -20659,7 +20230,7 @@
           <w:b w:val="0"/>
           <w:sz w:val="22"/>
         </w:rPr>
-        <w:t>"It should have updated," he complained.</w:t>
+        <w:t xml:space="preserve">"It should have updated," he said.</w:t>
       </w:r>
     </w:p>
     <w:p>
@@ -21114,7 +20685,7 @@
           <w:b w:val="0"/>
           <w:sz w:val="22"/>
         </w:rPr>
-        <w:t>"No," said Derek. "But you could. That's the difference, and it's the whole difference. We refused to get on a train yesterday. That was an act, and we were allowed to refuse it, and it worked. You're refusing a fact. You can't. It's there whether you turn round or not. All you can do is not write it down."</w:t>
+        <w:t xml:space="preserve">"No," said Derek. "But you could. That's the difference, and it's the whole difference. I refused to get on a train yesterday. That was an act, and I was allowed to refuse it, and it worked. You're refusing a fact. You can't. It's there whether you turn round or not. All you can do is not write it down."</w:t>
       </w:r>
     </w:p>
     <w:p>
@@ -21205,7 +20776,488 @@
           <w:b w:val="0"/>
           <w:sz w:val="22"/>
         </w:rPr>
-        <w:t>Mr Pendleton put his head round the outer door just after lunch to confirm that the form for unauthorised railways was not his, and that he had looked, and that it was not in this building, and might not be in this continuum, and he was sorry. Nobody had asked. He went away again looking relieved, as if he had been carrying the information since Monday and had been waiting for somewhere to put it down.</w:t>
+        <w:t xml:space="preserve">Mr Pendleton came up just after lunch, at the speed of a man who has never once been sure he is in the right building, and this time he did not put his head round the outer door. He came all the way in. He was carrying a lever-arch file in both arms, the way a man carries a baby he has been told is his.</w:t>
+      </w:r>
+    </w:p>
+    <w:p>
+      <w:pPr>
+        <w:spacing w:after="160" w:line="240" w:lineRule="auto"/>
+      </w:pPr>
+      <w:r>
+        <w:rPr>
+          <w:rFonts w:ascii="Georgia" w:hAnsi="Georgia" w:eastAsia="Georgia"/>
+          <w:b w:val="0"/>
+          <w:sz w:val="22"/>
+        </w:rPr>
+        <w:t xml:space="preserve">"I have found it," he said.</w:t>
+      </w:r>
+    </w:p>
+    <w:p>
+      <w:pPr>
+        <w:spacing w:after="160" w:line="240" w:lineRule="auto"/>
+      </w:pPr>
+      <w:r>
+        <w:rPr>
+          <w:rFonts w:ascii="Georgia" w:hAnsi="Georgia" w:eastAsia="Georgia"/>
+          <w:b w:val="0"/>
+          <w:sz w:val="22"/>
+        </w:rPr>
+        <w:t xml:space="preserve">Nobody understood him at first. Mr Pendleton had been not finding things for the Bureau since Monday morning, with great thoroughness and real sorrow, and his not finding had become a fixture of the building, like the fourth step.</w:t>
+      </w:r>
+    </w:p>
+    <w:p>
+      <w:pPr>
+        <w:spacing w:after="160" w:line="240" w:lineRule="auto"/>
+      </w:pPr>
+      <w:r>
+        <w:rPr>
+          <w:rFonts w:ascii="Georgia" w:hAnsi="Georgia" w:eastAsia="Georgia"/>
+          <w:b w:val="0"/>
+          <w:sz w:val="22"/>
+        </w:rPr>
+        <w:t xml:space="preserve">"The form. For the platform. It was not in Structural, and it was not in Unauthorised Occupancy, and it was not in Acts of God. It was in the basement, in a box marked BRITISH RAIL (LONDON MIDLAND REGION), MISCELLANEOUS, 1974, which has been down there longer than the boiler and which nobody has opened in my time." He set the file on Derek's desk and opened it at a page marked with a bus ticket. "It is not my form. But it is a form. I wished you to know that it exists, so that nobody can say it was not looked for."</w:t>
+      </w:r>
+    </w:p>
+    <w:p>
+      <w:pPr>
+        <w:spacing w:after="160" w:line="240" w:lineRule="auto"/>
+      </w:pPr>
+      <w:r>
+        <w:rPr>
+          <w:rFonts w:ascii="Georgia" w:hAnsi="Georgia" w:eastAsia="Georgia"/>
+          <w:b w:val="0"/>
+          <w:sz w:val="22"/>
+        </w:rPr>
+        <w:t xml:space="preserve">The form was printed in a brown that had once been orange, on paper that had once been white. Its heading said: NOTIFICATION OF A PLATFORM ARISING IN NON-RAILWAY PREMISES (FORM PL/9).</w:t>
+      </w:r>
+    </w:p>
+    <w:p>
+      <w:pPr>
+        <w:spacing w:after="160" w:line="240" w:lineRule="auto"/>
+      </w:pPr>
+      <w:r>
+        <w:rPr>
+          <w:rFonts w:ascii="Georgia" w:hAnsi="Georgia" w:eastAsia="Georgia"/>
+          <w:b w:val="0"/>
+          <w:sz w:val="22"/>
+        </w:rPr>
+        <w:t xml:space="preserve">Trevor took his glasses off. Penny came round the desk. Even Mrs Marsh, who had been on her way down, came back up two steps to see.</w:t>
+      </w:r>
+    </w:p>
+    <w:p>
+      <w:pPr>
+        <w:spacing w:after="160" w:line="240" w:lineRule="auto"/>
+      </w:pPr>
+      <w:r>
+        <w:rPr>
+          <w:rFonts w:ascii="Georgia" w:hAnsi="Georgia" w:eastAsia="Georgia"/>
+          <w:b w:val="0"/>
+          <w:sz w:val="22"/>
+        </w:rPr>
+        <w:t xml:space="preserve">"Arising," said Penny.</w:t>
+      </w:r>
+    </w:p>
+    <w:p>
+      <w:pPr>
+        <w:spacing w:after="160" w:line="240" w:lineRule="auto"/>
+      </w:pPr>
+      <w:r>
+        <w:rPr>
+          <w:rFonts w:ascii="Georgia" w:hAnsi="Georgia" w:eastAsia="Georgia"/>
+          <w:b w:val="0"/>
+          <w:sz w:val="22"/>
+        </w:rPr>
+        <w:t xml:space="preserve">"It was a very confident decade," said Mr Pendleton.</w:t>
+      </w:r>
+    </w:p>
+    <w:p>
+      <w:pPr>
+        <w:spacing w:after="160" w:line="240" w:lineRule="auto"/>
+      </w:pPr>
+      <w:r>
+        <w:rPr>
+          <w:rFonts w:ascii="Georgia" w:hAnsi="Georgia" w:eastAsia="Georgia"/>
+          <w:b w:val="0"/>
+          <w:sz w:val="22"/>
+        </w:rPr>
+        <w:t xml:space="preserve">Under the heading were boxes. Location of premises. Name of occupier. Date and time platform first observed. Length of platform (yds). Destination as displayed. Number of passengers boarded. Signature of Station Master or person acting as such.</w:t>
+      </w:r>
+    </w:p>
+    <w:p>
+      <w:pPr>
+        <w:spacing w:after="160" w:line="240" w:lineRule="auto"/>
+      </w:pPr>
+      <w:r>
+        <w:rPr>
+          <w:rFonts w:ascii="Georgia" w:hAnsi="Georgia" w:eastAsia="Georgia"/>
+          <w:b w:val="0"/>
+          <w:sz w:val="22"/>
+        </w:rPr>
+        <w:t xml:space="preserve">"It wants a station master," said Trevor.</w:t>
+      </w:r>
+    </w:p>
+    <w:p>
+      <w:pPr>
+        <w:spacing w:after="160" w:line="240" w:lineRule="auto"/>
+      </w:pPr>
+      <w:r>
+        <w:rPr>
+          <w:rFonts w:ascii="Georgia" w:hAnsi="Georgia" w:eastAsia="Georgia"/>
+          <w:b w:val="0"/>
+          <w:sz w:val="22"/>
+        </w:rPr>
+        <w:t xml:space="preserve">"Everything wants something," said Mr Pendleton sadly. "That is the nature of forms."</w:t>
+      </w:r>
+    </w:p>
+    <w:p>
+      <w:pPr>
+        <w:spacing w:after="160" w:line="240" w:lineRule="auto"/>
+      </w:pPr>
+      <w:r>
+        <w:rPr>
+          <w:rFonts w:ascii="Georgia" w:hAnsi="Georgia" w:eastAsia="Georgia"/>
+          <w:b w:val="0"/>
+          <w:sz w:val="22"/>
+        </w:rPr>
+        <w:t xml:space="preserve">"We haven't got a station master."</w:t>
+      </w:r>
+    </w:p>
+    <w:p>
+      <w:pPr>
+        <w:spacing w:after="160" w:line="240" w:lineRule="auto"/>
+      </w:pPr>
+      <w:r>
+        <w:rPr>
+          <w:rFonts w:ascii="Georgia" w:hAnsi="Georgia" w:eastAsia="Georgia"/>
+          <w:b w:val="0"/>
+          <w:sz w:val="22"/>
+        </w:rPr>
+        <w:t xml:space="preserve">"You have a person acting as such." Mr Pendleton looked, without hope and without irony, at the only person in the building who held a key to everything. "In the absence of a Station Master, it says here, the senior keyholder of the premises shall act. I did not write it. I would not have written it. But somebody wrote it in 1974 expecting it to be read, and I have read it."</w:t>
+      </w:r>
+    </w:p>
+    <w:p>
+      <w:pPr>
+        <w:spacing w:after="160" w:line="240" w:lineRule="auto"/>
+      </w:pPr>
+      <w:r>
+        <w:rPr>
+          <w:rFonts w:ascii="Georgia" w:hAnsi="Georgia" w:eastAsia="Georgia"/>
+          <w:b w:val="0"/>
+          <w:sz w:val="22"/>
+        </w:rPr>
+        <w:t xml:space="preserve">Mrs Marsh looked at him. Then she looked at the platform, and at the form, and took the pen from her clipboard.</w:t>
+      </w:r>
+    </w:p>
+    <w:p>
+      <w:pPr>
+        <w:spacing w:after="160" w:line="240" w:lineRule="auto"/>
+      </w:pPr>
+      <w:r>
+        <w:rPr>
+          <w:rFonts w:ascii="Georgia" w:hAnsi="Georgia" w:eastAsia="Georgia"/>
+          <w:b w:val="0"/>
+          <w:sz w:val="22"/>
+        </w:rPr>
+        <w:t xml:space="preserve">"Acting," she said. "Not appointed. Write down that I said acting."</w:t>
+      </w:r>
+    </w:p>
+    <w:p>
+      <w:pPr>
+        <w:spacing w:after="160" w:line="240" w:lineRule="auto"/>
+      </w:pPr>
+      <w:r>
+        <w:rPr>
+          <w:rFonts w:ascii="Georgia" w:hAnsi="Georgia" w:eastAsia="Georgia"/>
+          <w:b w:val="0"/>
+          <w:sz w:val="22"/>
+        </w:rPr>
+        <w:t xml:space="preserve">They did it the way the Bureau had done everything that week, a box at a time, out loud. Location: second floor, inner office. Name of occupier: Derek wrote his own, and Mrs Marsh made him add the word tenant. Date and time first observed: Trevor wrote MONDAY 10:05, NOTICED, ALREADY OPEN, and Mr Pendleton read it upside down and said that he would copy it into his incident report exactly as it stood, because he had written ten oh five in the report on Monday, on the stairs, and he liked his reports to agree with themselves. Nobody thought anything of that at the time. By five o'clock two insurance companies would think a great deal of it.</w:t>
+      </w:r>
+    </w:p>
+    <w:p>
+      <w:pPr>
+        <w:spacing w:after="160" w:line="240" w:lineRule="auto"/>
+      </w:pPr>
+      <w:r>
+        <w:rPr>
+          <w:rFonts w:ascii="Georgia" w:hAnsi="Georgia" w:eastAsia="Georgia"/>
+          <w:b w:val="0"/>
+          <w:sz w:val="22"/>
+        </w:rPr>
+        <w:t xml:space="preserve">Destination as displayed: YESTERDAY. Trevor wrote it in capitals, and the form, which had been designed with Crewe in mind, took it without complaint, which Penny said was more than CASEBOOK had ever managed.</w:t>
+      </w:r>
+    </w:p>
+    <w:p>
+      <w:pPr>
+        <w:spacing w:after="160" w:line="240" w:lineRule="auto"/>
+      </w:pPr>
+      <w:r>
+        <w:rPr>
+          <w:rFonts w:ascii="Georgia" w:hAnsi="Georgia" w:eastAsia="Georgia"/>
+          <w:b w:val="0"/>
+          <w:sz w:val="22"/>
+        </w:rPr>
+        <w:t xml:space="preserve">Number of passengers boarded: Derek wrote 0. Then, because the box was large and the decade had been confident, he added: NONE. REFUSED, MONDAY 16:41.</w:t>
+      </w:r>
+    </w:p>
+    <w:p>
+      <w:pPr>
+        <w:spacing w:after="160" w:line="240" w:lineRule="auto"/>
+      </w:pPr>
+      <w:r>
+        <w:rPr>
+          <w:rFonts w:ascii="Georgia" w:hAnsi="Georgia" w:eastAsia="Georgia"/>
+          <w:b w:val="0"/>
+          <w:sz w:val="22"/>
+        </w:rPr>
+        <w:t xml:space="preserve">That left the length.</w:t>
+      </w:r>
+    </w:p>
+    <w:p>
+      <w:pPr>
+        <w:spacing w:after="160" w:line="240" w:lineRule="auto"/>
+      </w:pPr>
+      <w:r>
+        <w:rPr>
+          <w:rFonts w:ascii="Georgia" w:hAnsi="Georgia" w:eastAsia="Georgia"/>
+          <w:b w:val="0"/>
+          <w:sz w:val="22"/>
+        </w:rPr>
+        <w:t xml:space="preserve">"Yards," said Trevor. "Nobody's measured it in anything."</w:t>
+      </w:r>
+    </w:p>
+    <w:p>
+      <w:pPr>
+        <w:spacing w:after="160" w:line="240" w:lineRule="auto"/>
+      </w:pPr>
+      <w:r>
+        <w:rPr>
+          <w:rFonts w:ascii="Georgia" w:hAnsi="Georgia" w:eastAsia="Georgia"/>
+          <w:b w:val="0"/>
+          <w:sz w:val="22"/>
+        </w:rPr>
+        <w:t xml:space="preserve">"Mr Quayle has a laser," said Mrs Marsh.</w:t>
+      </w:r>
+    </w:p>
+    <w:p>
+      <w:pPr>
+        <w:spacing w:after="160" w:line="240" w:lineRule="auto"/>
+      </w:pPr>
+      <w:r>
+        <w:rPr>
+          <w:rFonts w:ascii="Georgia" w:hAnsi="Georgia" w:eastAsia="Georgia"/>
+          <w:b w:val="0"/>
+          <w:sz w:val="22"/>
+        </w:rPr>
+        <w:t xml:space="preserve">Mr Quayle had not yet left the building. He was in the lobby writing up the opening, and he came up the stairs a second time with the face of a man called back to a damp patch he had hoped was dry. He looked at the form. He looked at the box. He looked at Mrs Marsh, who held out the pen to him like the baton in a relay he had not entered.</w:t>
+      </w:r>
+    </w:p>
+    <w:p>
+      <w:pPr>
+        <w:spacing w:after="160" w:line="240" w:lineRule="auto"/>
+      </w:pPr>
+      <w:r>
+        <w:rPr>
+          <w:rFonts w:ascii="Georgia" w:hAnsi="Georgia" w:eastAsia="Georgia"/>
+          <w:b w:val="0"/>
+          <w:sz w:val="22"/>
+        </w:rPr>
+        <w:t xml:space="preserve">"I don't measure what isn't let."</w:t>
+      </w:r>
+    </w:p>
+    <w:p>
+      <w:pPr>
+        <w:spacing w:after="160" w:line="240" w:lineRule="auto"/>
+      </w:pPr>
+      <w:r>
+        <w:rPr>
+          <w:rFonts w:ascii="Georgia" w:hAnsi="Georgia" w:eastAsia="Georgia"/>
+          <w:b w:val="0"/>
+          <w:sz w:val="22"/>
+        </w:rPr>
+        <w:t xml:space="preserve">"This is not a question of the lease," said Mrs Marsh. "It is a question of the form. The form is British Rail's. It has been waiting fifty-two years for somebody to fill it in. The landlord is not mentioned."</w:t>
+      </w:r>
+    </w:p>
+    <w:p>
+      <w:pPr>
+        <w:spacing w:after="160" w:line="240" w:lineRule="auto"/>
+      </w:pPr>
+      <w:r>
+        <w:rPr>
+          <w:rFonts w:ascii="Georgia" w:hAnsi="Georgia" w:eastAsia="Georgia"/>
+          <w:b w:val="0"/>
+          <w:sz w:val="22"/>
+        </w:rPr>
+        <w:t xml:space="preserve">There was a long silence on the landing, in which Mr Quayle could be seen weighing his remit against the prospect of being, for the rest of his career, the surveyor who had refused British Rail.</w:t>
+      </w:r>
+    </w:p>
+    <w:p>
+      <w:pPr>
+        <w:spacing w:after="160" w:line="240" w:lineRule="auto"/>
+      </w:pPr>
+      <w:r>
+        <w:rPr>
+          <w:rFonts w:ascii="Georgia" w:hAnsi="Georgia" w:eastAsia="Georgia"/>
+          <w:b w:val="0"/>
+          <w:sz w:val="22"/>
+        </w:rPr>
+        <w:t xml:space="preserve">"I'm measuring for a form," he said at last. "Not for the landlord."</w:t>
+      </w:r>
+    </w:p>
+    <w:p>
+      <w:pPr>
+        <w:spacing w:after="160" w:line="240" w:lineRule="auto"/>
+      </w:pPr>
+      <w:r>
+        <w:rPr>
+          <w:rFonts w:ascii="Georgia" w:hAnsi="Georgia" w:eastAsia="Georgia"/>
+          <w:b w:val="0"/>
+          <w:sz w:val="22"/>
+        </w:rPr>
+        <w:t xml:space="preserve">"Noted," said Mrs Marsh, and noted it.</w:t>
+      </w:r>
+    </w:p>
+    <w:p>
+      <w:pPr>
+        <w:spacing w:after="160" w:line="240" w:lineRule="auto"/>
+      </w:pPr>
+      <w:r>
+        <w:rPr>
+          <w:rFonts w:ascii="Georgia" w:hAnsi="Georgia" w:eastAsia="Georgia"/>
+          <w:b w:val="0"/>
+          <w:sz w:val="22"/>
+        </w:rPr>
+        <w:t xml:space="preserve">He turned round. It was the first time he had turned round all day, and he did it the way a man gets into cold water, all at once, so as not to have to do it twice. He looked at the platform. He looked at the bench and the lamp and the train and the board, and his face went through several expressions, all of them professional, and settled on the one he presumably kept for subsidence.</w:t>
+      </w:r>
+    </w:p>
+    <w:p>
+      <w:pPr>
+        <w:spacing w:after="160" w:line="240" w:lineRule="auto"/>
+      </w:pPr>
+      <w:r>
+        <w:rPr>
+          <w:rFonts w:ascii="Georgia" w:hAnsi="Georgia" w:eastAsia="Georgia"/>
+          <w:b w:val="0"/>
+          <w:sz w:val="22"/>
+        </w:rPr>
+        <w:t xml:space="preserve">"Right," he said.</w:t>
+      </w:r>
+    </w:p>
+    <w:p>
+      <w:pPr>
+        <w:spacing w:after="160" w:line="240" w:lineRule="auto"/>
+      </w:pPr>
+      <w:r>
+        <w:rPr>
+          <w:rFonts w:ascii="Georgia" w:hAnsi="Georgia" w:eastAsia="Georgia"/>
+          <w:b w:val="0"/>
+          <w:sz w:val="22"/>
+        </w:rPr>
+        <w:t xml:space="preserve">He unholstered the laser, stood with his toes where the office ended, and aimed it down the platform at the far pillar. A red dot appeared under the white clock. The laser beeped. He looked at the number for some time.</w:t>
+      </w:r>
+    </w:p>
+    <w:p>
+      <w:pPr>
+        <w:spacing w:after="160" w:line="240" w:lineRule="auto"/>
+      </w:pPr>
+      <w:r>
+        <w:rPr>
+          <w:rFonts w:ascii="Georgia" w:hAnsi="Georgia" w:eastAsia="Georgia"/>
+          <w:b w:val="0"/>
+          <w:sz w:val="22"/>
+        </w:rPr>
+        <w:t xml:space="preserve">"Forty-one point two metres. Forty-five yards, near enough."</w:t>
+      </w:r>
+    </w:p>
+    <w:p>
+      <w:pPr>
+        <w:spacing w:after="160" w:line="240" w:lineRule="auto"/>
+      </w:pPr>
+      <w:r>
+        <w:rPr>
+          <w:rFonts w:ascii="Georgia" w:hAnsi="Georgia" w:eastAsia="Georgia"/>
+          <w:b w:val="0"/>
+          <w:sz w:val="22"/>
+        </w:rPr>
+        <w:t xml:space="preserve">"Is that right?" said Penny.</w:t>
+      </w:r>
+    </w:p>
+    <w:p>
+      <w:pPr>
+        <w:spacing w:after="160" w:line="240" w:lineRule="auto"/>
+      </w:pPr>
+      <w:r>
+        <w:rPr>
+          <w:rFonts w:ascii="Georgia" w:hAnsi="Georgia" w:eastAsia="Georgia"/>
+          <w:b w:val="0"/>
+          <w:sz w:val="22"/>
+        </w:rPr>
+        <w:t xml:space="preserve">"It's what came back," said Mr Quayle, and then, with a glance at Trevor, "in the time it took to come back." He wrote 45 in the box, very small, as if it might one day be used in evidence against him, and went downstairs without a word to anybody, and this time he did not stop at the bottom.</w:t>
+      </w:r>
+    </w:p>
+    <w:p>
+      <w:pPr>
+        <w:spacing w:after="160" w:line="240" w:lineRule="auto"/>
+      </w:pPr>
+      <w:r>
+        <w:rPr>
+          <w:rFonts w:ascii="Georgia" w:hAnsi="Georgia" w:eastAsia="Georgia"/>
+          <w:b w:val="0"/>
+          <w:sz w:val="22"/>
+        </w:rPr>
+        <w:t xml:space="preserve">Mrs Marsh signed. Acting Station Master, she wrote, and under it, smaller: Acting.</w:t>
+      </w:r>
+    </w:p>
+    <w:p>
+      <w:pPr>
+        <w:spacing w:after="160" w:line="240" w:lineRule="auto"/>
+      </w:pPr>
+      <w:r>
+        <w:rPr>
+          <w:rFonts w:ascii="Georgia" w:hAnsi="Georgia" w:eastAsia="Georgia"/>
+          <w:b w:val="0"/>
+          <w:sz w:val="22"/>
+        </w:rPr>
+        <w:t xml:space="preserve">Mr Pendleton took the file back in both arms and read the form from the top, box by box, moving his lips slightly on the yards.</w:t>
+      </w:r>
+    </w:p>
+    <w:p>
+      <w:pPr>
+        <w:spacing w:after="160" w:line="240" w:lineRule="auto"/>
+      </w:pPr>
+      <w:r>
+        <w:rPr>
+          <w:rFonts w:ascii="Georgia" w:hAnsi="Georgia" w:eastAsia="Georgia"/>
+          <w:b w:val="0"/>
+          <w:sz w:val="22"/>
+        </w:rPr>
+        <w:t xml:space="preserve">"It is complete," he said, in the voice of a man who had never in his life said that about anything. "It is not my form. But it is complete. I shall send it to British Rail."</w:t>
+      </w:r>
+    </w:p>
+    <w:p>
+      <w:pPr>
+        <w:spacing w:after="160" w:line="240" w:lineRule="auto"/>
+      </w:pPr>
+      <w:r>
+        <w:rPr>
+          <w:rFonts w:ascii="Georgia" w:hAnsi="Georgia" w:eastAsia="Georgia"/>
+          <w:b w:val="0"/>
+          <w:sz w:val="22"/>
+        </w:rPr>
+        <w:t xml:space="preserve">"British Rail doesn't exist," said Trevor.</w:t>
+      </w:r>
+    </w:p>
+    <w:p>
+      <w:pPr>
+        <w:spacing w:after="160" w:line="240" w:lineRule="auto"/>
+      </w:pPr>
+      <w:r>
+        <w:rPr>
+          <w:rFonts w:ascii="Georgia" w:hAnsi="Georgia" w:eastAsia="Georgia"/>
+          <w:b w:val="0"/>
+          <w:sz w:val="22"/>
+        </w:rPr>
+        <w:t xml:space="preserve">"Neither, until Monday, did the platform," said Mr Pendleton, and carried it away downstairs to the box marked MISCELLANEOUS, where it was the only thing that had ever been finished.</w:t>
       </w:r>
     </w:p>
     <w:p>
@@ -21231,59 +21283,7 @@
           <w:b w:val="0"/>
           <w:sz w:val="22"/>
         </w:rPr>
-        <w:t>"Alfred telephoned me from the airport." No greeting; Herbert did not believe in them. "He said that I was right and that it did not help."</w:t>
-      </w:r>
-    </w:p>
-    <w:p>
-      <w:pPr>
-        <w:spacing w:after="40" w:line="240" w:lineRule="auto"/>
-      </w:pPr>
-      <w:r>
-        <w:rPr>
-          <w:rFonts w:ascii="Georgia" w:hAnsi="Georgia" w:eastAsia="Georgia"/>
-          <w:b w:val="0"/>
-          <w:sz w:val="22"/>
-        </w:rPr>
-        <w:t>"He said he would."</w:t>
-      </w:r>
-    </w:p>
-    <w:p>
-      <w:pPr>
-        <w:spacing w:after="160" w:line="240" w:lineRule="auto"/>
-      </w:pPr>
-      <w:r>
-        <w:rPr>
-          <w:rFonts w:ascii="Georgia" w:hAnsi="Georgia" w:eastAsia="Georgia"/>
-          <w:b w:val="0"/>
-          <w:sz w:val="22"/>
-        </w:rPr>
-        <w:t>"It is the nicest thing he has said to me since nineteen ninety-one. I wished to tell somebody, and my wife does not regard it as news." There was the faint sound of a pen being capped. "I have one further remark. You may write it down or not."</w:t>
-      </w:r>
-    </w:p>
-    <w:p>
-      <w:pPr>
-        <w:spacing w:after="40" w:line="240" w:lineRule="auto"/>
-      </w:pPr>
-      <w:r>
-        <w:rPr>
-          <w:rFonts w:ascii="Georgia" w:hAnsi="Georgia" w:eastAsia="Georgia"/>
-          <w:b w:val="0"/>
-          <w:sz w:val="22"/>
-        </w:rPr>
-        <w:t>"Go on."</w:t>
-      </w:r>
-    </w:p>
-    <w:p>
-      <w:pPr>
-        <w:spacing w:after="40" w:line="240" w:lineRule="auto"/>
-      </w:pPr>
-      <w:r>
-        <w:rPr>
-          <w:rFonts w:ascii="Georgia" w:hAnsi="Georgia" w:eastAsia="Georgia"/>
-          <w:b w:val="0"/>
-          <w:sz w:val="22"/>
-        </w:rPr>
-        <w:t>"Your form. Alfred says it grew a field. Time of act."</w:t>
+        <w:t xml:space="preserve">"Your form." No greeting; Herbert did not believe in them. "Alfred says it grew a field. Time of act."</w:t>
       </w:r>
     </w:p>
     <w:p>
@@ -21607,7 +21607,7 @@
           <w:b w:val="0"/>
           <w:sz w:val="22"/>
         </w:rPr>
-        <w:t>He looked at the platform at once. That was the first thing Derek noticed about him, and the thing that most distinguished him from his surveyor: he did not keep his back to it. He walked straight across the outer room and stood a pace from the sill, exactly where Trevor's tape had been on Monday, and looked at the grey slabs and the bench and the lamp and the train lit at all its windows, and the board above it, and the word.</w:t>
+        <w:t xml:space="preserve">He looked at the platform at once. That was the first thing Derek noticed about him, and the thing that most distinguished him from his surveyor: he did not keep his back to it. He walked straight across the outer room and stood a pace from the sill, exactly where Trevor's tape had been on Monday, and looked at the grey slabs and the bench and the lamp and the lit train, and the board above it, and the word.</w:t>
       </w:r>
     </w:p>
     <w:p>
@@ -22392,15 +22392,41 @@
     </w:p>
     <w:p>
       <w:pPr>
-        <w:spacing w:after="40" w:line="240" w:lineRule="auto"/>
-      </w:pPr>
-      <w:r>
-        <w:rPr>
-          <w:rFonts w:ascii="Georgia" w:hAnsi="Georgia" w:eastAsia="Georgia"/>
-          <w:b w:val="0"/>
-          <w:sz w:val="22"/>
-        </w:rPr>
-        <w:t>"We were looking at a sheet of paper."</w:t>
+        <w:spacing w:after="160" w:line="240" w:lineRule="auto"/>
+      </w:pPr>
+      <w:r>
+        <w:rPr>
+          <w:rFonts w:ascii="Georgia" w:hAnsi="Georgia" w:eastAsia="Georgia"/>
+          <w:b w:val="0"/>
+          <w:sz w:val="22"/>
+        </w:rPr>
+        <w:t xml:space="preserve">"There's a good clock in this office," Trevor said. "Sophie's. Brass, from a car boot, quartz inside. It's right to the second." He looked at the filing cabinet, and his face fell. "It was in drawer three. With the file. Locked."</w:t>
+      </w:r>
+    </w:p>
+    <w:p>
+      <w:pPr>
+        <w:spacing w:after="160" w:line="240" w:lineRule="auto"/>
+      </w:pPr>
+      <w:r>
+        <w:rPr>
+          <w:rFonts w:ascii="Georgia" w:hAnsi="Georgia" w:eastAsia="Georgia"/>
+          <w:b w:val="0"/>
+          <w:sz w:val="22"/>
+        </w:rPr>
+        <w:t xml:space="preserve">"It is still in drawer three," said Mrs Marsh from the outer doorway. "It is evidence until a file says otherwise."</w:t>
+      </w:r>
+    </w:p>
+    <w:p>
+      <w:pPr>
+        <w:spacing w:after="40" w:line="240" w:lineRule="auto"/>
+      </w:pPr>
+      <w:r>
+        <w:rPr>
+          <w:rFonts w:ascii="Georgia" w:hAnsi="Georgia" w:eastAsia="Georgia"/>
+          <w:b w:val="0"/>
+          <w:sz w:val="22"/>
+        </w:rPr>
+        <w:t xml:space="preserve">"And the rest of us were looking at a sheet of paper," said Derek.</w:t>
       </w:r>
     </w:p>
     <w:p>
@@ -22699,7 +22725,7 @@
           <w:b w:val="0"/>
           <w:sz w:val="22"/>
         </w:rPr>
-        <w:t>Mr Haskett looked at the statement for a long time.</w:t>
+        <w:t xml:space="preserve">Mr Haskett looked at the statement.</w:t>
       </w:r>
     </w:p>
     <w:p>
@@ -23426,7 +23452,7 @@
           <w:b w:val="0"/>
           <w:sz w:val="22"/>
         </w:rPr>
-        <w:t>If the sheet went back, it would arrive. If it arrived, it would arrive as it was now: folded in four, soft at the folds, with a ring on one corner and today's date in the box. Nobody would ever have typed it. It would simply go round, the way Sophie's third answer on page forty went round and came back as the first one.</w:t>
+        <w:t xml:space="preserve">If the sheet went back, it would arrive. If it arrived, it would arrive as it was now: folded in four, soft at the folds, with a ring on one corner and today's date in the box. Nobody would ever have typed it. It would simply go round, like a rumour nobody had started, and come back to the desk it had left.</w:t>
       </w:r>
     </w:p>
     <w:p>
@@ -23452,7 +23478,7 @@
           <w:b w:val="0"/>
           <w:sz w:val="22"/>
         </w:rPr>
-        <w:t>The platform began at the sill. He had not crossed it. No one had. On Monday afternoon it had crept thirty-one millimetres into the office while they were at Paddington, and it had gone back to the sill when Penny struck Sophie's name, and since then it had stayed exactly where it was, and he had treated the sill as the edge of the world.</w:t>
+        <w:t xml:space="preserve">The platform began at the sill. He had not crossed it. No one had. On Monday afternoon it had crept thirty-one millimetres into the office while they were at Paddington, and it had gone back to the sill after he had said no at its yellow line and Penny had struck Sophie's name, and since then it had stayed exactly where it was, and he had treated the sill as the edge of the world.</w:t>
       </w:r>
     </w:p>
     <w:p>
@@ -23582,7 +23608,7 @@
           <w:b w:val="0"/>
           <w:sz w:val="22"/>
         </w:rPr>
-        <w:t>The train left. It did not pull away down a line; there was no line beyond it that he could see, only a dark that no tunnel had been dug for. The lit windows slid into it one after another, and the last one went, and the platform was empty for perhaps a breath. Then, without arriving, the train was there again, standing where it had always stood, lit at its windows, empty. The board above it flickered once and said what it had said since Monday.</w:t>
+        <w:t xml:space="preserve">The train left. It did not pull away down a line; there was no line beyond it that he could see, only a dark that no tunnel had been dug for. The lit windows slid into it one after another, and the last one went, and the platform was empty for perhaps a breath. Then, without arriving, the train was there again, standing where it had always stood, lit and empty. The board above it flickered once and said what it had said since Monday.</w:t>
       </w:r>
     </w:p>
     <w:p>
@@ -24049,7 +24075,7 @@
           <w:b w:val="0"/>
           <w:sz w:val="22"/>
         </w:rPr>
-        <w:t>He came in her coat collar, as he did when he came at all, and she set him down on the corridor carpet, and he looked at the sill for a long time. He looked at the sill where the yellow tape had lain until Trevor rolled it up on Monday evening, on the grounds that the platform had proved it could keep still without supervision. He looked at the grey slabs and the bench nobody would choose and the train lit at all its windows. Then he went and lay down in the hall, a little way along the corridor, as if a railway were a piece of furniture he had declined to discuss.</w:t>
+        <w:t xml:space="preserve">He came in her coat collar, as he did when he came at all, and she set him down on the corridor carpet, and he looked at the sill where the yellow tape had lain until Trevor rolled it up on Monday evening, on the grounds that the platform had proved it could keep still without supervision. He looked at the slabs and the bench and the train. Then he went and lay down a little way along the corridor, as if a railway were a piece of furniture he had declined to discuss.</w:t>
       </w:r>
     </w:p>
     <w:p>
@@ -24140,7 +24166,7 @@
           <w:b w:val="0"/>
           <w:sz w:val="22"/>
         </w:rPr>
-        <w:t>"The procedure was simpler when affection was a closed hinge."</w:t>
+        <w:t xml:space="preserve">"It was simpler when you two had a door to shut," he said, to the kettle.</w:t>
       </w:r>
     </w:p>
     <w:p>
@@ -24166,7 +24192,7 @@
           <w:b w:val="0"/>
           <w:sz w:val="22"/>
         </w:rPr>
-        <w:t>Trevor considered this for a long moment, then regarded the kettle as though it had made the point, and went home. He went the long way, through the park, and did not look at any clocks, and told Derek on Wednesday that it had been the most relaxing walk of his adult life.</w:t>
+        <w:t xml:space="preserve">Trevor considered this, then regarded the kettle as though it had made the point, and went home. He went the long way, through the park, and did not look at any clocks, and told Derek on Wednesday that it had been the most relaxing walk of his adult life.</w:t>
       </w:r>
     </w:p>
     <w:p>
@@ -24192,7 +24218,7 @@
           <w:b w:val="0"/>
           <w:sz w:val="22"/>
         </w:rPr>
-        <w:t>She did not say hello. She read one line, and no other, in her results voice, from the notebook.</w:t>
+        <w:t xml:space="preserve">She did not say hello. She read one line, and no other, from the notebook.</w:t>
       </w:r>
     </w:p>
     <w:p>
@@ -25214,6 +25240,32 @@
           <w:b w:val="0"/>
           <w:sz w:val="22"/>
         </w:rPr>
+        <w:t xml:space="preserve">Moved from Chapter 16. What reaches you is in your past light cone; what you can reach is in your future light cone. Light from the platform lighting Derek's shoes at night tells you nothing about any signal going the other way. Seeing a thing is not boarding it.</w:t>
+      </w:r>
+    </w:p>
+    <w:p>
+      <w:pPr>
+        <w:spacing w:after="160" w:line="240" w:lineRule="auto"/>
+      </w:pPr>
+      <w:r>
+        <w:rPr>
+          <w:rFonts w:ascii="Georgia" w:hAnsi="Georgia" w:eastAsia="Georgia"/>
+          <w:b w:val="0"/>
+          <w:sz w:val="22"/>
+        </w:rPr>
+        <w:t xml:space="preserve">Moved from Chapter 15 (Penny's number). The textbook estimate for a London–Athens flight treats the ground as standing still. At about 11 km, gh/c² ≈ 1.2 × 10⁻¹², about 4.3 ns gained per hour; at 250 m/s, v²/2c² ≈ 3.5 × 10⁻¹³, about 1.25 ns lost per hour; so roughly +10 ns for the trip. Done properly, every clock is compared in a frame that does not rotate with the Earth. The ground at London already moves east at about 290 m/s (Athens, about 365 m/s), so an eastbound airliner's loss goes as (v_ground + v)² − v_ground², more than three times the textbook figure, while the time spent below cruising height shrinks the gain. For a few hours eastbound the net is close to zero, and the wind decides its sign. Hafele and Keating flew four caesium-beam clocks round the world on scheduled airliners in October 1971: eastbound the clocks lost 59 ± 10 ns, westbound they gained 273 ± 7 ns, against predictions of −40 ± 23 ns and +275 ± 21 ns (Science 177, 166–170, 1972). Clocks at rest at sea level all tick at the same rate: the faster rotation near the equator is exactly offset by the greater distance from the centre, because the sea settles on a surface of equal gravitational-plus-rotational potential, the geoid. Greece runs at London's rate; only the time in the air differs.</w:t>
+      </w:r>
+    </w:p>
+    <w:p>
+      <w:pPr>
+        <w:spacing w:after="160" w:line="240" w:lineRule="auto"/>
+      </w:pPr>
+      <w:r>
+        <w:rPr>
+          <w:rFonts w:ascii="Georgia" w:hAnsi="Georgia" w:eastAsia="Georgia"/>
+          <w:b w:val="0"/>
+          <w:sz w:val="22"/>
+        </w:rPr>
         <w:t>Common trap: reaching for a frame change because the book before this one used frames. That tool answers a different question.</w:t>
       </w:r>
     </w:p>
@@ -25288,7 +25340,7 @@
           <w:b w:val="0"/>
           <w:sz w:val="22"/>
         </w:rPr>
-        <w:t>A warning is not a single moment. It is a message paired with an act, and this file has two messages. Pair the voice with the door: the voice comes after, so that sign is late. Pair the front of the sheet with boarding: the sheet was already in the pocket before the door, and nobody has boarded, so that sign is early. Nothing in that requires the two acts to be the same event. They are not. That was the other case.</w:t>
+        <w:t xml:space="preserve">A warning is not a single moment. It is a message paired with an act, and this file has two messages. Pair the voice with the door: the voice comes after, so that sign is late. Pair the front of the sheet with boarding: the sheet was already in the pocket before the door, and nobody has boarded, so that sign is early. An early sign is still only a forecast until somebody acts on it. In Chapter 12 Derek turns it into an act: he stands on the line, says no, and turns his back, and only then is there a refusal for the form to record. Nothing in that requires the two acts to be the same event. They are not. That was the other case.</w:t>
       </w:r>
     </w:p>
     <w:p>
@@ -25414,6 +25466,19 @@
           <w:b w:val="0"/>
           <w:sz w:val="22"/>
         </w:rPr>
+        <w:t xml:space="preserve">Moved from Chapter 18 (Twenty Clocks). Herbert's "quantity every clock at rest would agree on" is proper time: the reading an ideal clock accumulates between two events on its own world line is the same in every frame. Barbarian's point is that every unit is a count of one motion against another. Since 1967 the SI second has been 9,192,631,770 periods of the radiation from the hyperfine transition of the ground state of caesium-133. Before that it was a fraction of the tropical year 1900 (adopted in 1956, made official in 1960), and before that a fraction of the mean solar day. Herbert's watch gets German legal time from the Physikalisch-Technische Bundesanstalt in Braunschweig, broadcast every minute by the DCF77 longwave transmitter at Mainflingen, south-east of Frankfurt. His "partial order" is the causal structure of spacetime: pairs of events separated in a timelike or lightlike way have an order every observer agrees on; spacelike pairs have none.</w:t>
+      </w:r>
+    </w:p>
+    <w:p>
+      <w:pPr>
+        <w:spacing w:after="160" w:line="240" w:lineRule="auto"/>
+      </w:pPr>
+      <w:r>
+        <w:rPr>
+          <w:rFonts w:ascii="Georgia" w:hAnsi="Georgia" w:eastAsia="Georgia"/>
+          <w:b w:val="0"/>
+          <w:sz w:val="22"/>
+        </w:rPr>
         <w:t>Common trap: stacking the seventeens into a signature because an earlier case was fond of the digit. Fondness is not a mechanism.</w:t>
       </w:r>
     </w:p>
@@ -25488,7 +25553,7 @@
           <w:b w:val="0"/>
           <w:sz w:val="22"/>
         </w:rPr>
-        <w:t>The form asked for a birthday because it assumed a person. A person who has not been born is not in the past of the paper, so the form correctly refused tomorrow. The refusal recorded at 16:41 can author that record. It has a time, and the time is after the acts it does not claim to have caused. It is not the sender of the morning sheet. The morning sheet was already in the pocket. Acts have times. A sheet that arrived earlier still needs its own account. In this case the account, found in Chapter 21, was not a sender but a route: the sheet went round a closed loop through the railway and was never written by anyone.</w:t>
+        <w:t xml:space="preserve">The form asked for a birthday because it assumed a person. A person who has not been born is not in the past of the paper, so the form correctly refused tomorrow. Derek's refusal at 16:41, made at the yellow line with the carriage door open, can author that record. It has a time, and the time is after the acts it does not claim to have caused. It is not the sender of the morning sheet. The morning sheet was already in the pocket. Acts have times. A sheet that arrived earlier still needs its own account. In this case the account, found in Chapter 21, was not a sender but a route: the sheet went round a closed loop through the railway and was never written by anyone.</w:t>
       </w:r>
     </w:p>
     <w:p>
@@ -25688,7 +25753,7 @@
           <w:b w:val="0"/>
           <w:sz w:val="22"/>
         </w:rPr>
-        <w:t>Write the earlier act first, and if you do not have its time, write that the time is unknown and earlier than the noticing. Admit the voice is late for the opening, and that the sheet is not. Write the later act second. Refuse it while the sign is still early. The record of the refusal gets a time. It does not get the morning sheet's byline. If a name appeared in an empty person-field, check whether that person had an act. If they had none, strike the name. Do not strike it to make the page calm, and do not delete the platform by saving.</w:t>
+        <w:t xml:space="preserve">Write the earlier act first, and if you do not have its time, write that the time is unknown and earlier than the noticing. Admit the voice is late for the opening, and that the sheet is not. Write the later act second. Refuse it while the sign is still early, and refuse it as an act, not as a forecast. The record of the refusal gets a time. It does not get the morning sheet's byline. If a name appeared in an empty person-field, check whether that person had an act. If they had none, strike the name. Do not strike it to make the page calm, and do not delete the platform by saving.</w:t>
       </w:r>
     </w:p>
     <w:p>
@@ -25740,7 +25805,7 @@
           <w:b w:val="0"/>
           <w:sz w:val="22"/>
         </w:rPr>
-        <w:t>Quick test: Say the close without looking up. Sheet, then the door, both before 10:05. Voice after the door, late, size unknown. Reading at 10:22 is how long they read. Sunday's notice, 18:17 after an 18:00 opening, a different seventeen, and the previous warning the back of the sheet meant. Boarding refused before it happened. The record at 16:41 is the refusal. Sophie had no act. The name comes off. The morning sheet gets a route, not a sender.</w:t>
+        <w:t xml:space="preserve">Quick test: Say the close without looking up. Sheet, then the door, both before 10:05. Voice after the door, late, size unknown. Reading at 10:22 is how long they read. Sunday's notice, 18:17 after an 18:00 opening, a different seventeen, and the previous warning the back of the sheet meant. Boarding refused before it happened. The record at 16:41 is Derek's refusal, made at the line. Sophie had no act. The name comes off. The morning sheet gets a route, not a sender.</w:t>
       </w:r>
     </w:p>
     <w:p>
@@ -25930,17 +25995,17 @@
       <w:bookmarkEnd w:id="33"/>
     </w:p>
     <w:p>
+      <w:pPr>
+        <w:spacing w:after="160" w:line="240" w:lineRule="auto"/>
+      </w:pPr>
       <w:bookmarkStart w:id="34" w:name="gloss_Pending_author"/>
-      <w:pPr>
-        <w:spacing w:after="160" w:line="240" w:lineRule="auto"/>
-      </w:pPr>
-      <w:r>
-        <w:rPr>
-          <w:rFonts w:ascii="Georgia" w:hAnsi="Georgia" w:eastAsia="Georgia"/>
-          <w:b w:val="0"/>
-          <w:sz w:val="22"/>
-        </w:rPr>
-        <w:t>Pending author. The morning sheet still has none. The record written at 16:41 names the refusal and does not claim to have printed the sheet.</w:t>
+      <w:r>
+        <w:rPr>
+          <w:rFonts w:ascii="Georgia" w:hAnsi="Georgia" w:eastAsia="Georgia"/>
+          <w:b w:val="0"/>
+          <w:sz w:val="22"/>
+        </w:rPr>
+        <w:t xml:space="preserve">Pending author. The morning sheet never gets one. The record written at 16:41 names Derek's refusal and does not claim to have printed the sheet; in Chapter 21 he is recorded as its carrier, not its author.</w:t>
       </w:r>
       <w:bookmarkEnd w:id="34"/>
     </w:p>
@@ -26005,19 +26070,17 @@
       <w:bookmarkEnd w:id="38"/>
     </w:p>
     <w:p>
-      <w:bookmarkStart w:id="38" w:name="gloss_LOCALHOST"/>
-      <w:pPr>
-        <w:spacing w:after="160" w:line="240" w:lineRule="auto"/>
-      </w:pPr>
-      <w:r>
-        <w:rPr>
-          <w:rFonts w:ascii="Georgia" w:hAnsi="Georgia" w:eastAsia="Georgia"/>
-          <w:b w:val="0"/>
-          <w:sz w:val="22"/>
-        </w:rPr>
-        <w:t>LOCALHOST. The originating address of the photograph in Case 1047. Not the sender of this paper. Still unidentified. Not solved by being mentioned.</w:t>
-      </w:r>
-      <w:bookmarkEnd w:id="38"/>
+      <w:pPr>
+        <w:spacing w:after="160" w:line="240" w:lineRule="auto"/>
+      </w:pPr>
+      <w:r>
+        <w:rPr>
+          <w:rFonts w:ascii="Georgia" w:hAnsi="Georgia" w:eastAsia="Georgia"/>
+          <w:b w:val="0"/>
+          <w:sz w:val="22"/>
+        </w:rPr>
+        <w:t xml:space="preserve">LOCALHOST. In Case 1047, CASEBOOK's name for its own machine: the photograph was captured from the Bureau's camera by an unnamed paired phone, device 3, and sent by CASEBOOK's own sweep. Device 3 is still open. Not the sender of this paper.</w:t>
+      </w:r>
     </w:p>
     <w:p>
       <w:bookmarkStart w:id="39" w:name="gloss_YESTERDAY"/>

</xml_diff>

<commit_message>
RIB2 round 3: traceable sheet mechanism (CASEBOOK printout, form PL/9 note 7), ch21 rewritten, hook prologue, Penny's arc shown, ch15/18/20 shortened, RIB1 round-3 continuity
</commit_message>
<xml_diff>
--- a/The Relativistic Investigation Bureau - SERIES/Book 2 - The Warning That Was Sent Too Late/The_Warning_That_Was_Sent_Too_Late_BOOK_2_DRAFT.docx
+++ b/The Relativistic Investigation Bureau - SERIES/Book 2 - The Warning That Was Sent Too Late/The_Warning_That_Was_Sent_Too_Late_BOOK_2_DRAFT.docx
@@ -570,33 +570,72 @@
           <w:b w:val="0"/>
           <w:sz w:val="22"/>
         </w:rPr>
-        <w:t>At nine fifty on a Monday morning the Relativistic Investigation Bureau was closing a murder that had never happened.</w:t>
-      </w:r>
-    </w:p>
-    <w:p>
-      <w:pPr>
-        <w:spacing w:after="160" w:line="240" w:lineRule="auto"/>
-      </w:pPr>
-      <w:r>
-        <w:rPr>
-          <w:rFonts w:ascii="Georgia" w:hAnsi="Georgia" w:eastAsia="Georgia"/>
-          <w:b w:val="0"/>
-          <w:sz w:val="22"/>
-        </w:rPr>
-        <w:t>Case 1047 lay open on Derek Gent's desk for the last time: a fat buff folder, a printout of an email received at 9:17 one Tuesday morning, YOU HAVE BEEN MURDERED. THE PERPETRATOR IS YOU, and a photograph of a doorway with his daughter standing in it, sent from an address that called itself LOCALHOST. Nobody had been murdered. That had taken a week, four clocks, a professor in Munich and most of Derek's patience to establish. The photograph had been taken by someone who was still unidentified. The email had been wrong about everything except the time.</w:t>
-      </w:r>
-    </w:p>
-    <w:p>
-      <w:pPr>
-        <w:spacing w:after="160" w:line="240" w:lineRule="auto"/>
-      </w:pPr>
-      <w:r>
-        <w:rPr>
-          <w:rFonts w:ascii="Georgia" w:hAnsi="Georgia" w:eastAsia="Georgia"/>
-          <w:b w:val="0"/>
-          <w:sz w:val="22"/>
-        </w:rPr>
-        <w:t>On the windowsill a phone buzzed. It was Trevor Boltzman's. His sister Tabitha had texted him the single word BOTTLE, which was the continuation of an argument they had been having since Sunday about whether a Klein bottle could be said to have a sense of humour. Trevor picked up the phone, framed the glass object on his desk so that it caught the light from the window, and took a photograph of it holding nothing whatever. He sent it. Behind the bottle, out of focus, was Derek's office door: ordinary wood, an ordinary handle, an ordinary scuff at the bottom where people kicked it open with their hands full of tea.</w:t>
+        <w:t xml:space="preserve">The warning arrived on a Monday morning at a time nobody wrote down. It was folded in four, it was dated the following day, and somebody had stood a mug of tea on one corner of it. It forbade a thing nobody in the room had thought of doing, on a train that was not yet in the building, and on the back, in the same flat capitals, it apologised for being late.</w:t>
+      </w:r>
+    </w:p>
+    <w:p>
+      <w:pPr>
+        <w:spacing w:after="160" w:line="240" w:lineRule="auto"/>
+      </w:pPr>
+      <w:r>
+        <w:rPr>
+          <w:rFonts w:ascii="Georgia" w:hAnsi="Georgia" w:eastAsia="Georgia"/>
+          <w:b w:val="0"/>
+          <w:sz w:val="22"/>
+        </w:rPr>
+        <w:t xml:space="preserve">At the time, the Relativistic Investigation Bureau was busy closing a murder that had never happened. Case 1047 lay on Derek Gent's desk for the last time: a fat buff folder; an email received at 9:17 one Tuesday morning, YOU HAVE BEEN MURDERED. THE PERPETRATOR IS YOU; and a photograph of his office doorway with his daughter standing in it, sent by the Bureau's own case system, CASEBOOK, from an address that called itself LOCALHOST. It had taken a week, four clocks, a professor in Munich and most of Derek's patience to establish that nobody had been murdered. CASEBOOK had filled its empty fields with whatever was nearest, and a phone nobody could name had been looking through the Bureau's camera. The phone was still nobody. The email had been wrong about everything except the time.</w:t>
+      </w:r>
+    </w:p>
+    <w:p>
+      <w:pPr>
+        <w:spacing w:after="160" w:line="240" w:lineRule="auto"/>
+      </w:pPr>
+      <w:r>
+        <w:rPr>
+          <w:rFonts w:ascii="Georgia" w:hAnsi="Georgia" w:eastAsia="Georgia"/>
+          <w:b w:val="0"/>
+          <w:sz w:val="22"/>
+        </w:rPr>
+        <w:t xml:space="preserve">At ten to ten Penny Gent took the closing memo off the printer and read it standing up. The printer had laid its faint grey stripe down the left margin, as it had laid it down everything since Trevor cleaned the drum with a kitchen scourer. CASEBOOK had printed NOT YET in the box for the date of the next action, as it printed NOT YET in any date box nobody had filled. And it had taken Derek's one-word note on LOCALHOST, REFUSED, and turned it into a line of capitals across the top of the page, as it did with every refusal it was given, so that the Bureau's paperwork read like the notices on a building site.</w:t>
+      </w:r>
+    </w:p>
+    <w:p>
+      <w:pPr>
+        <w:spacing w:after="160" w:line="240" w:lineRule="auto"/>
+      </w:pPr>
+      <w:r>
+        <w:rPr>
+          <w:rFonts w:ascii="Georgia" w:hAnsi="Georgia" w:eastAsia="Georgia"/>
+          <w:b w:val="0"/>
+          <w:sz w:val="22"/>
+        </w:rPr>
+        <w:t xml:space="preserve">"It makes everything an instruction to somebody else," Penny said. "It was designed by a man who thought refusing was a thing other people did for you."</w:t>
+      </w:r>
+    </w:p>
+    <w:p>
+      <w:pPr>
+        <w:spacing w:after="160" w:line="240" w:lineRule="auto"/>
+      </w:pPr>
+      <w:r>
+        <w:rPr>
+          <w:rFonts w:ascii="Georgia" w:hAnsi="Georgia" w:eastAsia="Georgia"/>
+          <w:b w:val="0"/>
+          <w:sz w:val="22"/>
+        </w:rPr>
+        <w:t xml:space="preserve">"It's a closing memo," said Derek. "Nobody reads them."</w:t>
+      </w:r>
+    </w:p>
+    <w:p>
+      <w:pPr>
+        <w:spacing w:after="160" w:line="240" w:lineRule="auto"/>
+      </w:pPr>
+      <w:r>
+        <w:rPr>
+          <w:rFonts w:ascii="Georgia" w:hAnsi="Georgia" w:eastAsia="Georgia"/>
+          <w:b w:val="0"/>
+          <w:sz w:val="22"/>
+        </w:rPr>
+        <w:t xml:space="preserve">At two minutes to ten a phone buzzed on the windowsill. It was Trevor Boltzman's. His sister Tabitha had texted him the single word BOTTLE, which was the continuation of an argument they had been having since Sunday about whether a Klein bottle could be said to have a sense of humour. Trevor picked up the phone, framed the glass object on his desk so that it caught the light from the window, and took a photograph of it holding nothing whatever. He sent it. Behind the bottle, out of focus, was Derek's office door: ordinary wood, an ordinary handle, an ordinary scuff at the bottom where people kicked it open with their hands full of tea.</w:t>
       </w:r>
     </w:p>
     <w:p>
@@ -622,7 +661,7 @@
           <w:b w:val="0"/>
           <w:sz w:val="22"/>
         </w:rPr>
-        <w:t>"Don't," said Penny Gent.</w:t>
+        <w:t xml:space="preserve">"Don't," said Penny.</w:t>
       </w:r>
     </w:p>
     <w:p>
@@ -648,7 +687,7 @@
           <w:b w:val="0"/>
           <w:sz w:val="22"/>
         </w:rPr>
-        <w:t>"Then add them right." She was making tea. Penny made tea the way she made departures: once, on time, and without asking anyone whether they wanted it. The kettle in the corner boiled for a closed file. She poured four mugs, and put Derek's down on the corner of his desk, on top of the 1047 folder, because it was the only flat thing left.</w:t>
+        <w:t xml:space="preserve">"Then add them right." Trevor had offered tea at twenty to ten and been overruled at the kettle. Penny made tea the way she made departures: once, on time, and without asking anyone whether they wanted it. The kettle in the corner boiled for a closed file. She poured four mugs, and put Derek's down on the corner of his desk, on top of the 1047 folder, because it was the only flat thing left.</w:t>
       </w:r>
     </w:p>
     <w:p>
@@ -804,7 +843,7 @@
           <w:b w:val="0"/>
           <w:sz w:val="22"/>
         </w:rPr>
-        <w:t>Nobody had put it there. Derek was sure of that the way he was sure of the floor. Four people in a small room, all of them facing that desk, and none of them had seen a hand. It was simply there, as if it had always been underneath and the folder had been sitting on it all week. It had been folded in four and opened out again, and the creases were soft, the way creases go when a page has been carried in a pocket and taken out too often. On one corner was a pale brown ring, the size of the bottom of a mug.</w:t>
+        <w:t xml:space="preserve">Nobody had put it there. Derek was sure of that the way he was sure of the floor. Four people in a small room, all of them facing that desk, and none of them had seen a hand. It was simply there, as if it had always been underneath and the folder had been sitting on it all week. It had been folded in four, once, carefully, and opened out again, so that the creases stood up from the blotter like the ridges of a small roof. On one corner was a pale brown ring, the size of the bottom of a mug, with a little bite out of its left side. A faint grey line ran down the margin.</w:t>
       </w:r>
     </w:p>
     <w:p>
@@ -1788,7 +1827,7 @@
           <w:b w:val="0"/>
           <w:sz w:val="22"/>
         </w:rPr>
-        <w:t xml:space="preserve">"Last week's photograph came off our own camera, through our own machine, from a phone nobody has named. Device three is still open, and it can stay open. This did not come from there. Different paper, different route, different lie. I do not want anybody in this room solving last week again because it was comfortable."</w:t>
+        <w:t xml:space="preserve">"Last week's photograph came off our own camera, through our own machine, from a phone nobody has named. Its share was revoked at half past one on Sunday morning, and it is still nobody we can name. Device three is still open, and it can stay open. This did not come from there. Different paper, different route, different lie. I do not want anybody in this room solving last week again because it was comfortable."</w:t>
       </w:r>
     </w:p>
     <w:p>
@@ -9801,33 +9840,33 @@
           <w:b w:val="0"/>
           <w:sz w:val="22"/>
         </w:rPr>
-        <w:t>"I've carried this since the old Tuesday."</w:t>
-      </w:r>
-    </w:p>
-    <w:p>
-      <w:pPr>
-        <w:spacing w:after="40" w:line="240" w:lineRule="auto"/>
-      </w:pPr>
-      <w:r>
-        <w:rPr>
-          <w:rFonts w:ascii="Georgia" w:hAnsi="Georgia" w:eastAsia="Georgia"/>
-          <w:b w:val="0"/>
-          <w:sz w:val="22"/>
-        </w:rPr>
-        <w:t>"I know."</w:t>
-      </w:r>
-    </w:p>
-    <w:p>
-      <w:pPr>
-        <w:spacing w:after="160" w:line="240" w:lineRule="auto"/>
-      </w:pPr>
-      <w:r>
-        <w:rPr>
-          <w:rFonts w:ascii="Georgia" w:hAnsi="Georgia" w:eastAsia="Georgia"/>
-          <w:b w:val="0"/>
-          <w:sz w:val="22"/>
-        </w:rPr>
-        <w:t>"You don't know why. You think it's so Sophie never sees herself in a doorway. It is. It's also so that if it ever stopped being a filing error I'd have it with me when I went to tell her." She kept her eyes on the taxi rank. "I rehearsed it. More than once. On the bus, mostly. I had a version for if it was quick and a version for if it wasn't."</w:t>
+        <w:t xml:space="preserve">"You're still carrying that," Derek said. He meant the one from the old Tuesday: a man on a floor, a girl in a door.</w:t>
+      </w:r>
+    </w:p>
+    <w:p>
+      <w:pPr>
+        <w:spacing w:after="40" w:line="240" w:lineRule="auto"/>
+      </w:pPr>
+      <w:r>
+        <w:rPr>
+          <w:rFonts w:ascii="Georgia" w:hAnsi="Georgia" w:eastAsia="Georgia"/>
+          <w:b w:val="0"/>
+          <w:sz w:val="22"/>
+        </w:rPr>
+        <w:t xml:space="preserve">"I'm carrying a photograph."</w:t>
+      </w:r>
+    </w:p>
+    <w:p>
+      <w:pPr>
+        <w:spacing w:after="160" w:line="240" w:lineRule="auto"/>
+      </w:pPr>
+      <w:r>
+        <w:rPr>
+          <w:rFonts w:ascii="Georgia" w:hAnsi="Georgia" w:eastAsia="Georgia"/>
+          <w:b w:val="0"/>
+          <w:sz w:val="22"/>
+        </w:rPr>
+        <w:t xml:space="preserve">She did not say which, and he did not ask, because the white back of a photograph is the same on every photograph, and because she had said it in the voice that closed a subject.</w:t>
       </w:r>
     </w:p>
     <w:p>
@@ -9853,7 +9892,7 @@
           <w:b w:val="0"/>
           <w:sz w:val="22"/>
         </w:rPr>
-        <w:t>"I'm not telling you that so you'll feel something. I'm telling you because I've already been the person who stood in this office being frightened on schedule, and I know what it does to the paperwork. When you're frightened you want to write a line that makes the fear stop. Any line. You'd have struck her name at lunch if I'd let you."</w:t>
+        <w:t xml:space="preserve">"I've stood in that office being frightened on schedule before," she said, with her eyes on the taxi rank. "I know what it does to the paperwork. When you're frightened you want to write a line that makes the fear stop. Any line. You'd have struck her name at lunch if I'd let you."</w:t>
       </w:r>
     </w:p>
     <w:p>
@@ -9931,20 +9970,20 @@
           <w:b w:val="0"/>
           <w:sz w:val="22"/>
         </w:rPr>
-        <w:t>"Which version. If it wasn't quick."</w:t>
-      </w:r>
-    </w:p>
-    <w:p>
-      <w:pPr>
-        <w:spacing w:after="160" w:line="240" w:lineRule="auto"/>
-      </w:pPr>
-      <w:r>
-        <w:rPr>
-          <w:rFonts w:ascii="Georgia" w:hAnsi="Georgia" w:eastAsia="Georgia"/>
-          <w:b w:val="0"/>
-          <w:sz w:val="22"/>
-        </w:rPr>
-        <w:t>"No. That one stays in the bag." She slid the photograph back in, face-down, under the itinerary, and closed the clasp. "Drink your tea. It's twenty to three. She's in double maths for another half an hour, and then she's going to ring you, because she's twelve and she doesn't wait to be managed. You'll want your voice to be the one you use for tea."</w:t>
+        <w:t xml:space="preserve">He reached for the photograph, to take it off her. "Give me that. It's mine to carry."</w:t>
+      </w:r>
+    </w:p>
+    <w:p>
+      <w:pPr>
+        <w:spacing w:after="160" w:line="240" w:lineRule="auto"/>
+      </w:pPr>
+      <w:r>
+        <w:rPr>
+          <w:rFonts w:ascii="Georgia" w:hAnsi="Georgia" w:eastAsia="Georgia"/>
+          <w:b w:val="0"/>
+          <w:sz w:val="22"/>
+        </w:rPr>
+        <w:t xml:space="preserve">"It isn't yours." She slid it back into the bag, face-down, under the itinerary, and closed the clasp, and there was no argument in it at all, only a fact. "Drink your tea. It's twenty to three. She's in double maths for another half an hour, and then she's going to ring you, because she's twelve and she doesn't wait to be managed. You'll want your voice to be the one you use for tea."</w:t>
       </w:r>
     </w:p>
     <w:p>
@@ -13282,6 +13321,71 @@
           <w:b w:val="0"/>
           <w:sz w:val="22"/>
         </w:rPr>
+        <w:t xml:space="preserve">Further up the screen, under the line Trevor had typed at lunch from the back of his envelope, VOICE: DON'T OPEN THE DOOR. HEARD AFTER THE DOOR WAS OPEN, a line of the form's soft grey had appeared, now that the form had a time of act to compare things with.</w:t>
+      </w:r>
+    </w:p>
+    <w:p>
+      <w:pPr>
+        <w:spacing w:after="160" w:line="240" w:lineRule="auto"/>
+      </w:pPr>
+      <w:r>
+        <w:rPr>
+          <w:rFonts w:ascii="Georgia" w:hAnsi="Georgia" w:eastAsia="Georgia"/>
+          <w:b w:val="0"/>
+          <w:sz w:val="22"/>
+        </w:rPr>
+        <w:t xml:space="preserve">PLEASE NOTE. THE PREVIOUS WARNING WAS SENT TOO LATE.</w:t>
+      </w:r>
+    </w:p>
+    <w:p>
+      <w:pPr>
+        <w:spacing w:after="160" w:line="240" w:lineRule="auto"/>
+      </w:pPr>
+      <w:r>
+        <w:rPr>
+          <w:rFonts w:ascii="Georgia" w:hAnsi="Georgia" w:eastAsia="Georgia"/>
+          <w:b w:val="0"/>
+          <w:sz w:val="22"/>
+        </w:rPr>
+        <w:t xml:space="preserve">"It's quoting the back of the sheet," said Trevor.</w:t>
+      </w:r>
+    </w:p>
+    <w:p>
+      <w:pPr>
+        <w:spacing w:after="160" w:line="240" w:lineRule="auto"/>
+      </w:pPr>
+      <w:r>
+        <w:rPr>
+          <w:rFonts w:ascii="Georgia" w:hAnsi="Georgia" w:eastAsia="Georgia"/>
+          <w:b w:val="0"/>
+          <w:sz w:val="22"/>
+        </w:rPr>
+        <w:t xml:space="preserve">"Or the sheet's quoting it," said Penny.</w:t>
+      </w:r>
+    </w:p>
+    <w:p>
+      <w:pPr>
+        <w:spacing w:after="160" w:line="240" w:lineRule="auto"/>
+      </w:pPr>
+      <w:r>
+        <w:rPr>
+          <w:rFonts w:ascii="Georgia" w:hAnsi="Georgia" w:eastAsia="Georgia"/>
+          <w:b w:val="0"/>
+          <w:sz w:val="22"/>
+        </w:rPr>
+        <w:t xml:space="preserve">"Leave it," said Derek. "It's true. The voice came after the door."</w:t>
+      </w:r>
+    </w:p>
+    <w:p>
+      <w:pPr>
+        <w:spacing w:after="160" w:line="240" w:lineRule="auto"/>
+      </w:pPr>
+      <w:r>
+        <w:rPr>
+          <w:rFonts w:ascii="Georgia" w:hAnsi="Georgia" w:eastAsia="Georgia"/>
+          <w:b w:val="0"/>
+          <w:sz w:val="22"/>
+        </w:rPr>
         <w:t>Then the cursor moved, by itself, down the page, and stopped. It waited, blinking, on the line it had written at lunch.</w:t>
       </w:r>
     </w:p>
@@ -13321,7 +13425,7 @@
           <w:b w:val="0"/>
           <w:sz w:val="22"/>
         </w:rPr>
-        <w:t xml:space="preserve">Penny put her handbag down on the desk. She took out the face-down photograph, looked at the back of it for a moment, and put it face-down on the desk beside the keyboard, where it would be in the room for this and would not have to watch. Then she leaned over Derek's shoulder, put one finger on the delete key, and did not press it.</w:t>
+        <w:t xml:space="preserve">Penny put her handbag down on the desk. She took out the photograph she had carried all day, and this time she turned it face-up and stood it against the monitor, where it could see. Derek saw it for a second, upside down, before he looked back at the screen. It was not a man on a floor. It was four people and a dog in a row in this office at half past one on Sunday morning, standing up, with Penny in the middle of them, furious. Then she leaned over his shoulder, put one finger on the delete key, and did not press it.</w:t>
       </w:r>
     </w:p>
     <w:p>
@@ -15932,20 +16036,20 @@
           <w:b w:val="0"/>
           <w:sz w:val="22"/>
         </w:rPr>
-        <w:t>She looked at Derek's name for some time.</w:t>
-      </w:r>
-    </w:p>
-    <w:p>
-      <w:pPr>
-        <w:spacing w:after="40" w:line="240" w:lineRule="auto"/>
-      </w:pPr>
-      <w:r>
-        <w:rPr>
-          <w:rFonts w:ascii="Georgia" w:hAnsi="Georgia" w:eastAsia="Georgia"/>
-          <w:b w:val="0"/>
-          <w:sz w:val="22"/>
-        </w:rPr>
-        <w:t>"I'm going to let him do Wednesday."</w:t>
+        <w:t xml:space="preserve">She looked at Derek's name for some time. Then she took the clipboard out of her bag, the one she chaired things with, and turned back two pages to a line in her own hand, written at twenty to two on Sunday morning, in the second of the two one o'clocks: WEDNESDAYS: D., AFTER SCHOOL. She had told Sophie at tea on Sunday, in the voice. She had not told Derek.</w:t>
+      </w:r>
+    </w:p>
+    <w:p>
+      <w:pPr>
+        <w:spacing w:after="40" w:line="240" w:lineRule="auto"/>
+      </w:pPr>
+      <w:r>
+        <w:rPr>
+          <w:rFonts w:ascii="Georgia" w:hAnsi="Georgia" w:eastAsia="Georgia"/>
+          <w:b w:val="0"/>
+          <w:sz w:val="22"/>
+        </w:rPr>
+        <w:t xml:space="preserve">"I'm still going to let him do Wednesday."</w:t>
       </w:r>
     </w:p>
     <w:p>
@@ -15971,20 +16075,20 @@
           <w:b w:val="0"/>
           <w:sz w:val="22"/>
         </w:rPr>
-        <w:t>"The gate?"</w:t>
-      </w:r>
-    </w:p>
-    <w:p>
-      <w:pPr>
-        <w:spacing w:after="160" w:line="240" w:lineRule="auto"/>
-      </w:pPr>
-      <w:r>
-        <w:rPr>
-          <w:rFonts w:ascii="Georgia" w:hAnsi="Georgia" w:eastAsia="Georgia"/>
-          <w:b w:val="0"/>
-          <w:sz w:val="22"/>
-        </w:rPr>
-        <w:t>"The ordinary gate. After school. Not during double maths. Him." She heard herself say it in the committee voice and let it stand, because it was the right voice for a decision; it was what the voice was for. "He told me the order before it was over. He told me what he wasn't going to do, and then he didn't do it, and he did it twice. That's data. I've been waiting three years for some."</w:t>
+        <w:t xml:space="preserve">"You wrote that on Sunday."</w:t>
+      </w:r>
+    </w:p>
+    <w:p>
+      <w:pPr>
+        <w:spacing w:after="160" w:line="240" w:lineRule="auto"/>
+      </w:pPr>
+      <w:r>
+        <w:rPr>
+          <w:rFonts w:ascii="Georgia" w:hAnsi="Georgia" w:eastAsia="Georgia"/>
+          <w:b w:val="0"/>
+          <w:sz w:val="22"/>
+        </w:rPr>
+        <w:t xml:space="preserve">"In the middle of the night. I wanted to see if it would survive a Monday." She heard herself say it in the committee voice and let it stand, because it was the right voice for a decision; it was what the voice was for. "It's survived a railway. He told me the order before it was over. He told me what he wasn't going to do, and then he didn't do it, and he did it twice. That's data. I've been waiting three years for some."</w:t>
       </w:r>
     </w:p>
     <w:p>
@@ -16036,7 +16140,7 @@
           <w:b w:val="0"/>
           <w:sz w:val="22"/>
         </w:rPr>
-        <w:t>"It's finished," he said, mildly surprised.</w:t>
+        <w:t xml:space="preserve">"It's finished," he said, mildly surprised. He took the list out of his cardigan pocket, the one Sophie had annotated on Sunday, and under WHAT I DON'T KNOW YET he wrote, in his whiteboard capitals, WEDNESDAY: NOT MINE. GOOD.</w:t>
       </w:r>
     </w:p>
     <w:p>
@@ -16152,20 +16256,20 @@
           <w:b w:val="0"/>
           <w:sz w:val="22"/>
         </w:rPr>
-        <w:t>She lived on the top floor of a narrow house that had been divided, at some point in the 1970s, by a builder with strong views about where a kitchen should not go. The kitchen was in the hall. The table was in the kitchen, which meant the table was in the hall, and she sat at it with her coat still on, because she had come in at seven and sat down and not got up again, apart from once, to put the kettle on and forget it.</w:t>
-      </w:r>
-    </w:p>
-    <w:p>
-      <w:pPr>
-        <w:spacing w:after="160" w:line="240" w:lineRule="auto"/>
-      </w:pPr>
-      <w:r>
-        <w:rPr>
-          <w:rFonts w:ascii="Georgia" w:hAnsi="Georgia" w:eastAsia="Georgia"/>
-          <w:b w:val="0"/>
-          <w:sz w:val="22"/>
-        </w:rPr>
-        <w:t>The handbag was on the chair beside her. She had not unpacked it. She had taken out the itinerary, and her phone, and a biro from the Bureau that said nothing on the side, and she had taken out the photograph and put it on the table face-down, the way it had travelled all day, and had not turned it over. She did not intend to turn it over. It was not that kind of evening. She had put it there because it had been in the bag all day for a frightening reason, and she wanted, now that the day was over, to see whether it still felt like that kind of object out of the bag. It did. She left it where it was.</w:t>
+        <w:t xml:space="preserve">She lived on the top floor of a narrow house divided in the 1970s by a builder with strong views about where a kitchen should not go. The kitchen was in the hall, and so was the table, and she sat at it with her coat still on, because she had come in at seven and sat down and not got up again, apart from once, to put the kettle on and forget it.</w:t>
+      </w:r>
+    </w:p>
+    <w:p>
+      <w:pPr>
+        <w:spacing w:after="160" w:line="240" w:lineRule="auto"/>
+      </w:pPr>
+      <w:r>
+        <w:rPr>
+          <w:rFonts w:ascii="Georgia" w:hAnsi="Georgia" w:eastAsia="Georgia"/>
+          <w:b w:val="0"/>
+          <w:sz w:val="22"/>
+        </w:rPr>
+        <w:t xml:space="preserve">She had taken out the itinerary, and her phone, and a biro from the Bureau that said nothing on the side, and the photograph she had taken back off Derek's monitor at five. She stood it against the sugar bowl, face-up. Four of them and a dog, at half past one on Sunday morning, standing in a row in the office because she had told them to, and herself in the middle, looking furious. She had looked at it a good many times since Sunday. It was still the right way up.</w:t>
       </w:r>
     </w:p>
     <w:p>
@@ -16230,33 +16334,33 @@
           <w:b w:val="0"/>
           <w:sz w:val="22"/>
         </w:rPr>
-        <w:t>There were two parts. She knew that much, though she would not have admitted how in company: she had read the chapter in the physics book Trevor had lent her in the spring, the one with the coffee ring on the cover, and she had read it twice, because Trevor had asked her once at the kettle whether she had read it and she had wanted to be able to say yes without lying. Clocks higher up run fast. Clocks moving run slow. On an aeroplane you were both, and the question was which one won.</w:t>
-      </w:r>
-    </w:p>
-    <w:p>
-      <w:pPr>
-        <w:spacing w:after="160" w:line="240" w:lineRule="auto"/>
-      </w:pPr>
-      <w:r>
-        <w:rPr>
-          <w:rFonts w:ascii="Georgia" w:hAnsi="Georgia" w:eastAsia="Georgia"/>
-          <w:b w:val="0"/>
-          <w:sz w:val="22"/>
-        </w:rPr>
-        <w:t>Higher up first. The fraction by which a clock gained was the height times the strength of gravity, divided by the speed of light squared. She wrote it out the long way, because the short way was how you made mistakes: eleven thousand metres, times nine point eight, divided by nine times ten to the sixteen. One point two times ten to the minus twelve. A little over a trillionth. She multiplied by the seconds in an hour and got four point three billionths of a second for every hour at height.</w:t>
-      </w:r>
-    </w:p>
-    <w:p>
-      <w:pPr>
-        <w:spacing w:after="160" w:line="240" w:lineRule="auto"/>
-      </w:pPr>
-      <w:r>
-        <w:rPr>
-          <w:rFonts w:ascii="Georgia" w:hAnsi="Georgia" w:eastAsia="Georgia"/>
-          <w:b w:val="0"/>
-          <w:sz w:val="22"/>
-        </w:rPr>
-        <w:t>Moving second. The fraction by which a clock lost was half the speed squared over the speed of light squared. Two hundred and fifty metres a second, which was what the internet said an airliner did, more or less, if you did not ask it any harder questions. Half of two hundred and fifty squared, divided by nine times ten to the sixteen. Three and a half times ten to the minus thirteen. One and a quarter nanoseconds an hour, lost.</w:t>
+        <w:t xml:space="preserve">There were two parts. She had read the chapter in the physics book Trevor had lent her in the spring, twice, so as to be able to say yes at the kettle without lying. Clocks higher up run fast. Clocks moving run slow. On an aeroplane you were both, and the question was which one won.</w:t>
+      </w:r>
+    </w:p>
+    <w:p>
+      <w:pPr>
+        <w:spacing w:after="160" w:line="240" w:lineRule="auto"/>
+      </w:pPr>
+      <w:r>
+        <w:rPr>
+          <w:rFonts w:ascii="Georgia" w:hAnsi="Georgia" w:eastAsia="Georgia"/>
+          <w:b w:val="0"/>
+          <w:sz w:val="22"/>
+        </w:rPr>
+        <w:t xml:space="preserve">Higher up first: eleven thousand metres, times nine point eight, divided by the speed of light squared. She wrote it out the long way, because the short way was how you made mistakes. A little over a trillionth. Four point three billionths of a second gained for every hour at height.</w:t>
+      </w:r>
+    </w:p>
+    <w:p>
+      <w:pPr>
+        <w:spacing w:after="160" w:line="240" w:lineRule="auto"/>
+      </w:pPr>
+      <w:r>
+        <w:rPr>
+          <w:rFonts w:ascii="Georgia" w:hAnsi="Georgia" w:eastAsia="Georgia"/>
+          <w:b w:val="0"/>
+          <w:sz w:val="22"/>
+        </w:rPr>
+        <w:t xml:space="preserve">Moving second: half the speed squared, over the speed of light squared, at two hundred and fifty metres a second, which was what the internet said an airliner did if you did not ask it any harder questions. One and a quarter billionths an hour, lost.</w:t>
       </w:r>
     </w:p>
     <w:p>
@@ -16295,7 +16399,7 @@
           <w:b w:val="0"/>
           <w:sz w:val="22"/>
         </w:rPr>
-        <w:t>It annoyed her more than she could reasonably account for. It was not that she wanted him to be wrong. It was that he had done it upside down, in his head, in the time it took to put a ticket away, while being visibly delighted about something else, and she had done it at a table with a biro over twenty minutes, and they had got the same number, and that was what being very smart and very lazy looked like from the outside. Herbert's phrase. She had heard Weinstein quote it about himself with something not far from pride.</w:t>
+        <w:t xml:space="preserve">It annoyed her more than she could reasonably account for. He had done it upside down, in his head, in the time it took to put a ticket away, and she had done it with a biro over twenty minutes, and they had got the same number. Very smart and very lazy, Herbert called it. Weinstein quoted it about himself with something not far from pride.</w:t>
       </w:r>
     </w:p>
     <w:p>
@@ -16542,7 +16646,7 @@
           <w:b w:val="0"/>
           <w:sz w:val="22"/>
         </w:rPr>
-        <w:t>"You did the speed of the plane against the ground. Two hundred and fifty metres a second. But the ground isn't standing still. It's going round. London's doing about three hundred metres a second, east, just sitting there. Athens is further south, so it's doing more, nearly three hundred and seventy. Everyone's doing it. You, me, Derek, the kettle. It's the Earth turning."</w:t>
+        <w:t xml:space="preserve">"You did the plane's speed against the ground. But the ground's going round. London's doing about three hundred metres a second, east, just sitting there. Athens is further south, so it's doing more. Everyone's doing it. You, me, Derek, the kettle."</w:t>
       </w:r>
     </w:p>
     <w:p>
@@ -16568,7 +16672,7 @@
           <w:b w:val="0"/>
           <w:sz w:val="22"/>
         </w:rPr>
-        <w:t xml:space="preserve">"It doesn't cancel. That's what everybody gets wrong." He was going faster now; she could hear it, the particular acceleration of Trevor when a problem had stopped being a problem and become a pleasure. "Moving clocks run slow, but moving compared with what? Not the ground. The ground's moving. You have to measure everyone against something that isn't spinning. In that frame the ground's already doing three hundred east, so its clocks are already slow, and you, flying east, are doing three hundred plus your two-fifty. And the slowing goes with the square of the speed."</w:t>
+        <w:t xml:space="preserve">"It doesn't cancel." He was going faster now, the particular acceleration of Trevor when a problem had stopped being a problem and become a pleasure. "Moving compared with what? You have to measure everyone against something that isn't spinning. Then the ground's already doing three hundred east, and you, flying east, are doing three hundred plus your two-fifty. And the slowing goes with the square of the speed."</w:t>
       </w:r>
     </w:p>
     <w:p>
@@ -16633,7 +16737,7 @@
           <w:b w:val="0"/>
           <w:sz w:val="22"/>
         </w:rPr>
-        <w:t>"Less than that, because you're not going straight east. South-east. Call it three, three and a half, an hour. Actually." There was a pause, and the scratch of a pencil on something that was probably the back of a cereal box. "Hang on. Also you're not at eleven thousand metres for three and a half hours. That's the time on the ticket. That's from the gate to the gate. Some of it's sitting on the tarmac at Heathrow behind a plane to Dubai. Some of it's going up, and some of it's coming down, and on the way up and the way down you're lower, and lower means less of the gravity bit. You're probably at height for two and a half hours. Maybe a bit more."</w:t>
+        <w:t xml:space="preserve">"Call it three, three and a half an hour, because you're going south-east, not east." The scratch of a pencil on what was probably the back of a cereal box. "And you're not at eleven thousand metres for three and a half hours. That's gate to gate. Some of it's sitting at Heathrow behind a plane to Dubai. Some of it's climbing. You're at height for two and a half, maybe."</w:t>
       </w:r>
     </w:p>
     <w:p>
@@ -16724,7 +16828,7 @@
           <w:b w:val="0"/>
           <w:sz w:val="22"/>
         </w:rPr>
-        <w:t>Penny looked at the ten and a half on the itinerary, and at the x3 in the margin beside it, and at the photograph, face-down, which had not moved.</w:t>
+        <w:t xml:space="preserve">Penny looked at the ten and a half on the itinerary, and at the x3 in the margin beside it, and at the four of them standing against the sugar bowl.</w:t>
       </w:r>
     </w:p>
     <w:p>
@@ -16750,33 +16854,7 @@
           <w:b w:val="0"/>
           <w:sz w:val="22"/>
         </w:rPr>
-        <w:t>"Somebody did it. Properly. Nineteen seventy-one. Two men took four atomic clocks round the world on ordinary airliners. Passenger flights. They bought the clocks seats." He sounded, suddenly, very happy. "They went east all the way round, and then west all the way round, and compared them with the clocks they'd left at home in Washington. Going east, the clocks lost about sixty billionths of a second. Going west, they gained about two hundred and seventy. Same planes, same heights, roughly. The only difference was which way they went round a planet that was already turning. And it came out the way the theory said, more or less, within the error. Hafele and Keating. I've got the paper somewhere. It's two pages. It's the best two pages in the world."</w:t>
-      </w:r>
-    </w:p>
-    <w:p>
-      <w:pPr>
-        <w:spacing w:after="40" w:line="240" w:lineRule="auto"/>
-      </w:pPr>
-      <w:r>
-        <w:rPr>
-          <w:rFonts w:ascii="Georgia" w:hAnsi="Georgia" w:eastAsia="Georgia"/>
-          <w:b w:val="0"/>
-          <w:sz w:val="22"/>
-        </w:rPr>
-        <w:t>"West gained."</w:t>
-      </w:r>
-    </w:p>
-    <w:p>
-      <w:pPr>
-        <w:spacing w:after="160" w:line="240" w:lineRule="auto"/>
-      </w:pPr>
-      <w:r>
-        <w:rPr>
-          <w:rFonts w:ascii="Georgia" w:hAnsi="Georgia" w:eastAsia="Georgia"/>
-          <w:b w:val="0"/>
-          <w:sz w:val="22"/>
-        </w:rPr>
-        <w:t>"West gained a lot. Because going west you're taking some of the Earth's spin off. You're nearly standing still compared with the frame that isn't spinning. So you hardly slow at all, and the gravity bit's all you get." He paused. "If you were going to Los Angeles he'd at least have got the sign right."</w:t>
+        <w:t xml:space="preserve">"Somebody did it. Nineteen seventy-one. Two men took four atomic clocks round the world on ordinary airliners and bought them seats." He sounded very happy. "East, the clocks lost. West, they gained. Same planes, roughly the same heights. The only difference was which way they went round a planet that was already turning. Hafele and Keating. It's two pages. It's the best two pages in the world."</w:t>
       </w:r>
     </w:p>
     <w:p>
@@ -17075,7 +17153,7 @@
           <w:b w:val="0"/>
           <w:sz w:val="22"/>
         </w:rPr>
-        <w:t>"He'll find out from the air. Thursday week. When I send him a number and it isn't ten." She looked at the photograph on the table and, this time, picked it up, still face-down, and put it back in the bag, in the inside pocket, behind the itinerary, where it lived. It was not that kind of evening any more. It had stopped being that kind of evening somewhere around the Earth turning. "Let him be right for ten days. It'll do him good to have something to lose."</w:t>
+        <w:t xml:space="preserve">"He'll find out from the air. Thursday week. When I send him a number and it isn't ten." She picked up the photograph, looked at it once more, and put it in the inside pocket of the bag, behind the itinerary, face-up. "Let him be right for ten days. It'll do him good to have something to lose."</w:t>
       </w:r>
     </w:p>
     <w:p>
@@ -17231,7 +17309,7 @@
           <w:b w:val="0"/>
           <w:sz w:val="22"/>
         </w:rPr>
-        <w:t>"Ask for the ground speed. Not the airspeed. They're different. The airspeed's what the wing feels. The ground speed's what the clock feels, near enough. Well, the ground speed and the Earth." He hesitated. "And the height. And the time at height. Write them down when they say them. They only say them once."</w:t>
+        <w:t xml:space="preserve">"Ask for the ground speed, not the airspeed. And the height. And the time at height. Write them down when they say them. They only say them once."</w:t>
       </w:r>
     </w:p>
     <w:p>
@@ -17283,7 +17361,7 @@
           <w:b w:val="0"/>
           <w:sz w:val="22"/>
         </w:rPr>
-        <w:t xml:space="preserve">He rang off. She sat for a while with the phone in her hand and the itinerary in front of her, and the kettle she had boiled at seven and forgotten, and the rain on the window, and a train somewhere across London in a doorway on the second floor of an old building, with Derek sitting in front of it with the face.</w:t>
+        <w:t xml:space="preserve">He rang off. She sat with the phone in her hand, and the kettle she had boiled at seven and forgotten, and the rain on the window, and a train somewhere across London in a doorway on the second floor of an old building, with Derek sitting in front of it with the face.</w:t>
       </w:r>
     </w:p>
     <w:p>
@@ -18697,7 +18775,7 @@
           <w:b w:val="0"/>
           <w:sz w:val="22"/>
         </w:rPr>
-        <w:t>Herbert Matkowski arrived at Julius Barbarian's house at two o'clock, which he knew because his watch said so, and his watch said so because a transmitter outside Frankfurt told it so every minute, and the transmitter knew because a room full of atomic clocks in Braunschweig had agreed among themselves. He had walked from Schwabing after lunch in order to arrive exactly then. He had telephoned on Monday evening to make the appointment.</w:t>
+        <w:t xml:space="preserve">Herbert Matkowski arrived at Julius Barbarian's house at two o'clock, which he knew because his watch said so, and his watch said so because a transmitter outside Frankfurt told it so every minute, on behalf of a room of atomic clocks in Braunschweig.</w:t>
       </w:r>
     </w:p>
     <w:p>
@@ -18853,7 +18931,7 @@
           <w:b w:val="0"/>
           <w:sz w:val="22"/>
         </w:rPr>
-        <w:t xml:space="preserve">They were not a collection in the ordinary sense. Nobody would have collected them for their beauty. There was a kitchen timer shaped like a tomato. There was a station clock, small, of the kind that hangs over platforms, with its cable cut. There was a ship's chronometer in a box, a child's alarm clock with bells, two wristwatches lying on their backs, an hourglass, a candle marked in rings, a metronome, a pendulum clock lying on its side, which was therefore not going, and others Herbert did not stop to catalogue. Every one that told the time at all told a different one. Not slightly different. Different. The station clock said twenty past nine. The chronometer said a quarter to five. The tomato said nothing, because it was a timer and did not believe in the hour at all, only in how long until the next thing.</w:t>
+        <w:t xml:space="preserve">They were not a collection in the ordinary sense. There was a kitchen timer shaped like a tomato, a small station clock with its cable cut, a ship's chronometer in a box, a child's alarm clock with bells, two wristwatches lying on their backs, an hourglass, a candle marked in rings, a metronome, and others Herbert did not stop to catalogue. Every one that told the time told a different one. The station clock said twenty past nine. The chronometer said a quarter to five. The tomato said nothing, because it did not believe in the hour at all, only in how long until the next thing.</w:t>
       </w:r>
     </w:p>
     <w:p>
@@ -18905,7 +18983,7 @@
           <w:b w:val="0"/>
           <w:sz w:val="22"/>
         </w:rPr>
-        <w:t>Herbert sat down across the table from twenty disagreements and laid his drawing on the only clear corner. He found that the tick of so many unsynchronised mechanisms at once produced in him a physical discomfort he had not experienced since an examination hall in 1971, and that the discomfort was located, quite precisely, behind his left eye. He did not intend to mention it.</w:t>
+        <w:t xml:space="preserve">Herbert sat down across the table from twenty disagreements and laid his drawing on the only clear corner. The tick of so many unsynchronised mechanisms produced in him a discomfort he had not felt since an examination hall in 1971, located, quite precisely, behind his left eye. He did not intend to mention it.</w:t>
       </w:r>
     </w:p>
     <w:p>
@@ -18944,59 +19022,7 @@
           <w:b w:val="0"/>
           <w:sz w:val="22"/>
         </w:rPr>
-        <w:t>"They are all correctly reporting their relation to the moment I wound them. That is all any clock reports. That one," he pointed at the chronometer, "is reporting that it has been going for a certain number of swings since I set it to a quarter to five. It is perfectly honest about it. You call it wrong because it disagrees with Braunschweig. It does not know Braunschweig. It has never been introduced."</w:t>
-      </w:r>
-    </w:p>
-    <w:p>
-      <w:pPr>
-        <w:spacing w:after="40" w:line="240" w:lineRule="auto"/>
-      </w:pPr>
-      <w:r>
-        <w:rPr>
-          <w:rFonts w:ascii="Georgia" w:hAnsi="Georgia" w:eastAsia="Georgia"/>
-          <w:b w:val="0"/>
-          <w:sz w:val="22"/>
-        </w:rPr>
-        <w:t>"It is a quarter past two."</w:t>
-      </w:r>
-    </w:p>
-    <w:p>
-      <w:pPr>
-        <w:spacing w:after="40" w:line="240" w:lineRule="auto"/>
-      </w:pPr>
-      <w:r>
-        <w:rPr>
-          <w:rFonts w:ascii="Georgia" w:hAnsi="Georgia" w:eastAsia="Georgia"/>
-          <w:b w:val="0"/>
-          <w:sz w:val="22"/>
-        </w:rPr>
-        <w:t>"In Braunschweig."</w:t>
-      </w:r>
-    </w:p>
-    <w:p>
-      <w:pPr>
-        <w:spacing w:after="40" w:line="240" w:lineRule="auto"/>
-      </w:pPr>
-      <w:r>
-        <w:rPr>
-          <w:rFonts w:ascii="Georgia" w:hAnsi="Georgia" w:eastAsia="Georgia"/>
-          <w:b w:val="0"/>
-          <w:sz w:val="22"/>
-        </w:rPr>
-        <w:t>"Everywhere in this time zone."</w:t>
-      </w:r>
-    </w:p>
-    <w:p>
-      <w:pPr>
-        <w:spacing w:after="160" w:line="240" w:lineRule="auto"/>
-      </w:pPr>
-      <w:r>
-        <w:rPr>
-          <w:rFonts w:ascii="Georgia" w:hAnsi="Georgia" w:eastAsia="Georgia"/>
-          <w:b w:val="0"/>
-          <w:sz w:val="22"/>
-        </w:rPr>
-        <w:t>"Everywhere that has agreed to ask Braunschweig." Barbarian looked enormously pleased. "Show me the drawing."</w:t>
+        <w:t xml:space="preserve">"They are all correctly reporting their relation to the moment I wound them. That is all any clock reports. You call the chronometer wrong because it disagrees with Braunschweig. It has never been introduced to Braunschweig. Show me the drawing."</w:t>
       </w:r>
     </w:p>
     <w:p>
@@ -19183,41 +19209,15 @@
     </w:p>
     <w:p>
       <w:pPr>
-        <w:spacing w:after="40" w:line="240" w:lineRule="auto"/>
-      </w:pPr>
-      <w:r>
-        <w:rPr>
-          <w:rFonts w:ascii="Georgia" w:hAnsi="Georgia" w:eastAsia="Georgia"/>
-          <w:b w:val="0"/>
-          <w:sz w:val="22"/>
-        </w:rPr>
-        <w:t>"That is unfair to duration."</w:t>
-      </w:r>
-    </w:p>
-    <w:p>
-      <w:pPr>
-        <w:spacing w:after="40" w:line="240" w:lineRule="auto"/>
-      </w:pPr>
-      <w:r>
-        <w:rPr>
-          <w:rFonts w:ascii="Georgia" w:hAnsi="Georgia" w:eastAsia="Georgia"/>
-          <w:b w:val="0"/>
-          <w:sz w:val="22"/>
-        </w:rPr>
-        <w:t>"I am always unfair to duration. It has been unfair to me for forty years."</w:t>
-      </w:r>
-    </w:p>
-    <w:p>
-      <w:pPr>
-        <w:spacing w:after="160" w:line="240" w:lineRule="auto"/>
-      </w:pPr>
-      <w:r>
-        <w:rPr>
-          <w:rFonts w:ascii="Georgia" w:hAnsi="Georgia" w:eastAsia="Georgia"/>
-          <w:b w:val="0"/>
-          <w:sz w:val="22"/>
-        </w:rPr>
-        <w:t>Herbert took a pencil out of his inside pocket. He did not intend to write anything with it. He held it because he found it easier to think with a pencil in his hand than with twenty clocks in his ear.</w:t>
+        <w:spacing w:after="160" w:line="240" w:lineRule="auto"/>
+      </w:pPr>
+      <w:r>
+        <w:rPr>
+          <w:rFonts w:ascii="Georgia" w:hAnsi="Georgia" w:eastAsia="Georgia"/>
+          <w:b w:val="0"/>
+          <w:sz w:val="22"/>
+        </w:rPr>
+        <w:t xml:space="preserve">Herbert took a pencil out of his inside pocket, because he found it easier to think with a pencil in his hand than with twenty clocks in his ear.</w:t>
       </w:r>
     </w:p>
     <w:p>
@@ -19256,72 +19256,20 @@
           <w:b w:val="0"/>
           <w:sz w:val="22"/>
         </w:rPr>
-        <w:t xml:space="preserve">"In steps. One." He laid the pencil beside the drawing, parallel to the ruled line, exactly. "Between the door and the reading there is a quantity every good clock at rest in that office would agree on, whatever it said at the start: the difference between its readings. It does not depend on Braunschweig. In relativity it is the one thing about that interval every observer agrees upon. It is not a convention. It is geometry. Two."</w:t>
-      </w:r>
-    </w:p>
-    <w:p>
-      <w:pPr>
-        <w:spacing w:after="40" w:line="240" w:lineRule="auto"/>
-      </w:pPr>
-      <w:r>
-        <w:rPr>
-          <w:rFonts w:ascii="Georgia" w:hAnsi="Georgia" w:eastAsia="Georgia"/>
-          <w:b w:val="0"/>
-          <w:sz w:val="22"/>
-        </w:rPr>
-        <w:t>"Stop. Before two."</w:t>
-      </w:r>
-    </w:p>
-    <w:p>
-      <w:pPr>
-        <w:spacing w:after="40" w:line="240" w:lineRule="auto"/>
-      </w:pPr>
-      <w:r>
-        <w:rPr>
-          <w:rFonts w:ascii="Georgia" w:hAnsi="Georgia" w:eastAsia="Georgia"/>
-          <w:b w:val="0"/>
-          <w:sz w:val="22"/>
-        </w:rPr>
-        <w:t>"I have not finished one."</w:t>
-      </w:r>
-    </w:p>
-    <w:p>
-      <w:pPr>
-        <w:spacing w:after="160" w:line="240" w:lineRule="auto"/>
-      </w:pPr>
-      <w:r>
-        <w:rPr>
-          <w:rFonts w:ascii="Georgia" w:hAnsi="Georgia" w:eastAsia="Georgia"/>
-          <w:b w:val="0"/>
-          <w:sz w:val="22"/>
-        </w:rPr>
-        <w:t>"You have finished one. You said every clock at rest in the office would agree. How would they agree?"</w:t>
-      </w:r>
-    </w:p>
-    <w:p>
-      <w:pPr>
-        <w:spacing w:after="40" w:line="240" w:lineRule="auto"/>
-      </w:pPr>
-      <w:r>
-        <w:rPr>
-          <w:rFonts w:ascii="Georgia" w:hAnsi="Georgia" w:eastAsia="Georgia"/>
-          <w:b w:val="0"/>
-          <w:sz w:val="22"/>
-        </w:rPr>
-        <w:t>"By reading."</w:t>
-      </w:r>
-    </w:p>
-    <w:p>
-      <w:pPr>
-        <w:spacing w:after="160" w:line="240" w:lineRule="auto"/>
-      </w:pPr>
-      <w:r>
-        <w:rPr>
-          <w:rFonts w:ascii="Georgia" w:hAnsi="Georgia" w:eastAsia="Georgia"/>
-          <w:b w:val="0"/>
-          <w:sz w:val="22"/>
-        </w:rPr>
-        <w:t xml:space="preserve">"By counting. Each one counts its own motion. A pendulum counts swings. Braunschweig counts caesium atoms, because a committee in Paris told it to. Every second there has ever been is one motion counted against another. There is no time in any of it. There is only counting, and comparing the counts." He spread his hands over the twenty clocks. "These do not measure time. They measure each other."</w:t>
+        <w:t xml:space="preserve">"In steps. One." He laid the pencil beside the drawing, parallel to the ruled line, exactly. "Between the door and the reading there is a quantity every good clock at rest in that office would agree on, whatever it said at the start: the difference between its readings. It is not a convention. It is geometry. Two—"</w:t>
+      </w:r>
+    </w:p>
+    <w:p>
+      <w:pPr>
+        <w:spacing w:after="40" w:line="240" w:lineRule="auto"/>
+      </w:pPr>
+      <w:r>
+        <w:rPr>
+          <w:rFonts w:ascii="Georgia" w:hAnsi="Georgia" w:eastAsia="Georgia"/>
+          <w:b w:val="0"/>
+          <w:sz w:val="22"/>
+        </w:rPr>
+        <w:t xml:space="preserve">"Stop. Before two. How would they agree?" said Barbarian. "By counting. Each clock counts its own motion. A pendulum counts swings. Braunschweig counts caesium atoms, because a committee in Paris told it to. Every second there has ever been is one motion counted against another." He spread his hands over the twenty clocks. "These do not measure time. They measure each other."</w:t>
       </w:r>
     </w:p>
     <w:p>
@@ -19399,7 +19347,423 @@
           <w:b w:val="0"/>
           <w:sz w:val="22"/>
         </w:rPr>
-        <w:t xml:space="preserve">"Two. Grant you the counting. Two good clocks at rest, together at the door and together at the reading, agree on the count between, whatever convention you choose. That agreement is not a convention. The world enforces it. Three—"</w:t>
+        <w:t xml:space="preserve">"Two. Two good clocks together at the door and together at the reading agree on the count between," said Herbert. "The world enforces that."</w:t>
+      </w:r>
+    </w:p>
+    <w:p>
+      <w:pPr>
+        <w:spacing w:after="160" w:line="240" w:lineRule="auto"/>
+      </w:pPr>
+      <w:r>
+        <w:rPr>
+          <w:rFonts w:ascii="Georgia" w:hAnsi="Georgia" w:eastAsia="Georgia"/>
+          <w:b w:val="0"/>
+          <w:sz w:val="22"/>
+        </w:rPr>
+        <w:t xml:space="preserve">"I give you that the world is extraordinarily well behaved about which counts agree. What I do not give you is the wire." Barbarian tapped the ruled line once with the end of a finger, the only time he touched the paper. "You have the events. You have the order. You have the counts, if anybody counted, which that office mostly did not. Where in any of that is the line?"</w:t>
+      </w:r>
+    </w:p>
+    <w:p>
+      <w:pPr>
+        <w:spacing w:after="160" w:line="240" w:lineRule="auto"/>
+      </w:pPr>
+      <w:r>
+        <w:rPr>
+          <w:rFonts w:ascii="Georgia" w:hAnsi="Georgia" w:eastAsia="Georgia"/>
+          <w:b w:val="0"/>
+          <w:sz w:val="22"/>
+        </w:rPr>
+        <w:t>Herbert looked at the line he had drawn.</w:t>
+      </w:r>
+    </w:p>
+    <w:p>
+      <w:pPr>
+        <w:spacing w:after="40" w:line="240" w:lineRule="auto"/>
+      </w:pPr>
+      <w:r>
+        <w:rPr>
+          <w:rFonts w:ascii="Georgia" w:hAnsi="Georgia" w:eastAsia="Georgia"/>
+          <w:b w:val="0"/>
+          <w:sz w:val="22"/>
+        </w:rPr>
+        <w:t>"It is where I put it."</w:t>
+      </w:r>
+    </w:p>
+    <w:p>
+      <w:pPr>
+        <w:spacing w:after="40" w:line="240" w:lineRule="auto"/>
+      </w:pPr>
+      <w:r>
+        <w:rPr>
+          <w:rFonts w:ascii="Georgia" w:hAnsi="Georgia" w:eastAsia="Georgia"/>
+          <w:b w:val="0"/>
+          <w:sz w:val="22"/>
+        </w:rPr>
+        <w:t>"Yes."</w:t>
+      </w:r>
+    </w:p>
+    <w:p>
+      <w:pPr>
+        <w:spacing w:after="40" w:line="240" w:lineRule="auto"/>
+      </w:pPr>
+      <w:r>
+        <w:rPr>
+          <w:rFonts w:ascii="Georgia" w:hAnsi="Georgia" w:eastAsia="Georgia"/>
+          <w:b w:val="0"/>
+          <w:sz w:val="22"/>
+        </w:rPr>
+        <w:t>"It is a convenience."</w:t>
+      </w:r>
+    </w:p>
+    <w:p>
+      <w:pPr>
+        <w:spacing w:after="160" w:line="240" w:lineRule="auto"/>
+      </w:pPr>
+      <w:r>
+        <w:rPr>
+          <w:rFonts w:ascii="Georgia" w:hAnsi="Georgia" w:eastAsia="Georgia"/>
+          <w:b w:val="0"/>
+          <w:sz w:val="22"/>
+        </w:rPr>
+        <w:t xml:space="preserve">"It is the best convenience in physics. It is so good that people forget they put it there." Barbarian sat back. "And then a sheet arrives before a door, and a voice comes after, and they look at the wire for the answer, and the wire says nothing. YESTERDAY. Not a date. A direction. It is the most honest railway in Europe. I should like to meet whoever designed it."</w:t>
+      </w:r>
+    </w:p>
+    <w:p>
+      <w:pPr>
+        <w:spacing w:after="40" w:line="240" w:lineRule="auto"/>
+      </w:pPr>
+      <w:r>
+        <w:rPr>
+          <w:rFonts w:ascii="Georgia" w:hAnsi="Georgia" w:eastAsia="Georgia"/>
+          <w:b w:val="0"/>
+          <w:sz w:val="22"/>
+        </w:rPr>
+        <w:t>"So should Mr Gent."</w:t>
+      </w:r>
+    </w:p>
+    <w:p>
+      <w:pPr>
+        <w:spacing w:after="160" w:line="240" w:lineRule="auto"/>
+      </w:pPr>
+      <w:r>
+        <w:rPr>
+          <w:rFonts w:ascii="Georgia" w:hAnsi="Georgia" w:eastAsia="Georgia"/>
+          <w:b w:val="0"/>
+          <w:sz w:val="22"/>
+        </w:rPr>
+        <w:t>"No. Mr Gent should like to know who sent the sheet. That is a different wish." Barbarian looked at the question mark beside SHEET. "And it is the wrong question."</w:t>
+      </w:r>
+    </w:p>
+    <w:p>
+      <w:pPr>
+        <w:spacing w:after="40" w:line="240" w:lineRule="auto"/>
+      </w:pPr>
+      <w:r>
+        <w:rPr>
+          <w:rFonts w:ascii="Georgia" w:hAnsi="Georgia" w:eastAsia="Georgia"/>
+          <w:b w:val="0"/>
+          <w:sz w:val="22"/>
+        </w:rPr>
+        <w:t>"It is not a wrong question. It is an unanswerable one, at present."</w:t>
+      </w:r>
+    </w:p>
+    <w:p>
+      <w:pPr>
+        <w:spacing w:after="160" w:line="240" w:lineRule="auto"/>
+      </w:pPr>
+      <w:r>
+        <w:rPr>
+          <w:rFonts w:ascii="Georgia" w:hAnsi="Georgia" w:eastAsia="Georgia"/>
+          <w:b w:val="0"/>
+          <w:sz w:val="22"/>
+        </w:rPr>
+        <w:t xml:space="preserve">"It is wrong in the form he asks it. Who sent it. Sent is a verb with a before inside it. He wants a person standing at the before, holding the sheet out. But you cannot get a sender out of an order. You can only get one out of a mechanism, and he has no mechanism." Barbarian considered. "Alfred thinks it was himself, I suppose."</w:t>
+      </w:r>
+    </w:p>
+    <w:p>
+      <w:pPr>
+        <w:spacing w:after="160" w:line="240" w:lineRule="auto"/>
+      </w:pPr>
+      <w:r>
+        <w:rPr>
+          <w:rFonts w:ascii="Georgia" w:hAnsi="Georgia" w:eastAsia="Georgia"/>
+          <w:b w:val="0"/>
+          <w:sz w:val="22"/>
+        </w:rPr>
+        <w:t>Herbert did not answer, which was an answer.</w:t>
+      </w:r>
+    </w:p>
+    <w:p>
+      <w:pPr>
+        <w:spacing w:after="160" w:line="240" w:lineRule="auto"/>
+      </w:pPr>
+      <w:r>
+        <w:rPr>
+          <w:rFonts w:ascii="Georgia" w:hAnsi="Georgia" w:eastAsia="Georgia"/>
+          <w:b w:val="0"/>
+          <w:sz w:val="22"/>
+        </w:rPr>
+        <w:t xml:space="preserve">"Of course he does. He was holding it. People always want to be the before; it is the only position in a story that cannot be blamed for arriving late." Barbarian shook his head, slowly, with every appearance of affection. "Tell him he is in the order, and that is honour enough for anyone. He was there for the sheet. That is all."</w:t>
+      </w:r>
+    </w:p>
+    <w:p>
+      <w:pPr>
+        <w:spacing w:after="40" w:line="240" w:lineRule="auto"/>
+      </w:pPr>
+      <w:r>
+        <w:rPr>
+          <w:rFonts w:ascii="Georgia" w:hAnsi="Georgia" w:eastAsia="Georgia"/>
+          <w:b w:val="0"/>
+          <w:sz w:val="22"/>
+        </w:rPr>
+        <w:t>"I told him something of the kind this morning."</w:t>
+      </w:r>
+    </w:p>
+    <w:p>
+      <w:pPr>
+        <w:spacing w:after="40" w:line="240" w:lineRule="auto"/>
+      </w:pPr>
+      <w:r>
+        <w:rPr>
+          <w:rFonts w:ascii="Georgia" w:hAnsi="Georgia" w:eastAsia="Georgia"/>
+          <w:b w:val="0"/>
+          <w:sz w:val="22"/>
+        </w:rPr>
+        <w:t>"Did he listen?"</w:t>
+      </w:r>
+    </w:p>
+    <w:p>
+      <w:pPr>
+        <w:spacing w:after="40" w:line="240" w:lineRule="auto"/>
+      </w:pPr>
+      <w:r>
+        <w:rPr>
+          <w:rFonts w:ascii="Georgia" w:hAnsi="Georgia" w:eastAsia="Georgia"/>
+          <w:b w:val="0"/>
+          <w:sz w:val="22"/>
+        </w:rPr>
+        <w:t>"He opened a patent file about a dishwasher."</w:t>
+      </w:r>
+    </w:p>
+    <w:p>
+      <w:pPr>
+        <w:spacing w:after="40" w:line="240" w:lineRule="auto"/>
+      </w:pPr>
+      <w:r>
+        <w:rPr>
+          <w:rFonts w:ascii="Georgia" w:hAnsi="Georgia" w:eastAsia="Georgia"/>
+          <w:b w:val="0"/>
+          <w:sz w:val="22"/>
+        </w:rPr>
+        <w:t>"Then he listened."</w:t>
+      </w:r>
+    </w:p>
+    <w:p>
+      <w:pPr>
+        <w:spacing w:after="160" w:line="240" w:lineRule="auto"/>
+      </w:pPr>
+      <w:r>
+        <w:rPr>
+          <w:rFonts w:ascii="Georgia" w:hAnsi="Georgia" w:eastAsia="Georgia"/>
+          <w:b w:val="0"/>
+          <w:sz w:val="22"/>
+        </w:rPr>
+        <w:t xml:space="preserve">They sat for a while. Twenty clocks went on disagreeing.</w:t>
+      </w:r>
+    </w:p>
+    <w:p>
+      <w:pPr>
+        <w:spacing w:after="40" w:line="240" w:lineRule="auto"/>
+      </w:pPr>
+      <w:r>
+        <w:rPr>
+          <w:rFonts w:ascii="Georgia" w:hAnsi="Georgia" w:eastAsia="Georgia"/>
+          <w:b w:val="0"/>
+          <w:sz w:val="22"/>
+        </w:rPr>
+        <w:t>"You still have not said three."</w:t>
+      </w:r>
+    </w:p>
+    <w:p>
+      <w:pPr>
+        <w:spacing w:after="160" w:line="240" w:lineRule="auto"/>
+      </w:pPr>
+      <w:r>
+        <w:rPr>
+          <w:rFonts w:ascii="Georgia" w:hAnsi="Georgia" w:eastAsia="Georgia"/>
+          <w:b w:val="0"/>
+          <w:sz w:val="22"/>
+        </w:rPr>
+        <w:t>Herbert picked up the pencil.</w:t>
+      </w:r>
+    </w:p>
+    <w:p>
+      <w:pPr>
+        <w:spacing w:after="160" w:line="240" w:lineRule="auto"/>
+      </w:pPr>
+      <w:r>
+        <w:rPr>
+          <w:rFonts w:ascii="Georgia" w:hAnsi="Georgia" w:eastAsia="Georgia"/>
+          <w:b w:val="0"/>
+          <w:sz w:val="22"/>
+        </w:rPr>
+        <w:t xml:space="preserve">"Three. You may take away my ruler. You may not take away the cone. A sheet and a voice purported to come from somewhere else, and you cannot order events in different places unless you know whether a signal could pass between them. Without the cone your relations are a heap. With it they are a—"</w:t>
+      </w:r>
+    </w:p>
+    <w:p>
+      <w:pPr>
+        <w:spacing w:after="40" w:line="240" w:lineRule="auto"/>
+      </w:pPr>
+      <w:r>
+        <w:rPr>
+          <w:rFonts w:ascii="Georgia" w:hAnsi="Georgia" w:eastAsia="Georgia"/>
+          <w:b w:val="0"/>
+          <w:sz w:val="22"/>
+        </w:rPr>
+        <w:t>"A shape. Yes. Go on."</w:t>
+      </w:r>
+    </w:p>
+    <w:p>
+      <w:pPr>
+        <w:spacing w:after="160" w:line="240" w:lineRule="auto"/>
+      </w:pPr>
+      <w:r>
+        <w:rPr>
+          <w:rFonts w:ascii="Georgia" w:hAnsi="Georgia" w:eastAsia="Georgia"/>
+          <w:b w:val="0"/>
+          <w:sz w:val="22"/>
+        </w:rPr>
+        <w:t xml:space="preserve">"I am going on. With it they are a partial order. Some pairs before and after. Some pairs neither. The door and the voice: ordered. The sheet and its sender, wherever he is: unknown, because we do not know where he stands."</w:t>
+      </w:r>
+    </w:p>
+    <w:p>
+      <w:pPr>
+        <w:spacing w:after="160" w:line="240" w:lineRule="auto"/>
+      </w:pPr>
+      <w:r>
+        <w:rPr>
+          <w:rFonts w:ascii="Georgia" w:hAnsi="Georgia" w:eastAsia="Georgia"/>
+          <w:b w:val="0"/>
+          <w:sz w:val="22"/>
+        </w:rPr>
+        <w:t>He stopped, because Barbarian had opened his mouth, and Herbert, for the first time in a conversation with this man that had lasted, on and off, some forty years, held up one hand flat.</w:t>
+      </w:r>
+    </w:p>
+    <w:p>
+      <w:pPr>
+        <w:spacing w:after="40" w:line="240" w:lineRule="auto"/>
+      </w:pPr>
+      <w:r>
+        <w:rPr>
+          <w:rFonts w:ascii="Georgia" w:hAnsi="Georgia" w:eastAsia="Georgia"/>
+          <w:b w:val="0"/>
+          <w:sz w:val="22"/>
+        </w:rPr>
+        <w:t>"No," Herbert said. "I have not finished."</w:t>
+      </w:r>
+    </w:p>
+    <w:p>
+      <w:pPr>
+        <w:spacing w:after="160" w:line="240" w:lineRule="auto"/>
+      </w:pPr>
+      <w:r>
+        <w:rPr>
+          <w:rFonts w:ascii="Georgia" w:hAnsi="Georgia" w:eastAsia="Georgia"/>
+          <w:b w:val="0"/>
+          <w:sz w:val="22"/>
+        </w:rPr>
+        <w:t>Barbarian shut his mouth.</w:t>
+      </w:r>
+    </w:p>
+    <w:p>
+      <w:pPr>
+        <w:spacing w:after="160" w:line="240" w:lineRule="auto"/>
+      </w:pPr>
+      <w:r>
+        <w:rPr>
+          <w:rFonts w:ascii="Georgia" w:hAnsi="Georgia" w:eastAsia="Georgia"/>
+          <w:b w:val="0"/>
+          <w:sz w:val="22"/>
+        </w:rPr>
+        <w:t xml:space="preserve">"The sender stays blank because we do not know where the sender stands in the shape. It is not a mystery. It is a missing coordinate. When Mr Gent leaves that field empty, he is writing down accurately that one of his events has no place yet. Now you may speak."</w:t>
+      </w:r>
+    </w:p>
+    <w:p>
+      <w:pPr>
+        <w:spacing w:after="160" w:line="240" w:lineRule="auto"/>
+      </w:pPr>
+      <w:r>
+        <w:rPr>
+          <w:rFonts w:ascii="Georgia" w:hAnsi="Georgia" w:eastAsia="Georgia"/>
+          <w:b w:val="0"/>
+          <w:sz w:val="22"/>
+        </w:rPr>
+        <w:t>Barbarian looked at him across the twenty clocks with an expression Herbert had never once seen on his face, and which he identified, after a moment, as pure happiness.</w:t>
+      </w:r>
+    </w:p>
+    <w:p>
+      <w:pPr>
+        <w:spacing w:after="40" w:line="240" w:lineRule="auto"/>
+      </w:pPr>
+      <w:r>
+        <w:rPr>
+          <w:rFonts w:ascii="Georgia" w:hAnsi="Georgia" w:eastAsia="Georgia"/>
+          <w:b w:val="0"/>
+          <w:sz w:val="22"/>
+        </w:rPr>
+        <w:t>"You interrupted me."</w:t>
+      </w:r>
+    </w:p>
+    <w:p>
+      <w:pPr>
+        <w:spacing w:after="40" w:line="240" w:lineRule="auto"/>
+      </w:pPr>
+      <w:r>
+        <w:rPr>
+          <w:rFonts w:ascii="Georgia" w:hAnsi="Georgia" w:eastAsia="Georgia"/>
+          <w:b w:val="0"/>
+          <w:sz w:val="22"/>
+        </w:rPr>
+        <w:t>"Yes."</w:t>
+      </w:r>
+    </w:p>
+    <w:p>
+      <w:pPr>
+        <w:spacing w:after="40" w:line="240" w:lineRule="auto"/>
+      </w:pPr>
+      <w:r>
+        <w:rPr>
+          <w:rFonts w:ascii="Georgia" w:hAnsi="Georgia" w:eastAsia="Georgia"/>
+          <w:b w:val="0"/>
+          <w:sz w:val="22"/>
+        </w:rPr>
+        <w:t>"In forty years you have never interrupted me."</w:t>
+      </w:r>
+    </w:p>
+    <w:p>
+      <w:pPr>
+        <w:spacing w:after="40" w:line="240" w:lineRule="auto"/>
+      </w:pPr>
+      <w:r>
+        <w:rPr>
+          <w:rFonts w:ascii="Georgia" w:hAnsi="Georgia" w:eastAsia="Georgia"/>
+          <w:b w:val="0"/>
+          <w:sz w:val="22"/>
+        </w:rPr>
+        <w:t>"In forty years you have never let me finish one."</w:t>
+      </w:r>
+    </w:p>
+    <w:p>
+      <w:pPr>
+        <w:spacing w:after="160" w:line="240" w:lineRule="auto"/>
+      </w:pPr>
+      <w:r>
+        <w:rPr>
+          <w:rFonts w:ascii="Georgia" w:hAnsi="Georgia" w:eastAsia="Georgia"/>
+          <w:b w:val="0"/>
+          <w:sz w:val="22"/>
+        </w:rPr>
+        <w:t>"Excellent," said Julius Barbarian. "Oh, excellent." He leaned forward. "A partial order. Not a wire. A shape with holes in it where we do not know the places yet. I can live in that. I have always lived in that. You have simply never said it to me without a ruler in your hand." He reached out, and for the second time touched the drawing, and this time he turned it face-down. "May I have this? For the collection."</w:t>
       </w:r>
     </w:p>
     <w:p>
@@ -19425,423 +19789,85 @@
           <w:b w:val="0"/>
           <w:sz w:val="22"/>
         </w:rPr>
-        <w:t>"I have not said three."</w:t>
-      </w:r>
-    </w:p>
-    <w:p>
-      <w:pPr>
-        <w:spacing w:after="160" w:line="240" w:lineRule="auto"/>
-      </w:pPr>
-      <w:r>
-        <w:rPr>
-          <w:rFonts w:ascii="Georgia" w:hAnsi="Georgia" w:eastAsia="Georgia"/>
-          <w:b w:val="0"/>
-          <w:sz w:val="22"/>
-        </w:rPr>
-        <w:t xml:space="preserve">"You were going to say that therefore duration is real. It is not therefore. I give you that the world is extraordinarily well behaved about which counts agree. What I do not give you is the wire." Barbarian tapped the ruled line once with the end of a finger, the only time he touched the paper. "You have the events. You have the order. You have the counts, if anybody counted, which this office mostly did not. Where in any of that is the line?"</w:t>
-      </w:r>
-    </w:p>
-    <w:p>
-      <w:pPr>
-        <w:spacing w:after="160" w:line="240" w:lineRule="auto"/>
-      </w:pPr>
-      <w:r>
-        <w:rPr>
-          <w:rFonts w:ascii="Georgia" w:hAnsi="Georgia" w:eastAsia="Georgia"/>
-          <w:b w:val="0"/>
-          <w:sz w:val="22"/>
-        </w:rPr>
-        <w:t>Herbert looked at the line he had drawn.</w:t>
-      </w:r>
-    </w:p>
-    <w:p>
-      <w:pPr>
-        <w:spacing w:after="40" w:line="240" w:lineRule="auto"/>
-      </w:pPr>
-      <w:r>
-        <w:rPr>
-          <w:rFonts w:ascii="Georgia" w:hAnsi="Georgia" w:eastAsia="Georgia"/>
-          <w:b w:val="0"/>
-          <w:sz w:val="22"/>
-        </w:rPr>
-        <w:t>"It is where I put it."</w:t>
-      </w:r>
-    </w:p>
-    <w:p>
-      <w:pPr>
-        <w:spacing w:after="40" w:line="240" w:lineRule="auto"/>
-      </w:pPr>
-      <w:r>
-        <w:rPr>
-          <w:rFonts w:ascii="Georgia" w:hAnsi="Georgia" w:eastAsia="Georgia"/>
-          <w:b w:val="0"/>
-          <w:sz w:val="22"/>
-        </w:rPr>
-        <w:t>"Yes."</w:t>
-      </w:r>
-    </w:p>
-    <w:p>
-      <w:pPr>
-        <w:spacing w:after="40" w:line="240" w:lineRule="auto"/>
-      </w:pPr>
-      <w:r>
-        <w:rPr>
-          <w:rFonts w:ascii="Georgia" w:hAnsi="Georgia" w:eastAsia="Georgia"/>
-          <w:b w:val="0"/>
-          <w:sz w:val="22"/>
-        </w:rPr>
-        <w:t>"It is a convenience."</w:t>
-      </w:r>
-    </w:p>
-    <w:p>
-      <w:pPr>
-        <w:spacing w:after="160" w:line="240" w:lineRule="auto"/>
-      </w:pPr>
-      <w:r>
-        <w:rPr>
-          <w:rFonts w:ascii="Georgia" w:hAnsi="Georgia" w:eastAsia="Georgia"/>
-          <w:b w:val="0"/>
-          <w:sz w:val="22"/>
-        </w:rPr>
-        <w:t>"It is a very good convenience. It is the best convenience in physics. It is so good that people forget they put it there." Barbarian sat back. "And then a sheet of paper arrives before a door, and a voice comes after, and they look at the wire for the answer, and the wire says nothing, because the wire was never anything. The answer was in the order. The board in that doorway understood this better than any of you. YESTERDAY. Not a date. A direction. A relation between the train and the room. It is the most honest railway in Europe. I should like to meet whoever designed it."</w:t>
-      </w:r>
-    </w:p>
-    <w:p>
-      <w:pPr>
-        <w:spacing w:after="40" w:line="240" w:lineRule="auto"/>
-      </w:pPr>
-      <w:r>
-        <w:rPr>
-          <w:rFonts w:ascii="Georgia" w:hAnsi="Georgia" w:eastAsia="Georgia"/>
-          <w:b w:val="0"/>
-          <w:sz w:val="22"/>
-        </w:rPr>
-        <w:t>"So should Mr Gent."</w:t>
-      </w:r>
-    </w:p>
-    <w:p>
-      <w:pPr>
-        <w:spacing w:after="160" w:line="240" w:lineRule="auto"/>
-      </w:pPr>
-      <w:r>
-        <w:rPr>
-          <w:rFonts w:ascii="Georgia" w:hAnsi="Georgia" w:eastAsia="Georgia"/>
-          <w:b w:val="0"/>
-          <w:sz w:val="22"/>
-        </w:rPr>
-        <w:t>"No. Mr Gent should like to know who sent the sheet. That is a different wish." Barbarian looked at the question mark beside SHEET. "And it is the wrong question."</w:t>
-      </w:r>
-    </w:p>
-    <w:p>
-      <w:pPr>
-        <w:spacing w:after="40" w:line="240" w:lineRule="auto"/>
-      </w:pPr>
-      <w:r>
-        <w:rPr>
-          <w:rFonts w:ascii="Georgia" w:hAnsi="Georgia" w:eastAsia="Georgia"/>
-          <w:b w:val="0"/>
-          <w:sz w:val="22"/>
-        </w:rPr>
-        <w:t>"It is not a wrong question. It is an unanswerable one, at present."</w:t>
-      </w:r>
-    </w:p>
-    <w:p>
-      <w:pPr>
-        <w:spacing w:after="160" w:line="240" w:lineRule="auto"/>
-      </w:pPr>
-      <w:r>
-        <w:rPr>
-          <w:rFonts w:ascii="Georgia" w:hAnsi="Georgia" w:eastAsia="Georgia"/>
-          <w:b w:val="0"/>
-          <w:sz w:val="22"/>
-        </w:rPr>
-        <w:t xml:space="preserve">"It is wrong in the form he asks it. Who sent it. Sent is a verb with a before inside it. He wants a person standing at the before, holding the sheet out. But you cannot get a sender out of an order. You can only get one out of a mechanism, and he has no mechanism." Barbarian considered. "Alfred thinks it was himself, I suppose."</w:t>
-      </w:r>
-    </w:p>
-    <w:p>
-      <w:pPr>
-        <w:spacing w:after="160" w:line="240" w:lineRule="auto"/>
-      </w:pPr>
-      <w:r>
-        <w:rPr>
-          <w:rFonts w:ascii="Georgia" w:hAnsi="Georgia" w:eastAsia="Georgia"/>
-          <w:b w:val="0"/>
-          <w:sz w:val="22"/>
-        </w:rPr>
-        <w:t>Herbert did not answer, which was an answer.</w:t>
-      </w:r>
-    </w:p>
-    <w:p>
-      <w:pPr>
-        <w:spacing w:after="160" w:line="240" w:lineRule="auto"/>
-      </w:pPr>
-      <w:r>
-        <w:rPr>
-          <w:rFonts w:ascii="Georgia" w:hAnsi="Georgia" w:eastAsia="Georgia"/>
-          <w:b w:val="0"/>
-          <w:sz w:val="22"/>
-        </w:rPr>
-        <w:t xml:space="preserve">"Of course he does. He was holding it. People always want to be the before; it is the only position in a story that cannot be blamed for arriving late." Barbarian shook his head, slowly, with every appearance of affection. "Tell him he is in the order, and that is honour enough for anyone. He was there for the sheet. That is all."</w:t>
-      </w:r>
-    </w:p>
-    <w:p>
-      <w:pPr>
-        <w:spacing w:after="40" w:line="240" w:lineRule="auto"/>
-      </w:pPr>
-      <w:r>
-        <w:rPr>
-          <w:rFonts w:ascii="Georgia" w:hAnsi="Georgia" w:eastAsia="Georgia"/>
-          <w:b w:val="0"/>
-          <w:sz w:val="22"/>
-        </w:rPr>
-        <w:t>"I told him something of the kind this morning."</w:t>
-      </w:r>
-    </w:p>
-    <w:p>
-      <w:pPr>
-        <w:spacing w:after="40" w:line="240" w:lineRule="auto"/>
-      </w:pPr>
-      <w:r>
-        <w:rPr>
-          <w:rFonts w:ascii="Georgia" w:hAnsi="Georgia" w:eastAsia="Georgia"/>
-          <w:b w:val="0"/>
-          <w:sz w:val="22"/>
-        </w:rPr>
-        <w:t>"Did he listen?"</w:t>
-      </w:r>
-    </w:p>
-    <w:p>
-      <w:pPr>
-        <w:spacing w:after="40" w:line="240" w:lineRule="auto"/>
-      </w:pPr>
-      <w:r>
-        <w:rPr>
-          <w:rFonts w:ascii="Georgia" w:hAnsi="Georgia" w:eastAsia="Georgia"/>
-          <w:b w:val="0"/>
-          <w:sz w:val="22"/>
-        </w:rPr>
-        <w:t>"He opened a patent file about a dishwasher."</w:t>
-      </w:r>
-    </w:p>
-    <w:p>
-      <w:pPr>
-        <w:spacing w:after="40" w:line="240" w:lineRule="auto"/>
-      </w:pPr>
-      <w:r>
-        <w:rPr>
-          <w:rFonts w:ascii="Georgia" w:hAnsi="Georgia" w:eastAsia="Georgia"/>
-          <w:b w:val="0"/>
-          <w:sz w:val="22"/>
-        </w:rPr>
-        <w:t>"Then he listened."</w:t>
-      </w:r>
-    </w:p>
-    <w:p>
-      <w:pPr>
-        <w:spacing w:after="160" w:line="240" w:lineRule="auto"/>
-      </w:pPr>
-      <w:r>
-        <w:rPr>
-          <w:rFonts w:ascii="Georgia" w:hAnsi="Georgia" w:eastAsia="Georgia"/>
-          <w:b w:val="0"/>
-          <w:sz w:val="22"/>
-        </w:rPr>
-        <w:t>They sat for a while. Twenty clocks went on disagreeing. The metronome, which Herbert had not noticed was going, had a faster beat than the pendulum would have had if the pendulum had been upright, and the two wristwatches, lying on their backs, ticked so nearly together that he found himself waiting for them to drift apart, and then could not tell whether they had.</w:t>
-      </w:r>
-    </w:p>
-    <w:p>
-      <w:pPr>
-        <w:spacing w:after="40" w:line="240" w:lineRule="auto"/>
-      </w:pPr>
-      <w:r>
-        <w:rPr>
-          <w:rFonts w:ascii="Georgia" w:hAnsi="Georgia" w:eastAsia="Georgia"/>
-          <w:b w:val="0"/>
-          <w:sz w:val="22"/>
-        </w:rPr>
-        <w:t>"You still have not said three."</w:t>
-      </w:r>
-    </w:p>
-    <w:p>
-      <w:pPr>
-        <w:spacing w:after="160" w:line="240" w:lineRule="auto"/>
-      </w:pPr>
-      <w:r>
-        <w:rPr>
-          <w:rFonts w:ascii="Georgia" w:hAnsi="Georgia" w:eastAsia="Georgia"/>
-          <w:b w:val="0"/>
-          <w:sz w:val="22"/>
-        </w:rPr>
-        <w:t>Herbert picked up the pencil.</w:t>
-      </w:r>
-    </w:p>
-    <w:p>
-      <w:pPr>
-        <w:spacing w:after="160" w:line="240" w:lineRule="auto"/>
-      </w:pPr>
-      <w:r>
-        <w:rPr>
-          <w:rFonts w:ascii="Georgia" w:hAnsi="Georgia" w:eastAsia="Georgia"/>
-          <w:b w:val="0"/>
-          <w:sz w:val="22"/>
-        </w:rPr>
-        <w:t xml:space="preserve">"Three. Order on one line is cheap. Of course everything in one office is in one order; the office does not go anywhere. What made the case hard is that a sheet and a voice purported to come from somewhere else, and you cannot order events in different places unless you know whether a signal could pass between them. That is the cone. You may take away my ruler. You may not take away the cone. Without it your relations are a heap. With it they are a—"</w:t>
-      </w:r>
-    </w:p>
-    <w:p>
-      <w:pPr>
-        <w:spacing w:after="40" w:line="240" w:lineRule="auto"/>
-      </w:pPr>
-      <w:r>
-        <w:rPr>
-          <w:rFonts w:ascii="Georgia" w:hAnsi="Georgia" w:eastAsia="Georgia"/>
-          <w:b w:val="0"/>
-          <w:sz w:val="22"/>
-        </w:rPr>
-        <w:t>"A shape. Yes. Go on."</w:t>
-      </w:r>
-    </w:p>
-    <w:p>
-      <w:pPr>
-        <w:spacing w:after="160" w:line="240" w:lineRule="auto"/>
-      </w:pPr>
-      <w:r>
-        <w:rPr>
-          <w:rFonts w:ascii="Georgia" w:hAnsi="Georgia" w:eastAsia="Georgia"/>
-          <w:b w:val="0"/>
-          <w:sz w:val="22"/>
-        </w:rPr>
-        <w:t xml:space="preserve">"I am going on. With it they are a partial order. Some pairs before and after. Some pairs neither. The door and the voice: ordered. The sheet and its sender, wherever he is: unknown, because we do not know where he stands, and so we do not know whether the pair can be ordered at all."</w:t>
-      </w:r>
-    </w:p>
-    <w:p>
-      <w:pPr>
-        <w:spacing w:after="160" w:line="240" w:lineRule="auto"/>
-      </w:pPr>
-      <w:r>
-        <w:rPr>
-          <w:rFonts w:ascii="Georgia" w:hAnsi="Georgia" w:eastAsia="Georgia"/>
-          <w:b w:val="0"/>
-          <w:sz w:val="22"/>
-        </w:rPr>
-        <w:t>He stopped, because Barbarian had opened his mouth, and Herbert, for the first time in a conversation with this man that had lasted, on and off, some forty years, held up one hand flat.</w:t>
-      </w:r>
-    </w:p>
-    <w:p>
-      <w:pPr>
-        <w:spacing w:after="40" w:line="240" w:lineRule="auto"/>
-      </w:pPr>
-      <w:r>
-        <w:rPr>
-          <w:rFonts w:ascii="Georgia" w:hAnsi="Georgia" w:eastAsia="Georgia"/>
-          <w:b w:val="0"/>
-          <w:sz w:val="22"/>
-        </w:rPr>
-        <w:t>"No," Herbert said. "I have not finished."</w:t>
-      </w:r>
-    </w:p>
-    <w:p>
-      <w:pPr>
-        <w:spacing w:after="160" w:line="240" w:lineRule="auto"/>
-      </w:pPr>
-      <w:r>
-        <w:rPr>
-          <w:rFonts w:ascii="Georgia" w:hAnsi="Georgia" w:eastAsia="Georgia"/>
-          <w:b w:val="0"/>
-          <w:sz w:val="22"/>
-        </w:rPr>
-        <w:t>Barbarian shut his mouth.</w:t>
-      </w:r>
-    </w:p>
-    <w:p>
-      <w:pPr>
-        <w:spacing w:after="160" w:line="240" w:lineRule="auto"/>
-      </w:pPr>
-      <w:r>
-        <w:rPr>
-          <w:rFonts w:ascii="Georgia" w:hAnsi="Georgia" w:eastAsia="Georgia"/>
-          <w:b w:val="0"/>
-          <w:sz w:val="22"/>
-        </w:rPr>
-        <w:t xml:space="preserve">"The sender stays blank because we do not know where the sender stands in the shape. It is not a mystery. It is a missing coordinate. When Mr Gent leaves that field empty, he is writing down accurately that one of his events has no place yet. Now you may speak."</w:t>
-      </w:r>
-    </w:p>
-    <w:p>
-      <w:pPr>
-        <w:spacing w:after="160" w:line="240" w:lineRule="auto"/>
-      </w:pPr>
-      <w:r>
-        <w:rPr>
-          <w:rFonts w:ascii="Georgia" w:hAnsi="Georgia" w:eastAsia="Georgia"/>
-          <w:b w:val="0"/>
-          <w:sz w:val="22"/>
-        </w:rPr>
-        <w:t>Barbarian looked at him across the twenty clocks with an expression Herbert had never once seen on his face, and which he identified, after a moment, as pure happiness.</w:t>
-      </w:r>
-    </w:p>
-    <w:p>
-      <w:pPr>
-        <w:spacing w:after="40" w:line="240" w:lineRule="auto"/>
-      </w:pPr>
-      <w:r>
-        <w:rPr>
-          <w:rFonts w:ascii="Georgia" w:hAnsi="Georgia" w:eastAsia="Georgia"/>
-          <w:b w:val="0"/>
-          <w:sz w:val="22"/>
-        </w:rPr>
-        <w:t>"You interrupted me."</w:t>
-      </w:r>
-    </w:p>
-    <w:p>
-      <w:pPr>
-        <w:spacing w:after="40" w:line="240" w:lineRule="auto"/>
-      </w:pPr>
-      <w:r>
-        <w:rPr>
-          <w:rFonts w:ascii="Georgia" w:hAnsi="Georgia" w:eastAsia="Georgia"/>
-          <w:b w:val="0"/>
-          <w:sz w:val="22"/>
-        </w:rPr>
-        <w:t>"Yes."</w:t>
-      </w:r>
-    </w:p>
-    <w:p>
-      <w:pPr>
-        <w:spacing w:after="40" w:line="240" w:lineRule="auto"/>
-      </w:pPr>
-      <w:r>
-        <w:rPr>
-          <w:rFonts w:ascii="Georgia" w:hAnsi="Georgia" w:eastAsia="Georgia"/>
-          <w:b w:val="0"/>
-          <w:sz w:val="22"/>
-        </w:rPr>
-        <w:t>"In forty years you have never interrupted me."</w:t>
-      </w:r>
-    </w:p>
-    <w:p>
-      <w:pPr>
-        <w:spacing w:after="40" w:line="240" w:lineRule="auto"/>
-      </w:pPr>
-      <w:r>
-        <w:rPr>
-          <w:rFonts w:ascii="Georgia" w:hAnsi="Georgia" w:eastAsia="Georgia"/>
-          <w:b w:val="0"/>
-          <w:sz w:val="22"/>
-        </w:rPr>
-        <w:t>"In forty years you have never let me finish one."</w:t>
-      </w:r>
-    </w:p>
-    <w:p>
-      <w:pPr>
-        <w:spacing w:after="160" w:line="240" w:lineRule="auto"/>
-      </w:pPr>
-      <w:r>
-        <w:rPr>
-          <w:rFonts w:ascii="Georgia" w:hAnsi="Georgia" w:eastAsia="Georgia"/>
-          <w:b w:val="0"/>
-          <w:sz w:val="22"/>
-        </w:rPr>
-        <w:t>"Excellent," said Julius Barbarian. "Oh, excellent." He leaned forward. "A partial order. Not a wire. A shape with holes in it where we do not know the places yet. I can live in that. I have always lived in that. You have simply never said it to me without a ruler in your hand." He reached out, and for the second time touched the drawing, and this time he turned it face-down. "May I have this? For the collection."</w:t>
+        <w:t>"I collect things people use to pretend time exists."</w:t>
+      </w:r>
+    </w:p>
+    <w:p>
+      <w:pPr>
+        <w:spacing w:after="40" w:line="240" w:lineRule="auto"/>
+      </w:pPr>
+      <w:r>
+        <w:rPr>
+          <w:rFonts w:ascii="Georgia" w:hAnsi="Georgia" w:eastAsia="Georgia"/>
+          <w:b w:val="0"/>
+          <w:sz w:val="22"/>
+        </w:rPr>
+        <w:t>"That is not a pretence. That is a world line."</w:t>
+      </w:r>
+    </w:p>
+    <w:p>
+      <w:pPr>
+        <w:spacing w:after="40" w:line="240" w:lineRule="auto"/>
+      </w:pPr>
+      <w:r>
+        <w:rPr>
+          <w:rFonts w:ascii="Georgia" w:hAnsi="Georgia" w:eastAsia="Georgia"/>
+          <w:b w:val="0"/>
+          <w:sz w:val="22"/>
+        </w:rPr>
+        <w:t>"Then draw me one that is not."</w:t>
+      </w:r>
+    </w:p>
+    <w:p>
+      <w:pPr>
+        <w:spacing w:after="160" w:line="240" w:lineRule="auto"/>
+      </w:pPr>
+      <w:r>
+        <w:rPr>
+          <w:rFonts w:ascii="Georgia" w:hAnsi="Georgia" w:eastAsia="Georgia"/>
+          <w:b w:val="0"/>
+          <w:sz w:val="22"/>
+        </w:rPr>
+        <w:t>Herbert considered refusing, and found that he did not want to. He asked for a clean sheet, which took some time to find, because the papers in that house were where they had been put for reasons, and he took his ruler out of his inside pocket and then, after a moment's thought, put it back. He drew the five events freehand, as small circles, without a line between them. He joined the ones that could be ordered with short arrows: sheet to door, door to voice, voice to reading, reading to refusal. He drew the train, out to one side, as a sixth circle, and an arrow from the sheet to the train, and nothing at all from the train back. He drew Sunday's radiator as a seventh circle, lower down, and an arrow from it to the door, and wrote on the arrow, in his immaculate hand: POSSIBLE. NOT SHOWN. And off on its own, unconnected to anything, an eighth circle, empty, with a question mark inside it, and no arrow either way.</w:t>
+      </w:r>
+    </w:p>
+    <w:p>
+      <w:pPr>
+        <w:spacing w:after="160" w:line="240" w:lineRule="auto"/>
+      </w:pPr>
+      <w:r>
+        <w:rPr>
+          <w:rFonts w:ascii="Georgia" w:hAnsi="Georgia" w:eastAsia="Georgia"/>
+          <w:b w:val="0"/>
+          <w:sz w:val="22"/>
+        </w:rPr>
+        <w:t>He turned it round.</w:t>
+      </w:r>
+    </w:p>
+    <w:p>
+      <w:pPr>
+        <w:spacing w:after="160" w:line="240" w:lineRule="auto"/>
+      </w:pPr>
+      <w:r>
+        <w:rPr>
+          <w:rFonts w:ascii="Georgia" w:hAnsi="Georgia" w:eastAsia="Georgia"/>
+          <w:b w:val="0"/>
+          <w:sz w:val="22"/>
+        </w:rPr>
+        <w:t xml:space="preserve">Barbarian looked at it.</w:t>
+      </w:r>
+    </w:p>
+    <w:p>
+      <w:pPr>
+        <w:spacing w:after="40" w:line="240" w:lineRule="auto"/>
+      </w:pPr>
+      <w:r>
+        <w:rPr>
+          <w:rFonts w:ascii="Georgia" w:hAnsi="Georgia" w:eastAsia="Georgia"/>
+          <w:b w:val="0"/>
+          <w:sz w:val="22"/>
+        </w:rPr>
+        <w:t>"That one I cannot collect. It does not pretend anything."</w:t>
       </w:r>
     </w:p>
     <w:p>
@@ -19867,110 +19893,6 @@
           <w:b w:val="0"/>
           <w:sz w:val="22"/>
         </w:rPr>
-        <w:t>"I collect things people use to pretend time exists."</w:t>
-      </w:r>
-    </w:p>
-    <w:p>
-      <w:pPr>
-        <w:spacing w:after="40" w:line="240" w:lineRule="auto"/>
-      </w:pPr>
-      <w:r>
-        <w:rPr>
-          <w:rFonts w:ascii="Georgia" w:hAnsi="Georgia" w:eastAsia="Georgia"/>
-          <w:b w:val="0"/>
-          <w:sz w:val="22"/>
-        </w:rPr>
-        <w:t>"That is not a pretence. That is a world line."</w:t>
-      </w:r>
-    </w:p>
-    <w:p>
-      <w:pPr>
-        <w:spacing w:after="40" w:line="240" w:lineRule="auto"/>
-      </w:pPr>
-      <w:r>
-        <w:rPr>
-          <w:rFonts w:ascii="Georgia" w:hAnsi="Georgia" w:eastAsia="Georgia"/>
-          <w:b w:val="0"/>
-          <w:sz w:val="22"/>
-        </w:rPr>
-        <w:t>"Then draw me one that is not."</w:t>
-      </w:r>
-    </w:p>
-    <w:p>
-      <w:pPr>
-        <w:spacing w:after="160" w:line="240" w:lineRule="auto"/>
-      </w:pPr>
-      <w:r>
-        <w:rPr>
-          <w:rFonts w:ascii="Georgia" w:hAnsi="Georgia" w:eastAsia="Georgia"/>
-          <w:b w:val="0"/>
-          <w:sz w:val="22"/>
-        </w:rPr>
-        <w:t>Herbert considered refusing, and found that he did not want to. He asked for a clean sheet, which took some time to find, because the papers in that house were where they had been put for reasons, and he took his ruler out of his inside pocket and then, after a moment's thought, put it back. He drew the five events freehand, as small circles, without a line between them. He joined the ones that could be ordered with short arrows: sheet to door, door to voice, voice to reading, reading to refusal. He drew the train, out to one side, as a sixth circle, and an arrow from the sheet to the train, and nothing at all from the train back. He drew Sunday's radiator as a seventh circle, lower down, and an arrow from it to the door, and wrote on the arrow, in his immaculate hand: POSSIBLE. NOT SHOWN. And off on its own, unconnected to anything, an eighth circle, empty, with a question mark inside it, and no arrow either way.</w:t>
-      </w:r>
-    </w:p>
-    <w:p>
-      <w:pPr>
-        <w:spacing w:after="160" w:line="240" w:lineRule="auto"/>
-      </w:pPr>
-      <w:r>
-        <w:rPr>
-          <w:rFonts w:ascii="Georgia" w:hAnsi="Georgia" w:eastAsia="Georgia"/>
-          <w:b w:val="0"/>
-          <w:sz w:val="22"/>
-        </w:rPr>
-        <w:t>He turned it round.</w:t>
-      </w:r>
-    </w:p>
-    <w:p>
-      <w:pPr>
-        <w:spacing w:after="160" w:line="240" w:lineRule="auto"/>
-      </w:pPr>
-      <w:r>
-        <w:rPr>
-          <w:rFonts w:ascii="Georgia" w:hAnsi="Georgia" w:eastAsia="Georgia"/>
-          <w:b w:val="0"/>
-          <w:sz w:val="22"/>
-        </w:rPr>
-        <w:t xml:space="preserve">Barbarian looked at it.</w:t>
-      </w:r>
-    </w:p>
-    <w:p>
-      <w:pPr>
-        <w:spacing w:after="40" w:line="240" w:lineRule="auto"/>
-      </w:pPr>
-      <w:r>
-        <w:rPr>
-          <w:rFonts w:ascii="Georgia" w:hAnsi="Georgia" w:eastAsia="Georgia"/>
-          <w:b w:val="0"/>
-          <w:sz w:val="22"/>
-        </w:rPr>
-        <w:t>"That one I cannot collect. It does not pretend anything."</w:t>
-      </w:r>
-    </w:p>
-    <w:p>
-      <w:pPr>
-        <w:spacing w:after="40" w:line="240" w:lineRule="auto"/>
-      </w:pPr>
-      <w:r>
-        <w:rPr>
-          <w:rFonts w:ascii="Georgia" w:hAnsi="Georgia" w:eastAsia="Georgia"/>
-          <w:b w:val="0"/>
-          <w:sz w:val="22"/>
-        </w:rPr>
-        <w:t>"No."</w:t>
-      </w:r>
-    </w:p>
-    <w:p>
-      <w:pPr>
-        <w:spacing w:after="40" w:line="240" w:lineRule="auto"/>
-      </w:pPr>
-      <w:r>
-        <w:rPr>
-          <w:rFonts w:ascii="Georgia" w:hAnsi="Georgia" w:eastAsia="Georgia"/>
-          <w:b w:val="0"/>
-          <w:sz w:val="22"/>
-        </w:rPr>
         <w:t>"Leave it anyway."</w:t>
       </w:r>
     </w:p>
@@ -20101,33 +20023,20 @@
           <w:b w:val="0"/>
           <w:sz w:val="22"/>
         </w:rPr>
-        <w:t xml:space="preserve">He wrote four hundred words, and found that they explained the joke, and deleted them. He wrote two hundred, and found that they agreed with Herbert, and deleted those too, because a letter that agreed with Herbert would be read in London as a letter from Herbert. Then he looked at the clocks for a while, the station clock and the tomato and the chronometer and the two wristwatches on their backs, each one perfectly honest and none of them in agreement, and found that he was content, and wrote four lines that said what he meant.</w:t>
-      </w:r>
-    </w:p>
-    <w:p>
-      <w:pPr>
-        <w:spacing w:after="160" w:line="240" w:lineRule="auto"/>
-      </w:pPr>
-      <w:r>
-        <w:rPr>
-          <w:rFonts w:ascii="Georgia" w:hAnsi="Georgia" w:eastAsia="Georgia"/>
-          <w:b w:val="0"/>
-          <w:sz w:val="22"/>
-        </w:rPr>
-        <w:t>He did not put a subject line, because a subject line would have implied that one thing was about another, and he had spent the afternoon being shown, very precisely, which things were.</w:t>
-      </w:r>
-    </w:p>
-    <w:p>
-      <w:pPr>
-        <w:spacing w:after="160" w:line="240" w:lineRule="auto"/>
-      </w:pPr>
-      <w:r>
-        <w:rPr>
-          <w:rFonts w:ascii="Georgia" w:hAnsi="Georgia" w:eastAsia="Georgia"/>
-          <w:b w:val="0"/>
-          <w:sz w:val="22"/>
-        </w:rPr>
-        <w:t>He sent it. It was a little after four in London. He did not check.</w:t>
+        <w:t xml:space="preserve">He wrote four hundred words, and found that they explained the joke, and deleted them. He wrote two hundred, and found that they agreed with Herbert, and deleted those too. Then he looked at the clocks for a while, each one perfectly honest and none of them in agreement, and wrote four lines that said what he meant.</w:t>
+      </w:r>
+    </w:p>
+    <w:p>
+      <w:pPr>
+        <w:spacing w:after="160" w:line="240" w:lineRule="auto"/>
+      </w:pPr>
+      <w:r>
+        <w:rPr>
+          <w:rFonts w:ascii="Georgia" w:hAnsi="Georgia" w:eastAsia="Georgia"/>
+          <w:b w:val="0"/>
+          <w:sz w:val="22"/>
+        </w:rPr>
+        <w:t xml:space="preserve">He did not put a subject line. He sent it. It was a little after four in London. He did not check.</w:t>
       </w:r>
     </w:p>
     <w:p>
@@ -20360,7 +20269,7 @@
           <w:b w:val="0"/>
           <w:sz w:val="22"/>
         </w:rPr>
-        <w:t>"I'm aware of where it is." Mr Quayle did not turn round. He wrote the date at the top of his form, and the address, and the time, which he took from his own watch and not from the board. Derek found he approved of that. "I'll be measuring the opening."</w:t>
+        <w:t xml:space="preserve">"I'm aware of where it is." Mr Quayle did not turn round. He wrote the date at the top of his form, and the time, which he took from his own watch and not from the board. "I'll be measuring the opening."</w:t>
       </w:r>
     </w:p>
     <w:p>
@@ -20490,7 +20399,7 @@
           <w:b w:val="0"/>
           <w:sz w:val="22"/>
         </w:rPr>
-        <w:t>"I could," Mr Quayle agreed. "But I'd then have to put it on the form, and the form hasn't got a box for it. The landlord's view is that it's a decorative feature installed by the tenant. A mural, or a projection, or one of those, what do they call them. An installation. Something you'd take down at the end of the lease and make good." He looked at Mrs Marsh. "If the superintendent were to confirm it was decorative, we could all go home."</w:t>
+        <w:t xml:space="preserve">"I could," Mr Quayle agreed. "But then I'd have to put it on the form, and the form hasn't got a box for it. The landlord's view is that it's a decorative feature installed by the tenant. An installation. Something you'd take down at the end of the lease and make good." He looked at Mrs Marsh. "If the superintendent were to confirm it was decorative, we could all go home."</w:t>
       </w:r>
     </w:p>
     <w:p>
@@ -20646,7 +20555,7 @@
           <w:b w:val="0"/>
           <w:sz w:val="22"/>
         </w:rPr>
-        <w:t>"It times it. It sends light out and waits for it to come back. That's all a distance is, to it. A time. Eight hundred and ninety-six millimetres there and back is about six nanoseconds. It's not measuring where the frame is. It's measuring when the light gets home." He was going a little pink. "So you did measure it. You measured the light that came back off the sill. If you pointed it one inch further, it'd come back off the platform, and it'd come back late by exactly the right amount, because the platform's there. It doesn't care about the lease."</w:t>
+        <w:t xml:space="preserve">"It times it. It sends light out and waits for it to come back. Eight hundred and ninety-six millimetres there and back is about six nanoseconds. It's measuring when the light gets home." He was going a little pink. "If you pointed it one inch further, it'd come back off the platform, late by exactly the right amount, because the platform's there. It doesn't care about the lease."</w:t>
       </w:r>
     </w:p>
     <w:p>
@@ -20737,7 +20646,7 @@
           <w:b w:val="0"/>
           <w:sz w:val="22"/>
         </w:rPr>
-        <w:t>He went down the stairs without once looking at the doorway, which Derek thought must have taken a certain amount of effort, and was in its way a kind of discipline. At the bottom he stopped, and they heard the small click of the laser measure being taken out of its holster, and a pause, and the click of it going back in. Nobody went to the banister to see which way he had pointed it.</w:t>
+        <w:t xml:space="preserve">He went down the stairs without once looking at the doorway. At the bottom he stopped, and they heard the small click of the laser measure leaving its holster, a pause, and the click of it going back. Nobody went to the banister to see which way he had pointed it.</w:t>
       </w:r>
     </w:p>
     <w:p>
@@ -20984,6 +20893,84 @@
           <w:b w:val="0"/>
           <w:sz w:val="22"/>
         </w:rPr>
+        <w:t xml:space="preserve">Penny read the heading of his report upside down while he said it. NATURE OF INCIDENT: MYSTERIOUS (OTHER). TRAIN, 2ND FLOOR.</w:t>
+      </w:r>
+    </w:p>
+    <w:p>
+      <w:pPr>
+        <w:spacing w:after="160" w:line="240" w:lineRule="auto"/>
+      </w:pPr>
+      <w:r>
+        <w:rPr>
+          <w:rFonts w:ascii="Georgia" w:hAnsi="Georgia" w:eastAsia="Georgia"/>
+          <w:b w:val="0"/>
+          <w:sz w:val="22"/>
+        </w:rPr>
+        <w:t xml:space="preserve">"Mysterious," she said.</w:t>
+      </w:r>
+    </w:p>
+    <w:p>
+      <w:pPr>
+        <w:spacing w:after="160" w:line="240" w:lineRule="auto"/>
+      </w:pPr>
+      <w:r>
+        <w:rPr>
+          <w:rFonts w:ascii="Georgia" w:hAnsi="Georgia" w:eastAsia="Georgia"/>
+          <w:b w:val="0"/>
+          <w:sz w:val="22"/>
+        </w:rPr>
+        <w:t xml:space="preserve">"It was the only box," said Mr Pendleton. "There is fire, and there is flood, and there is suspicious package. It was not a package."</w:t>
+      </w:r>
+    </w:p>
+    <w:p>
+      <w:pPr>
+        <w:spacing w:after="160" w:line="240" w:lineRule="auto"/>
+      </w:pPr>
+      <w:r>
+        <w:rPr>
+          <w:rFonts w:ascii="Georgia" w:hAnsi="Georgia" w:eastAsia="Georgia"/>
+          <w:b w:val="0"/>
+          <w:sz w:val="22"/>
+        </w:rPr>
+        <w:t xml:space="preserve">Trevor, who liked a file to know about its neighbours, typed the report's number into the Bureau's case under RELATED RECORDS, and the form, which liked a noun, lifted the words into its FEATURE line before he could stop it. MYSTERIOUS TRAIN. He looked at it. "That's what the sheet says."</w:t>
+      </w:r>
+    </w:p>
+    <w:p>
+      <w:pPr>
+        <w:spacing w:after="160" w:line="240" w:lineRule="auto"/>
+      </w:pPr>
+      <w:r>
+        <w:rPr>
+          <w:rFonts w:ascii="Georgia" w:hAnsi="Georgia" w:eastAsia="Georgia"/>
+          <w:b w:val="0"/>
+          <w:sz w:val="22"/>
+        </w:rPr>
+        <w:t xml:space="preserve">"Then the sheet has Mr Pendleton's taste in adjectives," said Penny. "Mysterious is what people write when they don't want to describe something. It's a mood. Fix it later."</w:t>
+      </w:r>
+    </w:p>
+    <w:p>
+      <w:pPr>
+        <w:spacing w:after="160" w:line="240" w:lineRule="auto"/>
+      </w:pPr>
+      <w:r>
+        <w:rPr>
+          <w:rFonts w:ascii="Georgia" w:hAnsi="Georgia" w:eastAsia="Georgia"/>
+          <w:b w:val="0"/>
+          <w:sz w:val="22"/>
+        </w:rPr>
+        <w:t xml:space="preserve">Trevor said he would fix it later. He did not.</w:t>
+      </w:r>
+    </w:p>
+    <w:p>
+      <w:pPr>
+        <w:spacing w:after="160" w:line="240" w:lineRule="auto"/>
+      </w:pPr>
+      <w:r>
+        <w:rPr>
+          <w:rFonts w:ascii="Georgia" w:hAnsi="Georgia" w:eastAsia="Georgia"/>
+          <w:b w:val="0"/>
+          <w:sz w:val="22"/>
+        </w:rPr>
         <w:t xml:space="preserve">Destination as displayed: YESTERDAY. Trevor wrote it in capitals, and the form, which had been designed with Crewe in mind, took it without complaint, which Penny said was more than CASEBOOK had ever managed.</w:t>
       </w:r>
     </w:p>
@@ -21205,7 +21192,46 @@
           <w:b w:val="0"/>
           <w:sz w:val="22"/>
         </w:rPr>
-        <w:t xml:space="preserve">Mrs Marsh signed. Acting Station Master, she wrote, and under it, smaller: Acting.</w:t>
+        <w:t xml:space="preserve">Before she signed, Mrs Marsh turned the form over and read the back aloud, because she did not put her name to anything she had not read. The back was where the decade had put its afterthoughts. Most of them concerned buckets. The seventh did not.</w:t>
+      </w:r>
+    </w:p>
+    <w:p>
+      <w:pPr>
+        <w:spacing w:after="160" w:line="240" w:lineRule="auto"/>
+      </w:pPr>
+      <w:r>
+        <w:rPr>
+          <w:rFonts w:ascii="Georgia" w:hAnsi="Georgia" w:eastAsia="Georgia"/>
+          <w:b w:val="0"/>
+          <w:sz w:val="22"/>
+        </w:rPr>
+        <w:t xml:space="preserve">7. NOTICES FOR THE ATTENTION OF STAFF AT THE PREVIOUS STATION ARE TO BE FOLDED IN FOUR AND LEFT ON THE FIRST SEAT OF THE LEADING VEHICLE OF THE STANDING SERVICE, WHICH WILL CONVEY THEM. THE BOARD ACCEPTS NO RESPONSIBILITY FOR NOTICES RECEIVED BEFORE THEY ARE WRITTEN.</w:t>
+      </w:r>
+    </w:p>
+    <w:p>
+      <w:pPr>
+        <w:spacing w:after="160" w:line="240" w:lineRule="auto"/>
+      </w:pPr>
+      <w:r>
+        <w:rPr>
+          <w:rFonts w:ascii="Georgia" w:hAnsi="Georgia" w:eastAsia="Georgia"/>
+          <w:b w:val="0"/>
+          <w:sz w:val="22"/>
+        </w:rPr>
+        <w:t xml:space="preserve">"That isn't a rule," said Penny. "That's a confession."</w:t>
+      </w:r>
+    </w:p>
+    <w:p>
+      <w:pPr>
+        <w:spacing w:after="160" w:line="240" w:lineRule="auto"/>
+      </w:pPr>
+      <w:r>
+        <w:rPr>
+          <w:rFonts w:ascii="Georgia" w:hAnsi="Georgia" w:eastAsia="Georgia"/>
+          <w:b w:val="0"/>
+          <w:sz w:val="22"/>
+        </w:rPr>
+        <w:t xml:space="preserve">Trevor looked through the doorway at the board. YESTERDAY. "Previous station," he said, and nobody answered him, because Mrs Marsh had turned the form back over and uncapped the pen. She signed: Acting Station Master, and under it, smaller, Acting.</w:t>
       </w:r>
     </w:p>
     <w:p>
@@ -21607,7 +21633,7 @@
           <w:b w:val="0"/>
           <w:sz w:val="22"/>
         </w:rPr>
-        <w:t xml:space="preserve">He looked at the platform at once. That was the first thing Derek noticed about him, and the thing that most distinguished him from his surveyor: he did not keep his back to it. He walked straight across the outer room and stood a pace from the sill, exactly where Trevor's tape had been on Monday, and looked at the grey slabs and the bench and the lamp and the lit train, and the board above it, and the word.</w:t>
+        <w:t xml:space="preserve">He looked at the platform at once, which was the thing that most distinguished him from his surveyor. He crossed the outer room, stood a pace from the sill, where Trevor's tape had been on Monday, and looked at the slabs and the bench and the lit train, and the word.</w:t>
       </w:r>
     </w:p>
     <w:p>
@@ -21711,7 +21737,7 @@
           <w:b w:val="0"/>
           <w:sz w:val="22"/>
         </w:rPr>
-        <w:t>"The building's insured. Was insured. Is insured. That's the trouble. On Monday morning the cover moved. Northgate had it for six years and their premium went up, so my broker moved it to Castellan, and Castellan's cover started on Monday at ten o'clock. Ten a.m. It's always ten. My broker renews everything at ten because his office opens at ten and he likes to be at his desk when a policy starts. He says it's good practice." He tapped the first letter. "Northgate says their cover ended at ten on Monday, and the tenant reported the feature at five past ten, so it's not theirs. They've got that from Pendleton's incident report. Pendleton wrote ten oh five because one of you said ten oh five to him on the stairs."</w:t>
+        <w:t xml:space="preserve">"The building's insured. That's the trouble. On Monday morning the cover moved. Northgate had it for six years, their premium went up, so my broker moved it to Castellan, and Castellan's cover started on Monday at ten a.m. It's always ten. My broker likes to be at his desk when a policy starts." He tapped the first letter. "Northgate says their cover ended at ten, and the tenant reported the feature at five past, so it's not theirs. They've got that from Pendleton's incident report. Pendleton wrote ten oh five because one of you said ten oh five to him on the stairs."</w:t>
       </w:r>
     </w:p>
     <w:p>
@@ -21737,7 +21763,7 @@
           <w:b w:val="0"/>
           <w:sz w:val="22"/>
         </w:rPr>
-        <w:t>"Castellan," Mr Haskett tapped the second, "says their cover started at ten on Monday, and the tenant's own report says the door was already open when it was noticed, so the feature pre-existed the cover, so it's not theirs either. They've got that from Pendleton's report as well. Same page. Same sentence. Already open, ten oh five." He sat back against the desk. "So one insurer has the ten oh five and the other one has the already, and between them I've got a railway in a second-floor office in a building I own and no cover at all."</w:t>
+        <w:t xml:space="preserve">"Castellan," Mr Haskett tapped the second, "says their cover started at ten, and the same report says the door was already open when it was noticed, so the feature pre-existed the cover, so it's not theirs either. Same page. Same sentence. One insurer has the ten oh five and the other one has the already, and between them I've got a railway in a second-floor office and no cover at all."</w:t>
       </w:r>
     </w:p>
     <w:p>
@@ -22023,7 +22049,7 @@
           <w:b w:val="0"/>
           <w:sz w:val="22"/>
         </w:rPr>
-        <w:t>It was Trevor who moved first. He had been sitting perfectly still on the floor by the cabinet with the cable in his lap and his glasses in his hand, and now he put the cable down and stood up, all of him, in sections, until the top of him was nearly at the door frame, and he took out his phone.</w:t>
+        <w:t xml:space="preserve">It was Trevor who moved first. He put the cable down and stood up, all of him, in sections, and took out his phone.</w:t>
       </w:r>
     </w:p>
     <w:p>
@@ -22062,7 +22088,7 @@
           <w:b w:val="0"/>
           <w:sz w:val="22"/>
         </w:rPr>
-        <w:t>"A time it hadn't happened yet." He was scrolling. "I sent Tabitha a photo on Monday morning. Before. Of the Klein bottle. She'd said on Sunday that it was the only object in the office with a sense of humour and I said it wasn't funny, it was topologically honest, and I sent her a picture of it not holding anything to prove it." He found it, and turned the screen round, and held it out at arm's length so that Mr Haskett could see. "There."</w:t>
+        <w:t xml:space="preserve">"A time it hadn't happened yet." He was scrolling. "I sent Tabitha a photo on Monday morning. Of the Klein bottle, not holding anything, to win an argument." He turned the screen round and held it out at arm's length. "There."</w:t>
       </w:r>
     </w:p>
     <w:p>
@@ -22088,7 +22114,7 @@
           <w:b w:val="0"/>
           <w:sz w:val="22"/>
         </w:rPr>
-        <w:t>"The phone puts the time on it. Not the time I sent it. The time it took the picture. From the network, which gets it from the satellites, which get it from clocks a great deal better than the one in the corridor." He touched the screen, and a line of small grey figures appeared beneath the image. "Monday. Nine fifty-eight and twelve seconds."</w:t>
+        <w:t xml:space="preserve">"The phone puts the time on it. The time it took the picture, from the network, which gets it from clocks a great deal better than the one in the corridor." He touched the screen. "Monday. Nine fifty-eight and twelve seconds."</w:t>
       </w:r>
     </w:p>
     <w:p>
@@ -22153,33 +22179,7 @@
           <w:b w:val="0"/>
           <w:sz w:val="22"/>
         </w:rPr>
-        <w:t>"The corridor clock's the ordinary clock. It doesn't have a second hand." Trevor was already out in the corridor, leaning, with his phone held up beside the clock face. He came back. "And it's slow. It says twenty-three minutes past five, and the hand's only just on the twenty-three. The phone says twenty-three minutes and thirty-one seconds. Call it half a minute slow. I checked it against the platform clock on Monday, but I never checked it against the phone, because I was only asking whether they ran at the same rate. They do. That's not the same as being right." He looked faintly ashamed of the corridor clock, as if it were a relative. "So when I said ten oh five on Monday, it was really ten oh five and a half, roughly, by the phone. Give or take a bit, because I don't know how far through the minute the hand was when I read it."</w:t>
-      </w:r>
-    </w:p>
-    <w:p>
-      <w:pPr>
-        <w:spacing w:after="40" w:line="240" w:lineRule="auto"/>
-      </w:pPr>
-      <w:r>
-        <w:rPr>
-          <w:rFonts w:ascii="Georgia" w:hAnsi="Georgia" w:eastAsia="Georgia"/>
-          <w:b w:val="0"/>
-          <w:sz w:val="22"/>
-        </w:rPr>
-        <w:t>"Ten oh six, then," said Mr Haskett.</w:t>
-      </w:r>
-    </w:p>
-    <w:p>
-      <w:pPr>
-        <w:spacing w:after="160" w:line="240" w:lineRule="auto"/>
-      </w:pPr>
-      <w:r>
-        <w:rPr>
-          <w:rFonts w:ascii="Georgia" w:hAnsi="Georgia" w:eastAsia="Georgia"/>
-          <w:b w:val="0"/>
-          <w:sz w:val="22"/>
-        </w:rPr>
-        <w:t>"No. Between ten oh five and a half and ten oh six and a half, by the phone, for the noticing. I can't do better without a second hand."</w:t>
+        <w:t xml:space="preserve">"The corridor clock's the ordinary clock. It hasn't got a second hand." Trevor was already out in the corridor, leaning, with his phone held up beside the clock face. He came back looking faintly ashamed of the corridor clock, as if it were a relative. "And it's about half a minute slow. On Monday I only checked whether it ran at the same rate as the platform. It does. That's not the same as being right. So my ten oh five was really between five and a half past and six and a half past, by the phone. I can't do better without a second hand."</w:t>
       </w:r>
     </w:p>
     <w:p>
@@ -22296,7 +22296,7 @@
           <w:b w:val="0"/>
           <w:sz w:val="22"/>
         </w:rPr>
-        <w:t>"It's about eight minutes wide. Ten o'clock is a minute and forty-eight seconds from the near end. Nearer the beginning than the end." Trevor had the glasses off again. "If you assumed it was equally likely to have opened at any moment in the interval, which you can't, because nothing about doors is equally likely, then about—"</w:t>
+        <w:t xml:space="preserve">"About eight. Ten o'clock is a minute and forty-eight seconds from the near end." Trevor had the glasses off again. "If you assumed it was equally likely to have opened at any moment in the interval, which you can't, because nothing about doors is equally likely, then about—"</w:t>
       </w:r>
     </w:p>
     <w:p>
@@ -22366,28 +22366,15 @@
     </w:p>
     <w:p>
       <w:pPr>
-        <w:spacing w:after="160" w:line="240" w:lineRule="auto"/>
-      </w:pPr>
-      <w:r>
-        <w:rPr>
-          <w:rFonts w:ascii="Georgia" w:hAnsi="Georgia" w:eastAsia="Georgia"/>
-          <w:b w:val="0"/>
-          <w:sz w:val="22"/>
-        </w:rPr>
-        <w:t>Mr Haskett had picked up the paper and was holding it at arm's length, as if distance might sharpen it.</w:t>
-      </w:r>
-    </w:p>
-    <w:p>
-      <w:pPr>
-        <w:spacing w:after="40" w:line="240" w:lineRule="auto"/>
-      </w:pPr>
-      <w:r>
-        <w:rPr>
-          <w:rFonts w:ascii="Georgia" w:hAnsi="Georgia" w:eastAsia="Georgia"/>
-          <w:b w:val="0"/>
-          <w:sz w:val="22"/>
-        </w:rPr>
-        <w:t>"There must be something else. Something in the room. Somebody looked at something."</w:t>
+        <w:spacing w:after="40" w:line="240" w:lineRule="auto"/>
+      </w:pPr>
+      <w:r>
+        <w:rPr>
+          <w:rFonts w:ascii="Georgia" w:hAnsi="Georgia" w:eastAsia="Georgia"/>
+          <w:b w:val="0"/>
+          <w:sz w:val="22"/>
+        </w:rPr>
+        <w:t xml:space="preserve">"There must be something else," said Mr Haskett. "Something in the room. Somebody looked at something."</w:t>
       </w:r>
     </w:p>
     <w:p>
@@ -22556,7 +22543,7 @@
           <w:b w:val="0"/>
           <w:sz w:val="22"/>
         </w:rPr>
-        <w:t>"I am saying you were present. In the sense of the lease. Your instruction opened a door at eighteen hundred on Sunday, which is earlier than the railway. Being earlier makes you possible. It does not make you the cause. I had that explained to me yesterday by a professor in Munich, and I explained it to myself several times overnight, and I am now explaining it to you." She closed the book. "If you wish to tell Northgate that the railway was Sunday, you will have to tell them how it got from my hand on your key at six o'clock on Sunday to this doorway at some time after two minutes to ten on Monday, when Mr Boltzman's photograph shows the door shut. I do not believe you can. I do not believe anybody can. And if you could, the name in their file would be yours."</w:t>
+        <w:t xml:space="preserve">"I am saying you were present. In the sense of the lease. Your instruction opened a door at eighteen hundred on Sunday, which is earlier than the railway. Being earlier makes you possible. It does not make you the cause." She closed the book. "If you wish to tell Northgate the railway was Sunday, you will have to tell them how it got from my hand on your key at six o'clock on Sunday to this doorway after two minutes to ten on Monday, when Mr Boltzman's photograph shows the door shut. And if you could, the name in their file would be yours."</w:t>
       </w:r>
     </w:p>
     <w:p>
@@ -22790,7 +22777,7 @@
           <w:b w:val="0"/>
           <w:sz w:val="22"/>
         </w:rPr>
-        <w:t>Mrs Marsh took the statement from the desk before he could pick it up, and went through to the outer room, and unlocked the filing cabinet with the key Derek had still not asked her about, and filed the original in drawer three, under Pending Geometry, behind Sunday, behind Case 1047, in front of nothing. Then she photocopied it on the machine on the landing, which took her some time, because the machine on the landing had views, and came back with two copies, and gave them both to Mr Haskett.</w:t>
+        <w:t xml:space="preserve">Mrs Marsh took the statement from the desk before he could pick it up, filed the original in drawer three, under Pending Geometry, behind Sunday, behind Case 1047, and came back from the photocopier on the landing with two copies, and gave them both to Mr Haskett. On her way past Derek's desk she said, without stopping, "I shall want the rest of the case on paper before I lock that drawer at half past six. I do not file screens."</w:t>
       </w:r>
     </w:p>
     <w:p>
@@ -22920,150 +22907,46 @@
           <w:b w:val="0"/>
           <w:sz w:val="22"/>
         </w:rPr>
-        <w:t>He went down. They heard the street door, and then, through the window, saw him on the pavement in the camel coat, standing quite still at the kerb with the folder under his arm and the buses going past him, for longer than it takes to look for a taxi. Then he walked away towards the river.</w:t>
-      </w:r>
-    </w:p>
-    <w:p>
-      <w:pPr>
-        <w:spacing w:after="160" w:line="240" w:lineRule="auto"/>
-      </w:pPr>
-      <w:r>
-        <w:rPr>
-          <w:rFonts w:ascii="Georgia" w:hAnsi="Georgia" w:eastAsia="Georgia"/>
-          <w:b w:val="0"/>
-          <w:sz w:val="22"/>
-        </w:rPr>
-        <w:t>Trevor sat down on the floor again, by the filing cabinet, and picked up the cable, and did not do anything to it.</w:t>
-      </w:r>
-    </w:p>
-    <w:p>
-      <w:pPr>
-        <w:spacing w:after="40" w:line="240" w:lineRule="auto"/>
-      </w:pPr>
-      <w:r>
-        <w:rPr>
-          <w:rFonts w:ascii="Georgia" w:hAnsi="Georgia" w:eastAsia="Georgia"/>
-          <w:b w:val="0"/>
-          <w:sz w:val="22"/>
-        </w:rPr>
-        <w:t>"I should have checked the corridor clock against the phone on Monday."</w:t>
-      </w:r>
-    </w:p>
-    <w:p>
-      <w:pPr>
-        <w:spacing w:after="160" w:line="240" w:lineRule="auto"/>
-      </w:pPr>
-      <w:r>
-        <w:rPr>
-          <w:rFonts w:ascii="Georgia" w:hAnsi="Georgia" w:eastAsia="Georgia"/>
-          <w:b w:val="0"/>
-          <w:sz w:val="22"/>
-        </w:rPr>
-        <w:t>"You checked what you were asking. You were asking whether it ran at the same rate. It does."</w:t>
-      </w:r>
-    </w:p>
-    <w:p>
-      <w:pPr>
-        <w:spacing w:after="40" w:line="240" w:lineRule="auto"/>
-      </w:pPr>
-      <w:r>
-        <w:rPr>
-          <w:rFonts w:ascii="Georgia" w:hAnsi="Georgia" w:eastAsia="Georgia"/>
-          <w:b w:val="0"/>
-          <w:sz w:val="22"/>
-        </w:rPr>
-        <w:t>"I could have asked both."</w:t>
-      </w:r>
-    </w:p>
-    <w:p>
-      <w:pPr>
-        <w:spacing w:after="40" w:line="240" w:lineRule="auto"/>
-      </w:pPr>
-      <w:r>
-        <w:rPr>
-          <w:rFonts w:ascii="Georgia" w:hAnsi="Georgia" w:eastAsia="Georgia"/>
-          <w:b w:val="0"/>
-          <w:sz w:val="22"/>
-        </w:rPr>
-        <w:t>"Then you'd have had two problems at once."</w:t>
-      </w:r>
-    </w:p>
-    <w:p>
-      <w:pPr>
-        <w:spacing w:after="160" w:line="240" w:lineRule="auto"/>
-      </w:pPr>
-      <w:r>
-        <w:rPr>
-          <w:rFonts w:ascii="Georgia" w:hAnsi="Georgia" w:eastAsia="Georgia"/>
-          <w:b w:val="0"/>
-          <w:sz w:val="22"/>
-        </w:rPr>
-        <w:t>"I'd have had a better interval." He looked at the photograph on his phone again, at the shut door behind the bottle, at nine fifty-eight and twelve seconds. "That's the last picture of it. Before."</w:t>
-      </w:r>
-    </w:p>
-    <w:p>
-      <w:pPr>
-        <w:spacing w:after="40" w:line="240" w:lineRule="auto"/>
-      </w:pPr>
-      <w:r>
-        <w:rPr>
-          <w:rFonts w:ascii="Georgia" w:hAnsi="Georgia" w:eastAsia="Georgia"/>
-          <w:b w:val="0"/>
-          <w:sz w:val="22"/>
-        </w:rPr>
-        <w:t>"Send it to Tabitha again," said Penny. "She'll want to know it was evidence."</w:t>
-      </w:r>
-    </w:p>
-    <w:p>
-      <w:pPr>
-        <w:spacing w:after="40" w:line="240" w:lineRule="auto"/>
-      </w:pPr>
-      <w:r>
-        <w:rPr>
-          <w:rFonts w:ascii="Georgia" w:hAnsi="Georgia" w:eastAsia="Georgia"/>
-          <w:b w:val="0"/>
-          <w:sz w:val="22"/>
-        </w:rPr>
-        <w:t>"She'll say she told me the bottle had a sense of humour."</w:t>
-      </w:r>
-    </w:p>
-    <w:p>
-      <w:pPr>
-        <w:spacing w:after="40" w:line="240" w:lineRule="auto"/>
-      </w:pPr>
-      <w:r>
-        <w:rPr>
-          <w:rFonts w:ascii="Georgia" w:hAnsi="Georgia" w:eastAsia="Georgia"/>
-          <w:b w:val="0"/>
-          <w:sz w:val="22"/>
-        </w:rPr>
-        <w:t>"It did. It held the only time anybody had."</w:t>
-      </w:r>
-    </w:p>
-    <w:p>
-      <w:pPr>
-        <w:spacing w:after="160" w:line="240" w:lineRule="auto"/>
-      </w:pPr>
-      <w:r>
-        <w:rPr>
-          <w:rFonts w:ascii="Georgia" w:hAnsi="Georgia" w:eastAsia="Georgia"/>
-          <w:b w:val="0"/>
-          <w:sz w:val="22"/>
-        </w:rPr>
-        <w:t>Trevor thought about this, and evidently found it acceptable, and put the phone away. At ten past six he looked at the window, said something about a warden and the Mini, and went down to move it, because the warden on that street was a woman of rigorous habits and the Mini was on a single yellow line by a margin he described as theoretical.</w:t>
-      </w:r>
-    </w:p>
-    <w:p>
-      <w:pPr>
-        <w:spacing w:after="160" w:line="240" w:lineRule="auto"/>
-      </w:pPr>
-      <w:r>
-        <w:rPr>
-          <w:rFonts w:ascii="Georgia" w:hAnsi="Georgia" w:eastAsia="Georgia"/>
-          <w:b w:val="0"/>
-          <w:sz w:val="22"/>
-        </w:rPr>
-        <w:t>Penny put on her coat. She picked up the guidebook and put it in the bag, on top of the itinerary, on top of the photograph.</w:t>
+        <w:t xml:space="preserve">He went down. Through the window they saw him on the pavement in the camel coat, standing at the kerb with the folder under his arm for longer than it takes to look for a taxi. Then he walked away towards the river.</w:t>
+      </w:r>
+    </w:p>
+    <w:p>
+      <w:pPr>
+        <w:spacing w:after="160" w:line="240" w:lineRule="auto"/>
+      </w:pPr>
+      <w:r>
+        <w:rPr>
+          <w:rFonts w:ascii="Georgia" w:hAnsi="Georgia" w:eastAsia="Georgia"/>
+          <w:b w:val="0"/>
+          <w:sz w:val="22"/>
+        </w:rPr>
+        <w:t xml:space="preserve">Trevor sat down on the floor again by the filing cabinet and looked at the photograph on his phone, at the shut door behind the bottle, at nine fifty-eight and twelve seconds. "That's the last picture of it. Before."</w:t>
+      </w:r>
+    </w:p>
+    <w:p>
+      <w:pPr>
+        <w:spacing w:after="160" w:line="240" w:lineRule="auto"/>
+      </w:pPr>
+      <w:r>
+        <w:rPr>
+          <w:rFonts w:ascii="Georgia" w:hAnsi="Georgia" w:eastAsia="Georgia"/>
+          <w:b w:val="0"/>
+          <w:sz w:val="22"/>
+        </w:rPr>
+        <w:t xml:space="preserve">Trevor put the phone away. At ten past six he looked at the window, said something about a warden and the Mini, and went down to move it.</w:t>
+      </w:r>
+    </w:p>
+    <w:p>
+      <w:pPr>
+        <w:spacing w:after="160" w:line="240" w:lineRule="auto"/>
+      </w:pPr>
+      <w:r>
+        <w:rPr>
+          <w:rFonts w:ascii="Georgia" w:hAnsi="Georgia" w:eastAsia="Georgia"/>
+          <w:b w:val="0"/>
+          <w:sz w:val="22"/>
+        </w:rPr>
+        <w:t xml:space="preserve">Penny put on her coat. She picked up the guidebook and put it in the bag, on top of the itinerary. Then she took the photograph out, the one from Sunday morning, and stood it against her own monitor, face-up, facing the room. She did not explain it. She did not look to see whether anybody had noticed.</w:t>
       </w:r>
     </w:p>
     <w:p>
@@ -23128,20 +23011,20 @@
           <w:b w:val="0"/>
           <w:sz w:val="22"/>
         </w:rPr>
-        <w:t>"Then I'll go now." She did not say anything else. She did not need to. She went down the stairs, and the stairs creaked under her the ordinary amount, and the street door went.</w:t>
-      </w:r>
-    </w:p>
-    <w:p>
-      <w:pPr>
-        <w:spacing w:after="160" w:line="240" w:lineRule="auto"/>
-      </w:pPr>
-      <w:r>
-        <w:rPr>
-          <w:rFonts w:ascii="Georgia" w:hAnsi="Georgia" w:eastAsia="Georgia"/>
-          <w:b w:val="0"/>
-          <w:sz w:val="22"/>
-        </w:rPr>
-        <w:t>Derek sat at his desk for a while with nothing in front of him but the two letters Mr Haskett had forgotten to take, each with half a sentence underlined. He straightened them. They were already straight. He noticed himself doing it, and stopped, and put them in the tray for Mrs Marsh, who would know where they went.</w:t>
+        <w:t xml:space="preserve">"Then I'll go now." She went down the stairs, and the stairs creaked under her the ordinary amount, and the street door went.</w:t>
+      </w:r>
+    </w:p>
+    <w:p>
+      <w:pPr>
+        <w:spacing w:after="160" w:line="240" w:lineRule="auto"/>
+      </w:pPr>
+      <w:r>
+        <w:rPr>
+          <w:rFonts w:ascii="Georgia" w:hAnsi="Georgia" w:eastAsia="Georgia"/>
+          <w:b w:val="0"/>
+          <w:sz w:val="22"/>
+        </w:rPr>
+        <w:t xml:space="preserve">Derek sat at his desk with nothing in front of him but the two letters Mr Haskett had forgotten to take, each with half a sentence underlined. He straightened them. They were already straight. He noticed himself doing it, and stopped, and put them in the tray for Mrs Marsh, who would know where they went. Across the outer room, on Penny's desk, four people and a dog stood in a row in the middle of the night and looked back at him. He left them where she had put them.</w:t>
       </w:r>
     </w:p>
     <w:p>
@@ -23231,371 +23114,397 @@
           <w:b w:val="0"/>
           <w:sz w:val="22"/>
         </w:rPr>
-        <w:t>At sixteen minutes past six Derek took the sheet out of his pocket for the first time since Monday and spread it on the blotter.</w:t>
-      </w:r>
-    </w:p>
-    <w:p>
-      <w:pPr>
-        <w:spacing w:after="160" w:line="240" w:lineRule="auto"/>
-      </w:pPr>
-      <w:r>
-        <w:rPr>
-          <w:rFonts w:ascii="Georgia" w:hAnsi="Georgia" w:eastAsia="Georgia"/>
-          <w:b w:val="0"/>
-          <w:sz w:val="22"/>
-        </w:rPr>
-        <w:t>He did it because the office was empty and he could. He had not looked at it properly in daylight with nobody watching. Every time he had taken it out, someone had been reading it aloud, or arguing about which side of it was early, or asking him to put it away before the board noticed. Now there was only the platform, and the train lit at its windows, and the word.</w:t>
-      </w:r>
-    </w:p>
-    <w:p>
-      <w:pPr>
-        <w:spacing w:after="160" w:line="240" w:lineRule="auto"/>
-      </w:pPr>
-      <w:r>
-        <w:rPr>
-          <w:rFonts w:ascii="Georgia" w:hAnsi="Georgia" w:eastAsia="Georgia"/>
-          <w:b w:val="0"/>
-          <w:sz w:val="22"/>
-        </w:rPr>
-        <w:t>DO NOT ALLOW DEREK GENT TO BOARD THE MYSTERIOUS TRAIN.</w:t>
-      </w:r>
-    </w:p>
-    <w:p>
-      <w:pPr>
-        <w:spacing w:after="160" w:line="240" w:lineRule="auto"/>
-      </w:pPr>
-      <w:r>
-        <w:rPr>
-          <w:rFonts w:ascii="Georgia" w:hAnsi="Georgia" w:eastAsia="Georgia"/>
-          <w:b w:val="0"/>
-          <w:sz w:val="22"/>
-        </w:rPr>
-        <w:t>The paper had softened. He had folded it and unfolded it, by his own count, more times than he would have admitted to Penny, always along the same two lines, because the lines had been there when Weinstein handed it to him and it had seemed rude to make new ones. It had been in his jacket for a day and a half. It had the slight fur at the folds that paper gets when it has been worried at.</w:t>
-      </w:r>
-    </w:p>
-    <w:p>
-      <w:pPr>
-        <w:spacing w:after="160" w:line="240" w:lineRule="auto"/>
-      </w:pPr>
-      <w:r>
-        <w:rPr>
-          <w:rFonts w:ascii="Georgia" w:hAnsi="Georgia" w:eastAsia="Georgia"/>
-          <w:b w:val="0"/>
-          <w:sz w:val="22"/>
-        </w:rPr>
-        <w:t>He picked up his tea, which had gone cold while Mr Haskett talked about bees, drank half of it, and put the mug down.</w:t>
-      </w:r>
-    </w:p>
-    <w:p>
-      <w:pPr>
-        <w:spacing w:after="160" w:line="240" w:lineRule="auto"/>
-      </w:pPr>
-      <w:r>
-        <w:rPr>
-          <w:rFonts w:ascii="Georgia" w:hAnsi="Georgia" w:eastAsia="Georgia"/>
-          <w:b w:val="0"/>
-          <w:sz w:val="22"/>
-        </w:rPr>
-        <w:t>He put it down on the corner of the sheet.</w:t>
-      </w:r>
-    </w:p>
-    <w:p>
-      <w:pPr>
-        <w:spacing w:after="160" w:line="240" w:lineRule="auto"/>
-      </w:pPr>
-      <w:r>
-        <w:rPr>
-          <w:rFonts w:ascii="Georgia" w:hAnsi="Georgia" w:eastAsia="Georgia"/>
-          <w:b w:val="0"/>
-          <w:sz w:val="22"/>
-        </w:rPr>
-        <w:t>He lifted it again almost at once, the way you lift a mug off a library book, and looked at what he had done. A pale brown ring, the size of the bottom of the mug, on the top right corner of the form.</w:t>
-      </w:r>
-    </w:p>
-    <w:p>
-      <w:pPr>
-        <w:spacing w:after="160" w:line="240" w:lineRule="auto"/>
-      </w:pPr>
-      <w:r>
-        <w:rPr>
-          <w:rFonts w:ascii="Georgia" w:hAnsi="Georgia" w:eastAsia="Georgia"/>
-          <w:b w:val="0"/>
-          <w:sz w:val="22"/>
-        </w:rPr>
-        <w:t>He sat very still.</w:t>
-      </w:r>
-    </w:p>
-    <w:p>
-      <w:pPr>
-        <w:spacing w:after="160" w:line="240" w:lineRule="auto"/>
-      </w:pPr>
-      <w:r>
-        <w:rPr>
-          <w:rFonts w:ascii="Georgia" w:hAnsi="Georgia" w:eastAsia="Georgia"/>
-          <w:b w:val="0"/>
-          <w:sz w:val="22"/>
-        </w:rPr>
-        <w:t>The ring had been there on Monday morning. He had seen it on the blotter at ten to ten, before the door, before anyone had read a word. He had thought, in the part of his mind that noticed such things while the rest of it was busy, that someone had used a warning as a coaster. He had not thought about it since. He had been told, and had told everybody else, that the sheet arrived first, and you did not ask an arrival about its stains.</w:t>
-      </w:r>
-    </w:p>
-    <w:p>
-      <w:pPr>
-        <w:spacing w:after="160" w:line="240" w:lineRule="auto"/>
-      </w:pPr>
-      <w:r>
-        <w:rPr>
-          <w:rFonts w:ascii="Georgia" w:hAnsi="Georgia" w:eastAsia="Georgia"/>
-          <w:b w:val="0"/>
-          <w:sz w:val="22"/>
-        </w:rPr>
-        <w:t>He put the mug back down, exactly over the ring. It fitted. Not nearly. Exactly: the same diameter, the same slight thickening on the left where the glaze on the base of his mug had a chip in it, a chip Sophie had made with a spoon when she was seven.</w:t>
-      </w:r>
-    </w:p>
-    <w:p>
-      <w:pPr>
-        <w:spacing w:after="160" w:line="240" w:lineRule="auto"/>
-      </w:pPr>
-      <w:r>
-        <w:rPr>
-          <w:rFonts w:ascii="Georgia" w:hAnsi="Georgia" w:eastAsia="Georgia"/>
-          <w:b w:val="0"/>
-          <w:sz w:val="22"/>
-        </w:rPr>
-        <w:t>He did not trust it. He was a man who straightened letters that were already straight, and he knew what a mind like his would do with a coincidence it wanted. So he made himself go through it the way Penny would have, in order.</w:t>
-      </w:r>
-    </w:p>
-    <w:p>
-      <w:pPr>
-        <w:spacing w:after="160" w:line="240" w:lineRule="auto"/>
-      </w:pPr>
-      <w:r>
-        <w:rPr>
-          <w:rFonts w:ascii="Georgia" w:hAnsi="Georgia" w:eastAsia="Georgia"/>
-          <w:b w:val="0"/>
-          <w:sz w:val="22"/>
-        </w:rPr>
-        <w:t>The creases. When Weinstein had held the sheet out to him on Monday it had already been folded in four and opened out again. He had folded it along those lines because they were there. Since then he had folded it along them perhaps thirty times. The folds he was looking at now were his folds. They were soft in the way his handling had made them soft. They had been soft on Monday.</w:t>
-      </w:r>
-    </w:p>
-    <w:p>
-      <w:pPr>
-        <w:spacing w:after="160" w:line="240" w:lineRule="auto"/>
-      </w:pPr>
-      <w:r>
-        <w:rPr>
-          <w:rFonts w:ascii="Georgia" w:hAnsi="Georgia" w:eastAsia="Georgia"/>
-          <w:b w:val="0"/>
-          <w:sz w:val="22"/>
-        </w:rPr>
-        <w:t>The date. Typed in the box at the top, flat capitals: Tuesday's date. Today. On Monday the form had refused it as a birthday and they had called it tomorrow, and nobody had asked why a sheet should be dated the day after it arrived.</w:t>
-      </w:r>
-    </w:p>
-    <w:p>
-      <w:pPr>
-        <w:spacing w:after="160" w:line="240" w:lineRule="auto"/>
-      </w:pPr>
-      <w:r>
-        <w:rPr>
-          <w:rFonts w:ascii="Georgia" w:hAnsi="Georgia" w:eastAsia="Georgia"/>
-          <w:b w:val="0"/>
-          <w:sz w:val="22"/>
-        </w:rPr>
-        <w:t>The sender. NOT YET. Not a person who had not been born. A field that had not been filled because nobody, at any time, had sat down and filled it.</w:t>
-      </w:r>
-    </w:p>
-    <w:p>
-      <w:pPr>
-        <w:spacing w:after="160" w:line="240" w:lineRule="auto"/>
-      </w:pPr>
-      <w:r>
-        <w:rPr>
-          <w:rFonts w:ascii="Georgia" w:hAnsi="Georgia" w:eastAsia="Georgia"/>
-          <w:b w:val="0"/>
-          <w:sz w:val="22"/>
-        </w:rPr>
-        <w:t>The board. YESTERDAY. Not the name of a station. The name of a day. Tuesday's yesterday was Monday.</w:t>
-      </w:r>
-    </w:p>
-    <w:p>
-      <w:pPr>
-        <w:spacing w:after="160" w:line="240" w:lineRule="auto"/>
-      </w:pPr>
-      <w:r>
-        <w:rPr>
-          <w:rFonts w:ascii="Georgia" w:hAnsi="Georgia" w:eastAsia="Georgia"/>
-          <w:b w:val="0"/>
-          <w:sz w:val="22"/>
-        </w:rPr>
-        <w:t>He stood up.</w:t>
-      </w:r>
-    </w:p>
-    <w:p>
-      <w:pPr>
-        <w:spacing w:after="160" w:line="240" w:lineRule="auto"/>
-      </w:pPr>
-      <w:r>
-        <w:rPr>
-          <w:rFonts w:ascii="Georgia" w:hAnsi="Georgia" w:eastAsia="Georgia"/>
-          <w:b w:val="0"/>
-          <w:sz w:val="22"/>
-        </w:rPr>
-        <w:t>Herbert had said, on Monday evening, that if you wanted to call a thing a cause you had to show how it got from there to here. For a day and a half Derek had not had a how. He had an order, sheet then door then voice, and an order would tell you who could not be blamed but never who to thank. He looked at the doorway. There was the how. It had been standing in his office since Monday morning, lit at all its windows, and every one of them had been careful to treat it as nothing but a threat.</w:t>
-      </w:r>
-    </w:p>
-    <w:p>
-      <w:pPr>
-        <w:spacing w:after="160" w:line="240" w:lineRule="auto"/>
-      </w:pPr>
-      <w:r>
-        <w:rPr>
-          <w:rFonts w:ascii="Georgia" w:hAnsi="Georgia" w:eastAsia="Georgia"/>
-          <w:b w:val="0"/>
-          <w:sz w:val="22"/>
-        </w:rPr>
-        <w:t xml:space="preserve">If the sheet went back, it would arrive. If it arrived, it would arrive as it was now: folded in four, soft at the folds, with a ring on one corner and today's date in the box. Nobody would ever have typed it. It would simply go round, like a rumour nobody had started, and come back to the desk it had left.</w:t>
-      </w:r>
-    </w:p>
-    <w:p>
-      <w:pPr>
-        <w:spacing w:after="160" w:line="240" w:lineRule="auto"/>
-      </w:pPr>
-      <w:r>
-        <w:rPr>
-          <w:rFonts w:ascii="Georgia" w:hAnsi="Georgia" w:eastAsia="Georgia"/>
-          <w:b w:val="0"/>
-          <w:sz w:val="22"/>
-        </w:rPr>
-        <w:t>And if it did not go back, then something else would have put it on the blotter on Monday, and nothing else in the whole case had the ring of his mug on it.</w:t>
-      </w:r>
-    </w:p>
-    <w:p>
-      <w:pPr>
-        <w:spacing w:after="160" w:line="240" w:lineRule="auto"/>
-      </w:pPr>
-      <w:r>
-        <w:rPr>
-          <w:rFonts w:ascii="Georgia" w:hAnsi="Georgia" w:eastAsia="Georgia"/>
-          <w:b w:val="0"/>
-          <w:sz w:val="22"/>
-        </w:rPr>
-        <w:t xml:space="preserve">The platform began at the sill. He had not crossed it. No one had. On Monday afternoon it had crept thirty-one millimetres into the office while they were at Paddington, and it had gone back to the sill after he had said no at its yellow line and Penny had struck Sophie's name, and since then it had stayed exactly where it was, and he had treated the sill as the edge of the world.</w:t>
-      </w:r>
-    </w:p>
-    <w:p>
-      <w:pPr>
-        <w:spacing w:after="160" w:line="240" w:lineRule="auto"/>
-      </w:pPr>
-      <w:r>
-        <w:rPr>
-          <w:rFonts w:ascii="Georgia" w:hAnsi="Georgia" w:eastAsia="Georgia"/>
-          <w:b w:val="0"/>
-          <w:sz w:val="22"/>
-        </w:rPr>
-        <w:t>The sheet did not say do not cross the sill. It said do not board.</w:t>
-      </w:r>
-    </w:p>
-    <w:p>
-      <w:pPr>
-        <w:spacing w:after="160" w:line="240" w:lineRule="auto"/>
-      </w:pPr>
-      <w:r>
-        <w:rPr>
-          <w:rFonts w:ascii="Georgia" w:hAnsi="Georgia" w:eastAsia="Georgia"/>
-          <w:b w:val="0"/>
-          <w:sz w:val="22"/>
-        </w:rPr>
-        <w:t>He folded it along its lines. He held it in his left hand. He stepped over the sill.</w:t>
-      </w:r>
-    </w:p>
-    <w:p>
-      <w:pPr>
-        <w:spacing w:after="160" w:line="240" w:lineRule="auto"/>
-      </w:pPr>
-      <w:r>
-        <w:rPr>
-          <w:rFonts w:ascii="Georgia" w:hAnsi="Georgia" w:eastAsia="Georgia"/>
-          <w:b w:val="0"/>
-          <w:sz w:val="22"/>
-        </w:rPr>
-        <w:t>The slabs were colder than the carpet and very slightly gritty underfoot. The air smelled of brake dust and of nothing else: no rain, no street, no buses, no London. The lamp hummed. The bench nobody would choose was a bench, wooden, bolted down, with a brass plate on the back that had been polished blank by years of shoulders. He walked past it to the yellow line. Three paces. It felt much further.</w:t>
-      </w:r>
-    </w:p>
-    <w:p>
-      <w:pPr>
-        <w:spacing w:after="160" w:line="240" w:lineRule="auto"/>
-      </w:pPr>
-      <w:r>
-        <w:rPr>
-          <w:rFonts w:ascii="Georgia" w:hAnsi="Georgia" w:eastAsia="Georgia"/>
-          <w:b w:val="0"/>
-          <w:sz w:val="22"/>
-        </w:rPr>
-        <w:t>The nearest door of the carriage opened.</w:t>
-      </w:r>
-    </w:p>
-    <w:p>
-      <w:pPr>
-        <w:spacing w:after="160" w:line="240" w:lineRule="auto"/>
-      </w:pPr>
-      <w:r>
-        <w:rPr>
-          <w:rFonts w:ascii="Georgia" w:hAnsi="Georgia" w:eastAsia="Georgia"/>
-          <w:b w:val="0"/>
-          <w:sz w:val="22"/>
-        </w:rPr>
-        <w:t>It did not hiss. It slid back on its runners without any sound at all, as if it had been waiting for him to come close enough to be polite to. Inside, the carriage was lit and clean and empty, two rows of seats in a pattern of moquette he half remembered from somewhere, a luggage rack, a strip of advertisements with nothing printed on them. The nearest seat was an arm's length from the door.</w:t>
-      </w:r>
-    </w:p>
-    <w:p>
-      <w:pPr>
-        <w:spacing w:after="160" w:line="240" w:lineRule="auto"/>
-      </w:pPr>
-      <w:r>
-        <w:rPr>
-          <w:rFonts w:ascii="Georgia" w:hAnsi="Georgia" w:eastAsia="Georgia"/>
-          <w:b w:val="0"/>
-          <w:sz w:val="22"/>
-        </w:rPr>
-        <w:t>The doors began to beep.</w:t>
-      </w:r>
-    </w:p>
-    <w:p>
-      <w:pPr>
-        <w:spacing w:after="160" w:line="240" w:lineRule="auto"/>
-      </w:pPr>
-      <w:r>
-        <w:rPr>
-          <w:rFonts w:ascii="Georgia" w:hAnsi="Georgia" w:eastAsia="Georgia"/>
-          <w:b w:val="0"/>
-          <w:sz w:val="22"/>
-        </w:rPr>
-        <w:t>It was the ordinary sound. It was the sound of the Paddington doors closing behind Weinstein. A man could step up and in during that sound, and be on, and the doors would close after him, and the train would leave after he boarded it, in the right order, and nobody would ever know what yesterday he had got off in. He found that the thought had a pull, the way the edge of a high place has a pull. He would know who sent the Sunday slip. He would know whose voice it had been behind the carriage door. He would know everything except how to come back.</w:t>
-      </w:r>
-    </w:p>
-    <w:p>
-      <w:pPr>
-        <w:spacing w:after="160" w:line="240" w:lineRule="auto"/>
-      </w:pPr>
-      <w:r>
-        <w:rPr>
-          <w:rFonts w:ascii="Georgia" w:hAnsi="Georgia" w:eastAsia="Georgia"/>
-          <w:b w:val="0"/>
-          <w:sz w:val="22"/>
-        </w:rPr>
-        <w:t>Derek Gent planted his right foot on the platform behind the yellow line, leaned in through the beeping, and laid the folded sheet on the seat.</w:t>
-      </w:r>
-    </w:p>
-    <w:p>
-      <w:pPr>
-        <w:spacing w:after="160" w:line="240" w:lineRule="auto"/>
-      </w:pPr>
-      <w:r>
-        <w:rPr>
-          <w:rFonts w:ascii="Georgia" w:hAnsi="Georgia" w:eastAsia="Georgia"/>
-          <w:b w:val="0"/>
-          <w:sz w:val="22"/>
-        </w:rPr>
-        <w:t>He took his hand out of the carriage. The doors closed an inch in front of his face. He stepped back.</w:t>
+        <w:t xml:space="preserve">At sixteen minutes past six Derek did what Mrs Marsh had asked, which was to put the case on paper before she locked drawer three. He opened the form, read it through once the way he read a train time he already knew, and pressed Print.</w:t>
+      </w:r>
+    </w:p>
+    <w:p>
+      <w:pPr>
+        <w:spacing w:after="160" w:line="240" w:lineRule="auto"/>
+      </w:pPr>
+      <w:r>
+        <w:rPr>
+          <w:rFonts w:ascii="Georgia" w:hAnsi="Georgia" w:eastAsia="Georgia"/>
+          <w:b w:val="0"/>
+          <w:sz w:val="22"/>
+        </w:rPr>
+        <w:t xml:space="preserve">The printer in the outer room cleared its throat, as it did, took a sheet from the tray and gave it back to him warm. He read it standing beside the printer. Then he went on standing there.</w:t>
+      </w:r>
+    </w:p>
+    <w:p>
+      <w:pPr>
+        <w:spacing w:after="160" w:line="240" w:lineRule="auto"/>
+      </w:pPr>
+      <w:r>
+        <w:rPr>
+          <w:rFonts w:ascii="Georgia" w:hAnsi="Georgia" w:eastAsia="Georgia"/>
+          <w:b w:val="0"/>
+          <w:sz w:val="22"/>
+        </w:rPr>
+        <w:t xml:space="preserve">RELATIVISTIC INVESTIGATION BUREAU. CASE STATUS: NOT YET OCCURRED.</w:t>
+      </w:r>
+    </w:p>
+    <w:p>
+      <w:pPr>
+        <w:spacing w:after="160" w:line="240" w:lineRule="auto"/>
+      </w:pPr>
+      <w:r>
+        <w:rPr>
+          <w:rFonts w:ascii="Georgia" w:hAnsi="Georgia" w:eastAsia="Georgia"/>
+          <w:b w:val="0"/>
+          <w:sz w:val="22"/>
+        </w:rPr>
+        <w:t xml:space="preserve">DO NOT ALLOW DEREK GENT TO BOARD THE MYSTERIOUS TRAIN.</w:t>
+      </w:r>
+    </w:p>
+    <w:p>
+      <w:pPr>
+        <w:spacing w:after="160" w:line="240" w:lineRule="auto"/>
+      </w:pPr>
+      <w:r>
+        <w:rPr>
+          <w:rFonts w:ascii="Georgia" w:hAnsi="Georgia" w:eastAsia="Georgia"/>
+          <w:b w:val="0"/>
+          <w:sz w:val="22"/>
+        </w:rPr>
+        <w:t xml:space="preserve">Today's date was in the date box, because the form put the day of printing in the date box and always had. The box for the sender's date of birth said NOT YET, because nobody had filled it, and CASEBOOK printed NOT YET in any date box nobody had filled. Penny had complained about it on Monday morning, over the closing memo, ten minutes before the sheet. Down the left margin ran the faint grey stripe the printer put on everything. He turned the page over. On the back, where the form put its notes, in the same flat capitals: PLEASE NOTE. THE PREVIOUS WARNING WAS SENT TOO LATE.</w:t>
+      </w:r>
+    </w:p>
+    <w:p>
+      <w:pPr>
+        <w:spacing w:after="160" w:line="240" w:lineRule="auto"/>
+      </w:pPr>
+      <w:r>
+        <w:rPr>
+          <w:rFonts w:ascii="Georgia" w:hAnsi="Georgia" w:eastAsia="Georgia"/>
+          <w:b w:val="0"/>
+          <w:sz w:val="22"/>
+        </w:rPr>
+        <w:t xml:space="preserve">He took the other one out of his pocket and held the two side by side.</w:t>
+      </w:r>
+    </w:p>
+    <w:p>
+      <w:pPr>
+        <w:spacing w:after="160" w:line="240" w:lineRule="auto"/>
+      </w:pPr>
+      <w:r>
+        <w:rPr>
+          <w:rFonts w:ascii="Georgia" w:hAnsi="Georgia" w:eastAsia="Georgia"/>
+          <w:b w:val="0"/>
+          <w:sz w:val="22"/>
+        </w:rPr>
+        <w:t xml:space="preserve">The one from his pocket had been folded and unfolded, by his own count, more times than he would have admitted to Penny, always along the same two lines, because the lines had been there when Weinstein handed it to him and it had seemed rude to make new ones. It had fur at the folds. It had a pale brown ring on one corner. Otherwise it was the sheet from the printer: the same heading, the same sentence, the same date, the same stripe, the same apology on the back. The one from the printer was flat and warm and had no ring at all.</w:t>
+      </w:r>
+    </w:p>
+    <w:p>
+      <w:pPr>
+        <w:spacing w:after="160" w:line="240" w:lineRule="auto"/>
+      </w:pPr>
+      <w:r>
+        <w:rPr>
+          <w:rFonts w:ascii="Georgia" w:hAnsi="Georgia" w:eastAsia="Georgia"/>
+          <w:b w:val="0"/>
+          <w:sz w:val="22"/>
+        </w:rPr>
+        <w:t xml:space="preserve">He did not trust it. He was a man who straightened letters that were already straight, and he knew what a mind like his would do with a coincidence it wanted. So he went through it the way Penny would have, a word at a time, and asked each word where it had come from.</w:t>
+      </w:r>
+    </w:p>
+    <w:p>
+      <w:pPr>
+        <w:spacing w:after="160" w:line="240" w:lineRule="auto"/>
+      </w:pPr>
+      <w:r>
+        <w:rPr>
+          <w:rFonts w:ascii="Georgia" w:hAnsi="Georgia" w:eastAsia="Georgia"/>
+          <w:b w:val="0"/>
+          <w:sz w:val="22"/>
+        </w:rPr>
+        <w:t xml:space="preserve">DEREK GENT came from his own record: AUTHOR OF THIS RECORD: D. GENT, REFUSING, typed with two fingers at sixteen forty-one on Monday. The form had looked him up in the staff list and spelled him out in full, as it spelled out everybody.</w:t>
+      </w:r>
+    </w:p>
+    <w:p>
+      <w:pPr>
+        <w:spacing w:after="160" w:line="240" w:lineRule="auto"/>
+      </w:pPr>
+      <w:r>
+        <w:rPr>
+          <w:rFonts w:ascii="Georgia" w:hAnsi="Georgia" w:eastAsia="Georgia"/>
+          <w:b w:val="0"/>
+          <w:sz w:val="22"/>
+        </w:rPr>
+        <w:t xml:space="preserve">DO NOT ALLOW, and TO BOARD, came from BOARDING: REFUSED IN FACT. The form turned every refusal it was given into an instruction to somebody else. It had done it for three years. It had done it to LOCALHOST on Monday morning, on the closing memo.</w:t>
+      </w:r>
+    </w:p>
+    <w:p>
+      <w:pPr>
+        <w:spacing w:after="160" w:line="240" w:lineRule="auto"/>
+      </w:pPr>
+      <w:r>
+        <w:rPr>
+          <w:rFonts w:ascii="Georgia" w:hAnsi="Georgia" w:eastAsia="Georgia"/>
+          <w:b w:val="0"/>
+          <w:sz w:val="22"/>
+        </w:rPr>
+        <w:t xml:space="preserve">THE MYSTERIOUS TRAIN came from Mr Pendleton's incident report, which had boxes for fire, for flood and for suspicious packages, and one more, MYSTERIOUS (OTHER). Trevor had linked the report to the case after lunch, and the form, which liked a noun, had lifted the words into its FEATURE line. Penny had said mysterious was a mood. Trevor had said he would fix it later.</w:t>
+      </w:r>
+    </w:p>
+    <w:p>
+      <w:pPr>
+        <w:spacing w:after="160" w:line="240" w:lineRule="auto"/>
+      </w:pPr>
+      <w:r>
+        <w:rPr>
+          <w:rFonts w:ascii="Georgia" w:hAnsi="Georgia" w:eastAsia="Georgia"/>
+          <w:b w:val="0"/>
+          <w:sz w:val="22"/>
+        </w:rPr>
+        <w:t xml:space="preserve">The date was the printer's. NOT YET was an empty box. The apology on the back was the form's own grey note under the line for the voice, which had appeared on Monday afternoon, when the field for the time of act came and the form could see at last that the voice had come after the door.</w:t>
+      </w:r>
+    </w:p>
+    <w:p>
+      <w:pPr>
+        <w:spacing w:after="160" w:line="240" w:lineRule="auto"/>
+      </w:pPr>
+      <w:r>
+        <w:rPr>
+          <w:rFonts w:ascii="Georgia" w:hAnsi="Georgia" w:eastAsia="Georgia"/>
+          <w:b w:val="0"/>
+          <w:sz w:val="22"/>
+        </w:rPr>
+        <w:t xml:space="preserve">Nobody had written the sentence. Three people had each put a word in a box, for reasons of their own, over two days, a printer had supplied the date, and a form designed by a man who believed every problem was a name and a date had put the words in a row. On Monday afternoon Derek had typed NOT CASEBOOK into the record. It had been the line he was surest of.</w:t>
+      </w:r>
+    </w:p>
+    <w:p>
+      <w:pPr>
+        <w:spacing w:after="160" w:line="240" w:lineRule="auto"/>
+      </w:pPr>
+      <w:r>
+        <w:rPr>
+          <w:rFonts w:ascii="Georgia" w:hAnsi="Georgia" w:eastAsia="Georgia"/>
+          <w:b w:val="0"/>
+          <w:sz w:val="22"/>
+        </w:rPr>
+        <w:t xml:space="preserve">He went back to his desk and sat down with the new sheet flat on the blotter in front of him.</w:t>
+      </w:r>
+    </w:p>
+    <w:p>
+      <w:pPr>
+        <w:spacing w:after="160" w:line="240" w:lineRule="auto"/>
+      </w:pPr>
+      <w:r>
+        <w:rPr>
+          <w:rFonts w:ascii="Georgia" w:hAnsi="Georgia" w:eastAsia="Georgia"/>
+          <w:b w:val="0"/>
+          <w:sz w:val="22"/>
+        </w:rPr>
+        <w:t xml:space="preserve">His tea had gone cold while Mr Haskett talked about bees. He drank half of it and put the mug down. He put it down on the corner of the new sheet.</w:t>
+      </w:r>
+    </w:p>
+    <w:p>
+      <w:pPr>
+        <w:spacing w:after="160" w:line="240" w:lineRule="auto"/>
+      </w:pPr>
+      <w:r>
+        <w:rPr>
+          <w:rFonts w:ascii="Georgia" w:hAnsi="Georgia" w:eastAsia="Georgia"/>
+          <w:b w:val="0"/>
+          <w:sz w:val="22"/>
+        </w:rPr>
+        <w:t xml:space="preserve">He lifted it again almost at once, the way you lift a mug off a library book, and looked at what he had done. A pale brown ring, the size of the bottom of the mug, with a little bite out of its left side where the glaze on the base had a chip in it, a chip Sophie had made with a spoon when she was seven.</w:t>
+      </w:r>
+    </w:p>
+    <w:p>
+      <w:pPr>
+        <w:spacing w:after="160" w:line="240" w:lineRule="auto"/>
+      </w:pPr>
+      <w:r>
+        <w:rPr>
+          <w:rFonts w:ascii="Georgia" w:hAnsi="Georgia" w:eastAsia="Georgia"/>
+          <w:b w:val="0"/>
+          <w:sz w:val="22"/>
+        </w:rPr>
+        <w:t xml:space="preserve">He laid the old sheet next to it. The two rings were in the same place on the same corner. They were the same size. Both had the bite.</w:t>
+      </w:r>
+    </w:p>
+    <w:p>
+      <w:pPr>
+        <w:spacing w:after="160" w:line="240" w:lineRule="auto"/>
+      </w:pPr>
+      <w:r>
+        <w:rPr>
+          <w:rFonts w:ascii="Georgia" w:hAnsi="Georgia" w:eastAsia="Georgia"/>
+          <w:b w:val="0"/>
+          <w:sz w:val="22"/>
+        </w:rPr>
+        <w:t xml:space="preserve">He did nothing to either of them. Outside, a bus went by, and then another.</w:t>
+      </w:r>
+    </w:p>
+    <w:p>
+      <w:pPr>
+        <w:spacing w:after="160" w:line="240" w:lineRule="auto"/>
+      </w:pPr>
+      <w:r>
+        <w:rPr>
+          <w:rFonts w:ascii="Georgia" w:hAnsi="Georgia" w:eastAsia="Georgia"/>
+          <w:b w:val="0"/>
+          <w:sz w:val="22"/>
+        </w:rPr>
+        <w:t xml:space="preserve">Mrs Marsh had read the back of the British Rail form aloud after lunch, because she read everything she signed. Notices for the attention of staff at the previous station are to be folded in four and left on the first seat of the leading vehicle of the standing service, which will convey them. The Board accepts no responsibility for notices received before they are written. Penny had called it a confession, and everybody had laughed, and Trevor had looked at the board and said "Previous station," and nobody had answered him.</w:t>
+      </w:r>
+    </w:p>
+    <w:p>
+      <w:pPr>
+        <w:spacing w:after="160" w:line="240" w:lineRule="auto"/>
+      </w:pPr>
+      <w:r>
+        <w:rPr>
+          <w:rFonts w:ascii="Georgia" w:hAnsi="Georgia" w:eastAsia="Georgia"/>
+          <w:b w:val="0"/>
+          <w:sz w:val="22"/>
+        </w:rPr>
+        <w:t xml:space="preserve">He folded the new sheet in four, once, as the notice said, and as the other one had come. The creases stood up from the blotter like the ridges of a small roof. They were the creases Weinstein had handed him on Monday.</w:t>
+      </w:r>
+    </w:p>
+    <w:p>
+      <w:pPr>
+        <w:spacing w:after="160" w:line="240" w:lineRule="auto"/>
+      </w:pPr>
+      <w:r>
+        <w:rPr>
+          <w:rFonts w:ascii="Georgia" w:hAnsi="Georgia" w:eastAsia="Georgia"/>
+          <w:b w:val="0"/>
+          <w:sz w:val="22"/>
+        </w:rPr>
+        <w:t xml:space="preserve">If this sheet went, it would arrive. It would arrive as it was now: folded in four, crisp, with a ring and a stripe and Tuesday's date in the box. It would lie under a folder on Monday morning until a man lifted the folder, and it would go into his pocket and be worried at for two days, and come out tonight with fur at the folds, and lie on this desk next to itself.</w:t>
+      </w:r>
+    </w:p>
+    <w:p>
+      <w:pPr>
+        <w:spacing w:after="160" w:line="240" w:lineRule="auto"/>
+      </w:pPr>
+      <w:r>
+        <w:rPr>
+          <w:rFonts w:ascii="Georgia" w:hAnsi="Georgia" w:eastAsia="Georgia"/>
+          <w:b w:val="0"/>
+          <w:sz w:val="22"/>
+        </w:rPr>
+        <w:t xml:space="preserve">And if it did not go, then nothing would have been on the blotter on Monday. Nothing would have stopped him, at ten past ten, from walking through his own door to see what the train was for. He thought about that honestly, the way he would have thought about a client. He would have gone. He knew he would have gone. It was the only warning in the whole case that had arrived in time.</w:t>
+      </w:r>
+    </w:p>
+    <w:p>
+      <w:pPr>
+        <w:spacing w:after="160" w:line="240" w:lineRule="auto"/>
+      </w:pPr>
+      <w:r>
+        <w:rPr>
+          <w:rFonts w:ascii="Georgia" w:hAnsi="Georgia" w:eastAsia="Georgia"/>
+          <w:b w:val="0"/>
+          <w:sz w:val="22"/>
+        </w:rPr>
+        <w:t xml:space="preserve">The platform began at the sill. Nobody had crossed it. On Monday afternoon it had crept into the office while they were at Paddington, and it had gone back after he said no at its yellow line and Penny struck Sophie's name, and since then he had treated the sill as the edge of the world.</w:t>
+      </w:r>
+    </w:p>
+    <w:p>
+      <w:pPr>
+        <w:spacing w:after="160" w:line="240" w:lineRule="auto"/>
+      </w:pPr>
+      <w:r>
+        <w:rPr>
+          <w:rFonts w:ascii="Georgia" w:hAnsi="Georgia" w:eastAsia="Georgia"/>
+          <w:b w:val="0"/>
+          <w:sz w:val="22"/>
+        </w:rPr>
+        <w:t xml:space="preserve">The sheet did not say do not cross the sill. It said do not board.</w:t>
+      </w:r>
+    </w:p>
+    <w:p>
+      <w:pPr>
+        <w:spacing w:after="160" w:line="240" w:lineRule="auto"/>
+      </w:pPr>
+      <w:r>
+        <w:rPr>
+          <w:rFonts w:ascii="Georgia" w:hAnsi="Georgia" w:eastAsia="Georgia"/>
+          <w:b w:val="0"/>
+          <w:sz w:val="22"/>
+        </w:rPr>
+        <w:t xml:space="preserve">He put the old sheet back in his pocket. He held the new one in his left hand. He stepped over the sill.</w:t>
+      </w:r>
+    </w:p>
+    <w:p>
+      <w:pPr>
+        <w:spacing w:after="160" w:line="240" w:lineRule="auto"/>
+      </w:pPr>
+      <w:r>
+        <w:rPr>
+          <w:rFonts w:ascii="Georgia" w:hAnsi="Georgia" w:eastAsia="Georgia"/>
+          <w:b w:val="0"/>
+          <w:sz w:val="22"/>
+        </w:rPr>
+        <w:t xml:space="preserve">The slabs were colder than the carpet and slightly gritty underfoot. The air smelled of brake dust and of nothing else: no rain, no street, no buses, no London. The lamp hummed. The bench was wooden, bolted down, with a brass plate on the back polished blank by years of shoulders. He walked past it to the yellow line. Three paces. It felt much further.</w:t>
+      </w:r>
+    </w:p>
+    <w:p>
+      <w:pPr>
+        <w:spacing w:after="160" w:line="240" w:lineRule="auto"/>
+      </w:pPr>
+      <w:r>
+        <w:rPr>
+          <w:rFonts w:ascii="Georgia" w:hAnsi="Georgia" w:eastAsia="Georgia"/>
+          <w:b w:val="0"/>
+          <w:sz w:val="22"/>
+        </w:rPr>
+        <w:t xml:space="preserve">The nearest door of the leading carriage opened. It slid back on its runners without any sound at all, as if it had been waiting for him to come close enough to be polite to. Inside, the carriage was lit and clean and empty, two rows of seats in a blue moquette he half remembered, a luggage rack, a strip of advertisements with nothing printed on them. The first seat was an arm's length from the door.</w:t>
+      </w:r>
+    </w:p>
+    <w:p>
+      <w:pPr>
+        <w:spacing w:after="160" w:line="240" w:lineRule="auto"/>
+      </w:pPr>
+      <w:r>
+        <w:rPr>
+          <w:rFonts w:ascii="Georgia" w:hAnsi="Georgia" w:eastAsia="Georgia"/>
+          <w:b w:val="0"/>
+          <w:sz w:val="22"/>
+        </w:rPr>
+        <w:t xml:space="preserve">The doors began to beep.</w:t>
+      </w:r>
+    </w:p>
+    <w:p>
+      <w:pPr>
+        <w:spacing w:after="160" w:line="240" w:lineRule="auto"/>
+      </w:pPr>
+      <w:r>
+        <w:rPr>
+          <w:rFonts w:ascii="Georgia" w:hAnsi="Georgia" w:eastAsia="Georgia"/>
+          <w:b w:val="0"/>
+          <w:sz w:val="22"/>
+        </w:rPr>
+        <w:t xml:space="preserve">It was the ordinary sound, the sound of the Paddington doors closing behind Weinstein. A man could step up and in during that sound and be on, and the doors would close after him, and the train would leave after he boarded it, in the right order, and nobody would ever know what yesterday he had got off in. The thought had a pull, the way the edge of a high place has a pull. He would know who had sent the Sunday slip. He would know whose voice it had been behind the carriage door. He would know everything except how to come back.</w:t>
+      </w:r>
+    </w:p>
+    <w:p>
+      <w:pPr>
+        <w:spacing w:after="160" w:line="240" w:lineRule="auto"/>
+      </w:pPr>
+      <w:r>
+        <w:rPr>
+          <w:rFonts w:ascii="Georgia" w:hAnsi="Georgia" w:eastAsia="Georgia"/>
+          <w:b w:val="0"/>
+          <w:sz w:val="22"/>
+        </w:rPr>
+        <w:t xml:space="preserve">Derek Gent planted his right foot on the platform behind the yellow line, leaned in through the beeping, and laid the folded sheet on the first seat.</w:t>
+      </w:r>
+    </w:p>
+    <w:p>
+      <w:pPr>
+        <w:spacing w:after="160" w:line="240" w:lineRule="auto"/>
+      </w:pPr>
+      <w:r>
+        <w:rPr>
+          <w:rFonts w:ascii="Georgia" w:hAnsi="Georgia" w:eastAsia="Georgia"/>
+          <w:b w:val="0"/>
+          <w:sz w:val="22"/>
+        </w:rPr>
+        <w:t xml:space="preserve">He took his hand out of the carriage. The doors closed an inch in front of his face. He stepped back.</w:t>
       </w:r>
     </w:p>
     <w:p>
@@ -23621,384 +23530,410 @@
           <w:b w:val="0"/>
           <w:sz w:val="22"/>
         </w:rPr>
-        <w:t>YESTERDAY.</w:t>
-      </w:r>
-    </w:p>
-    <w:p>
-      <w:pPr>
-        <w:spacing w:after="160" w:line="240" w:lineRule="auto"/>
-      </w:pPr>
-      <w:r>
-        <w:rPr>
-          <w:rFonts w:ascii="Georgia" w:hAnsi="Georgia" w:eastAsia="Georgia"/>
-          <w:b w:val="0"/>
-          <w:sz w:val="22"/>
-        </w:rPr>
-        <w:t>The seat nearest the door was empty.</w:t>
-      </w:r>
-    </w:p>
-    <w:p>
-      <w:pPr>
-        <w:spacing w:after="160" w:line="240" w:lineRule="auto"/>
-      </w:pPr>
-      <w:r>
-        <w:rPr>
-          <w:rFonts w:ascii="Georgia" w:hAnsi="Georgia" w:eastAsia="Georgia"/>
-          <w:b w:val="0"/>
-          <w:sz w:val="22"/>
-        </w:rPr>
-        <w:t>He went back over the sill. He did not look behind him. He sat down at his desk, which had a blotter on it and a cold mug and nothing else, and found that his hands were shaking in a way they had not shaken for murders, and he let them.</w:t>
-      </w:r>
-    </w:p>
-    <w:p>
-      <w:pPr>
-        <w:spacing w:after="160" w:line="240" w:lineRule="auto"/>
-      </w:pPr>
-      <w:r>
-        <w:rPr>
-          <w:rFonts w:ascii="Georgia" w:hAnsi="Georgia" w:eastAsia="Georgia"/>
-          <w:b w:val="0"/>
-          <w:sz w:val="22"/>
-        </w:rPr>
-        <w:t>Then he rang Munich.</w:t>
-      </w:r>
-    </w:p>
-    <w:p>
-      <w:pPr>
-        <w:spacing w:after="160" w:line="240" w:lineRule="auto"/>
-      </w:pPr>
-      <w:r>
-        <w:rPr>
-          <w:rFonts w:ascii="Georgia" w:hAnsi="Georgia" w:eastAsia="Georgia"/>
-          <w:b w:val="0"/>
-          <w:sz w:val="22"/>
-        </w:rPr>
-        <w:t>Herbert Matkowski answered on the first ring.</w:t>
-      </w:r>
-    </w:p>
-    <w:p>
-      <w:pPr>
-        <w:spacing w:after="160" w:line="240" w:lineRule="auto"/>
-      </w:pPr>
-      <w:r>
-        <w:rPr>
-          <w:rFonts w:ascii="Georgia" w:hAnsi="Georgia" w:eastAsia="Georgia"/>
-          <w:b w:val="0"/>
-          <w:sz w:val="22"/>
-        </w:rPr>
-        <w:t>"Matkowski."</w:t>
-      </w:r>
-    </w:p>
-    <w:p>
-      <w:pPr>
-        <w:spacing w:after="160" w:line="240" w:lineRule="auto"/>
-      </w:pPr>
-      <w:r>
-        <w:rPr>
-          <w:rFonts w:ascii="Georgia" w:hAnsi="Georgia" w:eastAsia="Georgia"/>
-          <w:b w:val="0"/>
-          <w:sz w:val="22"/>
-        </w:rPr>
-        <w:t>"It's Derek Gent. I've found the mechanism."</w:t>
-      </w:r>
-    </w:p>
-    <w:p>
-      <w:pPr>
-        <w:spacing w:after="160" w:line="240" w:lineRule="auto"/>
-      </w:pPr>
-      <w:r>
-        <w:rPr>
-          <w:rFonts w:ascii="Georgia" w:hAnsi="Georgia" w:eastAsia="Georgia"/>
-          <w:b w:val="0"/>
-          <w:sz w:val="22"/>
-        </w:rPr>
-        <w:t>He told it in order, because Herbert would not have accepted it in any other way. The ring. The chip. The folds. The date in the box. The board. The seat. He did not describe his feelings, and Herbert did not ask for them. When he had finished there was the sound of a pencil being put down.</w:t>
-      </w:r>
-    </w:p>
-    <w:p>
-      <w:pPr>
-        <w:spacing w:after="160" w:line="240" w:lineRule="auto"/>
-      </w:pPr>
-      <w:r>
-        <w:rPr>
-          <w:rFonts w:ascii="Georgia" w:hAnsi="Georgia" w:eastAsia="Georgia"/>
-          <w:b w:val="0"/>
-          <w:sz w:val="22"/>
-        </w:rPr>
-        <w:t>"I told Alfred this morning that ignorance is not a paradox," Herbert said. "It is not." He sounded, for once, as if he were choosing his words for someone else's sake. "But you are no longer ignorant, Mr Gent. You have a ring on a piece of paper that you made today and saw on Monday. That is not a feeling. It is evidence. It puts the sheet in your shape. It gives the empty coordinate a place."</w:t>
-      </w:r>
-    </w:p>
-    <w:p>
-      <w:pPr>
-        <w:spacing w:after="160" w:line="240" w:lineRule="auto"/>
-      </w:pPr>
-      <w:r>
-        <w:rPr>
-          <w:rFonts w:ascii="Georgia" w:hAnsi="Georgia" w:eastAsia="Georgia"/>
-          <w:b w:val="0"/>
-          <w:sz w:val="22"/>
-        </w:rPr>
-        <w:t>"Where?"</w:t>
-      </w:r>
-    </w:p>
-    <w:p>
-      <w:pPr>
-        <w:spacing w:after="160" w:line="240" w:lineRule="auto"/>
-      </w:pPr>
-      <w:r>
-        <w:rPr>
-          <w:rFonts w:ascii="Georgia" w:hAnsi="Georgia" w:eastAsia="Georgia"/>
-          <w:b w:val="0"/>
-          <w:sz w:val="22"/>
-        </w:rPr>
-        <w:t>"On a closed loop. Your desk on Tuesday evening, to the train, to your desk on Monday morning, to your pocket, to your desk on Tuesday evening. Round once. Nobody's hand at the beginning, because there is no beginning." A pause. "Our physics does not tell us whether closed loops in time can exist. Hawking suspected the universe forbids them. Nobody has proved it either way. But there is a principle, Novikov's, that if they do exist, the only histories that can happen on them are ones that agree with themselves. Your sheet agrees with itself, so far as you can see. Strictly, it must go back in exactly the state it arrived in, every crease and every stain, and that is the hard part: anything that goes round has to be restored to itself, and something outside it must pay for the repair. Here I suspect your railway pays. I cannot tell you how. Novikov and a colleague named objects like that, which go round and have no maker, in a paper in 1992. They called them jinn."</w:t>
-      </w:r>
-    </w:p>
-    <w:p>
-      <w:pPr>
-        <w:spacing w:after="160" w:line="240" w:lineRule="auto"/>
-      </w:pPr>
-      <w:r>
-        <w:rPr>
-          <w:rFonts w:ascii="Georgia" w:hAnsi="Georgia" w:eastAsia="Georgia"/>
-          <w:b w:val="0"/>
-          <w:sz w:val="22"/>
-        </w:rPr>
-        <w:t>"A genie."</w:t>
-      </w:r>
-    </w:p>
-    <w:p>
-      <w:pPr>
-        <w:spacing w:after="160" w:line="240" w:lineRule="auto"/>
-      </w:pPr>
-      <w:r>
-        <w:rPr>
-          <w:rFonts w:ascii="Georgia" w:hAnsi="Georgia" w:eastAsia="Georgia"/>
-          <w:b w:val="0"/>
-          <w:sz w:val="22"/>
-        </w:rPr>
-        <w:t>"A jinni, singular. They were Russians writing in English. They were entitled to some fun." The pencil was picked up again. "Do not let it go to your head. A loop like that is permitted by some solutions of the equations. That is not the same as likely. In your office it has happened once, with one sheet. And it explains one sheet. It does not explain the slip at Paddington. Did that have a ring on it?"</w:t>
-      </w:r>
-    </w:p>
-    <w:p>
-      <w:pPr>
-        <w:spacing w:after="160" w:line="240" w:lineRule="auto"/>
-      </w:pPr>
-      <w:r>
-        <w:rPr>
-          <w:rFonts w:ascii="Georgia" w:hAnsi="Georgia" w:eastAsia="Georgia"/>
-          <w:b w:val="0"/>
-          <w:sz w:val="22"/>
-        </w:rPr>
-        <w:t>"No."</w:t>
-      </w:r>
-    </w:p>
-    <w:p>
-      <w:pPr>
-        <w:spacing w:after="160" w:line="240" w:lineRule="auto"/>
-      </w:pPr>
-      <w:r>
-        <w:rPr>
-          <w:rFonts w:ascii="Georgia" w:hAnsi="Georgia" w:eastAsia="Georgia"/>
-          <w:b w:val="0"/>
-          <w:sz w:val="22"/>
-        </w:rPr>
-        <w:t>"Then that one is still blank, and you will keep it blank until you have a mechanism for it. And it does not make you the author of anything. You did not write a word. You carried a piece of paper to a place it had already been. Write it like that."</w:t>
-      </w:r>
-    </w:p>
-    <w:p>
-      <w:pPr>
-        <w:spacing w:after="160" w:line="240" w:lineRule="auto"/>
-      </w:pPr>
-      <w:r>
-        <w:rPr>
-          <w:rFonts w:ascii="Georgia" w:hAnsi="Georgia" w:eastAsia="Georgia"/>
-          <w:b w:val="0"/>
-          <w:sz w:val="22"/>
-        </w:rPr>
-        <w:t>"Weinstein will be unbearable."</w:t>
-      </w:r>
-    </w:p>
-    <w:p>
-      <w:pPr>
-        <w:spacing w:after="160" w:line="240" w:lineRule="auto"/>
-      </w:pPr>
-      <w:r>
-        <w:rPr>
-          <w:rFonts w:ascii="Georgia" w:hAnsi="Georgia" w:eastAsia="Georgia"/>
-          <w:b w:val="0"/>
-          <w:sz w:val="22"/>
-        </w:rPr>
-        <w:t>"Weinstein will be disappointed it was not him. That is a very good thing for Weinstein. Goodnight, Mr Gent."</w:t>
-      </w:r>
-    </w:p>
-    <w:p>
-      <w:pPr>
-        <w:spacing w:after="160" w:line="240" w:lineRule="auto"/>
-      </w:pPr>
-      <w:r>
-        <w:rPr>
-          <w:rFonts w:ascii="Georgia" w:hAnsi="Georgia" w:eastAsia="Georgia"/>
-          <w:b w:val="0"/>
-          <w:sz w:val="22"/>
-        </w:rPr>
-        <w:t>He hung up.</w:t>
-      </w:r>
-    </w:p>
-    <w:p>
-      <w:pPr>
-        <w:spacing w:after="160" w:line="240" w:lineRule="auto"/>
-      </w:pPr>
-      <w:r>
-        <w:rPr>
-          <w:rFonts w:ascii="Georgia" w:hAnsi="Georgia" w:eastAsia="Georgia"/>
-          <w:b w:val="0"/>
-          <w:sz w:val="22"/>
-        </w:rPr>
-        <w:t>Derek turned to the keyboard and opened the form, which had been waiting since Monday afternoon with its empty field and its grey patience. The cursor sat in SENDER OF THE MORNING SHEET. He typed into it, and the form did not argue.</w:t>
-      </w:r>
-    </w:p>
-    <w:p>
-      <w:pPr>
-        <w:spacing w:after="160" w:line="240" w:lineRule="auto"/>
-      </w:pPr>
-      <w:r>
-        <w:rPr>
-          <w:rFonts w:ascii="Georgia" w:hAnsi="Georgia" w:eastAsia="Georgia"/>
-          <w:b w:val="0"/>
-          <w:sz w:val="22"/>
-        </w:rPr>
-        <w:t>SENDER: NONE.</w:t>
-      </w:r>
-    </w:p>
-    <w:p>
-      <w:pPr>
-        <w:spacing w:after="160" w:line="240" w:lineRule="auto"/>
-      </w:pPr>
-      <w:r>
-        <w:rPr>
-          <w:rFonts w:ascii="Georgia" w:hAnsi="Georgia" w:eastAsia="Georgia"/>
-          <w:b w:val="0"/>
-          <w:sz w:val="22"/>
-        </w:rPr>
-        <w:t>ROUTE: THIS DESK, TUESDAY, 18:24, TO THE TRAIN; THE TRAIN TO THIS DESK, MONDAY, BETWEEN 09:58:12 AND THE OPENING OF THE DOOR. ROUND ONCE.</w:t>
-      </w:r>
-    </w:p>
-    <w:p>
-      <w:pPr>
-        <w:spacing w:after="160" w:line="240" w:lineRule="auto"/>
-      </w:pPr>
-      <w:r>
-        <w:rPr>
-          <w:rFonts w:ascii="Georgia" w:hAnsi="Georgia" w:eastAsia="Georgia"/>
-          <w:b w:val="0"/>
-          <w:sz w:val="22"/>
-        </w:rPr>
-        <w:t>CARRIER: D. GENT. NOT THE AUTHOR. NO AUTHOR.</w:t>
-      </w:r>
-    </w:p>
-    <w:p>
-      <w:pPr>
-        <w:spacing w:after="160" w:line="240" w:lineRule="auto"/>
-      </w:pPr>
-      <w:r>
-        <w:rPr>
-          <w:rFonts w:ascii="Georgia" w:hAnsi="Georgia" w:eastAsia="Georgia"/>
-          <w:b w:val="0"/>
-          <w:sz w:val="22"/>
-        </w:rPr>
-        <w:t>EVIDENCE: A RING FROM THIS MUG. THE FOLDS. THE DATE IN THE BOX.</w:t>
-      </w:r>
-    </w:p>
-    <w:p>
-      <w:pPr>
-        <w:spacing w:after="160" w:line="240" w:lineRule="auto"/>
-      </w:pPr>
-      <w:r>
-        <w:rPr>
-          <w:rFonts w:ascii="Georgia" w:hAnsi="Georgia" w:eastAsia="Georgia"/>
-          <w:b w:val="0"/>
-          <w:sz w:val="22"/>
-        </w:rPr>
-        <w:t>BOARDING: REFUSED. STILL.</w:t>
-      </w:r>
-    </w:p>
-    <w:p>
-      <w:pPr>
-        <w:spacing w:after="160" w:line="240" w:lineRule="auto"/>
-      </w:pPr>
-      <w:r>
-        <w:rPr>
-          <w:rFonts w:ascii="Georgia" w:hAnsi="Georgia" w:eastAsia="Georgia"/>
-          <w:b w:val="0"/>
-          <w:sz w:val="22"/>
-        </w:rPr>
-        <w:t>SUNDAY SLIP: SENDER UNKNOWN. NO MECHANISM. LEFT BLANK.</w:t>
-      </w:r>
-    </w:p>
-    <w:p>
-      <w:pPr>
-        <w:spacing w:after="160" w:line="240" w:lineRule="auto"/>
-      </w:pPr>
-      <w:r>
-        <w:rPr>
-          <w:rFonts w:ascii="Georgia" w:hAnsi="Georgia" w:eastAsia="Georgia"/>
-          <w:b w:val="0"/>
-          <w:sz w:val="22"/>
-        </w:rPr>
-        <w:t>He saved it. The little wheel turned. The status line changed once more on its own, the last thing it ever did on its own, and he read it twice.</w:t>
-      </w:r>
-    </w:p>
-    <w:p>
-      <w:pPr>
-        <w:spacing w:after="160" w:line="240" w:lineRule="auto"/>
-      </w:pPr>
-      <w:r>
-        <w:rPr>
-          <w:rFonts w:ascii="Georgia" w:hAnsi="Georgia" w:eastAsia="Georgia"/>
-          <w:b w:val="0"/>
-          <w:sz w:val="22"/>
-        </w:rPr>
-        <w:t>CASE STATUS: OCCURRED.</w:t>
-      </w:r>
-    </w:p>
-    <w:p>
-      <w:pPr>
-        <w:spacing w:after="160" w:line="240" w:lineRule="auto"/>
-      </w:pPr>
-      <w:r>
-        <w:rPr>
-          <w:rFonts w:ascii="Georgia" w:hAnsi="Georgia" w:eastAsia="Georgia"/>
-          <w:b w:val="0"/>
-          <w:sz w:val="22"/>
-        </w:rPr>
-        <w:t>On the stairs below, a dog's claws, and a woman's voice telling the dog that the stairs were not a democracy.</w:t>
-      </w:r>
-    </w:p>
-    <w:p>
-      <w:pPr>
-        <w:spacing w:after="160" w:line="240" w:lineRule="auto"/>
-      </w:pPr>
-      <w:r>
-        <w:rPr>
-          <w:rFonts w:ascii="Georgia" w:hAnsi="Georgia" w:eastAsia="Georgia"/>
-          <w:b w:val="0"/>
-          <w:sz w:val="22"/>
-        </w:rPr>
-        <w:t>It was half past six.</w:t>
-      </w:r>
-    </w:p>
-    <w:p>
-      <w:pPr>
-        <w:spacing w:after="160" w:line="240" w:lineRule="auto"/>
-      </w:pPr>
-      <w:r>
-        <w:rPr>
-          <w:rFonts w:ascii="Georgia" w:hAnsi="Georgia" w:eastAsia="Georgia"/>
-          <w:b w:val="0"/>
-          <w:sz w:val="22"/>
-        </w:rPr>
-        <w:t>Rule: If the thing you are missing has no beginning, look for its route. Evidence can close a loop. A feeling cannot.</w:t>
+        <w:t xml:space="preserve">YESTERDAY.</w:t>
+      </w:r>
+    </w:p>
+    <w:p>
+      <w:pPr>
+        <w:spacing w:after="160" w:line="240" w:lineRule="auto"/>
+      </w:pPr>
+      <w:r>
+        <w:rPr>
+          <w:rFonts w:ascii="Georgia" w:hAnsi="Georgia" w:eastAsia="Georgia"/>
+          <w:b w:val="0"/>
+          <w:sz w:val="22"/>
+        </w:rPr>
+        <w:t xml:space="preserve">The first seat was empty.</w:t>
+      </w:r>
+    </w:p>
+    <w:p>
+      <w:pPr>
+        <w:spacing w:after="160" w:line="240" w:lineRule="auto"/>
+      </w:pPr>
+      <w:r>
+        <w:rPr>
+          <w:rFonts w:ascii="Georgia" w:hAnsi="Georgia" w:eastAsia="Georgia"/>
+          <w:b w:val="0"/>
+          <w:sz w:val="22"/>
+        </w:rPr>
+        <w:t xml:space="preserve">He went back over the sill without looking behind him and sat down at his desk, and found that his hands were shaking in a way they had not shaken for murders, and he let them. The sheet in his pocket was still there. He took it out. It had not gone anywhere. It had come from somewhere, and it was two days older than the one he had just sent.</w:t>
+      </w:r>
+    </w:p>
+    <w:p>
+      <w:pPr>
+        <w:spacing w:after="160" w:line="240" w:lineRule="auto"/>
+      </w:pPr>
+      <w:r>
+        <w:rPr>
+          <w:rFonts w:ascii="Georgia" w:hAnsi="Georgia" w:eastAsia="Georgia"/>
+          <w:b w:val="0"/>
+          <w:sz w:val="22"/>
+        </w:rPr>
+        <w:t xml:space="preserve">Then he rang Munich.</w:t>
+      </w:r>
+    </w:p>
+    <w:p>
+      <w:pPr>
+        <w:spacing w:after="160" w:line="240" w:lineRule="auto"/>
+      </w:pPr>
+      <w:r>
+        <w:rPr>
+          <w:rFonts w:ascii="Georgia" w:hAnsi="Georgia" w:eastAsia="Georgia"/>
+          <w:b w:val="0"/>
+          <w:sz w:val="22"/>
+        </w:rPr>
+        <w:t xml:space="preserve">Herbert Matkowski answered on the first ring. "Matkowski."</w:t>
+      </w:r>
+    </w:p>
+    <w:p>
+      <w:pPr>
+        <w:spacing w:after="160" w:line="240" w:lineRule="auto"/>
+      </w:pPr>
+      <w:r>
+        <w:rPr>
+          <w:rFonts w:ascii="Georgia" w:hAnsi="Georgia" w:eastAsia="Georgia"/>
+          <w:b w:val="0"/>
+          <w:sz w:val="22"/>
+        </w:rPr>
+        <w:t xml:space="preserve">"It's Derek Gent. I've found the mechanism."</w:t>
+      </w:r>
+    </w:p>
+    <w:p>
+      <w:pPr>
+        <w:spacing w:after="160" w:line="240" w:lineRule="auto"/>
+      </w:pPr>
+      <w:r>
+        <w:rPr>
+          <w:rFonts w:ascii="Georgia" w:hAnsi="Georgia" w:eastAsia="Georgia"/>
+          <w:b w:val="0"/>
+          <w:sz w:val="22"/>
+        </w:rPr>
+        <w:t xml:space="preserve">He told it in order, because Herbert would not have accepted it in any other way. The printer. The words, one at a time, and where each had come from. The British Rail form. The fold. The ring. The chip. The first seat. He did not describe his feelings, and Herbert did not ask for them. When he had finished there was the sound of a pencil being put down.</w:t>
+      </w:r>
+    </w:p>
+    <w:p>
+      <w:pPr>
+        <w:spacing w:after="160" w:line="240" w:lineRule="auto"/>
+      </w:pPr>
+      <w:r>
+        <w:rPr>
+          <w:rFonts w:ascii="Georgia" w:hAnsi="Georgia" w:eastAsia="Georgia"/>
+          <w:b w:val="0"/>
+          <w:sz w:val="22"/>
+        </w:rPr>
+        <w:t xml:space="preserve">"I told Alfred this morning that ignorance is not a paradox," Herbert said. "It is not. But you are no longer ignorant, Mr Gent, so let me be exact, because Alfred will not be. Your paper is not a jinn."</w:t>
+      </w:r>
+    </w:p>
+    <w:p>
+      <w:pPr>
+        <w:spacing w:after="160" w:line="240" w:lineRule="auto"/>
+      </w:pPr>
+      <w:r>
+        <w:rPr>
+          <w:rFonts w:ascii="Georgia" w:hAnsi="Georgia" w:eastAsia="Georgia"/>
+          <w:b w:val="0"/>
+          <w:sz w:val="22"/>
+        </w:rPr>
+        <w:t xml:space="preserve">"A what?"</w:t>
+      </w:r>
+    </w:p>
+    <w:p>
+      <w:pPr>
+        <w:spacing w:after="160" w:line="240" w:lineRule="auto"/>
+      </w:pPr>
+      <w:r>
+        <w:rPr>
+          <w:rFonts w:ascii="Georgia" w:hAnsi="Georgia" w:eastAsia="Georgia"/>
+          <w:b w:val="0"/>
+          <w:sz w:val="22"/>
+        </w:rPr>
+        <w:t xml:space="preserve">"Lossev and Novikov, 1992. A jinn is their name for an object that goes round a closed loop in time with no maker at all. They are a great nuisance, jinn. A jinn must come back exactly as it left, every crease and every stain, so something has to undo its wear each time round. Your paper has a maker: a printer with a scratched drum, at sixteen minutes past six on Tuesday. It went back once, and then it got older in your pocket, and now it is sitting on your desk two days older than itself. Nothing has to be repaired. That is a perfectly respectable history. A line with a jump in it."</w:t>
+      </w:r>
+    </w:p>
+    <w:p>
+      <w:pPr>
+        <w:spacing w:after="160" w:line="240" w:lineRule="auto"/>
+      </w:pPr>
+      <w:r>
+        <w:rPr>
+          <w:rFonts w:ascii="Georgia" w:hAnsi="Georgia" w:eastAsia="Georgia"/>
+          <w:b w:val="0"/>
+          <w:sz w:val="22"/>
+        </w:rPr>
+        <w:t xml:space="preserve">"Then what goes round?"</w:t>
+      </w:r>
+    </w:p>
+    <w:p>
+      <w:pPr>
+        <w:spacing w:after="160" w:line="240" w:lineRule="auto"/>
+      </w:pPr>
+      <w:r>
+        <w:rPr>
+          <w:rFonts w:ascii="Georgia" w:hAnsi="Georgia" w:eastAsia="Georgia"/>
+          <w:b w:val="0"/>
+          <w:sz w:val="22"/>
+        </w:rPr>
+        <w:t xml:space="preserve">"The sentence. You read it on Monday, so you refused. You refused, so the form wrote it. Every word came from somewhere, and not one of them came from anybody who meant the sentence. That is a closed loop of information. People call it a bootstrap, and they are right to be uneasy, because nobody knows whether the universe allows loops in time at all. Hawking suspected it forbids them. Nobody has proved it either way. But Novikov's principle says that if such loops exist, the only versions that can happen are the ones that agree with themselves. Yours agrees with itself. Every word of it is accounted for, and none of it is anybody's."</w:t>
+      </w:r>
+    </w:p>
+    <w:p>
+      <w:pPr>
+        <w:spacing w:after="160" w:line="240" w:lineRule="auto"/>
+      </w:pPr>
+      <w:r>
+        <w:rPr>
+          <w:rFonts w:ascii="Georgia" w:hAnsi="Georgia" w:eastAsia="Georgia"/>
+          <w:b w:val="0"/>
+          <w:sz w:val="22"/>
+        </w:rPr>
+        <w:t xml:space="preserve">"And the train?"</w:t>
+      </w:r>
+    </w:p>
+    <w:p>
+      <w:pPr>
+        <w:spacing w:after="160" w:line="240" w:lineRule="auto"/>
+      </w:pPr>
+      <w:r>
+        <w:rPr>
+          <w:rFonts w:ascii="Georgia" w:hAnsi="Georgia" w:eastAsia="Georgia"/>
+          <w:b w:val="0"/>
+          <w:sz w:val="22"/>
+        </w:rPr>
+        <w:t xml:space="preserve">"The train is the one witness in this case I cannot interview. Your form tells you how. It does not tell you why there is a railway in your wall, and neither can I." The pencil was picked up again. "And it explains one sheet. It does not explain the slip at Paddington. Did that have a ring on it?"</w:t>
+      </w:r>
+    </w:p>
+    <w:p>
+      <w:pPr>
+        <w:spacing w:after="160" w:line="240" w:lineRule="auto"/>
+      </w:pPr>
+      <w:r>
+        <w:rPr>
+          <w:rFonts w:ascii="Georgia" w:hAnsi="Georgia" w:eastAsia="Georgia"/>
+          <w:b w:val="0"/>
+          <w:sz w:val="22"/>
+        </w:rPr>
+        <w:t xml:space="preserve">"No."</w:t>
+      </w:r>
+    </w:p>
+    <w:p>
+      <w:pPr>
+        <w:spacing w:after="160" w:line="240" w:lineRule="auto"/>
+      </w:pPr>
+      <w:r>
+        <w:rPr>
+          <w:rFonts w:ascii="Georgia" w:hAnsi="Georgia" w:eastAsia="Georgia"/>
+          <w:b w:val="0"/>
+          <w:sz w:val="22"/>
+        </w:rPr>
+        <w:t xml:space="preserve">"Then that one stays blank until it has a mechanism. And none of this makes you the author of anything. You did not write a word. You carried a notice to the place it had already been. Write it like that."</w:t>
+      </w:r>
+    </w:p>
+    <w:p>
+      <w:pPr>
+        <w:spacing w:after="160" w:line="240" w:lineRule="auto"/>
+      </w:pPr>
+      <w:r>
+        <w:rPr>
+          <w:rFonts w:ascii="Georgia" w:hAnsi="Georgia" w:eastAsia="Georgia"/>
+          <w:b w:val="0"/>
+          <w:sz w:val="22"/>
+        </w:rPr>
+        <w:t xml:space="preserve">"Weinstein will be unbearable."</w:t>
+      </w:r>
+    </w:p>
+    <w:p>
+      <w:pPr>
+        <w:spacing w:after="160" w:line="240" w:lineRule="auto"/>
+      </w:pPr>
+      <w:r>
+        <w:rPr>
+          <w:rFonts w:ascii="Georgia" w:hAnsi="Georgia" w:eastAsia="Georgia"/>
+          <w:b w:val="0"/>
+          <w:sz w:val="22"/>
+        </w:rPr>
+        <w:t xml:space="preserve">"Weinstein will be disappointed it was not him. He was afraid he was the bootstrap. He was only the nearest hand. Goodnight, Mr Gent."</w:t>
+      </w:r>
+    </w:p>
+    <w:p>
+      <w:pPr>
+        <w:spacing w:after="160" w:line="240" w:lineRule="auto"/>
+      </w:pPr>
+      <w:r>
+        <w:rPr>
+          <w:rFonts w:ascii="Georgia" w:hAnsi="Georgia" w:eastAsia="Georgia"/>
+          <w:b w:val="0"/>
+          <w:sz w:val="22"/>
+        </w:rPr>
+        <w:t xml:space="preserve">Derek turned to the keyboard. The cursor sat in SENDER OF THE MORNING SHEET, where it had waited since Monday afternoon. He typed into it, and the form did not argue.</w:t>
+      </w:r>
+    </w:p>
+    <w:p>
+      <w:pPr>
+        <w:spacing w:after="160" w:line="240" w:lineRule="auto"/>
+      </w:pPr>
+      <w:r>
+        <w:rPr>
+          <w:rFonts w:ascii="Georgia" w:hAnsi="Georgia" w:eastAsia="Georgia"/>
+          <w:b w:val="0"/>
+          <w:sz w:val="22"/>
+        </w:rPr>
+        <w:t xml:space="preserve">SENDER: NONE.</w:t>
+      </w:r>
+    </w:p>
+    <w:p>
+      <w:pPr>
+        <w:spacing w:after="160" w:line="240" w:lineRule="auto"/>
+      </w:pPr>
+      <w:r>
+        <w:rPr>
+          <w:rFonts w:ascii="Georgia" w:hAnsi="Georgia" w:eastAsia="Georgia"/>
+          <w:b w:val="0"/>
+          <w:sz w:val="22"/>
+        </w:rPr>
+        <w:t xml:space="preserve">PRINTED: THIS DESK, TUESDAY 18:16, BY THIS FORM, FROM ITS OWN FIELDS. NOT CASEBOOK ON MONDAY. CASEBOOK ON TUESDAY.</w:t>
+      </w:r>
+    </w:p>
+    <w:p>
+      <w:pPr>
+        <w:spacing w:after="160" w:line="240" w:lineRule="auto"/>
+      </w:pPr>
+      <w:r>
+        <w:rPr>
+          <w:rFonts w:ascii="Georgia" w:hAnsi="Georgia" w:eastAsia="Georgia"/>
+          <w:b w:val="0"/>
+          <w:sz w:val="22"/>
+        </w:rPr>
+        <w:t xml:space="preserve">WORDS: DEREK GENT, FROM THIS RECORD (D. GENT, REFUSING, MONDAY 16:41). DO NOT ALLOW, TO BOARD, FROM BOARDING REFUSED. MYSTERIOUS TRAIN, FROM MR PENDLETON'S INCIDENT REPORT. DATE, FROM THE PRINTER. NOT YET, FROM AN EMPTY BOX. THE BACK, FROM THE FORM'S NOTE ON THE VOICE.</w:t>
+      </w:r>
+    </w:p>
+    <w:p>
+      <w:pPr>
+        <w:spacing w:after="160" w:line="240" w:lineRule="auto"/>
+      </w:pPr>
+      <w:r>
+        <w:rPr>
+          <w:rFonts w:ascii="Georgia" w:hAnsi="Georgia" w:eastAsia="Georgia"/>
+          <w:b w:val="0"/>
+          <w:sz w:val="22"/>
+        </w:rPr>
+        <w:t xml:space="preserve">AUTHOR OF THE SENTENCE: NONE.</w:t>
+      </w:r>
+    </w:p>
+    <w:p>
+      <w:pPr>
+        <w:spacing w:after="160" w:line="240" w:lineRule="auto"/>
+      </w:pPr>
+      <w:r>
+        <w:rPr>
+          <w:rFonts w:ascii="Georgia" w:hAnsi="Georgia" w:eastAsia="Georgia"/>
+          <w:b w:val="0"/>
+          <w:sz w:val="22"/>
+        </w:rPr>
+        <w:t xml:space="preserve">CARRIER: D. GENT, UNDER FORM PL/9, NOTE 7. ROUTE: THE FIRST SEAT, TUESDAY 18:24; THE TRAIN; THIS DESK, MONDAY, BETWEEN 09:58:12 AND THE OPENING OF THE DOOR. ONCE.</w:t>
+      </w:r>
+    </w:p>
+    <w:p>
+      <w:pPr>
+        <w:spacing w:after="160" w:line="240" w:lineRule="auto"/>
+      </w:pPr>
+      <w:r>
+        <w:rPr>
+          <w:rFonts w:ascii="Georgia" w:hAnsi="Georgia" w:eastAsia="Georgia"/>
+          <w:b w:val="0"/>
+          <w:sz w:val="22"/>
+        </w:rPr>
+        <w:t xml:space="preserve">THE SHEET RECEIVED ON MONDAY: THE SAME SHEET, TWO DAYS OLDER. FOR DRAWER THREE.</w:t>
+      </w:r>
+    </w:p>
+    <w:p>
+      <w:pPr>
+        <w:spacing w:after="160" w:line="240" w:lineRule="auto"/>
+      </w:pPr>
+      <w:r>
+        <w:rPr>
+          <w:rFonts w:ascii="Georgia" w:hAnsi="Georgia" w:eastAsia="Georgia"/>
+          <w:b w:val="0"/>
+          <w:sz w:val="22"/>
+        </w:rPr>
+        <w:t xml:space="preserve">BOARDING: REFUSED. STILL.</w:t>
+      </w:r>
+    </w:p>
+    <w:p>
+      <w:pPr>
+        <w:spacing w:after="160" w:line="240" w:lineRule="auto"/>
+      </w:pPr>
+      <w:r>
+        <w:rPr>
+          <w:rFonts w:ascii="Georgia" w:hAnsi="Georgia" w:eastAsia="Georgia"/>
+          <w:b w:val="0"/>
+          <w:sz w:val="22"/>
+        </w:rPr>
+        <w:t xml:space="preserve">SUNDAY SLIP: SENDER UNKNOWN. NO MECHANISM. NO RING. LEFT BLANK.</w:t>
+      </w:r>
+    </w:p>
+    <w:p>
+      <w:pPr>
+        <w:spacing w:after="160" w:line="240" w:lineRule="auto"/>
+      </w:pPr>
+      <w:r>
+        <w:rPr>
+          <w:rFonts w:ascii="Georgia" w:hAnsi="Georgia" w:eastAsia="Georgia"/>
+          <w:b w:val="0"/>
+          <w:sz w:val="22"/>
+        </w:rPr>
+        <w:t xml:space="preserve">He saved it. The little wheel turned. The status line changed once more on its own, the last thing it ever did on its own.</w:t>
+      </w:r>
+    </w:p>
+    <w:p>
+      <w:pPr>
+        <w:spacing w:after="160" w:line="240" w:lineRule="auto"/>
+      </w:pPr>
+      <w:r>
+        <w:rPr>
+          <w:rFonts w:ascii="Georgia" w:hAnsi="Georgia" w:eastAsia="Georgia"/>
+          <w:b w:val="0"/>
+          <w:sz w:val="22"/>
+        </w:rPr>
+        <w:t xml:space="preserve">CASE STATUS: OCCURRED.</w:t>
+      </w:r>
+    </w:p>
+    <w:p>
+      <w:pPr>
+        <w:spacing w:after="160" w:line="240" w:lineRule="auto"/>
+      </w:pPr>
+      <w:r>
+        <w:rPr>
+          <w:rFonts w:ascii="Georgia" w:hAnsi="Georgia" w:eastAsia="Georgia"/>
+          <w:b w:val="0"/>
+          <w:sz w:val="22"/>
+        </w:rPr>
+        <w:t xml:space="preserve">On the stairs below, a dog's claws, and a woman's voice telling the dog that the stairs were not a democracy.</w:t>
+      </w:r>
+    </w:p>
+    <w:p>
+      <w:pPr>
+        <w:spacing w:after="160" w:line="240" w:lineRule="auto"/>
+      </w:pPr>
+      <w:r>
+        <w:rPr>
+          <w:rFonts w:ascii="Georgia" w:hAnsi="Georgia" w:eastAsia="Georgia"/>
+          <w:b w:val="0"/>
+          <w:sz w:val="22"/>
+        </w:rPr>
+        <w:t xml:space="preserve">It was half past six.</w:t>
+      </w:r>
+    </w:p>
+    <w:p>
+      <w:pPr>
+        <w:spacing w:after="160" w:line="240" w:lineRule="auto"/>
+      </w:pPr>
+      <w:r>
+        <w:rPr>
+          <w:rFonts w:ascii="Georgia" w:hAnsi="Georgia" w:eastAsia="Georgia"/>
+          <w:b w:val="0"/>
+          <w:sz w:val="22"/>
+        </w:rPr>
+        <w:t xml:space="preserve">Rule: If a thing seems to have no author, ask each word where it came from. Evidence can close a loop. A feeling cannot.</w:t>
       </w:r>
     </w:p>
     <w:p>
@@ -24205,6 +24140,45 @@
           <w:b w:val="0"/>
           <w:sz w:val="22"/>
         </w:rPr>
+        <w:t xml:space="preserve">At twenty-five to seven Mrs Marsh came up for the paper. Derek gave her the record, and then, after a moment, the sheet from his pocket. She looked at the ring on its corner, and at his mug, and did not ask.</w:t>
+      </w:r>
+    </w:p>
+    <w:p>
+      <w:pPr>
+        <w:spacing w:after="160" w:line="240" w:lineRule="auto"/>
+      </w:pPr>
+      <w:r>
+        <w:rPr>
+          <w:rFonts w:ascii="Georgia" w:hAnsi="Georgia" w:eastAsia="Georgia"/>
+          <w:b w:val="0"/>
+          <w:sz w:val="22"/>
+        </w:rPr>
+        <w:t xml:space="preserve">"It's the same sheet," he said. "Two days older than itself."</w:t>
+      </w:r>
+    </w:p>
+    <w:p>
+      <w:pPr>
+        <w:spacing w:after="160" w:line="240" w:lineRule="auto"/>
+      </w:pPr>
+      <w:r>
+        <w:rPr>
+          <w:rFonts w:ascii="Georgia" w:hAnsi="Georgia" w:eastAsia="Georgia"/>
+          <w:b w:val="0"/>
+          <w:sz w:val="22"/>
+        </w:rPr>
+        <w:t xml:space="preserve">"Then it will be the oldest thing in the drawer," said Mrs Marsh, and filed it under Pending Geometry, beside the slip from Paddington, and locked the drawer, and wrote the time in her book.</w:t>
+      </w:r>
+    </w:p>
+    <w:p>
+      <w:pPr>
+        <w:spacing w:after="160" w:line="240" w:lineRule="auto"/>
+      </w:pPr>
+      <w:r>
+        <w:rPr>
+          <w:rFonts w:ascii="Georgia" w:hAnsi="Georgia" w:eastAsia="Georgia"/>
+          <w:b w:val="0"/>
+          <w:sz w:val="22"/>
+        </w:rPr>
         <w:t>Sophie rang before the dog had settled.</w:t>
       </w:r>
     </w:p>
@@ -24387,7 +24361,7 @@
           <w:b w:val="0"/>
           <w:sz w:val="22"/>
         </w:rPr>
-        <w:t>Thursday week remained Greece. Penny sent nothing yet; there was nothing yet to send. She had bought a new hat, which she showed nobody, and a guidebook, which she showed everybody. Weinstein, from a door in Munich that was actually his, sent a single line on Tuesday evening, in which he managed to be both brief and reproachful.</w:t>
+        <w:t xml:space="preserve">Thursday week remained Greece. Penny had bought a new hat, which she showed nobody, and a guidebook, which she showed everybody. Weinstein, from a door in Munich that was actually his, sent a single line on Tuesday evening, in which he managed to be both brief and reproachful.</w:t>
       </w:r>
     </w:p>
     <w:p>
@@ -24439,7 +24413,7 @@
           <w:b w:val="0"/>
           <w:sz w:val="22"/>
         </w:rPr>
-        <w:t>Wednesday morning, Sophie was in double maths. The school said so; Penny had rung to ask, on his behalf, so that he would not have to be a man who rang. Derek did not go to the gates then. He sat at his desk in front of a doorway with a railway in it and did a piece of ordinary paperwork about an ordinary insurance fraud, which involved a man in Croydon who had claimed his car was stolen on a day he had demonstrably been driving it. It had nothing whatever to do with time. He enjoyed it enormously.</w:t>
+        <w:t xml:space="preserve">Wednesday morning, Sophie was in double maths. The school said so; Penny had rung to ask, on his behalf, so that he would not have to be a man who rang. Derek did not go to the gates then. On Penny's desk the photograph from Sunday morning was still standing up, facing the room. Overnight it had acquired a frame, a cheap black one from the stationer's on the corner, and she did not mention that either. He sat at his desk in front of a doorway with a railway in it and did a piece of ordinary paperwork about an ordinary insurance fraud, which involved a man in Croydon who had claimed his car was stolen on a day he had demonstrably been driving it. It had nothing whatever to do with time. He enjoyed it enormously.</w:t>
       </w:r>
     </w:p>
     <w:p>
@@ -24621,46 +24595,46 @@
           <w:b w:val="0"/>
           <w:sz w:val="22"/>
         </w:rPr>
-        <w:t>"That's what the form thought. It turned out the thing went round. It came to me, and I carried it, and it came to me." He heard how that sounded. "I'll explain it properly when you've done the rest of the owl book."</w:t>
-      </w:r>
-    </w:p>
-    <w:p>
-      <w:pPr>
-        <w:spacing w:after="160" w:line="240" w:lineRule="auto"/>
-      </w:pPr>
-      <w:r>
-        <w:rPr>
-          <w:rFonts w:ascii="Georgia" w:hAnsi="Georgia" w:eastAsia="Georgia"/>
-          <w:b w:val="0"/>
-          <w:sz w:val="22"/>
-        </w:rPr>
-        <w:t>"So you didn't write it."</w:t>
-      </w:r>
-    </w:p>
-    <w:p>
-      <w:pPr>
-        <w:spacing w:after="160" w:line="240" w:lineRule="auto"/>
-      </w:pPr>
-      <w:r>
-        <w:rPr>
-          <w:rFonts w:ascii="Georgia" w:hAnsi="Georgia" w:eastAsia="Georgia"/>
-          <w:b w:val="0"/>
-          <w:sz w:val="22"/>
-        </w:rPr>
-        <w:t>"Nobody wrote it."</w:t>
-      </w:r>
-    </w:p>
-    <w:p>
-      <w:pPr>
-        <w:spacing w:after="160" w:line="240" w:lineRule="auto"/>
-      </w:pPr>
-      <w:r>
-        <w:rPr>
-          <w:rFonts w:ascii="Georgia" w:hAnsi="Georgia" w:eastAsia="Georgia"/>
-          <w:b w:val="0"/>
-          <w:sz w:val="22"/>
-        </w:rPr>
-        <w:t>"And you didn't put the nearest name in."</w:t>
+        <w:t xml:space="preserve">"The office printer printed it. On Tuesday. I carried it to the train, and it got to my desk on Monday." He heard how that sounded. "I'll explain it properly when you've done the rest of the owl book."</w:t>
+      </w:r>
+    </w:p>
+    <w:p>
+      <w:pPr>
+        <w:spacing w:after="160" w:line="240" w:lineRule="auto"/>
+      </w:pPr>
+      <w:r>
+        <w:rPr>
+          <w:rFonts w:ascii="Georgia" w:hAnsi="Georgia" w:eastAsia="Georgia"/>
+          <w:b w:val="0"/>
+          <w:sz w:val="22"/>
+        </w:rPr>
+        <w:t xml:space="preserve">"So who wrote it?"</w:t>
+      </w:r>
+    </w:p>
+    <w:p>
+      <w:pPr>
+        <w:spacing w:after="160" w:line="240" w:lineRule="auto"/>
+      </w:pPr>
+      <w:r>
+        <w:rPr>
+          <w:rFonts w:ascii="Georgia" w:hAnsi="Georgia" w:eastAsia="Georgia"/>
+          <w:b w:val="0"/>
+          <w:sz w:val="22"/>
+        </w:rPr>
+        <w:t xml:space="preserve">"Everybody wrote a word. Nobody wrote the sentence."</w:t>
+      </w:r>
+    </w:p>
+    <w:p>
+      <w:pPr>
+        <w:spacing w:after="160" w:line="240" w:lineRule="auto"/>
+      </w:pPr>
+      <w:r>
+        <w:rPr>
+          <w:rFonts w:ascii="Georgia" w:hAnsi="Georgia" w:eastAsia="Georgia"/>
+          <w:b w:val="0"/>
+          <w:sz w:val="22"/>
+        </w:rPr>
+        <w:t xml:space="preserve">She thought about that for the length of a lamp-post. "That's the worst answer I've ever heard. And you didn't put the nearest name in."</w:t>
       </w:r>
     </w:p>
     <w:p>
@@ -24933,7 +24907,7 @@
           <w:b w:val="0"/>
           <w:sz w:val="22"/>
         </w:rPr>
-        <w:t>He thought about two seventeens. He thought about a sheet on a blotter on Monday and the same sheet on a seat on Tuesday, which he had counted as two things for a day and a half because one of them was arriving and the other was leaving.</w:t>
+        <w:t xml:space="preserve">He thought about two sheets side by side on a blotter, one warm and one worn, which had been one sheet all along, counted twice because one of them was two days older.</w:t>
       </w:r>
     </w:p>
     <w:p>
@@ -25011,7 +24985,7 @@
           <w:b w:val="0"/>
           <w:sz w:val="22"/>
         </w:rPr>
-        <w:t>The morning sheet had no sender. It had a route, and it had been round it once. The Sunday slip had neither yet, and lay in drawer three under Pending Geometry, waiting for a mechanism.</w:t>
+        <w:t xml:space="preserve">In drawer three, under Pending Geometry, the morning sheet lay folded in four, two days older than itself. Beside it lay the slip from Paddington, which had no sender and no route. It had no ring on it. Not yet.</w:t>
       </w:r>
     </w:p>
     <w:p>
@@ -25114,7 +25088,7 @@
           <w:b w:val="0"/>
           <w:sz w:val="22"/>
         </w:rPr>
-        <w:t>You should finish able to say, without this page: a cause has to sit in the past of its effect; noticing an open door is not the time it opened; being in the same room does not let you reorder what already happened; the voice can be late for the door while the sheet is still early for the train; a repeated numeral is not a repeated gap; a birthday is the wrong field for a record you are writing now; a loop will not explain a sheet that was already in your pocket, and neither will the refusal you type afterwards.</w:t>
+        <w:t xml:space="preserve">You should finish able to say, without this page: a cause has to sit in the past of its effect; noticing an open door is not the time it opened; being in the same room does not let you reorder what already happened; the voice can be late for the door while the sheet is still early for the train; a repeated numeral is not a repeated gap; a birthday is the wrong field for a record you are writing now; a sheet with a printer does not need a jinn; and a sentence with no author can still have a source for every word.</w:t>
       </w:r>
     </w:p>
     <w:p>
@@ -25553,7 +25527,7 @@
           <w:b w:val="0"/>
           <w:sz w:val="22"/>
         </w:rPr>
-        <w:t xml:space="preserve">The form asked for a birthday because it assumed a person. A person who has not been born is not in the past of the paper, so the form correctly refused tomorrow. Derek's refusal at 16:41, made at the yellow line with the carriage door open, can author that record. It has a time, and the time is after the acts it does not claim to have caused. It is not the sender of the morning sheet. The morning sheet was already in the pocket. Acts have times. A sheet that arrived earlier still needs its own account. In this case the account, found in Chapter 21, was not a sender but a route: the sheet went round a closed loop through the railway and was never written by anyone.</w:t>
+        <w:t xml:space="preserve">The form asked for a birthday because it assumed a person. A person who has not been born is not in the past of the paper, so the form correctly refused tomorrow. Derek's refusal at 16:41, made at the yellow line with the carriage door open, can author that record. It has a time, and the time is after the acts it does not claim to have caused. It is not the sender of the morning sheet. The morning sheet was already in the pocket. Acts have times. A sheet that arrived earlier still needs its own account. In this case the account, found in Chapter 21, was not a sender but a printer, a carrier and a route: the form printed the sheet on Tuesday evening from fields the office had filled for other reasons, Derek carried it to the train, and it arrived on Monday morning. Every word has a source. The sentence has no author.</w:t>
       </w:r>
     </w:p>
     <w:p>
@@ -25640,33 +25614,33 @@
           <w:b w:val="0"/>
           <w:sz w:val="22"/>
         </w:rPr>
-        <w:t>Learning objective: State the closed-curve trap, and why this file did not require it.</w:t>
-      </w:r>
-    </w:p>
-    <w:p>
-      <w:pPr>
-        <w:spacing w:after="160" w:line="240" w:lineRule="auto"/>
-      </w:pPr>
-      <w:r>
-        <w:rPr>
-          <w:rFonts w:ascii="Georgia" w:hAnsi="Georgia" w:eastAsia="Georgia"/>
-          <w:b w:val="0"/>
-          <w:sz w:val="22"/>
-        </w:rPr>
-        <w:t>If later Derek writes the warning, he learned the sentence from a life in which he boarded, or from a life in which he did not. The first makes the warning a record of failure. The second never teaches him the sentence. That paradox is real in the sense that stories get stuck in it, and the book avoids it: Derek writes nothing. He carries a finished sheet back to a moment it had already reached. Physics has a name for this possibility. Novikov's self-consistency principle says that if closed timelike curves exist, only histories that agree with themselves can happen on them. Lossev and Novikov called an object that circulates on such a curve with no maker a jinn, and noted that it must be restored to its exact earlier state each time round. Whether closed timelike curves can exist at all is open; Hawking's chronology protection conjecture says the laws of physics forbid them. The railway in this book is fiction. The reasoning Derek uses to find the loop, evidence first and a route instead of a name, is not.</w:t>
-      </w:r>
-    </w:p>
-    <w:p>
-      <w:pPr>
-        <w:spacing w:after="160" w:line="240" w:lineRule="auto"/>
-      </w:pPr>
-      <w:r>
-        <w:rPr>
-          <w:rFonts w:ascii="Georgia" w:hAnsi="Georgia" w:eastAsia="Georgia"/>
-          <w:b w:val="0"/>
-          <w:sz w:val="22"/>
-        </w:rPr>
-        <w:t>Keep this: do not hire a loop, and do not hire today's refusal, to explain a sheet that arrived this morning.</w:t>
+        <w:t xml:space="preserve">Learning objective: State the closed-curve trap, and why this file did not need a person inside the loop.</w:t>
+      </w:r>
+    </w:p>
+    <w:p>
+      <w:pPr>
+        <w:spacing w:after="160" w:line="240" w:lineRule="auto"/>
+      </w:pPr>
+      <w:r>
+        <w:rPr>
+          <w:rFonts w:ascii="Georgia" w:hAnsi="Georgia" w:eastAsia="Georgia"/>
+          <w:b w:val="0"/>
+          <w:sz w:val="22"/>
+        </w:rPr>
+        <w:t xml:space="preserve">If later Derek writes the warning, he learned the sentence from a life in which he boarded, or from a life in which he did not. The first makes the warning a record of failure. The second never teaches him the sentence. The book avoids that trap: Derek writes nothing. The paper has an ordinary origin, a printer on Tuesday evening; it travels back once and then ages normally, so on Tuesday evening the same sheet exists twice, once new and once two days older. Nothing about the paper needs repairing. What closes on itself is the information: the refusal the sheet provoked supplied the words the form printed. Novikov's self-consistency principle says that if closed timelike curves exist, only histories that agree with themselves can happen on them. Lossev and Novikov called an object that circulates on such a curve with no maker a jinn, and noted that it would have to be restored to its exact earlier state each time round; the morning sheet is not a jinn, because it has a maker and goes round only once. Whether closed timelike curves can exist at all is open; Hawking's chronology protection conjecture says the laws of physics forbid them. The railway in this book is fiction. The method Derek uses, asking each word where it came from, is not.</w:t>
+      </w:r>
+    </w:p>
+    <w:p>
+      <w:pPr>
+        <w:spacing w:after="160" w:line="240" w:lineRule="auto"/>
+      </w:pPr>
+      <w:r>
+        <w:rPr>
+          <w:rFonts w:ascii="Georgia" w:hAnsi="Georgia" w:eastAsia="Georgia"/>
+          <w:b w:val="0"/>
+          <w:sz w:val="22"/>
+        </w:rPr>
+        <w:t xml:space="preserve">Keep this: a sheet with a maker does not need a jinn, and a sentence can close on itself without anybody having written it.</w:t>
       </w:r>
     </w:p>
     <w:p>
@@ -25779,7 +25753,7 @@
           <w:b w:val="0"/>
           <w:sz w:val="22"/>
         </w:rPr>
-        <w:t>Keep this: earlier opening left in the past, boarding refused while it was still future, no name invented for the morning sheet. When the evidence showed a route, the route went in the field.</w:t>
+        <w:t xml:space="preserve">Keep this: earlier opening left in the past, boarding refused while it was still future, no name invented for the morning sheet. When the evidence showed a printer and a route, they went in the record, and the author field stayed empty.</w:t>
       </w:r>
     </w:p>
     <w:p>
@@ -25805,7 +25779,7 @@
           <w:b w:val="0"/>
           <w:sz w:val="22"/>
         </w:rPr>
-        <w:t xml:space="preserve">Quick test: Say the close without looking up. Sheet, then the door, both before 10:05. Voice after the door, late, size unknown. Reading at 10:22 is how long they read. Sunday's notice, 18:17 after an 18:00 opening, a different seventeen, and the previous warning the back of the sheet meant. Boarding refused before it happened. The record at 16:41 is Derek's refusal, made at the line. Sophie had no act. The name comes off. The morning sheet gets a route, not a sender.</w:t>
+        <w:t xml:space="preserve">Quick test: Say the close without looking up. Sheet, then the door, both before 10:05. Voice after the door, late, size unknown. Reading at 10:22 is how long they read. Sunday's notice, 18:17 after an 18:00 opening, a different seventeen, and the previous warning the back of the sheet meant. Boarding refused before it happened. The record at 16:41 is Derek's refusal, made at the line. Sophie had no act. The name comes off. The morning sheet gets a printer, a carrier and a route, not a sender.</w:t>
       </w:r>
     </w:p>
     <w:p>
@@ -25999,15 +25973,15 @@
         <w:spacing w:after="160" w:line="240" w:lineRule="auto"/>
       </w:pPr>
       <w:bookmarkStart w:id="34" w:name="gloss_Pending_author"/>
-      <w:r>
-        <w:rPr>
-          <w:rFonts w:ascii="Georgia" w:hAnsi="Georgia" w:eastAsia="Georgia"/>
-          <w:b w:val="0"/>
-          <w:sz w:val="22"/>
-        </w:rPr>
-        <w:t xml:space="preserve">Pending author. The morning sheet never gets one. The record written at 16:41 names Derek's refusal and does not claim to have printed the sheet; in Chapter 21 he is recorded as its carrier, not its author.</w:t>
-      </w:r>
       <w:bookmarkEnd w:id="34"/>
+      <w:r>
+        <w:rPr>
+          <w:rFonts w:ascii="Georgia" w:hAnsi="Georgia" w:eastAsia="Georgia"/>
+          <w:b w:val="0"/>
+          <w:sz w:val="22"/>
+        </w:rPr>
+        <w:t xml:space="preserve">Pending author. The morning sheet never gets one. Every word on it has a source (Chapter 21), but nobody wrote the sentence. The record written at 16:41 is Derek's refusal; in Chapter 21 he is recorded as the sheet's carrier, not its author.</w:t>
+      </w:r>
     </w:p>
     <w:p>
       <w:bookmarkStart w:id="35" w:name="gloss_Recipient"/>
@@ -26025,19 +25999,19 @@
       <w:bookmarkEnd w:id="35"/>
     </w:p>
     <w:p>
+      <w:pPr>
+        <w:spacing w:after="160" w:line="240" w:lineRule="auto"/>
+      </w:pPr>
       <w:bookmarkStart w:id="36" w:name="gloss_Closed_curve"/>
-      <w:pPr>
-        <w:spacing w:after="160" w:line="240" w:lineRule="auto"/>
-      </w:pPr>
-      <w:r>
-        <w:rPr>
-          <w:rFonts w:ascii="Georgia" w:hAnsi="Georgia" w:eastAsia="Georgia"/>
-          <w:b w:val="0"/>
-          <w:sz w:val="22"/>
-        </w:rPr>
-        <w:t>Closed curve. A history in which a signal runs back along a life and helps produce the signal. A known trap in this subject. Not the mechanism of this case.</w:t>
-      </w:r>
       <w:bookmarkEnd w:id="36"/>
+      <w:r>
+        <w:rPr>
+          <w:rFonts w:ascii="Georgia" w:hAnsi="Georgia" w:eastAsia="Georgia"/>
+          <w:b w:val="0"/>
+          <w:sz w:val="22"/>
+        </w:rPr>
+        <w:t xml:space="preserve">Closed curve. A history in which a signal runs back and helps produce itself. In this case only the sentence does that; the paper has a printer and goes back once.</w:t>
+      </w:r>
     </w:p>
     <w:p>
       <w:bookmarkStart w:id="37" w:name="gloss_Chronology_protection"/>
@@ -26055,19 +26029,19 @@
       <w:bookmarkEnd w:id="37"/>
     </w:p>
     <w:p>
+      <w:pPr>
+        <w:spacing w:after="160" w:line="240" w:lineRule="auto"/>
+      </w:pPr>
       <w:bookmarkStart w:id="38" w:name="gloss_LOCALHOST"/>
-      <w:pPr>
-        <w:spacing w:after="160" w:line="240" w:lineRule="auto"/>
-      </w:pPr>
-      <w:r>
-        <w:rPr>
-          <w:rFonts w:ascii="Georgia" w:hAnsi="Georgia" w:eastAsia="Georgia"/>
-          <w:b w:val="0"/>
-          <w:sz w:val="22"/>
-        </w:rPr>
-        <w:t>Jinn. Lossev and Novikov's 1992 name for an object that travels a closed loop in time with no maker. Permitted by some solutions of the equations; never observed. The morning sheet, in this book's fiction.</w:t>
-      </w:r>
       <w:bookmarkEnd w:id="38"/>
+      <w:r>
+        <w:rPr>
+          <w:rFonts w:ascii="Georgia" w:hAnsi="Georgia" w:eastAsia="Georgia"/>
+          <w:b w:val="0"/>
+          <w:sz w:val="22"/>
+        </w:rPr>
+        <w:t xml:space="preserve">Jinn. Lossev and Novikov's 1992 name for an object that travels a closed loop in time with no maker. Permitted by some solutions of the equations; never observed. The morning sheet is not one: it has a printer, and it goes round only once.</w:t>
+      </w:r>
     </w:p>
     <w:p>
       <w:pPr>

</xml_diff>

<commit_message>
RIB2: give the carriage voice the same formal "left blank" close as the Sunday slip
The Ch22 closing record gives the Sunday slip a formal dead end
("SUNDAY SLIP: SENDER UNKNOWN. NO MECHANISM. NO RING. LEFT BLANK.") but
never does the same for the carriage voice (the three knocks, Derek's
own register, raised in the Prologue and Ch1/11/16 and then just
dropped). Added one matching record line so it reads as a deliberately
closed open thread, the same way Sunday's slip and LOCALHOST do,
instead of a dropped one.

Resynced scripts/manuscript_text.txt to the docx.

Verified: zip integrity OK, all hyperlink anchors resolve to bookmarks,
no new duplicate-substring hits.

Co-Authored-By: Claude Sonnet 5 <noreply@anthropic.com>
Claude-Session: https://claude.ai/code/session_01NXJ5dH8hUcV48B6YanovWf
</commit_message>
<xml_diff>
--- a/The Relativistic Investigation Bureau - SERIES/Book 2 - The Warning That Was Sent Too Late/The_Warning_That_Was_Sent_Too_Late_BOOK_2_DRAFT.docx
+++ b/The Relativistic Investigation Bureau - SERIES/Book 2 - The Warning That Was Sent Too Late/The_Warning_That_Was_Sent_Too_Late_BOOK_2_DRAFT.docx
@@ -23926,6 +23926,19 @@
           <w:sz w:val="22"/>
         </w:rPr>
         <w:t xml:space="preserve">SUNDAY SLIP: SENDER UNKNOWN. NO MECHANISM. NO RING. LEFT BLANK.</w:t>
+      </w:r>
+    </w:p>
+    <w:p>
+      <w:pPr>
+        <w:spacing w:after="160" w:line="240" w:lineRule="auto"/>
+      </w:pPr>
+      <w:r>
+        <w:rPr>
+          <w:rFonts w:ascii="Georgia" w:hAnsi="Georgia" w:eastAsia="Georgia"/>
+          <w:b w:val="0"/>
+          <w:sz w:val="22"/>
+        </w:rPr>
+        <w:t xml:space="preserve">VOICE: SOURCE UNKNOWN. NO MECHANISM. LEFT BLANK.</w:t>
       </w:r>
     </w:p>
     <w:p>

</xml_diff>